<commit_message>
multi agent pipeline developed
</commit_message>
<xml_diff>
--- a/Follow up/multi agent selection justification.docx
+++ b/Follow up/multi agent selection justification.docx
@@ -1,6 +1,6 @@
 
 <file path=word/document.xml><?xml version="1.0" encoding="utf-8"?>
-<w:document xmlns:wpc="http://schemas.microsoft.com/office/word/2010/wordprocessingCanvas" xmlns:cx="http://schemas.microsoft.com/office/drawing/2014/chartex" xmlns:cx1="http://schemas.microsoft.com/office/drawing/2015/9/8/chartex" xmlns:cx2="http://schemas.microsoft.com/office/drawing/2015/10/21/chartex" xmlns:cx3="http://schemas.microsoft.com/office/drawing/2016/5/9/chartex" xmlns:cx4="http://schemas.microsoft.com/office/drawing/2016/5/10/chartex" xmlns:cx5="http://schemas.microsoft.com/office/drawing/2016/5/11/chartex" xmlns:cx6="http://schemas.microsoft.com/office/drawing/2016/5/12/chartex" xmlns:cx7="http://schemas.microsoft.com/office/drawing/2016/5/13/chartex" xmlns:cx8="http://schemas.microsoft.com/office/drawing/2016/5/14/chartex" xmlns:mc="http://schemas.openxmlformats.org/markup-compatibility/2006" xmlns:aink="http://schemas.microsoft.com/office/drawing/2016/ink" xmlns:am3d="http://schemas.microsoft.com/office/drawing/2017/model3d" xmlns:o="urn:schemas-microsoft-com:office:office" xmlns:oel="http://schemas.microsoft.com/office/2019/extlst" xmlns:r="http://schemas.openxmlformats.org/officeDocument/2006/relationships" xmlns:m="http://schemas.openxmlformats.org/officeDocument/2006/math" xmlns:v="urn:schemas-microsoft-com:vml" xmlns:wp14="http://schemas.microsoft.com/office/word/2010/wordprocessingDrawing" xmlns:wp="http://schemas.openxmlformats.org/drawingml/2006/wordprocessingDrawing" xmlns:w10="urn:schemas-microsoft-com:office:word" xmlns:w="http://schemas.openxmlformats.org/wordprocessingml/2006/main" xmlns:w14="http://schemas.microsoft.com/office/word/2010/wordml" xmlns:w15="http://schemas.microsoft.com/office/word/2012/wordml" xmlns:w16cei="http://schemas.microsoft.com/office/word/2026/wordml/cei" xmlns:w16cex="http://schemas.microsoft.com/office/word/2018/wordml/cex" xmlns:w16cid="http://schemas.microsoft.com/office/word/2016/wordml/cid" xmlns:w16="http://schemas.microsoft.com/office/word/2018/wordml" xmlns:w16du="http://schemas.microsoft.com/office/word/2023/wordml/word16du" xmlns:w16sdtdh="http://schemas.microsoft.com/office/word/2020/wordml/sdtdatahash" xmlns:w16sdtfl="http://schemas.microsoft.com/office/word/2024/wordml/sdtformatlock" xmlns:w16se="http://schemas.microsoft.com/office/word/2015/wordml/symex" xmlns:wpg="http://schemas.microsoft.com/office/word/2010/wordprocessingGroup" xmlns:wpi="http://schemas.microsoft.com/office/word/2010/wordprocessingInk" xmlns:wne="http://schemas.microsoft.com/office/word/2006/wordml" xmlns:wps="http://schemas.microsoft.com/office/word/2010/wordprocessingShape" mc:Ignorable="w14 w15 w16se w16cid w16 w16cex w16sdtdh w16sdtfl w16du wp14">
+<w:document xmlns:wpc="http://schemas.microsoft.com/office/word/2010/wordprocessingCanvas" xmlns:cx="http://schemas.microsoft.com/office/drawing/2014/chartex" xmlns:cx1="http://schemas.microsoft.com/office/drawing/2015/9/8/chartex" xmlns:cx2="http://schemas.microsoft.com/office/drawing/2015/10/21/chartex" xmlns:cx3="http://schemas.microsoft.com/office/drawing/2016/5/9/chartex" xmlns:cx4="http://schemas.microsoft.com/office/drawing/2016/5/10/chartex" xmlns:cx5="http://schemas.microsoft.com/office/drawing/2016/5/11/chartex" xmlns:cx6="http://schemas.microsoft.com/office/drawing/2016/5/12/chartex" xmlns:cx7="http://schemas.microsoft.com/office/drawing/2016/5/13/chartex" xmlns:cx8="http://schemas.microsoft.com/office/drawing/2016/5/14/chartex" xmlns:mc="http://schemas.openxmlformats.org/markup-compatibility/2006" xmlns:aink="http://schemas.microsoft.com/office/drawing/2016/ink" xmlns:am3d="http://schemas.microsoft.com/office/drawing/2017/model3d" xmlns:o="urn:schemas-microsoft-com:office:office" xmlns:oel="http://schemas.microsoft.com/office/2019/extlst" xmlns:r="http://schemas.openxmlformats.org/officeDocument/2006/relationships" xmlns:m="http://schemas.openxmlformats.org/officeDocument/2006/math" xmlns:v="urn:schemas-microsoft-com:vml" xmlns:wp14="http://schemas.microsoft.com/office/word/2010/wordprocessingDrawing" xmlns:wp="http://schemas.openxmlformats.org/drawingml/2006/wordprocessingDrawing" xmlns:w10="urn:schemas-microsoft-com:office:word" xmlns:w="http://schemas.openxmlformats.org/wordprocessingml/2006/main" xmlns:w14="http://schemas.microsoft.com/office/word/2010/wordml" xmlns:w15="http://schemas.microsoft.com/office/word/2012/wordml" xmlns:w16cex="http://schemas.microsoft.com/office/word/2018/wordml/cex" xmlns:w16cid="http://schemas.microsoft.com/office/word/2016/wordml/cid" xmlns:w16="http://schemas.microsoft.com/office/word/2018/wordml" xmlns:w16du="http://schemas.microsoft.com/office/word/2023/wordml/word16du" xmlns:w16sdtdh="http://schemas.microsoft.com/office/word/2020/wordml/sdtdatahash" xmlns:w16sdtfl="http://schemas.microsoft.com/office/word/2024/wordml/sdtformatlock" xmlns:w16se="http://schemas.microsoft.com/office/word/2015/wordml/symex" xmlns:wpg="http://schemas.microsoft.com/office/word/2010/wordprocessingGroup" xmlns:wpi="http://schemas.microsoft.com/office/word/2010/wordprocessingInk" xmlns:wne="http://schemas.microsoft.com/office/word/2006/wordml" xmlns:wps="http://schemas.microsoft.com/office/word/2010/wordprocessingShape" mc:Ignorable="w14 w15 w16se w16cid w16 w16cex w16sdtdh w16sdtfl w16du wp14">
   <w:body>
     <w:p>
       <w:pPr>
@@ -84,7 +84,15 @@
         <w:t>same LLM that wrote the plan</w:t>
       </w:r>
       <w:r>
-        <w:t xml:space="preserve"> to self-assess how confident it is, before any code has run. That's exactly the kind of unverified self-judgment Huang et al. (2024) found unreliable — and we've seen it directly in our own data: </w:t>
+        <w:t xml:space="preserve"> to self-assess how confident it is, before any code has run. That's exactly the kind of unverified self-judgment Huang et al. (2024) found </w:t>
+      </w:r>
+      <w:proofErr w:type="gramStart"/>
+      <w:r>
+        <w:t>unreliable  and</w:t>
+      </w:r>
+      <w:proofErr w:type="gramEnd"/>
+      <w:r>
+        <w:t xml:space="preserve"> we've seen it directly in our own data: </w:t>
       </w:r>
       <w:proofErr w:type="spellStart"/>
       <w:r>
@@ -102,73 +110,42 @@
       <w:pPr>
         <w:jc w:val="both"/>
       </w:pPr>
-    </w:p>
-    <w:p>
-      <w:pPr>
-        <w:jc w:val="both"/>
-      </w:pPr>
-      <w:proofErr w:type="gramStart"/>
-      <w:r>
-        <w:t xml:space="preserve">  </w:t>
-      </w:r>
       <w:r>
         <w:rPr>
           <w:b/>
           <w:bCs/>
         </w:rPr>
-        <w:t>It's</w:t>
-      </w:r>
-      <w:proofErr w:type="gramEnd"/>
+        <w:t>It's more token-efficient</w:t>
+      </w:r>
+      <w:r>
+        <w:t xml:space="preserve"> </w:t>
+      </w:r>
+      <w:proofErr w:type="spellStart"/>
+      <w:r>
+        <w:t>MapCoder's</w:t>
+      </w:r>
+      <w:proofErr w:type="spellEnd"/>
+      <w:r>
+        <w:t xml:space="preserve"> own limitations section admits they never solved the cost of generating k plans upfront when most go unused; this avoids that entirely. </w:t>
+      </w:r>
+    </w:p>
+    <w:p>
+      <w:pPr>
+        <w:jc w:val="both"/>
+      </w:pPr>
       <w:r>
         <w:rPr>
           <w:b/>
           <w:bCs/>
         </w:rPr>
-        <w:t xml:space="preserve"> more token-efficient</w:t>
-      </w:r>
-      <w:r>
-        <w:t xml:space="preserve"> — </w:t>
-      </w:r>
-      <w:proofErr w:type="spellStart"/>
-      <w:r>
-        <w:t>MapCoder's</w:t>
-      </w:r>
-      <w:proofErr w:type="spellEnd"/>
-      <w:r>
-        <w:t xml:space="preserve"> own limitations section admits they never solved the cost of generating k plans upfront when most go unused; this avoids that entirely. </w:t>
-      </w:r>
-    </w:p>
-    <w:p>
-      <w:pPr>
-        <w:jc w:val="both"/>
-      </w:pPr>
-      <w:proofErr w:type="gramStart"/>
-      <w:r>
-        <w:t xml:space="preserve">  </w:t>
-      </w:r>
-      <w:r>
-        <w:rPr>
-          <w:b/>
-          <w:bCs/>
-        </w:rPr>
-        <w:t>It's</w:t>
-      </w:r>
-      <w:proofErr w:type="gramEnd"/>
-      <w:r>
-        <w:rPr>
-          <w:b/>
-          <w:bCs/>
-        </w:rPr>
-        <w:t xml:space="preserve"> better grounded in the Huang et al. (2024) finding</w:t>
-      </w:r>
-      <w:r>
-        <w:t xml:space="preserve"> — what makes iteration </w:t>
-      </w:r>
-      <w:proofErr w:type="gramStart"/>
-      <w:r>
-        <w:t>actually help</w:t>
-      </w:r>
-      <w:proofErr w:type="gramEnd"/>
+        <w:t>It's better grounded in the Huang et al. (2024) finding</w:t>
+      </w:r>
+      <w:r>
+        <w:t xml:space="preserve"> what makes iteration </w:t>
+      </w:r>
+      <w:r>
+        <w:t>help</w:t>
+      </w:r>
       <w:r>
         <w:t xml:space="preserve"> is </w:t>
       </w:r>
@@ -240,7 +217,25 @@
           <w:bCs/>
           <w:u w:val="single"/>
         </w:rPr>
-        <w:t xml:space="preserve"> Coding + Debugging — a real, fundamental distinction, not just a naming choice</w:t>
+        <w:t xml:space="preserve"> Coding + </w:t>
+      </w:r>
+      <w:proofErr w:type="gramStart"/>
+      <w:r>
+        <w:rPr>
+          <w:b/>
+          <w:bCs/>
+          <w:u w:val="single"/>
+        </w:rPr>
+        <w:t>Debugging  a</w:t>
+      </w:r>
+      <w:proofErr w:type="gramEnd"/>
+      <w:r>
+        <w:rPr>
+          <w:b/>
+          <w:bCs/>
+          <w:u w:val="single"/>
+        </w:rPr>
+        <w:t xml:space="preserve"> real, fundamental distinction, not just a naming choice</w:t>
       </w:r>
     </w:p>
     <w:p>
@@ -273,15 +268,7 @@
       </w:r>
       <w:proofErr w:type="spellEnd"/>
       <w:r>
-        <w:t xml:space="preserve"> </w:t>
-      </w:r>
-      <w:proofErr w:type="gramStart"/>
-      <w:r>
-        <w:t>test(</w:t>
-      </w:r>
-      <w:proofErr w:type="gramEnd"/>
-      <w:r>
-        <w:t xml:space="preserve">) function checks code against </w:t>
+        <w:t xml:space="preserve"> test() function checks code against </w:t>
       </w:r>
       <w:r>
         <w:rPr>
@@ -291,23 +278,15 @@
         <w:t>known, ground-truth sample input/output pairs</w:t>
       </w:r>
       <w:r>
-        <w:t xml:space="preserve"> — competitive programming problems come with worked examples (</w:t>
+        <w:t xml:space="preserve"> competitive programming problems come with worked examples (</w:t>
       </w:r>
       <w:proofErr w:type="spellStart"/>
       <w:r>
-        <w:t>sum_</w:t>
-      </w:r>
-      <w:proofErr w:type="gramStart"/>
-      <w:r>
-        <w:t>squares</w:t>
+        <w:t>sum_squares</w:t>
       </w:r>
       <w:proofErr w:type="spellEnd"/>
       <w:r>
-        <w:t>(</w:t>
-      </w:r>
-      <w:proofErr w:type="gramEnd"/>
-      <w:r>
-        <w:t xml:space="preserve">[1,2,3]) == 14) that the code can be checked against </w:t>
+        <w:t xml:space="preserve">([1,2,3]) == 14) that the code can be checked against </w:t>
       </w:r>
       <w:r>
         <w:rPr>
@@ -342,7 +321,15 @@
         <w:t>is</w:t>
       </w:r>
       <w:r>
-        <w:t xml:space="preserve"> the thing we're testing whether the model can compute — handing it over as a "sample answer" to check against would make the whole experiment circular. There is no equivalent of a sample I/O for "is this borough's spatial clustering significant."</w:t>
+        <w:t xml:space="preserve"> the thing we're testing whether the model can </w:t>
+      </w:r>
+      <w:proofErr w:type="gramStart"/>
+      <w:r>
+        <w:t>compute  handing</w:t>
+      </w:r>
+      <w:proofErr w:type="gramEnd"/>
+      <w:r>
+        <w:t xml:space="preserve"> it over as a "sample answer" to check against would make the whole experiment circular. There is no equivalent of a sample I/O for "is this borough's spatial clustering significant."</w:t>
       </w:r>
     </w:p>
     <w:p>
@@ -389,7 +376,15 @@
         <w:t>.</w:t>
       </w:r>
       <w:r>
-        <w:t xml:space="preserve"> It can catch nan, an impossible p-value, or a hardcoded literal — but it </w:t>
+        <w:t xml:space="preserve"> It can catch nan, an impossible p-value, or a hardcoded </w:t>
+      </w:r>
+      <w:proofErr w:type="gramStart"/>
+      <w:r>
+        <w:t>literal  but</w:t>
+      </w:r>
+      <w:proofErr w:type="gramEnd"/>
+      <w:r>
+        <w:t xml:space="preserve"> it </w:t>
       </w:r>
       <w:r>
         <w:rPr>
@@ -399,7 +394,13 @@
         <w:t>cannot</w:t>
       </w:r>
       <w:r>
-        <w:t xml:space="preserve"> catch a well-formed, finite, correctly-printed number that's simply the </w:t>
+        <w:t xml:space="preserve"> catch a well-formed, finite, </w:t>
+      </w:r>
+      <w:r>
+        <w:t>correctly printed</w:t>
+      </w:r>
+      <w:r>
+        <w:t xml:space="preserve"> number that's simply the </w:t>
       </w:r>
       <w:r>
         <w:rPr>
@@ -409,7 +410,13 @@
         <w:t>wrong</w:t>
       </w:r>
       <w:r>
-        <w:t xml:space="preserve"> method. Recall gpt-4o-mini's sign-matching proxy on the change-spillover NO2 case — real, finite, correctly printed, and it would pass every one of our checks, despite being analytically weaker than real Moran's I. This is a genuine, honest limitation worth stating plainly in your thesis, not glossing over — and it's precisely </w:t>
+        <w:t xml:space="preserve"> method. Recall gpt-4o-mini's sign-matching proxy on the change-spillover NO2 case real, finite, correctly printed, and it would pass every one of our checks, despite being analytically weaker than real Moran's I. This is a genuine, honest limitation worth stating plainly in </w:t>
+      </w:r>
+      <w:r>
+        <w:t>the</w:t>
+      </w:r>
+      <w:r>
+        <w:t xml:space="preserve"> thesis, not glossing over and it's precisely </w:t>
       </w:r>
       <w:r>
         <w:rPr>
@@ -427,11 +434,7 @@
       </w:r>
       <w:proofErr w:type="spellEnd"/>
       <w:r>
-        <w:t xml:space="preserve"> </w:t>
-      </w:r>
-      <w:r>
-        <w:lastRenderedPageBreak/>
-        <w:t>approach doesn't transfer directly: they have access to objective ground truth pre-answer; open-ended statistical inference on real data does not.</w:t>
+        <w:t xml:space="preserve"> approach doesn't transfer directly: they have access to objective ground truth pre-answer; open-ended statistical inference on real data does not.</w:t>
       </w:r>
     </w:p>
     <w:p>
@@ -446,6 +449,7 @@
     </w:p>
     <w:p>
       <w:pPr>
+        <w:jc w:val="center"/>
         <w:rPr>
           <w:b/>
           <w:bCs/>
@@ -458,15 +462,18 @@
           <w:bCs/>
           <w:u w:val="single"/>
         </w:rPr>
+        <w:lastRenderedPageBreak/>
         <w:t>Justifications: Issues needed to be addressed through multi agent framework</w:t>
       </w:r>
-    </w:p>
-    <w:p>
-      <w:pPr>
-        <w:jc w:val="both"/>
-      </w:pPr>
-    </w:p>
-    <w:p/>
+      <w:r>
+        <w:rPr>
+          <w:b/>
+          <w:bCs/>
+          <w:u w:val="single"/>
+        </w:rPr>
+        <w:t xml:space="preserve"> (Generic)</w:t>
+      </w:r>
+    </w:p>
     <w:tbl>
       <w:tblPr>
         <w:tblW w:w="0" w:type="auto"/>
@@ -480,9 +487,7 @@
         <w:tblLook w:val="04A0" w:firstRow="1" w:lastRow="0" w:firstColumn="1" w:lastColumn="0" w:noHBand="0" w:noVBand="1"/>
       </w:tblPr>
       <w:tblGrid>
-        <w:gridCol w:w="2809"/>
-        <w:gridCol w:w="2564"/>
-        <w:gridCol w:w="3653"/>
+        <w:gridCol w:w="1830"/>
       </w:tblGrid>
       <w:tr>
         <w:trPr>
@@ -507,253 +512,1963 @@
                 <w:b/>
                 <w:bCs/>
               </w:rPr>
-              <w:t>Single-agent failure (with your own evidence)</w:t>
+              <w:t>Validation tasks</w:t>
+            </w:r>
+          </w:p>
+        </w:tc>
+      </w:tr>
+    </w:tbl>
+    <w:p>
+      <w:pPr>
+        <w:spacing w:after="0" w:line="240" w:lineRule="auto"/>
+        <w:rPr>
+          <w:rFonts w:ascii="Times New Roman" w:eastAsia="Times New Roman" w:hAnsi="Times New Roman" w:cs="Times New Roman"/>
+          <w:b/>
+          <w:bCs/>
+          <w:kern w:val="0"/>
+          <w:lang w:eastAsia="en-AU"/>
+          <w14:ligatures w14:val="none"/>
+        </w:rPr>
+      </w:pPr>
+      <w:r>
+        <w:rPr>
+          <w:rFonts w:ascii="Times New Roman" w:eastAsia="Times New Roman" w:hAnsi="Times New Roman" w:cs="Times New Roman"/>
+          <w:b/>
+          <w:bCs/>
+          <w:kern w:val="0"/>
+          <w:lang w:eastAsia="en-AU"/>
+          <w14:ligatures w14:val="none"/>
+        </w:rPr>
+        <w:t>Check</w:t>
+      </w:r>
+      <w:r>
+        <w:rPr>
+          <w:rFonts w:ascii="Times New Roman" w:eastAsia="Times New Roman" w:hAnsi="Times New Roman" w:cs="Times New Roman"/>
+          <w:b/>
+          <w:bCs/>
+          <w:kern w:val="0"/>
+          <w:lang w:eastAsia="en-AU"/>
+          <w14:ligatures w14:val="none"/>
+        </w:rPr>
+        <w:tab/>
+      </w:r>
+      <w:r>
+        <w:rPr>
+          <w:rFonts w:ascii="Times New Roman" w:eastAsia="Times New Roman" w:hAnsi="Times New Roman" w:cs="Times New Roman"/>
+          <w:b/>
+          <w:bCs/>
+          <w:kern w:val="0"/>
+          <w:lang w:eastAsia="en-AU"/>
+          <w14:ligatures w14:val="none"/>
+        </w:rPr>
+        <w:tab/>
+      </w:r>
+      <w:r>
+        <w:rPr>
+          <w:rFonts w:ascii="Times New Roman" w:eastAsia="Times New Roman" w:hAnsi="Times New Roman" w:cs="Times New Roman"/>
+          <w:b/>
+          <w:bCs/>
+          <w:kern w:val="0"/>
+          <w:lang w:eastAsia="en-AU"/>
+          <w14:ligatures w14:val="none"/>
+        </w:rPr>
+        <w:t xml:space="preserve">            </w:t>
+      </w:r>
+      <w:r>
+        <w:rPr>
+          <w:rFonts w:ascii="Times New Roman" w:eastAsia="Times New Roman" w:hAnsi="Times New Roman" w:cs="Times New Roman"/>
+          <w:b/>
+          <w:bCs/>
+          <w:kern w:val="0"/>
+          <w:lang w:eastAsia="en-AU"/>
+          <w14:ligatures w14:val="none"/>
+        </w:rPr>
+        <w:t xml:space="preserve">       </w:t>
+      </w:r>
+      <w:r>
+        <w:rPr>
+          <w:rFonts w:ascii="Times New Roman" w:eastAsia="Times New Roman" w:hAnsi="Times New Roman" w:cs="Times New Roman"/>
+          <w:b/>
+          <w:bCs/>
+          <w:kern w:val="0"/>
+          <w:lang w:eastAsia="en-AU"/>
+          <w14:ligatures w14:val="none"/>
+        </w:rPr>
+        <w:t>General principle it's really an instance of</w:t>
+      </w:r>
+      <w:r>
+        <w:rPr>
+          <w:rFonts w:ascii="Times New Roman" w:eastAsia="Times New Roman" w:hAnsi="Times New Roman" w:cs="Times New Roman"/>
+          <w:b/>
+          <w:bCs/>
+          <w:kern w:val="0"/>
+          <w:lang w:eastAsia="en-AU"/>
+          <w14:ligatures w14:val="none"/>
+        </w:rPr>
+        <w:t xml:space="preserve">        </w:t>
+      </w:r>
+      <w:r>
+        <w:rPr>
+          <w:rFonts w:ascii="Times New Roman" w:eastAsia="Times New Roman" w:hAnsi="Times New Roman" w:cs="Times New Roman"/>
+          <w:b/>
+          <w:bCs/>
+          <w:kern w:val="0"/>
+          <w:lang w:eastAsia="en-AU"/>
+          <w14:ligatures w14:val="none"/>
+        </w:rPr>
+        <w:t>Generic because</w:t>
+      </w:r>
+    </w:p>
+    <w:tbl>
+      <w:tblPr>
+        <w:tblStyle w:val="TableGrid"/>
+        <w:tblW w:w="9253" w:type="dxa"/>
+        <w:tblLayout w:type="fixed"/>
+        <w:tblLook w:val="04A0" w:firstRow="1" w:lastRow="0" w:firstColumn="1" w:lastColumn="0" w:noHBand="0" w:noVBand="1"/>
+      </w:tblPr>
+      <w:tblGrid>
+        <w:gridCol w:w="2689"/>
+        <w:gridCol w:w="4579"/>
+        <w:gridCol w:w="1985"/>
+      </w:tblGrid>
+      <w:tr>
+        <w:trPr>
+          <w:trHeight w:val="1061"/>
+        </w:trPr>
+        <w:tc>
+          <w:tcPr>
+            <w:tcW w:w="2689" w:type="dxa"/>
+          </w:tcPr>
+          <w:p>
+            <w:pPr>
+              <w:rPr>
+                <w:rFonts w:ascii="Cambria" w:eastAsia="Times New Roman" w:hAnsi="Cambria" w:cs="Calibri"/>
+                <w:kern w:val="0"/>
+                <w:lang w:eastAsia="en-AU"/>
+                <w14:ligatures w14:val="none"/>
+              </w:rPr>
+            </w:pPr>
+            <w:r>
+              <w:rPr>
+                <w:rFonts w:ascii="Cambria" w:eastAsia="Times New Roman" w:hAnsi="Cambria" w:cs="Calibri"/>
+                <w:b/>
+                <w:bCs/>
+                <w:kern w:val="0"/>
+                <w:lang w:eastAsia="en-AU"/>
+                <w14:ligatures w14:val="none"/>
+              </w:rPr>
+              <w:t>Finite statistic</w:t>
+            </w:r>
+            <w:r>
+              <w:rPr>
+                <w:rFonts w:ascii="Cambria" w:eastAsia="Times New Roman" w:hAnsi="Cambria" w:cs="Calibri"/>
+                <w:kern w:val="0"/>
+                <w:lang w:eastAsia="en-AU"/>
+                <w14:ligatures w14:val="none"/>
+              </w:rPr>
+              <w:t xml:space="preserve"> (none, infinity checking)</w:t>
             </w:r>
           </w:p>
         </w:tc>
         <w:tc>
           <w:tcPr>
-            <w:tcW w:w="0" w:type="auto"/>
-            <w:vAlign w:val="center"/>
-            <w:hideMark/>
+            <w:tcW w:w="4579" w:type="dxa"/>
           </w:tcPr>
           <w:p>
             <w:pPr>
               <w:rPr>
-                <w:b/>
-                <w:bCs/>
+                <w:rFonts w:ascii="Cambria" w:eastAsia="Times New Roman" w:hAnsi="Cambria" w:cs="Calibri"/>
+                <w:kern w:val="0"/>
+                <w:lang w:eastAsia="en-AU"/>
+                <w14:ligatures w14:val="none"/>
               </w:rPr>
             </w:pPr>
             <w:r>
               <w:rPr>
-                <w:b/>
-                <w:bCs/>
-              </w:rPr>
-              <w:t>New mechanism</w:t>
+                <w:rFonts w:ascii="Cambria" w:eastAsia="Times New Roman" w:hAnsi="Cambria" w:cs="Calibri"/>
+                <w:kern w:val="0"/>
+                <w:lang w:eastAsia="en-AU"/>
+                <w14:ligatures w14:val="none"/>
+              </w:rPr>
+              <w:t xml:space="preserve">Output </w:t>
+            </w:r>
+            <w:r>
+              <w:rPr>
+                <w:rFonts w:ascii="Cambria" w:eastAsia="Times New Roman" w:hAnsi="Cambria" w:cs="Calibri"/>
+                <w:kern w:val="0"/>
+                <w:lang w:eastAsia="en-AU"/>
+                <w14:ligatures w14:val="none"/>
+              </w:rPr>
+              <w:t>validity a</w:t>
+            </w:r>
+            <w:r>
+              <w:rPr>
+                <w:rFonts w:ascii="Cambria" w:eastAsia="Times New Roman" w:hAnsi="Cambria" w:cs="Calibri"/>
+                <w:kern w:val="0"/>
+                <w:lang w:eastAsia="en-AU"/>
+                <w14:ligatures w14:val="none"/>
+              </w:rPr>
+              <w:t xml:space="preserve"> basic postcondition of any numerical computation</w:t>
             </w:r>
           </w:p>
         </w:tc>
         <w:tc>
           <w:tcPr>
-            <w:tcW w:w="0" w:type="auto"/>
-            <w:vAlign w:val="center"/>
-            <w:hideMark/>
+            <w:tcW w:w="1985" w:type="dxa"/>
           </w:tcPr>
           <w:p>
             <w:pPr>
               <w:rPr>
-                <w:b/>
-                <w:bCs/>
+                <w:rFonts w:ascii="Cambria" w:eastAsia="Times New Roman" w:hAnsi="Cambria" w:cs="Calibri"/>
+                <w:kern w:val="0"/>
+                <w:lang w:eastAsia="en-AU"/>
+                <w14:ligatures w14:val="none"/>
               </w:rPr>
             </w:pPr>
             <w:r>
               <w:rPr>
-                <w:b/>
-                <w:bCs/>
-              </w:rPr>
-              <w:t>Why it should help</w:t>
+                <w:rFonts w:ascii="Cambria" w:eastAsia="Times New Roman" w:hAnsi="Cambria" w:cs="Calibri"/>
+                <w:kern w:val="0"/>
+                <w:lang w:eastAsia="en-AU"/>
+                <w14:ligatures w14:val="none"/>
+              </w:rPr>
+              <w:t>This is a universal sanity check for any pipeline outputting numbers, statistical or not</w:t>
             </w:r>
           </w:p>
         </w:tc>
       </w:tr>
       <w:tr>
         <w:trPr>
-          <w:tblCellSpacing w:w="15" w:type="dxa"/>
+          <w:trHeight w:val="1061"/>
         </w:trPr>
         <w:tc>
           <w:tcPr>
-            <w:tcW w:w="0" w:type="auto"/>
-            <w:vAlign w:val="center"/>
-            <w:hideMark/>
+            <w:tcW w:w="2689" w:type="dxa"/>
           </w:tcPr>
           <w:p>
-            <w:proofErr w:type="spellStart"/>
+            <w:pPr>
+              <w:rPr>
+                <w:rFonts w:ascii="Cambria" w:eastAsia="Times New Roman" w:hAnsi="Cambria" w:cs="Calibri"/>
+                <w:kern w:val="0"/>
+                <w:lang w:eastAsia="en-AU"/>
+                <w14:ligatures w14:val="none"/>
+              </w:rPr>
+            </w:pPr>
             <w:r>
-              <w:t>gas_waste</w:t>
+              <w:rPr>
+                <w:rFonts w:ascii="Cambria" w:eastAsia="Times New Roman" w:hAnsi="Cambria" w:cs="Calibri"/>
+                <w:b/>
+                <w:bCs/>
+                <w:kern w:val="0"/>
+                <w:lang w:eastAsia="en-AU"/>
+                <w14:ligatures w14:val="none"/>
+              </w:rPr>
+              <w:t>p</w:t>
             </w:r>
-            <w:proofErr w:type="spellEnd"/>
             <w:r>
-              <w:t>: code had no missing-value check at all; nan propagated through the whole calculation</w:t>
+              <w:rPr>
+                <w:rFonts w:ascii="Cambria" w:eastAsia="Times New Roman" w:hAnsi="Cambria" w:cs="Calibri"/>
+                <w:kern w:val="0"/>
+                <w:lang w:eastAsia="en-AU"/>
+                <w14:ligatures w14:val="none"/>
+              </w:rPr>
+              <w:t xml:space="preserve"> </w:t>
+            </w:r>
+            <w:r>
+              <w:rPr>
+                <w:rFonts w:ascii="Cambria" w:eastAsia="Times New Roman" w:hAnsi="Cambria" w:cs="Cambria Math"/>
+                <w:kern w:val="0"/>
+                <w:lang w:eastAsia="en-AU"/>
+                <w14:ligatures w14:val="none"/>
+              </w:rPr>
+              <w:t>∈</w:t>
+            </w:r>
+            <w:r>
+              <w:rPr>
+                <w:rFonts w:ascii="Cambria" w:eastAsia="Times New Roman" w:hAnsi="Cambria" w:cs="Calibri"/>
+                <w:kern w:val="0"/>
+                <w:lang w:eastAsia="en-AU"/>
+                <w14:ligatures w14:val="none"/>
+              </w:rPr>
+              <w:t xml:space="preserve"> [0,1]</w:t>
             </w:r>
           </w:p>
         </w:tc>
         <w:tc>
           <w:tcPr>
-            <w:tcW w:w="0" w:type="auto"/>
-            <w:vAlign w:val="center"/>
-            <w:hideMark/>
+            <w:tcW w:w="4579" w:type="dxa"/>
           </w:tcPr>
           <w:p>
+            <w:pPr>
+              <w:rPr>
+                <w:rFonts w:ascii="Cambria" w:eastAsia="Times New Roman" w:hAnsi="Cambria" w:cs="Calibri"/>
+                <w:kern w:val="0"/>
+                <w:lang w:eastAsia="en-AU"/>
+                <w14:ligatures w14:val="none"/>
+              </w:rPr>
+            </w:pPr>
             <w:r>
-              <w:t>Profiler explicitly surfaces missingness as a separate, named fact before any code is written</w:t>
+              <w:rPr>
+                <w:rFonts w:ascii="Cambria" w:eastAsia="Times New Roman" w:hAnsi="Cambria" w:cs="Calibri"/>
+                <w:kern w:val="0"/>
+                <w:lang w:eastAsia="en-AU"/>
+                <w14:ligatures w14:val="none"/>
+              </w:rPr>
+              <w:t xml:space="preserve">Definitional correctness this is what a p-value </w:t>
+            </w:r>
+            <w:r>
+              <w:rPr>
+                <w:rFonts w:ascii="Cambria" w:eastAsia="Times New Roman" w:hAnsi="Cambria" w:cs="Calibri"/>
+                <w:i/>
+                <w:iCs/>
+                <w:kern w:val="0"/>
+                <w:lang w:eastAsia="en-AU"/>
+                <w14:ligatures w14:val="none"/>
+              </w:rPr>
+              <w:t>is</w:t>
+            </w:r>
+            <w:r>
+              <w:rPr>
+                <w:rFonts w:ascii="Cambria" w:eastAsia="Times New Roman" w:hAnsi="Cambria" w:cs="Calibri"/>
+                <w:kern w:val="0"/>
+                <w:lang w:eastAsia="en-AU"/>
+                <w14:ligatures w14:val="none"/>
+              </w:rPr>
+              <w:t>, by mathematical definition</w:t>
             </w:r>
           </w:p>
         </w:tc>
         <w:tc>
           <w:tcPr>
-            <w:tcW w:w="0" w:type="auto"/>
-            <w:vAlign w:val="center"/>
-            <w:hideMark/>
+            <w:tcW w:w="1985" w:type="dxa"/>
           </w:tcPr>
           <w:p>
+            <w:pPr>
+              <w:rPr>
+                <w:rFonts w:ascii="Cambria" w:eastAsia="Times New Roman" w:hAnsi="Cambria" w:cs="Calibri"/>
+                <w:kern w:val="0"/>
+                <w:lang w:eastAsia="en-AU"/>
+                <w14:ligatures w14:val="none"/>
+              </w:rPr>
+            </w:pPr>
             <w:r>
-              <w:t>The Planner has something concrete to plan around, rather than discovering the problem (or not) by chance mid-calculation</w:t>
+              <w:rPr>
+                <w:rFonts w:ascii="Cambria" w:eastAsia="Times New Roman" w:hAnsi="Cambria" w:cs="Calibri"/>
+                <w:kern w:val="0"/>
+                <w:lang w:eastAsia="en-AU"/>
+                <w14:ligatures w14:val="none"/>
+              </w:rPr>
+              <w:t>True for any valid significance test, regardless of method</w:t>
             </w:r>
           </w:p>
         </w:tc>
       </w:tr>
       <w:tr>
         <w:trPr>
-          <w:tblCellSpacing w:w="15" w:type="dxa"/>
+          <w:trHeight w:val="1014"/>
         </w:trPr>
         <w:tc>
           <w:tcPr>
-            <w:tcW w:w="0" w:type="auto"/>
-            <w:vAlign w:val="center"/>
-            <w:hideMark/>
+            <w:tcW w:w="2689" w:type="dxa"/>
           </w:tcPr>
           <w:p>
+            <w:pPr>
+              <w:rPr>
+                <w:rFonts w:ascii="Cambria" w:eastAsia="Times New Roman" w:hAnsi="Cambria" w:cs="Calibri"/>
+                <w:kern w:val="0"/>
+                <w:lang w:eastAsia="en-AU"/>
+                <w14:ligatures w14:val="none"/>
+              </w:rPr>
+            </w:pPr>
             <w:r>
-              <w:t>no2_energy: two independent generations of the same prompt produced -0.494 vs -0.102, flipping the conclusion</w:t>
+              <w:rPr>
+                <w:rFonts w:ascii="Cambria" w:eastAsia="Times New Roman" w:hAnsi="Cambria" w:cs="Calibri"/>
+                <w:b/>
+                <w:bCs/>
+                <w:kern w:val="0"/>
+                <w:lang w:eastAsia="en-AU"/>
+                <w14:ligatures w14:val="none"/>
+              </w:rPr>
+              <w:t>Variable-reference, not hardcoded</w:t>
+            </w:r>
+            <w:r>
+              <w:rPr>
+                <w:rFonts w:ascii="Cambria" w:eastAsia="Times New Roman" w:hAnsi="Cambria" w:cs="Calibri"/>
+                <w:kern w:val="0"/>
+                <w:lang w:eastAsia="en-AU"/>
+                <w14:ligatures w14:val="none"/>
+              </w:rPr>
+              <w:t xml:space="preserve"> ("statistical method = Global Moran's I) – Instead </w:t>
+            </w:r>
+            <w:r>
+              <w:rPr>
+                <w:rFonts w:ascii="Cambria" w:eastAsia="Times New Roman" w:hAnsi="Cambria" w:cs="Calibri"/>
+                <w:kern w:val="0"/>
+                <w:lang w:eastAsia="en-AU"/>
+                <w14:ligatures w14:val="none"/>
+              </w:rPr>
+              <w:t>of giving</w:t>
+            </w:r>
+            <w:r>
+              <w:rPr>
+                <w:rFonts w:ascii="Cambria" w:eastAsia="Times New Roman" w:hAnsi="Cambria" w:cs="Calibri"/>
+                <w:kern w:val="0"/>
+                <w:lang w:eastAsia="en-AU"/>
+                <w14:ligatures w14:val="none"/>
+              </w:rPr>
+              <w:t xml:space="preserve"> a number giving </w:t>
+            </w:r>
+            <w:proofErr w:type="gramStart"/>
+            <w:r>
+              <w:rPr>
+                <w:rFonts w:ascii="Cambria" w:eastAsia="Times New Roman" w:hAnsi="Cambria" w:cs="Calibri"/>
+                <w:kern w:val="0"/>
+                <w:lang w:eastAsia="en-AU"/>
+                <w14:ligatures w14:val="none"/>
+              </w:rPr>
+              <w:t>hardcoded  values</w:t>
+            </w:r>
+            <w:proofErr w:type="gramEnd"/>
+            <w:r>
+              <w:rPr>
+                <w:rFonts w:ascii="Cambria" w:eastAsia="Times New Roman" w:hAnsi="Cambria" w:cs="Calibri"/>
+                <w:kern w:val="0"/>
+                <w:lang w:eastAsia="en-AU"/>
+                <w14:ligatures w14:val="none"/>
+              </w:rPr>
+              <w:t xml:space="preserve">, or </w:t>
+            </w:r>
+            <w:r>
+              <w:rPr>
+                <w:rFonts w:ascii="Cambria" w:eastAsia="Times New Roman" w:hAnsi="Cambria" w:cs="Calibri"/>
+                <w:kern w:val="0"/>
+                <w:lang w:eastAsia="en-AU"/>
+                <w14:ligatures w14:val="none"/>
+              </w:rPr>
+              <w:t>in place</w:t>
+            </w:r>
+            <w:r>
+              <w:rPr>
+                <w:rFonts w:ascii="Cambria" w:eastAsia="Times New Roman" w:hAnsi="Cambria" w:cs="Calibri"/>
+                <w:kern w:val="0"/>
+                <w:lang w:eastAsia="en-AU"/>
+                <w14:ligatures w14:val="none"/>
+              </w:rPr>
+              <w:t xml:space="preserve"> of value giving string like Global Moran's I</w:t>
             </w:r>
           </w:p>
         </w:tc>
         <w:tc>
           <w:tcPr>
-            <w:tcW w:w="0" w:type="auto"/>
-            <w:vAlign w:val="center"/>
-            <w:hideMark/>
+            <w:tcW w:w="4579" w:type="dxa"/>
           </w:tcPr>
           <w:p>
+            <w:pPr>
+              <w:rPr>
+                <w:rFonts w:ascii="Cambria" w:eastAsia="Times New Roman" w:hAnsi="Cambria" w:cs="Calibri"/>
+                <w:kern w:val="0"/>
+                <w:lang w:eastAsia="en-AU"/>
+                <w14:ligatures w14:val="none"/>
+              </w:rPr>
+            </w:pPr>
             <w:r>
-              <w:t>Explicit Planner step, written out before code</w:t>
+              <w:rPr>
+                <w:rFonts w:ascii="Cambria" w:eastAsia="Times New Roman" w:hAnsi="Cambria" w:cs="Calibri"/>
+                <w:kern w:val="0"/>
+                <w:lang w:eastAsia="en-AU"/>
+                <w14:ligatures w14:val="none"/>
+              </w:rPr>
+              <w:t>Provenance / no fabrication</w:t>
             </w:r>
           </w:p>
         </w:tc>
         <w:tc>
           <w:tcPr>
-            <w:tcW w:w="0" w:type="auto"/>
-            <w:vAlign w:val="center"/>
-            <w:hideMark/>
+            <w:tcW w:w="1985" w:type="dxa"/>
           </w:tcPr>
           <w:p>
+            <w:pPr>
+              <w:rPr>
+                <w:rFonts w:ascii="Cambria" w:eastAsia="Times New Roman" w:hAnsi="Cambria" w:cs="Calibri"/>
+                <w:kern w:val="0"/>
+                <w:lang w:eastAsia="en-AU"/>
+                <w14:ligatures w14:val="none"/>
+              </w:rPr>
+            </w:pPr>
             <w:r>
-              <w:t>A written plan is a checkpoint — does it name a specific, real method and account for missing data? — that the current single-shot design has no equivalent of</w:t>
+              <w:rPr>
+                <w:rFonts w:ascii="Cambria" w:eastAsia="Times New Roman" w:hAnsi="Cambria" w:cs="Calibri"/>
+                <w:kern w:val="0"/>
+                <w:lang w:eastAsia="en-AU"/>
+                <w14:ligatures w14:val="none"/>
+              </w:rPr>
+              <w:t xml:space="preserve">A standard reproducible-research </w:t>
+            </w:r>
+            <w:r>
+              <w:rPr>
+                <w:rFonts w:ascii="Cambria" w:eastAsia="Times New Roman" w:hAnsi="Cambria" w:cs="Calibri"/>
+                <w:kern w:val="0"/>
+                <w:lang w:eastAsia="en-AU"/>
+                <w14:ligatures w14:val="none"/>
+              </w:rPr>
+              <w:t>requirement</w:t>
+            </w:r>
+            <w:r>
+              <w:rPr>
+                <w:rFonts w:ascii="Cambria" w:eastAsia="Times New Roman" w:hAnsi="Cambria" w:cs="Calibri"/>
+                <w:kern w:val="0"/>
+                <w:lang w:eastAsia="en-AU"/>
+                <w14:ligatures w14:val="none"/>
+              </w:rPr>
+              <w:t>,</w:t>
+            </w:r>
+            <w:r>
+              <w:rPr>
+                <w:rFonts w:ascii="Cambria" w:eastAsia="Times New Roman" w:hAnsi="Cambria" w:cs="Calibri"/>
+                <w:kern w:val="0"/>
+                <w:lang w:eastAsia="en-AU"/>
+                <w14:ligatures w14:val="none"/>
+              </w:rPr>
+              <w:t xml:space="preserve"> a</w:t>
+            </w:r>
+            <w:r>
+              <w:rPr>
+                <w:rFonts w:ascii="Cambria" w:eastAsia="Times New Roman" w:hAnsi="Cambria" w:cs="Calibri"/>
+                <w:kern w:val="0"/>
+                <w:lang w:eastAsia="en-AU"/>
+                <w14:ligatures w14:val="none"/>
+              </w:rPr>
+              <w:t xml:space="preserve"> reported number must trace to real computation</w:t>
             </w:r>
           </w:p>
         </w:tc>
       </w:tr>
       <w:tr>
         <w:trPr>
-          <w:tblCellSpacing w:w="15" w:type="dxa"/>
+          <w:trHeight w:val="1061"/>
         </w:trPr>
         <w:tc>
           <w:tcPr>
-            <w:tcW w:w="0" w:type="auto"/>
-            <w:vAlign w:val="center"/>
-            <w:hideMark/>
+            <w:tcW w:w="2689" w:type="dxa"/>
           </w:tcPr>
           <w:p>
-            <w:proofErr w:type="spellStart"/>
+            <w:pPr>
+              <w:rPr>
+                <w:rFonts w:ascii="Cambria" w:eastAsia="Times New Roman" w:hAnsi="Cambria" w:cs="Calibri"/>
+                <w:kern w:val="0"/>
+                <w:lang w:eastAsia="en-AU"/>
+                <w14:ligatures w14:val="none"/>
+              </w:rPr>
+            </w:pPr>
             <w:r>
-              <w:t>qwen</w:t>
+              <w:rPr>
+                <w:rFonts w:ascii="Cambria" w:eastAsia="Times New Roman" w:hAnsi="Cambria" w:cs="Calibri"/>
+                <w:b/>
+                <w:bCs/>
+                <w:kern w:val="0"/>
+                <w:lang w:eastAsia="en-AU"/>
+                <w14:ligatures w14:val="none"/>
+              </w:rPr>
+              <w:t>Permutation count</w:t>
             </w:r>
-            <w:proofErr w:type="spellEnd"/>
             <w:r>
-              <w:t xml:space="preserve"> NO2: printed "statistical method = Global Moran's I" instead of a number</w:t>
+              <w:rPr>
+                <w:rFonts w:ascii="Cambria" w:eastAsia="Times New Roman" w:hAnsi="Cambria" w:cs="Calibri"/>
+                <w:kern w:val="0"/>
+                <w:lang w:eastAsia="en-AU"/>
+                <w14:ligatures w14:val="none"/>
+              </w:rPr>
+              <w:t xml:space="preserve"> ≥ 500</w:t>
             </w:r>
           </w:p>
         </w:tc>
         <w:tc>
           <w:tcPr>
-            <w:tcW w:w="0" w:type="auto"/>
-            <w:vAlign w:val="center"/>
-            <w:hideMark/>
+            <w:tcW w:w="4579" w:type="dxa"/>
           </w:tcPr>
           <w:p>
+            <w:pPr>
+              <w:rPr>
+                <w:rFonts w:ascii="Cambria" w:eastAsia="Times New Roman" w:hAnsi="Cambria" w:cs="Calibri"/>
+                <w:kern w:val="0"/>
+                <w:lang w:eastAsia="en-AU"/>
+                <w14:ligatures w14:val="none"/>
+              </w:rPr>
+            </w:pPr>
             <w:r>
-              <w:t>Deterministic Validator, not LLM self-check</w:t>
+              <w:rPr>
+                <w:rFonts w:ascii="Cambria" w:eastAsia="Times New Roman" w:hAnsi="Cambria" w:cs="Calibri"/>
+                <w:kern w:val="0"/>
+                <w:lang w:eastAsia="en-AU"/>
+                <w14:ligatures w14:val="none"/>
+              </w:rPr>
+              <w:t>Enforcing own stated methodology</w:t>
             </w:r>
           </w:p>
         </w:tc>
         <w:tc>
           <w:tcPr>
-            <w:tcW w:w="0" w:type="auto"/>
-            <w:vAlign w:val="center"/>
-            <w:hideMark/>
+            <w:tcW w:w="1985" w:type="dxa"/>
           </w:tcPr>
           <w:p>
-            <w:proofErr w:type="spellStart"/>
+            <w:pPr>
+              <w:rPr>
+                <w:rFonts w:ascii="Cambria" w:eastAsia="Times New Roman" w:hAnsi="Cambria" w:cs="Calibri"/>
+                <w:kern w:val="0"/>
+                <w:lang w:eastAsia="en-AU"/>
+                <w14:ligatures w14:val="none"/>
+              </w:rPr>
+            </w:pPr>
             <w:r>
-              <w:t>MapCoder's</w:t>
-            </w:r>
-            <w:proofErr w:type="spellEnd"/>
-            <w:r>
-              <w:t xml:space="preserve"> own reported evidence (8–15% of their failures came from </w:t>
+              <w:rPr>
+                <w:rFonts w:ascii="Cambria" w:eastAsia="Times New Roman" w:hAnsi="Cambria" w:cs="Calibri"/>
+                <w:kern w:val="0"/>
+                <w:lang w:eastAsia="en-AU"/>
+                <w14:ligatures w14:val="none"/>
+              </w:rPr>
+              <w:t xml:space="preserve">This was already in </w:t>
             </w:r>
             <w:r>
               <w:rPr>
-                <w:i/>
-                <w:iCs/>
-              </w:rPr>
-              <w:t>LLM-generated</w:t>
+                <w:rFonts w:ascii="Cambria" w:eastAsia="Times New Roman" w:hAnsi="Cambria" w:cs="Calibri"/>
+                <w:kern w:val="0"/>
+                <w:lang w:eastAsia="en-AU"/>
+                <w14:ligatures w14:val="none"/>
+              </w:rPr>
+              <w:t>the</w:t>
             </w:r>
             <w:r>
-              <w:t xml:space="preserve"> test cases being wrong) directly supports using mechanical, non-LLM validation instead</w:t>
+              <w:rPr>
+                <w:rFonts w:ascii="Cambria" w:eastAsia="Times New Roman" w:hAnsi="Cambria" w:cs="Calibri"/>
+                <w:kern w:val="0"/>
+                <w:lang w:eastAsia="en-AU"/>
+                <w14:ligatures w14:val="none"/>
+              </w:rPr>
+              <w:t xml:space="preserve"> original prompt for every model on every task the check just verifies compliance, it isn't new</w:t>
             </w:r>
           </w:p>
         </w:tc>
       </w:tr>
       <w:tr>
         <w:trPr>
-          <w:tblCellSpacing w:w="15" w:type="dxa"/>
+          <w:trHeight w:val="1061"/>
         </w:trPr>
         <w:tc>
           <w:tcPr>
-            <w:tcW w:w="0" w:type="auto"/>
-            <w:vAlign w:val="center"/>
-            <w:hideMark/>
+            <w:tcW w:w="2689" w:type="dxa"/>
           </w:tcPr>
           <w:p>
+            <w:pPr>
+              <w:rPr>
+                <w:rFonts w:ascii="Cambria" w:eastAsia="Times New Roman" w:hAnsi="Cambria" w:cs="Calibri"/>
+                <w:b/>
+                <w:bCs/>
+                <w:kern w:val="0"/>
+                <w:lang w:eastAsia="en-AU"/>
+                <w14:ligatures w14:val="none"/>
+              </w:rPr>
+            </w:pPr>
+            <w:proofErr w:type="spellStart"/>
             <w:r>
-              <w:t>gpt-4o-mini: chose a valid but far weaker method (sign-matching)</w:t>
+              <w:rPr>
+                <w:rFonts w:ascii="Cambria" w:eastAsia="Times New Roman" w:hAnsi="Cambria" w:cs="Calibri"/>
+                <w:b/>
+                <w:bCs/>
+                <w:kern w:val="0"/>
+                <w:lang w:eastAsia="en-AU"/>
+                <w14:ligatures w14:val="none"/>
+              </w:rPr>
+              <w:t>n_used</w:t>
+            </w:r>
+            <w:proofErr w:type="spellEnd"/>
+            <w:r>
+              <w:rPr>
+                <w:rFonts w:ascii="Cambria" w:eastAsia="Times New Roman" w:hAnsi="Cambria" w:cs="Calibri"/>
+                <w:b/>
+                <w:bCs/>
+                <w:kern w:val="0"/>
+                <w:lang w:eastAsia="en-AU"/>
+                <w14:ligatures w14:val="none"/>
+              </w:rPr>
+              <w:t xml:space="preserve"> reconciliation</w:t>
+            </w:r>
+          </w:p>
+          <w:p>
+            <w:pPr>
+              <w:rPr>
+                <w:rFonts w:ascii="Cambria" w:eastAsia="Times New Roman" w:hAnsi="Cambria" w:cs="Calibri"/>
+                <w:kern w:val="0"/>
+                <w:lang w:eastAsia="en-AU"/>
+                <w14:ligatures w14:val="none"/>
+              </w:rPr>
+            </w:pPr>
+          </w:p>
+          <w:p>
+            <w:pPr>
+              <w:rPr>
+                <w:rFonts w:ascii="Cambria" w:eastAsia="Times New Roman" w:hAnsi="Cambria" w:cs="Calibri"/>
+                <w:kern w:val="0"/>
+                <w:lang w:eastAsia="en-AU"/>
+                <w14:ligatures w14:val="none"/>
+              </w:rPr>
+            </w:pPr>
+            <w:proofErr w:type="spellStart"/>
+            <w:r>
+              <w:rPr>
+                <w:rFonts w:ascii="Cambria" w:eastAsia="Times New Roman" w:hAnsi="Cambria" w:cs="Calibri"/>
+                <w:kern w:val="0"/>
+                <w:lang w:eastAsia="en-AU"/>
+                <w14:ligatures w14:val="none"/>
+              </w:rPr>
+              <w:t>expected_n_used</w:t>
+            </w:r>
+            <w:proofErr w:type="spellEnd"/>
+            <w:r>
+              <w:rPr>
+                <w:rFonts w:ascii="Cambria" w:eastAsia="Times New Roman" w:hAnsi="Cambria" w:cs="Calibri"/>
+                <w:kern w:val="0"/>
+                <w:lang w:eastAsia="en-AU"/>
+                <w14:ligatures w14:val="none"/>
+              </w:rPr>
+              <w:t xml:space="preserve"> = 33 </w:t>
+            </w:r>
+            <w:r>
+              <w:rPr>
+                <w:rFonts w:ascii="Cambria" w:eastAsia="Times New Roman" w:hAnsi="Cambria" w:cs="Calibri"/>
+                <w:kern w:val="0"/>
+                <w:lang w:eastAsia="en-AU"/>
+                <w14:ligatures w14:val="none"/>
+              </w:rPr>
+              <w:t>-</w:t>
+            </w:r>
+            <w:proofErr w:type="spellStart"/>
+            <w:r>
+              <w:rPr>
+                <w:rFonts w:ascii="Cambria" w:eastAsia="Times New Roman" w:hAnsi="Cambria" w:cs="Calibri"/>
+                <w:kern w:val="0"/>
+                <w:lang w:eastAsia="en-AU"/>
+                <w14:ligatures w14:val="none"/>
+              </w:rPr>
+              <w:t>profile_output</w:t>
+            </w:r>
+            <w:proofErr w:type="spellEnd"/>
+            <w:r>
+              <w:rPr>
+                <w:rFonts w:ascii="Cambria" w:eastAsia="Times New Roman" w:hAnsi="Cambria" w:cs="Calibri"/>
+                <w:kern w:val="0"/>
+                <w:lang w:eastAsia="en-AU"/>
+                <w14:ligatures w14:val="none"/>
+              </w:rPr>
+              <w:t>["</w:t>
+            </w:r>
+            <w:proofErr w:type="spellStart"/>
+            <w:r>
+              <w:rPr>
+                <w:rFonts w:ascii="Cambria" w:eastAsia="Times New Roman" w:hAnsi="Cambria" w:cs="Calibri"/>
+                <w:kern w:val="0"/>
+                <w:lang w:eastAsia="en-AU"/>
+                <w14:ligatures w14:val="none"/>
+              </w:rPr>
+              <w:t>missing_count_for_this_column</w:t>
+            </w:r>
+            <w:proofErr w:type="spellEnd"/>
+            <w:r>
+              <w:rPr>
+                <w:rFonts w:ascii="Cambria" w:eastAsia="Times New Roman" w:hAnsi="Cambria" w:cs="Calibri"/>
+                <w:kern w:val="0"/>
+                <w:lang w:eastAsia="en-AU"/>
+                <w14:ligatures w14:val="none"/>
+              </w:rPr>
+              <w:t>"]</w:t>
+            </w:r>
+          </w:p>
+          <w:p>
+            <w:pPr>
+              <w:rPr>
+                <w:rFonts w:ascii="Cambria" w:eastAsia="Times New Roman" w:hAnsi="Cambria" w:cs="Calibri"/>
+                <w:kern w:val="0"/>
+                <w:lang w:eastAsia="en-AU"/>
+                <w14:ligatures w14:val="none"/>
+              </w:rPr>
+            </w:pPr>
+            <w:r>
+              <w:rPr>
+                <w:rFonts w:ascii="Cambria" w:eastAsia="Times New Roman" w:hAnsi="Cambria" w:cs="Calibri"/>
+                <w:kern w:val="0"/>
+                <w:lang w:eastAsia="en-AU"/>
+                <w14:ligatures w14:val="none"/>
+              </w:rPr>
+              <w:t xml:space="preserve"> </w:t>
+            </w:r>
+          </w:p>
+          <w:p>
+            <w:pPr>
+              <w:rPr>
+                <w:rFonts w:ascii="Cambria" w:eastAsia="Times New Roman" w:hAnsi="Cambria" w:cs="Calibri"/>
+                <w:kern w:val="0"/>
+                <w:lang w:eastAsia="en-AU"/>
+                <w14:ligatures w14:val="none"/>
+              </w:rPr>
+            </w:pPr>
+            <w:proofErr w:type="spellStart"/>
+            <w:r>
+              <w:rPr>
+                <w:rFonts w:ascii="Cambria" w:eastAsia="Times New Roman" w:hAnsi="Cambria" w:cs="Calibri"/>
+                <w:kern w:val="0"/>
+                <w:lang w:eastAsia="en-AU"/>
+                <w14:ligatures w14:val="none"/>
+              </w:rPr>
+              <w:t>actual_n_used</w:t>
+            </w:r>
+            <w:proofErr w:type="spellEnd"/>
+            <w:r>
+              <w:rPr>
+                <w:rFonts w:ascii="Cambria" w:eastAsia="Times New Roman" w:hAnsi="Cambria" w:cs="Calibri"/>
+                <w:kern w:val="0"/>
+                <w:lang w:eastAsia="en-AU"/>
+                <w14:ligatures w14:val="none"/>
+              </w:rPr>
+              <w:t xml:space="preserve"> = parsed from Coder's printed </w:t>
+            </w:r>
+          </w:p>
+          <w:p>
+            <w:pPr>
+              <w:rPr>
+                <w:rFonts w:ascii="Cambria" w:eastAsia="Times New Roman" w:hAnsi="Cambria" w:cs="Calibri"/>
+                <w:kern w:val="0"/>
+                <w:lang w:eastAsia="en-AU"/>
+                <w14:ligatures w14:val="none"/>
+              </w:rPr>
+            </w:pPr>
+          </w:p>
+          <w:p>
+            <w:pPr>
+              <w:rPr>
+                <w:rFonts w:ascii="Cambria" w:eastAsia="Times New Roman" w:hAnsi="Cambria" w:cs="Calibri"/>
+                <w:kern w:val="0"/>
+                <w:lang w:eastAsia="en-AU"/>
+                <w14:ligatures w14:val="none"/>
+              </w:rPr>
+            </w:pPr>
+            <w:r>
+              <w:rPr>
+                <w:rFonts w:ascii="Cambria" w:eastAsia="Times New Roman" w:hAnsi="Cambria" w:cs="Calibri"/>
+                <w:kern w:val="0"/>
+                <w:lang w:eastAsia="en-AU"/>
+                <w14:ligatures w14:val="none"/>
+              </w:rPr>
+              <w:t>"</w:t>
+            </w:r>
+            <w:proofErr w:type="spellStart"/>
+            <w:r>
+              <w:rPr>
+                <w:rFonts w:ascii="Cambria" w:eastAsia="Times New Roman" w:hAnsi="Cambria" w:cs="Calibri"/>
+                <w:kern w:val="0"/>
+                <w:lang w:eastAsia="en-AU"/>
+                <w14:ligatures w14:val="none"/>
+              </w:rPr>
+              <w:t>n_used</w:t>
+            </w:r>
+            <w:proofErr w:type="spellEnd"/>
+            <w:r>
+              <w:rPr>
+                <w:rFonts w:ascii="Cambria" w:eastAsia="Times New Roman" w:hAnsi="Cambria" w:cs="Calibri"/>
+                <w:kern w:val="0"/>
+                <w:lang w:eastAsia="en-AU"/>
+                <w14:ligatures w14:val="none"/>
+              </w:rPr>
+              <w:t xml:space="preserve"> = X" IF </w:t>
+            </w:r>
+            <w:proofErr w:type="spellStart"/>
+            <w:r>
+              <w:rPr>
+                <w:rFonts w:ascii="Cambria" w:eastAsia="Times New Roman" w:hAnsi="Cambria" w:cs="Calibri"/>
+                <w:kern w:val="0"/>
+                <w:lang w:eastAsia="en-AU"/>
+                <w14:ligatures w14:val="none"/>
+              </w:rPr>
+              <w:t>actual_n_</w:t>
+            </w:r>
+            <w:proofErr w:type="gramStart"/>
+            <w:r>
+              <w:rPr>
+                <w:rFonts w:ascii="Cambria" w:eastAsia="Times New Roman" w:hAnsi="Cambria" w:cs="Calibri"/>
+                <w:kern w:val="0"/>
+                <w:lang w:eastAsia="en-AU"/>
+                <w14:ligatures w14:val="none"/>
+              </w:rPr>
+              <w:t>used</w:t>
+            </w:r>
+            <w:proofErr w:type="spellEnd"/>
+            <w:r>
+              <w:rPr>
+                <w:rFonts w:ascii="Cambria" w:eastAsia="Times New Roman" w:hAnsi="Cambria" w:cs="Calibri"/>
+                <w:kern w:val="0"/>
+                <w:lang w:eastAsia="en-AU"/>
+                <w14:ligatures w14:val="none"/>
+              </w:rPr>
+              <w:t xml:space="preserve"> !</w:t>
+            </w:r>
+            <w:proofErr w:type="gramEnd"/>
+            <w:r>
+              <w:rPr>
+                <w:rFonts w:ascii="Cambria" w:eastAsia="Times New Roman" w:hAnsi="Cambria" w:cs="Calibri"/>
+                <w:kern w:val="0"/>
+                <w:lang w:eastAsia="en-AU"/>
+                <w14:ligatures w14:val="none"/>
+              </w:rPr>
+              <w:t xml:space="preserve">= </w:t>
+            </w:r>
+            <w:proofErr w:type="spellStart"/>
+            <w:r>
+              <w:rPr>
+                <w:rFonts w:ascii="Cambria" w:eastAsia="Times New Roman" w:hAnsi="Cambria" w:cs="Calibri"/>
+                <w:kern w:val="0"/>
+                <w:lang w:eastAsia="en-AU"/>
+                <w14:ligatures w14:val="none"/>
+              </w:rPr>
+              <w:t>expected_n_used</w:t>
+            </w:r>
+            <w:proofErr w:type="spellEnd"/>
+            <w:r>
+              <w:rPr>
+                <w:rFonts w:ascii="Cambria" w:eastAsia="Times New Roman" w:hAnsi="Cambria" w:cs="Calibri"/>
+                <w:kern w:val="0"/>
+                <w:lang w:eastAsia="en-AU"/>
+                <w14:ligatures w14:val="none"/>
+              </w:rPr>
+              <w:t>:</w:t>
             </w:r>
           </w:p>
         </w:tc>
         <w:tc>
           <w:tcPr>
-            <w:tcW w:w="0" w:type="auto"/>
-            <w:vAlign w:val="center"/>
-            <w:hideMark/>
+            <w:tcW w:w="4579" w:type="dxa"/>
           </w:tcPr>
           <w:p>
+            <w:pPr>
+              <w:rPr>
+                <w:rFonts w:ascii="Cambria" w:eastAsia="Times New Roman" w:hAnsi="Cambria" w:cs="Calibri"/>
+                <w:kern w:val="0"/>
+                <w:lang w:eastAsia="en-AU"/>
+                <w14:ligatures w14:val="none"/>
+              </w:rPr>
+            </w:pPr>
             <w:r>
               <w:rPr>
-                <w:i/>
-                <w:iCs/>
-              </w:rPr>
-              <w:t>Not solved</w:t>
+                <w:rFonts w:ascii="Cambria" w:eastAsia="Times New Roman" w:hAnsi="Cambria" w:cs="Calibri"/>
+                <w:kern w:val="0"/>
+                <w:lang w:eastAsia="en-AU"/>
+                <w14:ligatures w14:val="none"/>
+              </w:rPr>
+              <w:t xml:space="preserve">Data completeness </w:t>
             </w:r>
             <w:r>
-              <w:t xml:space="preserve"> by this design — stated honestly</w:t>
+              <w:rPr>
+                <w:rFonts w:ascii="Cambria" w:eastAsia="Times New Roman" w:hAnsi="Cambria" w:cs="Calibri"/>
+                <w:kern w:val="0"/>
+                <w:lang w:eastAsia="en-AU"/>
+                <w14:ligatures w14:val="none"/>
+              </w:rPr>
+              <w:t>accounting standard</w:t>
+            </w:r>
+            <w:r>
+              <w:rPr>
+                <w:rFonts w:ascii="Cambria" w:eastAsia="Times New Roman" w:hAnsi="Cambria" w:cs="Calibri"/>
+                <w:kern w:val="0"/>
+                <w:lang w:eastAsia="en-AU"/>
+                <w14:ligatures w14:val="none"/>
+              </w:rPr>
+              <w:t xml:space="preserve"> practice in any analysis involving exclusions</w:t>
             </w:r>
           </w:p>
         </w:tc>
         <w:tc>
           <w:tcPr>
-            <w:tcW w:w="0" w:type="auto"/>
-            <w:vAlign w:val="center"/>
-            <w:hideMark/>
+            <w:tcW w:w="1985" w:type="dxa"/>
           </w:tcPr>
           <w:p>
+            <w:pPr>
+              <w:rPr>
+                <w:rFonts w:ascii="Cambria" w:eastAsia="Times New Roman" w:hAnsi="Cambria" w:cs="Calibri"/>
+                <w:kern w:val="0"/>
+                <w:lang w:eastAsia="en-AU"/>
+                <w14:ligatures w14:val="none"/>
+              </w:rPr>
+            </w:pPr>
             <w:r>
-              <w:t>Worth telling your supervisor directly: this is a known, named limitation, not something papered over</w:t>
+              <w:rPr>
+                <w:rFonts w:ascii="Cambria" w:eastAsia="Times New Roman" w:hAnsi="Cambria" w:cs="Calibri"/>
+                <w:kern w:val="0"/>
+                <w:lang w:eastAsia="en-AU"/>
+                <w14:ligatures w14:val="none"/>
+              </w:rPr>
+              <w:t>A domain-general requirement wherever data can be legitimately excluded</w:t>
+            </w:r>
+          </w:p>
+        </w:tc>
+      </w:tr>
+      <w:tr>
+        <w:trPr>
+          <w:trHeight w:val="1061"/>
+        </w:trPr>
+        <w:tc>
+          <w:tcPr>
+            <w:tcW w:w="2689" w:type="dxa"/>
+          </w:tcPr>
+          <w:p>
+            <w:pPr>
+              <w:rPr>
+                <w:rFonts w:ascii="Times New Roman" w:eastAsia="Times New Roman" w:hAnsi="Times New Roman" w:cs="Times New Roman"/>
+                <w:b/>
+                <w:bCs/>
+                <w:kern w:val="0"/>
+                <w:lang w:eastAsia="en-AU"/>
+                <w14:ligatures w14:val="none"/>
+              </w:rPr>
+            </w:pPr>
+            <w:r>
+              <w:rPr>
+                <w:rFonts w:ascii="Times New Roman" w:eastAsia="Times New Roman" w:hAnsi="Times New Roman" w:cs="Times New Roman"/>
+                <w:b/>
+                <w:bCs/>
+                <w:kern w:val="0"/>
+                <w:lang w:eastAsia="en-AU"/>
+                <w14:ligatures w14:val="none"/>
+              </w:rPr>
+              <w:lastRenderedPageBreak/>
+              <w:t>Re-execution determinism-</w:t>
+            </w:r>
+          </w:p>
+          <w:p>
+            <w:pPr>
+              <w:rPr>
+                <w:rFonts w:ascii="Times New Roman" w:eastAsia="Times New Roman" w:hAnsi="Times New Roman" w:cs="Times New Roman"/>
+                <w:kern w:val="0"/>
+                <w:lang w:eastAsia="en-AU"/>
+                <w14:ligatures w14:val="none"/>
+              </w:rPr>
+            </w:pPr>
+            <w:r>
+              <w:rPr>
+                <w:rFonts w:ascii="Times New Roman" w:eastAsia="Times New Roman" w:hAnsi="Times New Roman" w:cs="Times New Roman"/>
+                <w:kern w:val="0"/>
+                <w:lang w:eastAsia="en-AU"/>
+                <w14:ligatures w14:val="none"/>
+              </w:rPr>
+              <w:t xml:space="preserve">the sandbox re-runs the </w:t>
+            </w:r>
+            <w:r>
+              <w:rPr>
+                <w:rFonts w:ascii="Times New Roman" w:eastAsia="Times New Roman" w:hAnsi="Times New Roman" w:cs="Times New Roman"/>
+                <w:i/>
+                <w:iCs/>
+                <w:kern w:val="0"/>
+                <w:lang w:eastAsia="en-AU"/>
+                <w14:ligatures w14:val="none"/>
+              </w:rPr>
+              <w:t>exact same code</w:t>
+            </w:r>
+            <w:r>
+              <w:rPr>
+                <w:rFonts w:ascii="Times New Roman" w:eastAsia="Times New Roman" w:hAnsi="Times New Roman" w:cs="Times New Roman"/>
+                <w:kern w:val="0"/>
+                <w:lang w:eastAsia="en-AU"/>
+                <w14:ligatures w14:val="none"/>
+              </w:rPr>
+              <w:t xml:space="preserve"> a second time (free, no new LLM call); the observed test statistic must match across both runs (the permutation-based p-value is allowed to vary, the statistic itself should not)</w:t>
+            </w:r>
+          </w:p>
+        </w:tc>
+        <w:tc>
+          <w:tcPr>
+            <w:tcW w:w="4579" w:type="dxa"/>
+          </w:tcPr>
+          <w:p>
+            <w:pPr>
+              <w:rPr>
+                <w:rFonts w:ascii="Times New Roman" w:eastAsia="Times New Roman" w:hAnsi="Times New Roman" w:cs="Times New Roman"/>
+                <w:kern w:val="0"/>
+                <w:lang w:eastAsia="en-AU"/>
+                <w14:ligatures w14:val="none"/>
+              </w:rPr>
+            </w:pPr>
+            <w:r>
+              <w:rPr>
+                <w:rFonts w:ascii="Times New Roman" w:eastAsia="Times New Roman" w:hAnsi="Times New Roman" w:cs="Times New Roman"/>
+                <w:kern w:val="0"/>
+                <w:lang w:eastAsia="en-AU"/>
+                <w14:ligatures w14:val="none"/>
+              </w:rPr>
+              <w:t>Reproducibility a</w:t>
+            </w:r>
+            <w:r>
+              <w:rPr>
+                <w:rFonts w:ascii="Times New Roman" w:eastAsia="Times New Roman" w:hAnsi="Times New Roman" w:cs="Times New Roman"/>
+                <w:kern w:val="0"/>
+                <w:lang w:eastAsia="en-AU"/>
+                <w14:ligatures w14:val="none"/>
+              </w:rPr>
+              <w:t xml:space="preserve"> cornerstone of scientific computing: same input, same </w:t>
+            </w:r>
+            <w:r>
+              <w:rPr>
+                <w:rFonts w:ascii="Times New Roman" w:eastAsia="Times New Roman" w:hAnsi="Times New Roman" w:cs="Times New Roman"/>
+                <w:kern w:val="0"/>
+                <w:lang w:eastAsia="en-AU"/>
+                <w14:ligatures w14:val="none"/>
+              </w:rPr>
+              <w:t>code same</w:t>
+            </w:r>
+            <w:r>
+              <w:rPr>
+                <w:rFonts w:ascii="Times New Roman" w:eastAsia="Times New Roman" w:hAnsi="Times New Roman" w:cs="Times New Roman"/>
+                <w:kern w:val="0"/>
+                <w:lang w:eastAsia="en-AU"/>
+                <w14:ligatures w14:val="none"/>
+              </w:rPr>
+              <w:t xml:space="preserve"> output</w:t>
+            </w:r>
+          </w:p>
+        </w:tc>
+        <w:tc>
+          <w:tcPr>
+            <w:tcW w:w="1985" w:type="dxa"/>
+          </w:tcPr>
+          <w:p>
+            <w:pPr>
+              <w:rPr>
+                <w:rFonts w:ascii="Times New Roman" w:eastAsia="Times New Roman" w:hAnsi="Times New Roman" w:cs="Times New Roman"/>
+                <w:kern w:val="0"/>
+                <w:lang w:eastAsia="en-AU"/>
+                <w14:ligatures w14:val="none"/>
+              </w:rPr>
+            </w:pPr>
+            <w:r>
+              <w:rPr>
+                <w:rFonts w:ascii="Times New Roman" w:eastAsia="Times New Roman" w:hAnsi="Times New Roman" w:cs="Times New Roman"/>
+                <w:kern w:val="0"/>
+                <w:lang w:eastAsia="en-AU"/>
+                <w14:ligatures w14:val="none"/>
+              </w:rPr>
+              <w:t>Universal property expected of any deterministic statistical computation, unrelated to spatial statistics specifically</w:t>
             </w:r>
           </w:p>
         </w:tc>
       </w:tr>
     </w:tbl>
+    <w:p>
+      <w:pPr>
+        <w:spacing w:after="0" w:line="240" w:lineRule="auto"/>
+        <w:rPr>
+          <w:rFonts w:ascii="Times New Roman" w:eastAsia="Times New Roman" w:hAnsi="Times New Roman" w:cs="Times New Roman"/>
+          <w:b/>
+          <w:bCs/>
+          <w:kern w:val="0"/>
+          <w:lang w:eastAsia="en-AU"/>
+          <w14:ligatures w14:val="none"/>
+        </w:rPr>
+      </w:pPr>
+    </w:p>
+    <w:p>
+      <w:r>
+        <w:tab/>
+      </w:r>
+    </w:p>
     <w:p/>
+    <w:p>
+      <w:pPr>
+        <w:jc w:val="center"/>
+      </w:pPr>
+      <w:r>
+        <w:rPr>
+          <w:noProof/>
+        </w:rPr>
+        <w:drawing>
+          <wp:inline distT="0" distB="0" distL="0" distR="0" wp14:anchorId="5BFFF81E" wp14:editId="1BAB1759">
+            <wp:extent cx="4695190" cy="5057140"/>
+            <wp:effectExtent l="0" t="0" r="0" b="0"/>
+            <wp:docPr id="947743728" name="Picture 1"/>
+            <wp:cNvGraphicFramePr>
+              <a:graphicFrameLocks xmlns:a="http://schemas.openxmlformats.org/drawingml/2006/main" noChangeAspect="1"/>
+            </wp:cNvGraphicFramePr>
+            <a:graphic xmlns:a="http://schemas.openxmlformats.org/drawingml/2006/main">
+              <a:graphicData uri="http://schemas.openxmlformats.org/drawingml/2006/picture">
+                <pic:pic xmlns:pic="http://schemas.openxmlformats.org/drawingml/2006/picture">
+                  <pic:nvPicPr>
+                    <pic:cNvPr id="947743728" name="Picture 947743728"/>
+                    <pic:cNvPicPr/>
+                  </pic:nvPicPr>
+                  <pic:blipFill>
+                    <a:blip r:embed="rId8" cstate="print">
+                      <a:extLst>
+                        <a:ext uri="{28A0092B-C50C-407E-A947-70E740481C1C}">
+                          <a14:useLocalDpi xmlns:a14="http://schemas.microsoft.com/office/drawing/2010/main" val="0"/>
+                        </a:ext>
+                      </a:extLst>
+                    </a:blip>
+                    <a:stretch>
+                      <a:fillRect/>
+                    </a:stretch>
+                  </pic:blipFill>
+                  <pic:spPr>
+                    <a:xfrm>
+                      <a:off x="0" y="0"/>
+                      <a:ext cx="4695190" cy="5057140"/>
+                    </a:xfrm>
+                    <a:prstGeom prst="rect">
+                      <a:avLst/>
+                    </a:prstGeom>
+                  </pic:spPr>
+                </pic:pic>
+              </a:graphicData>
+            </a:graphic>
+          </wp:inline>
+        </w:drawing>
+      </w:r>
+    </w:p>
+    <w:p>
+      <w:pPr>
+        <w:jc w:val="center"/>
+      </w:pPr>
+    </w:p>
+    <w:p>
+      <w:pPr>
+        <w:jc w:val="center"/>
+      </w:pPr>
+    </w:p>
+    <w:p>
+      <w:pPr>
+        <w:jc w:val="center"/>
+        <w:rPr>
+          <w:b/>
+          <w:bCs/>
+        </w:rPr>
+      </w:pPr>
+      <w:r>
+        <w:rPr>
+          <w:b/>
+          <w:bCs/>
+        </w:rPr>
+        <w:lastRenderedPageBreak/>
+        <w:t>User prompt</w:t>
+      </w:r>
+    </w:p>
+    <w:p>
+      <w:r>
+        <w:t xml:space="preserve">I've attached NO2 values for 33 London boroughs for the years 2021, 2022, and 2023, and a list showing which boroughs are geographic </w:t>
+      </w:r>
+      <w:proofErr w:type="spellStart"/>
+      <w:r>
+        <w:t>neighbors</w:t>
+      </w:r>
+      <w:proofErr w:type="spellEnd"/>
+      <w:r>
+        <w:t xml:space="preserve"> of each other.</w:t>
+      </w:r>
+    </w:p>
+    <w:p/>
+    <w:p>
+      <w:r>
+        <w:t xml:space="preserve">Question: Do boroughs that saw a large CHANGE in NO2 between 2021 and 2022 tend to be located near other boroughs that ALSO saw a </w:t>
+      </w:r>
+      <w:proofErr w:type="gramStart"/>
+      <w:r>
+        <w:t>similarly-sized</w:t>
+      </w:r>
+      <w:proofErr w:type="gramEnd"/>
+      <w:r>
+        <w:t xml:space="preserve"> change in the SAME direction (both increasing, or both decreasing), or does a borough's change show no relationship to its </w:t>
+      </w:r>
+      <w:proofErr w:type="spellStart"/>
+      <w:r>
+        <w:t>neighbors'</w:t>
+      </w:r>
+      <w:proofErr w:type="spellEnd"/>
+      <w:r>
+        <w:t xml:space="preserve"> changes? This tests whether the CHANGE itself clusters spatially, not just the raw level in any single year.</w:t>
+      </w:r>
+    </w:p>
+    <w:p/>
+    <w:p>
+      <w:r>
+        <w:t>(Note: the data includes a third year not needed for this question.)</w:t>
+      </w:r>
+    </w:p>
+    <w:p/>
+    <w:p>
+      <w:r>
+        <w:t>Explain your reasoning based on the data, including the actual computed statistic and its significance. You can use a statistical method such as Global Moran's I, or another appropriate method of your choosing, to support your conclusion.</w:t>
+      </w:r>
+    </w:p>
+    <w:p>
+      <w:pPr>
+        <w:tabs>
+          <w:tab w:val="left" w:pos="3804"/>
+        </w:tabs>
+      </w:pPr>
+      <w:r>
+        <w:tab/>
+      </w:r>
+    </w:p>
+    <w:p>
+      <w:r>
+        <w:t>Note: dedicated spatial-statistics packages (</w:t>
+      </w:r>
+      <w:proofErr w:type="spellStart"/>
+      <w:r>
+        <w:t>pysal</w:t>
+      </w:r>
+      <w:proofErr w:type="spellEnd"/>
+      <w:r>
+        <w:t xml:space="preserve">, </w:t>
+      </w:r>
+      <w:proofErr w:type="spellStart"/>
+      <w:r>
+        <w:t>esda</w:t>
+      </w:r>
+      <w:proofErr w:type="spellEnd"/>
+      <w:r>
+        <w:t xml:space="preserve">, </w:t>
+      </w:r>
+      <w:proofErr w:type="spellStart"/>
+      <w:r>
+        <w:t>libpysal</w:t>
+      </w:r>
+      <w:proofErr w:type="spellEnd"/>
+      <w:r>
+        <w:t xml:space="preserve">, </w:t>
+      </w:r>
+      <w:proofErr w:type="spellStart"/>
+      <w:r>
+        <w:t>geopandas</w:t>
+      </w:r>
+      <w:proofErr w:type="spellEnd"/>
+      <w:r>
+        <w:t xml:space="preserve">, or similar) are NOT installed in this environment -- don't spend turns trying different import paths for them. Implement your chosen method directly using only pandas and </w:t>
+      </w:r>
+      <w:proofErr w:type="spellStart"/>
+      <w:r>
+        <w:t>numpy</w:t>
+      </w:r>
+      <w:proofErr w:type="spellEnd"/>
+      <w:r>
+        <w:t>. If you test statistical significance via a permutation/randomization test, use at least 500 random shuffles -- fewer permutations can produce an unstable p-value that lands on the wrong side of the 0.05 threshold just by chance, especially when the true effect is only moderate.</w:t>
+      </w:r>
+    </w:p>
+    <w:p/>
+    <w:p>
+      <w:r>
+        <w:t>End your response with exactly one line, including the computed number(s) you used:</w:t>
+      </w:r>
+    </w:p>
+    <w:p>
+      <w:r>
+        <w:t>FINAL ANSWER: CLUSTERED (test statistic = &lt;value&gt;, p = &lt;value&gt;)</w:t>
+      </w:r>
+    </w:p>
+    <w:p>
+      <w:r>
+        <w:t>or</w:t>
+      </w:r>
+    </w:p>
+    <w:p>
+      <w:r>
+        <w:t>FINAL ANSWER: NOT CLUSTERED (test statistic = &lt;value&gt;, p = &lt;value&gt;)</w:t>
+      </w:r>
+    </w:p>
+    <w:p>
+      <w:r>
+        <w:t>(test statistic is just an example label -- if your method produces a different statistic, use its name instead, but the value after '=' must be a real number)</w:t>
+      </w:r>
+    </w:p>
+    <w:p>
+      <w:pPr>
+        <w:jc w:val="center"/>
+      </w:pPr>
+    </w:p>
+    <w:p>
+      <w:pPr>
+        <w:jc w:val="center"/>
+      </w:pPr>
+    </w:p>
+    <w:p>
+      <w:pPr>
+        <w:jc w:val="center"/>
+      </w:pPr>
+    </w:p>
+    <w:p>
+      <w:pPr>
+        <w:jc w:val="center"/>
+      </w:pPr>
+    </w:p>
+    <w:p>
+      <w:pPr>
+        <w:jc w:val="center"/>
+        <w:rPr>
+          <w:b/>
+          <w:bCs/>
+        </w:rPr>
+      </w:pPr>
+      <w:r>
+        <w:rPr>
+          <w:b/>
+          <w:bCs/>
+        </w:rPr>
+        <w:t>System prompt</w:t>
+      </w:r>
+    </w:p>
+    <w:p/>
+    <w:p>
+      <w:pPr>
+        <w:rPr>
+          <w:b/>
+          <w:bCs/>
+        </w:rPr>
+      </w:pPr>
+      <w:r>
+        <w:rPr>
+          <w:b/>
+          <w:bCs/>
+        </w:rPr>
+        <w:t xml:space="preserve">Single Agent </w:t>
+      </w:r>
+    </w:p>
+    <w:p>
+      <w:r>
+        <w:t>SYSTEM_PROMPT = """You are a single AI agent responsible for the entire analysis pipeline:</w:t>
+      </w:r>
+    </w:p>
+    <w:p>
+      <w:r>
+        <w:t>profiling the dataset, planning the analysis, writing and running code, and reporting results.</w:t>
+      </w:r>
+    </w:p>
+    <w:p>
+      <w:r>
+        <w:t xml:space="preserve">You must ground every claim in code output -- never guess numbers. Always </w:t>
+      </w:r>
+      <w:proofErr w:type="gramStart"/>
+      <w:r>
+        <w:t>print(</w:t>
+      </w:r>
+      <w:proofErr w:type="gramEnd"/>
+      <w:r>
+        <w:t>) the numbers</w:t>
+      </w:r>
+    </w:p>
+    <w:p>
+      <w:r>
+        <w:t>you compute so they appear in the tool output."""</w:t>
+      </w:r>
+    </w:p>
+    <w:p/>
+    <w:p/>
+    <w:p>
+      <w:pPr>
+        <w:rPr>
+          <w:b/>
+          <w:bCs/>
+        </w:rPr>
+      </w:pPr>
+      <w:r>
+        <w:rPr>
+          <w:b/>
+          <w:bCs/>
+        </w:rPr>
+        <w:t>Multi agent</w:t>
+      </w:r>
+    </w:p>
+    <w:p>
+      <w:pPr>
+        <w:rPr>
+          <w:b/>
+          <w:bCs/>
+        </w:rPr>
+      </w:pPr>
+      <w:r>
+        <w:rPr>
+          <w:b/>
+          <w:bCs/>
+        </w:rPr>
+        <w:t>profiler</w:t>
+      </w:r>
+    </w:p>
+    <w:p>
+      <w:r>
+        <w:t>   prompt = (</w:t>
+      </w:r>
+    </w:p>
+    <w:p>
+      <w:r>
+        <w:t>        "You are the Profiler. Explore this dataset with real, executed "</w:t>
+      </w:r>
+    </w:p>
+    <w:p>
+      <w:r>
+        <w:t>        "</w:t>
+      </w:r>
+      <w:proofErr w:type="gramStart"/>
+      <w:r>
+        <w:t>pandas</w:t>
+      </w:r>
+      <w:proofErr w:type="gramEnd"/>
+      <w:r>
+        <w:t xml:space="preserve"> code -- do not guess or describe from the preview alone. "</w:t>
+      </w:r>
+    </w:p>
+    <w:p>
+      <w:r>
+        <w:t>        "For every numeric column, print the exact count of missing "</w:t>
+      </w:r>
+    </w:p>
+    <w:p>
+      <w:r>
+        <w:t>        "(</w:t>
+      </w:r>
+      <w:proofErr w:type="spellStart"/>
+      <w:r>
+        <w:t>NaN</w:t>
+      </w:r>
+      <w:proofErr w:type="spellEnd"/>
+      <w:r>
+        <w:t xml:space="preserve">) values. Print the total row count. Do not </w:t>
+      </w:r>
+      <w:proofErr w:type="spellStart"/>
+      <w:r>
+        <w:t>analyze</w:t>
+      </w:r>
+      <w:proofErr w:type="spellEnd"/>
+      <w:r>
+        <w:t xml:space="preserve"> or "</w:t>
+      </w:r>
+    </w:p>
+    <w:p>
+      <w:r>
+        <w:t>        "</w:t>
+      </w:r>
+      <w:proofErr w:type="gramStart"/>
+      <w:r>
+        <w:t>answer</w:t>
+      </w:r>
+      <w:proofErr w:type="gramEnd"/>
+      <w:r>
+        <w:t xml:space="preserve"> any question -- only report facts about the data itself."</w:t>
+      </w:r>
+    </w:p>
+    <w:p>
+      <w:r>
+        <w:t>        f"\n\</w:t>
+      </w:r>
+      <w:proofErr w:type="spellStart"/>
+      <w:r>
+        <w:t>nDataset</w:t>
+      </w:r>
+      <w:proofErr w:type="spellEnd"/>
+      <w:r>
+        <w:t xml:space="preserve"> path: {</w:t>
+      </w:r>
+      <w:proofErr w:type="spellStart"/>
+      <w:r>
+        <w:t>dataset_</w:t>
+      </w:r>
+      <w:proofErr w:type="gramStart"/>
+      <w:r>
+        <w:t>path</w:t>
+      </w:r>
+      <w:proofErr w:type="spellEnd"/>
+      <w:r>
+        <w:t>}\</w:t>
+      </w:r>
+      <w:proofErr w:type="gramEnd"/>
+      <w:r>
+        <w:t>n"</w:t>
+      </w:r>
+    </w:p>
+    <w:p>
+      <w:r>
+        <w:t>        "Write ONE ```python``` block that loads the data and prints "</w:t>
+      </w:r>
+    </w:p>
+    <w:p>
+      <w:r>
+        <w:t>        "</w:t>
+      </w:r>
+      <w:proofErr w:type="gramStart"/>
+      <w:r>
+        <w:t>these</w:t>
+      </w:r>
+      <w:proofErr w:type="gramEnd"/>
+      <w:r>
+        <w:t xml:space="preserve"> facts. Re-import pandas/</w:t>
+      </w:r>
+      <w:proofErr w:type="spellStart"/>
+      <w:r>
+        <w:t>numpy</w:t>
+      </w:r>
+      <w:proofErr w:type="spellEnd"/>
+      <w:r>
+        <w:t>; this runs in a fresh "</w:t>
+      </w:r>
+    </w:p>
+    <w:p>
+      <w:r>
+        <w:t>        "</w:t>
+      </w:r>
+      <w:proofErr w:type="gramStart"/>
+      <w:r>
+        <w:t>process</w:t>
+      </w:r>
+      <w:proofErr w:type="gramEnd"/>
+      <w:r>
+        <w:t>.\n" + preview</w:t>
+      </w:r>
+    </w:p>
+    <w:p>
+      <w:r>
+        <w:t>    )</w:t>
+      </w:r>
+    </w:p>
+    <w:p/>
+    <w:p/>
+    <w:p>
+      <w:pPr>
+        <w:rPr>
+          <w:b/>
+          <w:bCs/>
+        </w:rPr>
+      </w:pPr>
+      <w:r>
+        <w:rPr>
+          <w:b/>
+          <w:bCs/>
+        </w:rPr>
+        <w:lastRenderedPageBreak/>
+        <w:t>Planner:</w:t>
+      </w:r>
+    </w:p>
+    <w:p>
+      <w:r>
+        <w:t> prompt = (</w:t>
+      </w:r>
+    </w:p>
+    <w:p>
+      <w:r>
+        <w:t>        "You are the Planner. Write a short, numbered plan (steps only, "</w:t>
+      </w:r>
+    </w:p>
+    <w:p>
+      <w:r>
+        <w:t>        "</w:t>
+      </w:r>
+      <w:proofErr w:type="gramStart"/>
+      <w:r>
+        <w:t>no</w:t>
+      </w:r>
+      <w:proofErr w:type="gramEnd"/>
+      <w:r>
+        <w:t xml:space="preserve"> code) for answering this question, using the real data facts "</w:t>
+      </w:r>
+    </w:p>
+    <w:p>
+      <w:r>
+        <w:t>        "</w:t>
+      </w:r>
+      <w:proofErr w:type="gramStart"/>
+      <w:r>
+        <w:t>below</w:t>
+      </w:r>
+      <w:proofErr w:type="gramEnd"/>
+      <w:r>
+        <w:t>. Your plan should explicitly state how missing values "</w:t>
+      </w:r>
+    </w:p>
+    <w:p>
+      <w:r>
+        <w:t>        "</w:t>
+      </w:r>
+      <w:proofErr w:type="gramStart"/>
+      <w:r>
+        <w:t>will</w:t>
+      </w:r>
+      <w:proofErr w:type="gramEnd"/>
+      <w:r>
+        <w:t xml:space="preserve"> be handled if any </w:t>
+      </w:r>
+      <w:proofErr w:type="gramStart"/>
+      <w:r>
+        <w:t>exist.\n\n</w:t>
+      </w:r>
+      <w:proofErr w:type="gramEnd"/>
+      <w:r>
+        <w:t>"</w:t>
+      </w:r>
+    </w:p>
+    <w:p>
+      <w:r>
+        <w:t xml:space="preserve">        </w:t>
+      </w:r>
+      <w:proofErr w:type="spellStart"/>
+      <w:r>
+        <w:t>f"Question</w:t>
+      </w:r>
+      <w:proofErr w:type="spellEnd"/>
+      <w:r>
+        <w:t>: {question}\n\</w:t>
+      </w:r>
+      <w:proofErr w:type="spellStart"/>
+      <w:r>
+        <w:t>nData</w:t>
+      </w:r>
+      <w:proofErr w:type="spellEnd"/>
+      <w:r>
+        <w:t xml:space="preserve"> profile:\n{</w:t>
+      </w:r>
+      <w:proofErr w:type="spellStart"/>
+      <w:r>
+        <w:t>profile_text</w:t>
+      </w:r>
+      <w:proofErr w:type="spellEnd"/>
+      <w:r>
+        <w:t>}"</w:t>
+      </w:r>
+    </w:p>
+    <w:p>
+      <w:r>
+        <w:t>        f"{</w:t>
+      </w:r>
+      <w:proofErr w:type="spellStart"/>
+      <w:r>
+        <w:t>retry_block</w:t>
+      </w:r>
+      <w:proofErr w:type="spellEnd"/>
+      <w:r>
+        <w:t>}"</w:t>
+      </w:r>
+    </w:p>
+    <w:p>
+      <w:r>
+        <w:t>    )</w:t>
+      </w:r>
+    </w:p>
+    <w:p/>
+    <w:p>
+      <w:pPr>
+        <w:rPr>
+          <w:b/>
+          <w:bCs/>
+        </w:rPr>
+      </w:pPr>
+      <w:r>
+        <w:rPr>
+          <w:b/>
+          <w:bCs/>
+        </w:rPr>
+        <w:t>Coder:</w:t>
+      </w:r>
+    </w:p>
+    <w:p/>
+    <w:p>
+      <w:r>
+        <w:t>   prompt = (</w:t>
+      </w:r>
+    </w:p>
+    <w:p>
+      <w:r>
+        <w:t>        "You are the Coder. Implement this plan with real, executed "</w:t>
+      </w:r>
+    </w:p>
+    <w:p>
+      <w:r>
+        <w:t>        "pandas/</w:t>
+      </w:r>
+      <w:proofErr w:type="spellStart"/>
+      <w:r>
+        <w:t>numpy</w:t>
+      </w:r>
+      <w:proofErr w:type="spellEnd"/>
+      <w:r>
+        <w:t xml:space="preserve"> code. Your code must print:\n"</w:t>
+      </w:r>
+    </w:p>
+    <w:p>
+      <w:r>
+        <w:t>        "1. `</w:t>
+      </w:r>
+      <w:proofErr w:type="spellStart"/>
+      <w:r>
+        <w:t>n_used</w:t>
+      </w:r>
+      <w:proofErr w:type="spellEnd"/>
+      <w:r>
+        <w:t xml:space="preserve"> = &lt;integer&gt;` -- the exact number of data points used "</w:t>
+      </w:r>
+    </w:p>
+    <w:p>
+      <w:r>
+        <w:t>        "</w:t>
+      </w:r>
+      <w:proofErr w:type="gramStart"/>
+      <w:r>
+        <w:t>in</w:t>
+      </w:r>
+      <w:proofErr w:type="gramEnd"/>
+      <w:r>
+        <w:t xml:space="preserve"> your FINAL calculation (after excluding any missing </w:t>
+      </w:r>
+      <w:proofErr w:type="gramStart"/>
+      <w:r>
+        <w:t>values)\</w:t>
+      </w:r>
+      <w:proofErr w:type="gramEnd"/>
+      <w:r>
+        <w:t>n"</w:t>
+      </w:r>
+    </w:p>
+    <w:p>
+      <w:r>
+        <w:t>        "2. `FINAL ANSWER: &lt;verdict&gt; (test statistic = &lt;value&gt;, p = &lt;value</w:t>
+      </w:r>
+      <w:proofErr w:type="gramStart"/>
+      <w:r>
+        <w:t>&gt;)`</w:t>
+      </w:r>
+      <w:proofErr w:type="gramEnd"/>
+      <w:r>
+        <w:t xml:space="preserve"> "</w:t>
+      </w:r>
+    </w:p>
+    <w:p>
+      <w:r>
+        <w:t>        "-- using an f-string that references your actual computed "</w:t>
+      </w:r>
+    </w:p>
+    <w:p>
+      <w:r>
+        <w:t>        "</w:t>
+      </w:r>
+      <w:proofErr w:type="gramStart"/>
+      <w:r>
+        <w:t>variables</w:t>
+      </w:r>
+      <w:proofErr w:type="gramEnd"/>
+      <w:r>
+        <w:t>, never a hand-typed number\n\n"</w:t>
+      </w:r>
+    </w:p>
+    <w:p>
+      <w:r>
+        <w:t xml:space="preserve">        </w:t>
+      </w:r>
+      <w:proofErr w:type="spellStart"/>
+      <w:r>
+        <w:t>f"Question</w:t>
+      </w:r>
+      <w:proofErr w:type="spellEnd"/>
+      <w:r>
+        <w:t>: {question}\n\</w:t>
+      </w:r>
+      <w:proofErr w:type="spellStart"/>
+      <w:r>
+        <w:t>nData</w:t>
+      </w:r>
+      <w:proofErr w:type="spellEnd"/>
+      <w:r>
+        <w:t xml:space="preserve"> profile:\n{</w:t>
+      </w:r>
+      <w:proofErr w:type="spellStart"/>
+      <w:r>
+        <w:t>profile_</w:t>
+      </w:r>
+      <w:proofErr w:type="gramStart"/>
+      <w:r>
+        <w:t>text</w:t>
+      </w:r>
+      <w:proofErr w:type="spellEnd"/>
+      <w:r>
+        <w:t>}\n\</w:t>
+      </w:r>
+      <w:proofErr w:type="spellStart"/>
+      <w:r>
+        <w:t>nPlan</w:t>
+      </w:r>
+      <w:proofErr w:type="spellEnd"/>
+      <w:proofErr w:type="gramEnd"/>
+      <w:r>
+        <w:t>:\n{plan}"</w:t>
+      </w:r>
+    </w:p>
+    <w:p>
+      <w:r>
+        <w:t>        f"{</w:t>
+      </w:r>
+      <w:proofErr w:type="spellStart"/>
+      <w:r>
+        <w:t>retry_</w:t>
+      </w:r>
+      <w:proofErr w:type="gramStart"/>
+      <w:r>
+        <w:t>block</w:t>
+      </w:r>
+      <w:proofErr w:type="spellEnd"/>
+      <w:r>
+        <w:t>}\</w:t>
+      </w:r>
+      <w:proofErr w:type="gramEnd"/>
+      <w:r>
+        <w:t>n"</w:t>
+      </w:r>
+    </w:p>
+    <w:p>
+      <w:r>
+        <w:t>        "Write ONE ```python``` block. This runs in a fresh process; "</w:t>
+      </w:r>
+    </w:p>
+    <w:p>
+      <w:r>
+        <w:t>        "re-import pandas/</w:t>
+      </w:r>
+      <w:proofErr w:type="spellStart"/>
+      <w:r>
+        <w:t>numpy</w:t>
+      </w:r>
+      <w:proofErr w:type="spellEnd"/>
+      <w:r>
+        <w:t xml:space="preserve"> and reload the data.\n" + preview</w:t>
+      </w:r>
+    </w:p>
+    <w:p>
+      <w:r>
+        <w:t>    )</w:t>
+      </w:r>
+    </w:p>
+    <w:p/>
+    <w:p/>
+    <w:p>
+      <w:r>
+        <w:lastRenderedPageBreak/>
+        <w:t>Get-Content "runs\20260827T135045Z</w:t>
+      </w:r>
+      <w:r>
+        <w:t xml:space="preserve"> </w:t>
+      </w:r>
+      <w:r>
+        <w:t>_bivariate_multiagent_qwen-qwen3-32b_bivariate_2021_gas_waste\attempts_log.json"</w:t>
+      </w:r>
+    </w:p>
+    <w:p/>
+    <w:p>
+      <w:r>
+        <w:t>\runs\20260827T135045Z_bivariate_multiagent_qwen-qwen3-32b_bivariate_2021_gas_waste</w:t>
+      </w:r>
+    </w:p>
+    <w:p/>
+    <w:p/>
+    <w:p>
+      <w:pPr>
+        <w:jc w:val="center"/>
+      </w:pPr>
+    </w:p>
     <w:sectPr>
       <w:pgSz w:w="11906" w:h="16838"/>
       <w:pgMar w:top="1440" w:right="1440" w:bottom="1440" w:left="1440" w:header="708" w:footer="708" w:gutter="0"/>
@@ -765,7 +2480,7 @@
 </file>
 
 <file path=word/endnotes.xml><?xml version="1.0" encoding="utf-8"?>
-<w:endnotes xmlns:wpc="http://schemas.microsoft.com/office/word/2010/wordprocessingCanvas" xmlns:cx="http://schemas.microsoft.com/office/drawing/2014/chartex" xmlns:cx1="http://schemas.microsoft.com/office/drawing/2015/9/8/chartex" xmlns:cx2="http://schemas.microsoft.com/office/drawing/2015/10/21/chartex" xmlns:cx3="http://schemas.microsoft.com/office/drawing/2016/5/9/chartex" xmlns:cx4="http://schemas.microsoft.com/office/drawing/2016/5/10/chartex" xmlns:cx5="http://schemas.microsoft.com/office/drawing/2016/5/11/chartex" xmlns:cx6="http://schemas.microsoft.com/office/drawing/2016/5/12/chartex" xmlns:cx7="http://schemas.microsoft.com/office/drawing/2016/5/13/chartex" xmlns:cx8="http://schemas.microsoft.com/office/drawing/2016/5/14/chartex" xmlns:mc="http://schemas.openxmlformats.org/markup-compatibility/2006" xmlns:aink="http://schemas.microsoft.com/office/drawing/2016/ink" xmlns:am3d="http://schemas.microsoft.com/office/drawing/2017/model3d" xmlns:o="urn:schemas-microsoft-com:office:office" xmlns:oel="http://schemas.microsoft.com/office/2019/extlst" xmlns:r="http://schemas.openxmlformats.org/officeDocument/2006/relationships" xmlns:m="http://schemas.openxmlformats.org/officeDocument/2006/math" xmlns:v="urn:schemas-microsoft-com:vml" xmlns:wp14="http://schemas.microsoft.com/office/word/2010/wordprocessingDrawing" xmlns:wp="http://schemas.openxmlformats.org/drawingml/2006/wordprocessingDrawing" xmlns:w10="urn:schemas-microsoft-com:office:word" xmlns:w="http://schemas.openxmlformats.org/wordprocessingml/2006/main" xmlns:w14="http://schemas.microsoft.com/office/word/2010/wordml" xmlns:w15="http://schemas.microsoft.com/office/word/2012/wordml" xmlns:w16cei="http://schemas.microsoft.com/office/word/2026/wordml/cei" xmlns:w16cex="http://schemas.microsoft.com/office/word/2018/wordml/cex" xmlns:w16cid="http://schemas.microsoft.com/office/word/2016/wordml/cid" xmlns:w16="http://schemas.microsoft.com/office/word/2018/wordml" xmlns:w16du="http://schemas.microsoft.com/office/word/2023/wordml/word16du" xmlns:w16sdtdh="http://schemas.microsoft.com/office/word/2020/wordml/sdtdatahash" xmlns:w16sdtfl="http://schemas.microsoft.com/office/word/2024/wordml/sdtformatlock" xmlns:w16se="http://schemas.microsoft.com/office/word/2015/wordml/symex" xmlns:wpg="http://schemas.microsoft.com/office/word/2010/wordprocessingGroup" xmlns:wpi="http://schemas.microsoft.com/office/word/2010/wordprocessingInk" xmlns:wne="http://schemas.microsoft.com/office/word/2006/wordml" xmlns:wps="http://schemas.microsoft.com/office/word/2010/wordprocessingShape" mc:Ignorable="w14 w15 w16se w16cid w16 w16cex w16sdtdh w16sdtfl w16du wp14">
+<w:endnotes xmlns:wpc="http://schemas.microsoft.com/office/word/2010/wordprocessingCanvas" xmlns:cx="http://schemas.microsoft.com/office/drawing/2014/chartex" xmlns:cx1="http://schemas.microsoft.com/office/drawing/2015/9/8/chartex" xmlns:cx2="http://schemas.microsoft.com/office/drawing/2015/10/21/chartex" xmlns:cx3="http://schemas.microsoft.com/office/drawing/2016/5/9/chartex" xmlns:cx4="http://schemas.microsoft.com/office/drawing/2016/5/10/chartex" xmlns:cx5="http://schemas.microsoft.com/office/drawing/2016/5/11/chartex" xmlns:cx6="http://schemas.microsoft.com/office/drawing/2016/5/12/chartex" xmlns:cx7="http://schemas.microsoft.com/office/drawing/2016/5/13/chartex" xmlns:cx8="http://schemas.microsoft.com/office/drawing/2016/5/14/chartex" xmlns:mc="http://schemas.openxmlformats.org/markup-compatibility/2006" xmlns:aink="http://schemas.microsoft.com/office/drawing/2016/ink" xmlns:am3d="http://schemas.microsoft.com/office/drawing/2017/model3d" xmlns:o="urn:schemas-microsoft-com:office:office" xmlns:oel="http://schemas.microsoft.com/office/2019/extlst" xmlns:r="http://schemas.openxmlformats.org/officeDocument/2006/relationships" xmlns:m="http://schemas.openxmlformats.org/officeDocument/2006/math" xmlns:v="urn:schemas-microsoft-com:vml" xmlns:wp14="http://schemas.microsoft.com/office/word/2010/wordprocessingDrawing" xmlns:wp="http://schemas.openxmlformats.org/drawingml/2006/wordprocessingDrawing" xmlns:w10="urn:schemas-microsoft-com:office:word" xmlns:w="http://schemas.openxmlformats.org/wordprocessingml/2006/main" xmlns:w14="http://schemas.microsoft.com/office/word/2010/wordml" xmlns:w15="http://schemas.microsoft.com/office/word/2012/wordml" xmlns:w16cex="http://schemas.microsoft.com/office/word/2018/wordml/cex" xmlns:w16cid="http://schemas.microsoft.com/office/word/2016/wordml/cid" xmlns:w16="http://schemas.microsoft.com/office/word/2018/wordml" xmlns:w16du="http://schemas.microsoft.com/office/word/2023/wordml/word16du" xmlns:w16sdtdh="http://schemas.microsoft.com/office/word/2020/wordml/sdtdatahash" xmlns:w16sdtfl="http://schemas.microsoft.com/office/word/2024/wordml/sdtformatlock" xmlns:w16se="http://schemas.microsoft.com/office/word/2015/wordml/symex" xmlns:wpg="http://schemas.microsoft.com/office/word/2010/wordprocessingGroup" xmlns:wpi="http://schemas.microsoft.com/office/word/2010/wordprocessingInk" xmlns:wne="http://schemas.microsoft.com/office/word/2006/wordml" xmlns:wps="http://schemas.microsoft.com/office/word/2010/wordprocessingShape" mc:Ignorable="w14 w15 w16se w16cid w16 w16cex w16sdtdh w16sdtfl w16du wp14">
   <w:endnote w:type="separator" w:id="-1">
     <w:p>
       <w:pPr>
@@ -790,7 +2505,7 @@
 </file>
 
 <file path=word/footnotes.xml><?xml version="1.0" encoding="utf-8"?>
-<w:footnotes xmlns:wpc="http://schemas.microsoft.com/office/word/2010/wordprocessingCanvas" xmlns:cx="http://schemas.microsoft.com/office/drawing/2014/chartex" xmlns:cx1="http://schemas.microsoft.com/office/drawing/2015/9/8/chartex" xmlns:cx2="http://schemas.microsoft.com/office/drawing/2015/10/21/chartex" xmlns:cx3="http://schemas.microsoft.com/office/drawing/2016/5/9/chartex" xmlns:cx4="http://schemas.microsoft.com/office/drawing/2016/5/10/chartex" xmlns:cx5="http://schemas.microsoft.com/office/drawing/2016/5/11/chartex" xmlns:cx6="http://schemas.microsoft.com/office/drawing/2016/5/12/chartex" xmlns:cx7="http://schemas.microsoft.com/office/drawing/2016/5/13/chartex" xmlns:cx8="http://schemas.microsoft.com/office/drawing/2016/5/14/chartex" xmlns:mc="http://schemas.openxmlformats.org/markup-compatibility/2006" xmlns:aink="http://schemas.microsoft.com/office/drawing/2016/ink" xmlns:am3d="http://schemas.microsoft.com/office/drawing/2017/model3d" xmlns:o="urn:schemas-microsoft-com:office:office" xmlns:oel="http://schemas.microsoft.com/office/2019/extlst" xmlns:r="http://schemas.openxmlformats.org/officeDocument/2006/relationships" xmlns:m="http://schemas.openxmlformats.org/officeDocument/2006/math" xmlns:v="urn:schemas-microsoft-com:vml" xmlns:wp14="http://schemas.microsoft.com/office/word/2010/wordprocessingDrawing" xmlns:wp="http://schemas.openxmlformats.org/drawingml/2006/wordprocessingDrawing" xmlns:w10="urn:schemas-microsoft-com:office:word" xmlns:w="http://schemas.openxmlformats.org/wordprocessingml/2006/main" xmlns:w14="http://schemas.microsoft.com/office/word/2010/wordml" xmlns:w15="http://schemas.microsoft.com/office/word/2012/wordml" xmlns:w16cei="http://schemas.microsoft.com/office/word/2026/wordml/cei" xmlns:w16cex="http://schemas.microsoft.com/office/word/2018/wordml/cex" xmlns:w16cid="http://schemas.microsoft.com/office/word/2016/wordml/cid" xmlns:w16="http://schemas.microsoft.com/office/word/2018/wordml" xmlns:w16du="http://schemas.microsoft.com/office/word/2023/wordml/word16du" xmlns:w16sdtdh="http://schemas.microsoft.com/office/word/2020/wordml/sdtdatahash" xmlns:w16sdtfl="http://schemas.microsoft.com/office/word/2024/wordml/sdtformatlock" xmlns:w16se="http://schemas.microsoft.com/office/word/2015/wordml/symex" xmlns:wpg="http://schemas.microsoft.com/office/word/2010/wordprocessingGroup" xmlns:wpi="http://schemas.microsoft.com/office/word/2010/wordprocessingInk" xmlns:wne="http://schemas.microsoft.com/office/word/2006/wordml" xmlns:wps="http://schemas.microsoft.com/office/word/2010/wordprocessingShape" mc:Ignorable="w14 w15 w16se w16cid w16 w16cex w16sdtdh w16sdtfl w16du wp14">
+<w:footnotes xmlns:wpc="http://schemas.microsoft.com/office/word/2010/wordprocessingCanvas" xmlns:cx="http://schemas.microsoft.com/office/drawing/2014/chartex" xmlns:cx1="http://schemas.microsoft.com/office/drawing/2015/9/8/chartex" xmlns:cx2="http://schemas.microsoft.com/office/drawing/2015/10/21/chartex" xmlns:cx3="http://schemas.microsoft.com/office/drawing/2016/5/9/chartex" xmlns:cx4="http://schemas.microsoft.com/office/drawing/2016/5/10/chartex" xmlns:cx5="http://schemas.microsoft.com/office/drawing/2016/5/11/chartex" xmlns:cx6="http://schemas.microsoft.com/office/drawing/2016/5/12/chartex" xmlns:cx7="http://schemas.microsoft.com/office/drawing/2016/5/13/chartex" xmlns:cx8="http://schemas.microsoft.com/office/drawing/2016/5/14/chartex" xmlns:mc="http://schemas.openxmlformats.org/markup-compatibility/2006" xmlns:aink="http://schemas.microsoft.com/office/drawing/2016/ink" xmlns:am3d="http://schemas.microsoft.com/office/drawing/2017/model3d" xmlns:o="urn:schemas-microsoft-com:office:office" xmlns:oel="http://schemas.microsoft.com/office/2019/extlst" xmlns:r="http://schemas.openxmlformats.org/officeDocument/2006/relationships" xmlns:m="http://schemas.openxmlformats.org/officeDocument/2006/math" xmlns:v="urn:schemas-microsoft-com:vml" xmlns:wp14="http://schemas.microsoft.com/office/word/2010/wordprocessingDrawing" xmlns:wp="http://schemas.openxmlformats.org/drawingml/2006/wordprocessingDrawing" xmlns:w10="urn:schemas-microsoft-com:office:word" xmlns:w="http://schemas.openxmlformats.org/wordprocessingml/2006/main" xmlns:w14="http://schemas.microsoft.com/office/word/2010/wordml" xmlns:w15="http://schemas.microsoft.com/office/word/2012/wordml" xmlns:w16cex="http://schemas.microsoft.com/office/word/2018/wordml/cex" xmlns:w16cid="http://schemas.microsoft.com/office/word/2016/wordml/cid" xmlns:w16="http://schemas.microsoft.com/office/word/2018/wordml" xmlns:w16du="http://schemas.microsoft.com/office/word/2023/wordml/word16du" xmlns:w16sdtdh="http://schemas.microsoft.com/office/word/2020/wordml/sdtdatahash" xmlns:w16sdtfl="http://schemas.microsoft.com/office/word/2024/wordml/sdtformatlock" xmlns:w16se="http://schemas.microsoft.com/office/word/2015/wordml/symex" xmlns:wpg="http://schemas.microsoft.com/office/word/2010/wordprocessingGroup" xmlns:wpi="http://schemas.microsoft.com/office/word/2010/wordprocessingInk" xmlns:wne="http://schemas.microsoft.com/office/word/2006/wordml" xmlns:wps="http://schemas.microsoft.com/office/word/2010/wordprocessingShape" mc:Ignorable="w14 w15 w16se w16cid w16 w16cex w16sdtdh w16sdtfl w16du wp14">
   <w:footnote w:type="separator" w:id="-1">
     <w:p>
       <w:pPr>
@@ -815,7 +2530,7 @@
 </file>
 
 <file path=word/numbering.xml><?xml version="1.0" encoding="utf-8"?>
-<w:numbering xmlns:wpc="http://schemas.microsoft.com/office/word/2010/wordprocessingCanvas" xmlns:cx="http://schemas.microsoft.com/office/drawing/2014/chartex" xmlns:cx1="http://schemas.microsoft.com/office/drawing/2015/9/8/chartex" xmlns:cx2="http://schemas.microsoft.com/office/drawing/2015/10/21/chartex" xmlns:cx3="http://schemas.microsoft.com/office/drawing/2016/5/9/chartex" xmlns:cx4="http://schemas.microsoft.com/office/drawing/2016/5/10/chartex" xmlns:cx5="http://schemas.microsoft.com/office/drawing/2016/5/11/chartex" xmlns:cx6="http://schemas.microsoft.com/office/drawing/2016/5/12/chartex" xmlns:cx7="http://schemas.microsoft.com/office/drawing/2016/5/13/chartex" xmlns:cx8="http://schemas.microsoft.com/office/drawing/2016/5/14/chartex" xmlns:mc="http://schemas.openxmlformats.org/markup-compatibility/2006" xmlns:aink="http://schemas.microsoft.com/office/drawing/2016/ink" xmlns:am3d="http://schemas.microsoft.com/office/drawing/2017/model3d" xmlns:o="urn:schemas-microsoft-com:office:office" xmlns:oel="http://schemas.microsoft.com/office/2019/extlst" xmlns:r="http://schemas.openxmlformats.org/officeDocument/2006/relationships" xmlns:m="http://schemas.openxmlformats.org/officeDocument/2006/math" xmlns:v="urn:schemas-microsoft-com:vml" xmlns:wp14="http://schemas.microsoft.com/office/word/2010/wordprocessingDrawing" xmlns:wp="http://schemas.openxmlformats.org/drawingml/2006/wordprocessingDrawing" xmlns:w10="urn:schemas-microsoft-com:office:word" xmlns:w="http://schemas.openxmlformats.org/wordprocessingml/2006/main" xmlns:w14="http://schemas.microsoft.com/office/word/2010/wordml" xmlns:w15="http://schemas.microsoft.com/office/word/2012/wordml" xmlns:w16cei="http://schemas.microsoft.com/office/word/2026/wordml/cei" xmlns:w16cex="http://schemas.microsoft.com/office/word/2018/wordml/cex" xmlns:w16cid="http://schemas.microsoft.com/office/word/2016/wordml/cid" xmlns:w16="http://schemas.microsoft.com/office/word/2018/wordml" xmlns:w16du="http://schemas.microsoft.com/office/word/2023/wordml/word16du" xmlns:w16sdtdh="http://schemas.microsoft.com/office/word/2020/wordml/sdtdatahash" xmlns:w16sdtfl="http://schemas.microsoft.com/office/word/2024/wordml/sdtformatlock" xmlns:w16se="http://schemas.microsoft.com/office/word/2015/wordml/symex" xmlns:wpg="http://schemas.microsoft.com/office/word/2010/wordprocessingGroup" xmlns:wpi="http://schemas.microsoft.com/office/word/2010/wordprocessingInk" xmlns:wne="http://schemas.microsoft.com/office/word/2006/wordml" xmlns:wps="http://schemas.microsoft.com/office/word/2010/wordprocessingShape" mc:Ignorable="w14 w15 w16se w16cid w16 w16cex w16sdtdh w16sdtfl w16du wp14">
+<w:numbering xmlns:wpc="http://schemas.microsoft.com/office/word/2010/wordprocessingCanvas" xmlns:cx="http://schemas.microsoft.com/office/drawing/2014/chartex" xmlns:cx1="http://schemas.microsoft.com/office/drawing/2015/9/8/chartex" xmlns:cx2="http://schemas.microsoft.com/office/drawing/2015/10/21/chartex" xmlns:cx3="http://schemas.microsoft.com/office/drawing/2016/5/9/chartex" xmlns:cx4="http://schemas.microsoft.com/office/drawing/2016/5/10/chartex" xmlns:cx5="http://schemas.microsoft.com/office/drawing/2016/5/11/chartex" xmlns:cx6="http://schemas.microsoft.com/office/drawing/2016/5/12/chartex" xmlns:cx7="http://schemas.microsoft.com/office/drawing/2016/5/13/chartex" xmlns:cx8="http://schemas.microsoft.com/office/drawing/2016/5/14/chartex" xmlns:mc="http://schemas.openxmlformats.org/markup-compatibility/2006" xmlns:aink="http://schemas.microsoft.com/office/drawing/2016/ink" xmlns:am3d="http://schemas.microsoft.com/office/drawing/2017/model3d" xmlns:o="urn:schemas-microsoft-com:office:office" xmlns:oel="http://schemas.microsoft.com/office/2019/extlst" xmlns:r="http://schemas.openxmlformats.org/officeDocument/2006/relationships" xmlns:m="http://schemas.openxmlformats.org/officeDocument/2006/math" xmlns:v="urn:schemas-microsoft-com:vml" xmlns:wp14="http://schemas.microsoft.com/office/word/2010/wordprocessingDrawing" xmlns:wp="http://schemas.openxmlformats.org/drawingml/2006/wordprocessingDrawing" xmlns:w10="urn:schemas-microsoft-com:office:word" xmlns:w="http://schemas.openxmlformats.org/wordprocessingml/2006/main" xmlns:w14="http://schemas.microsoft.com/office/word/2010/wordml" xmlns:w15="http://schemas.microsoft.com/office/word/2012/wordml" xmlns:w16cex="http://schemas.microsoft.com/office/word/2018/wordml/cex" xmlns:w16cid="http://schemas.microsoft.com/office/word/2016/wordml/cid" xmlns:w16="http://schemas.microsoft.com/office/word/2018/wordml" xmlns:w16du="http://schemas.microsoft.com/office/word/2023/wordml/word16du" xmlns:w16sdtdh="http://schemas.microsoft.com/office/word/2020/wordml/sdtdatahash" xmlns:w16sdtfl="http://schemas.microsoft.com/office/word/2024/wordml/sdtformatlock" xmlns:w16se="http://schemas.microsoft.com/office/word/2015/wordml/symex" xmlns:wpg="http://schemas.microsoft.com/office/word/2010/wordprocessingGroup" xmlns:wpi="http://schemas.microsoft.com/office/word/2010/wordprocessingInk" xmlns:wne="http://schemas.microsoft.com/office/word/2006/wordml" xmlns:wps="http://schemas.microsoft.com/office/word/2010/wordprocessingShape" mc:Ignorable="w14 w15 w16se w16cid w16 w16cex w16sdtdh w16sdtfl w16du wp14">
   <w:abstractNum w:abstractNumId="0" w15:restartNumberingAfterBreak="0">
     <w:nsid w:val="02FE7EE8"/>
     <w:multiLevelType w:val="multilevel"/>
@@ -5033,6 +6748,7 @@
   <w:style w:type="character" w:default="1" w:styleId="DefaultParagraphFont">
     <w:name w:val="Default Paragraph Font"/>
     <w:uiPriority w:val="1"/>
+    <w:semiHidden/>
     <w:unhideWhenUsed/>
   </w:style>
   <w:style w:type="table" w:default="1" w:styleId="TableNormal">
@@ -5467,6 +7183,30 @@
     <w:uiPriority w:val="99"/>
     <w:rsid w:val="00984EDC"/>
   </w:style>
+  <w:style w:type="character" w:styleId="Emphasis">
+    <w:name w:val="Emphasis"/>
+    <w:basedOn w:val="DefaultParagraphFont"/>
+    <w:uiPriority w:val="20"/>
+    <w:qFormat/>
+    <w:rsid w:val="00EE697F"/>
+    <w:rPr>
+      <w:i/>
+      <w:iCs/>
+    </w:rPr>
+  </w:style>
+  <w:style w:type="character" w:styleId="HTMLCode">
+    <w:name w:val="HTML Code"/>
+    <w:basedOn w:val="DefaultParagraphFont"/>
+    <w:uiPriority w:val="99"/>
+    <w:semiHidden/>
+    <w:unhideWhenUsed/>
+    <w:rsid w:val="00EE697F"/>
+    <w:rPr>
+      <w:rFonts w:ascii="Courier New" w:eastAsia="Times New Roman" w:hAnsi="Courier New" w:cs="Courier New"/>
+      <w:sz w:val="20"/>
+      <w:szCs w:val="20"/>
+    </w:rPr>
+  </w:style>
 </w:styles>
 </file>
 

</xml_diff>

<commit_message>
Three tasks completed for multi agent
</commit_message>
<xml_diff>
--- a/Follow up/multi agent selection justification.docx
+++ b/Follow up/multi agent selection justification.docx
@@ -2447,13 +2447,16 @@
     <w:p>
       <w:r>
         <w:lastRenderedPageBreak/>
-        <w:t>Get-Content "runs\20260827T135045Z</w:t>
-      </w:r>
-      <w:r>
-        <w:t xml:space="preserve"> </w:t>
-      </w:r>
-      <w:r>
-        <w:t>_bivariate_multiagent_qwen-qwen3-32b_bivariate_2021_gas_waste\attempts_log.json"</w:t>
+        <w:t xml:space="preserve">Get-Content </w:t>
+      </w:r>
+      <w:r>
+        <w:t>"</w:t>
+      </w:r>
+      <w:r>
+        <w:t>\runs\20260828T073219Z_bivariate_multiagent_openai-o3_bivariate_2021_energy_transport</w:t>
+      </w:r>
+      <w:r>
+        <w:t>\attempts_log.json"</w:t>
       </w:r>
     </w:p>
     <w:p/>
@@ -2464,11 +2467,752 @@
     </w:p>
     <w:p/>
     <w:p/>
-    <w:p>
-      <w:pPr>
-        <w:jc w:val="center"/>
-      </w:pPr>
-    </w:p>
+    <w:p/>
+    <w:p>
+      <w:r>
+        <w:t xml:space="preserve">$models = </w:t>
+      </w:r>
+      <w:proofErr w:type="gramStart"/>
+      <w:r>
+        <w:t>@(</w:t>
+      </w:r>
+      <w:proofErr w:type="gramEnd"/>
+    </w:p>
+    <w:p>
+      <w:r>
+        <w:t xml:space="preserve">    "</w:t>
+      </w:r>
+      <w:proofErr w:type="spellStart"/>
+      <w:r>
+        <w:t>openai</w:t>
+      </w:r>
+      <w:proofErr w:type="spellEnd"/>
+      <w:r>
+        <w:t>/o3",</w:t>
+      </w:r>
+    </w:p>
+    <w:p>
+      <w:r>
+        <w:t xml:space="preserve">    "</w:t>
+      </w:r>
+      <w:proofErr w:type="spellStart"/>
+      <w:r>
+        <w:t>openai</w:t>
+      </w:r>
+      <w:proofErr w:type="spellEnd"/>
+      <w:r>
+        <w:t>/o4-mini",</w:t>
+      </w:r>
+    </w:p>
+    <w:p>
+      <w:r>
+        <w:t xml:space="preserve">    "</w:t>
+      </w:r>
+      <w:proofErr w:type="spellStart"/>
+      <w:r>
+        <w:t>openai</w:t>
+      </w:r>
+      <w:proofErr w:type="spellEnd"/>
+      <w:r>
+        <w:t>/gpt-4o-mini"</w:t>
+      </w:r>
+    </w:p>
+    <w:p>
+      <w:r>
+        <w:t>)</w:t>
+      </w:r>
+    </w:p>
+    <w:p>
+      <w:r>
+        <w:t>foreach ($m in $models) {</w:t>
+      </w:r>
+    </w:p>
+    <w:p>
+      <w:r>
+        <w:t xml:space="preserve">    Write-Host "=== multi_agent_changespillover.py with $m ==="</w:t>
+      </w:r>
+    </w:p>
+    <w:p>
+      <w:r>
+        <w:t xml:space="preserve">    python multi_agent_changespillover.py --model $m 2&gt;&amp;1 | Tee-Object -Append -</w:t>
+      </w:r>
+      <w:proofErr w:type="spellStart"/>
+      <w:r>
+        <w:t>FilePath</w:t>
+      </w:r>
+      <w:proofErr w:type="spellEnd"/>
+      <w:r>
+        <w:t xml:space="preserve"> "changespillover_multiagent_run_log.txt"</w:t>
+      </w:r>
+    </w:p>
+    <w:p>
+      <w:r>
+        <w:t>}</w:t>
+      </w:r>
+    </w:p>
+    <w:p/>
+    <w:p>
+      <w:r>
+        <w:t xml:space="preserve">$models = </w:t>
+      </w:r>
+      <w:proofErr w:type="gramStart"/>
+      <w:r>
+        <w:t>@(</w:t>
+      </w:r>
+      <w:proofErr w:type="gramEnd"/>
+    </w:p>
+    <w:p>
+      <w:r>
+        <w:t xml:space="preserve">    "</w:t>
+      </w:r>
+      <w:proofErr w:type="spellStart"/>
+      <w:r>
+        <w:t>deepseek</w:t>
+      </w:r>
+      <w:proofErr w:type="spellEnd"/>
+      <w:r>
+        <w:t>/deepseek-chat-v3-0324",</w:t>
+      </w:r>
+    </w:p>
+    <w:p>
+      <w:r>
+        <w:t xml:space="preserve">    "</w:t>
+      </w:r>
+      <w:proofErr w:type="spellStart"/>
+      <w:r>
+        <w:t>deepseek</w:t>
+      </w:r>
+      <w:proofErr w:type="spellEnd"/>
+      <w:r>
+        <w:t>/deepseek-r1-0528",</w:t>
+      </w:r>
+    </w:p>
+    <w:p>
+      <w:r>
+        <w:t xml:space="preserve">    "</w:t>
+      </w:r>
+      <w:proofErr w:type="spellStart"/>
+      <w:r>
+        <w:t>qwen</w:t>
+      </w:r>
+      <w:proofErr w:type="spellEnd"/>
+      <w:r>
+        <w:t>/qwen3-32b",</w:t>
+      </w:r>
+    </w:p>
+    <w:p>
+      <w:r>
+        <w:t xml:space="preserve">    "</w:t>
+      </w:r>
+      <w:proofErr w:type="spellStart"/>
+      <w:r>
+        <w:t>moonshotai</w:t>
+      </w:r>
+      <w:proofErr w:type="spellEnd"/>
+      <w:r>
+        <w:t>/kimi-k2.6",</w:t>
+      </w:r>
+    </w:p>
+    <w:p>
+      <w:r>
+        <w:t xml:space="preserve">    "meta-llama/llama-3.1-8b-instruct"</w:t>
+      </w:r>
+    </w:p>
+    <w:p>
+      <w:r>
+        <w:t>)</w:t>
+      </w:r>
+    </w:p>
+    <w:p>
+      <w:r>
+        <w:t>foreach ($m in $models) {</w:t>
+      </w:r>
+    </w:p>
+    <w:p>
+      <w:r>
+        <w:t xml:space="preserve">    Write-Host "=== multi_agent_changespillover.py with $m ==="</w:t>
+      </w:r>
+    </w:p>
+    <w:p>
+      <w:r>
+        <w:lastRenderedPageBreak/>
+        <w:t xml:space="preserve">    python multi_agent_changespillover.py --model $m 2&gt;&amp;1 | Tee-Object -Append -</w:t>
+      </w:r>
+      <w:proofErr w:type="spellStart"/>
+      <w:r>
+        <w:t>FilePath</w:t>
+      </w:r>
+      <w:proofErr w:type="spellEnd"/>
+      <w:r>
+        <w:t xml:space="preserve"> "changespillover_multiagent_run_log.txt"</w:t>
+      </w:r>
+    </w:p>
+    <w:p>
+      <w:r>
+        <w:t>}</w:t>
+      </w:r>
+    </w:p>
+    <w:p/>
+    <w:p/>
+    <w:p>
+      <w:r>
+        <w:t># For single turn</w:t>
+      </w:r>
+    </w:p>
+    <w:p>
+      <w:r>
+        <w:t>RESULTS_CSV = "bivariate_results.csv"</w:t>
+      </w:r>
+    </w:p>
+    <w:p>
+      <w:r>
+        <w:t>SUMMARY_OUT = "Scores/single turn/bivariate_scoring_summary.csv"</w:t>
+      </w:r>
+    </w:p>
+    <w:p>
+      <w:r>
+        <w:t>CONFUSION_OUT = "Scores/single turn/bivariate_confusion_matrix.csv"</w:t>
+      </w:r>
+    </w:p>
+    <w:p/>
+    <w:p>
+      <w:r>
+        <w:t># For multi turn</w:t>
+      </w:r>
+    </w:p>
+    <w:p>
+      <w:r>
+        <w:t>#RESULTS_CSV = "results/single agent/bivariate_results_multi.csv"</w:t>
+      </w:r>
+    </w:p>
+    <w:p>
+      <w:r>
+        <w:t>#SUMMARY_OUT = "Scores/multi turn/bivariate_scoring_summary_multi.csv"</w:t>
+      </w:r>
+    </w:p>
+    <w:p>
+      <w:r>
+        <w:t>#CONFUSION_OUT = "Scores/multi turn/bivariate_confusion_matrix_multi.csv"</w:t>
+      </w:r>
+    </w:p>
+    <w:p/>
+    <w:p>
+      <w:r>
+        <w:t># For multi agent</w:t>
+      </w:r>
+    </w:p>
+    <w:p>
+      <w:r>
+        <w:t>#RESULTS_CSV = "results/multi agent/bivariate_results_multi.csv"</w:t>
+      </w:r>
+    </w:p>
+    <w:p>
+      <w:r>
+        <w:t>#SUMMARY_OUT = "Scores/multi agent/bivariate_scoring_summary_multi.csv"</w:t>
+      </w:r>
+    </w:p>
+    <w:p>
+      <w:r>
+        <w:t>#CONFUSION_OUT = "Scores/multi agent/bivariate_confusion_matrix_multi.csv"</w:t>
+      </w:r>
+    </w:p>
+    <w:p/>
+    <w:p/>
+    <w:p/>
+    <w:p>
+      <w:r>
+        <w:t xml:space="preserve">$models = </w:t>
+      </w:r>
+      <w:proofErr w:type="gramStart"/>
+      <w:r>
+        <w:t>@(</w:t>
+      </w:r>
+      <w:proofErr w:type="gramEnd"/>
+    </w:p>
+    <w:p>
+      <w:r>
+        <w:t xml:space="preserve">    "</w:t>
+      </w:r>
+      <w:proofErr w:type="spellStart"/>
+      <w:r>
+        <w:t>openai</w:t>
+      </w:r>
+      <w:proofErr w:type="spellEnd"/>
+      <w:r>
+        <w:t>/o3",</w:t>
+      </w:r>
+    </w:p>
+    <w:p>
+      <w:r>
+        <w:t xml:space="preserve">    "</w:t>
+      </w:r>
+      <w:proofErr w:type="spellStart"/>
+      <w:r>
+        <w:t>openai</w:t>
+      </w:r>
+      <w:proofErr w:type="spellEnd"/>
+      <w:r>
+        <w:t>/o4-mini",</w:t>
+      </w:r>
+    </w:p>
+    <w:p>
+      <w:r>
+        <w:t xml:space="preserve">    "</w:t>
+      </w:r>
+      <w:proofErr w:type="spellStart"/>
+      <w:r>
+        <w:t>openai</w:t>
+      </w:r>
+      <w:proofErr w:type="spellEnd"/>
+      <w:r>
+        <w:t>/gpt-4o-mini"</w:t>
+      </w:r>
+    </w:p>
+    <w:p>
+      <w:r>
+        <w:t>)</w:t>
+      </w:r>
+    </w:p>
+    <w:p>
+      <w:r>
+        <w:t>foreach ($m in $models) {</w:t>
+      </w:r>
+    </w:p>
+    <w:p>
+      <w:r>
+        <w:lastRenderedPageBreak/>
+        <w:t xml:space="preserve">    Write-Host "=== multi_agent_outlier_iterative_r.py with $m ==="</w:t>
+      </w:r>
+    </w:p>
+    <w:p>
+      <w:r>
+        <w:t xml:space="preserve">    python multi_agent_outlier_iterative_r.py --model $m 2&gt;&amp;1 | Tee-Object -Append -</w:t>
+      </w:r>
+      <w:proofErr w:type="spellStart"/>
+      <w:r>
+        <w:t>FilePath</w:t>
+      </w:r>
+      <w:proofErr w:type="spellEnd"/>
+      <w:r>
+        <w:t xml:space="preserve"> "outlier_multiagent_run_log.txt"</w:t>
+      </w:r>
+    </w:p>
+    <w:p>
+      <w:r>
+        <w:t>}</w:t>
+      </w:r>
+    </w:p>
+    <w:p/>
+    <w:p/>
+    <w:p>
+      <w:r>
+        <w:t xml:space="preserve">$models = </w:t>
+      </w:r>
+      <w:proofErr w:type="gramStart"/>
+      <w:r>
+        <w:t>@(</w:t>
+      </w:r>
+      <w:proofErr w:type="gramEnd"/>
+    </w:p>
+    <w:p>
+      <w:r>
+        <w:t xml:space="preserve">    "</w:t>
+      </w:r>
+      <w:proofErr w:type="spellStart"/>
+      <w:r>
+        <w:t>deepseek</w:t>
+      </w:r>
+      <w:proofErr w:type="spellEnd"/>
+      <w:r>
+        <w:t>/deepseek-chat-v3-0324",</w:t>
+      </w:r>
+    </w:p>
+    <w:p>
+      <w:r>
+        <w:t xml:space="preserve">    "</w:t>
+      </w:r>
+      <w:proofErr w:type="spellStart"/>
+      <w:r>
+        <w:t>deepseek</w:t>
+      </w:r>
+      <w:proofErr w:type="spellEnd"/>
+      <w:r>
+        <w:t>/deepseek-r1-0528",</w:t>
+      </w:r>
+    </w:p>
+    <w:p>
+      <w:r>
+        <w:t xml:space="preserve">    "</w:t>
+      </w:r>
+      <w:proofErr w:type="spellStart"/>
+      <w:r>
+        <w:t>qwen</w:t>
+      </w:r>
+      <w:proofErr w:type="spellEnd"/>
+      <w:r>
+        <w:t>/qwen3-32b",</w:t>
+      </w:r>
+    </w:p>
+    <w:p>
+      <w:r>
+        <w:t xml:space="preserve">    "</w:t>
+      </w:r>
+      <w:proofErr w:type="spellStart"/>
+      <w:r>
+        <w:t>moonshotai</w:t>
+      </w:r>
+      <w:proofErr w:type="spellEnd"/>
+      <w:r>
+        <w:t>/kimi-k2.6",</w:t>
+      </w:r>
+    </w:p>
+    <w:p>
+      <w:r>
+        <w:t xml:space="preserve">    "meta-llama/llama-3.1-8b-instruct"</w:t>
+      </w:r>
+    </w:p>
+    <w:p>
+      <w:r>
+        <w:t>)</w:t>
+      </w:r>
+    </w:p>
+    <w:p>
+      <w:r>
+        <w:t>foreach ($m in $models) {</w:t>
+      </w:r>
+    </w:p>
+    <w:p>
+      <w:r>
+        <w:t xml:space="preserve">    Write-Host "=== multi_agent_outlier_iterative_r.py with $m ==="</w:t>
+      </w:r>
+    </w:p>
+    <w:p>
+      <w:r>
+        <w:t xml:space="preserve">    python multi_agent_outlier_iterative_r.py --model $m 2&gt;&amp;1 | Tee-Object -Append -</w:t>
+      </w:r>
+      <w:proofErr w:type="spellStart"/>
+      <w:r>
+        <w:t>FilePath</w:t>
+      </w:r>
+      <w:proofErr w:type="spellEnd"/>
+      <w:r>
+        <w:t xml:space="preserve"> "outlier_multiagent_run_log.txt"</w:t>
+      </w:r>
+    </w:p>
+    <w:p>
+      <w:r>
+        <w:t>}</w:t>
+      </w:r>
+    </w:p>
+    <w:p/>
+    <w:p>
+      <w:r>
+        <w:t># for multi turn</w:t>
+      </w:r>
+    </w:p>
+    <w:p>
+      <w:r>
+        <w:t>#RESULTS_CSV = "getisord_results_multi.csv"</w:t>
+      </w:r>
+    </w:p>
+    <w:p>
+      <w:r>
+        <w:t>#OUT_CSV = "Scores/multi turn/getisord_scoring_summary.csv"</w:t>
+      </w:r>
+    </w:p>
+    <w:p/>
+    <w:p>
+      <w:r>
+        <w:t>#For single turn</w:t>
+      </w:r>
+    </w:p>
+    <w:p>
+      <w:r>
+        <w:t>#RESULTS_CSV = "getisord_results.csv"</w:t>
+      </w:r>
+    </w:p>
+    <w:p>
+      <w:r>
+        <w:t>#OUT_CSV = "Scores/single turn/getisord_scoring_summary.csv"</w:t>
+      </w:r>
+    </w:p>
+    <w:p/>
+    <w:p>
+      <w:r>
+        <w:t>#For multi agent</w:t>
+      </w:r>
+    </w:p>
+    <w:p>
+      <w:r>
+        <w:t>RESULTS_CSV = "results/multi agent/getisord_results_multiagent.csv"</w:t>
+      </w:r>
+    </w:p>
+    <w:p>
+      <w:r>
+        <w:lastRenderedPageBreak/>
+        <w:t>OUT_CSV = "Scores/multi agent/getisord_scoring_summary.csv"</w:t>
+      </w:r>
+    </w:p>
+    <w:p/>
+    <w:p/>
+    <w:p/>
+    <w:p>
+      <w:r>
+        <w:t>python -c "</w:t>
+      </w:r>
+    </w:p>
+    <w:p>
+      <w:r>
+        <w:t>import pandas as pd</w:t>
+      </w:r>
+    </w:p>
+    <w:p>
+      <w:r>
+        <w:t>path = '</w:t>
+      </w:r>
+      <w:r>
+        <w:t>results/multi agent/</w:t>
+      </w:r>
+      <w:r>
+        <w:t>getisord_results_multiagent.csv'</w:t>
+      </w:r>
+    </w:p>
+    <w:p>
+      <w:proofErr w:type="spellStart"/>
+      <w:r>
+        <w:t>df</w:t>
+      </w:r>
+      <w:proofErr w:type="spellEnd"/>
+      <w:r>
+        <w:t xml:space="preserve"> = </w:t>
+      </w:r>
+      <w:proofErr w:type="spellStart"/>
+      <w:proofErr w:type="gramStart"/>
+      <w:r>
+        <w:t>pd.read</w:t>
+      </w:r>
+      <w:proofErr w:type="gramEnd"/>
+      <w:r>
+        <w:t>_csv</w:t>
+      </w:r>
+      <w:proofErr w:type="spellEnd"/>
+      <w:r>
+        <w:t>(path)</w:t>
+      </w:r>
+    </w:p>
+    <w:p/>
+    <w:p>
+      <w:proofErr w:type="spellStart"/>
+      <w:r>
+        <w:t>to_remove</w:t>
+      </w:r>
+      <w:proofErr w:type="spellEnd"/>
+      <w:r>
+        <w:t xml:space="preserve"> = {</w:t>
+      </w:r>
+    </w:p>
+    <w:p>
+      <w:r>
+        <w:t xml:space="preserve">    'meta-llama/llama-3.1-8b-instruct': ['getisord_2021_no2', 'getisord_2021_transport', 'getisord_2023_crime', 'getisord_2023_gas'],</w:t>
+      </w:r>
+    </w:p>
+    <w:p>
+      <w:r>
+        <w:t xml:space="preserve">    '</w:t>
+      </w:r>
+      <w:proofErr w:type="spellStart"/>
+      <w:r>
+        <w:t>openai</w:t>
+      </w:r>
+      <w:proofErr w:type="spellEnd"/>
+      <w:r>
+        <w:t>/gpt-4o-mini': ['getisord_2021_transport', 'getisord_2022_transport', 'getisord_2023_transport'],</w:t>
+      </w:r>
+    </w:p>
+    <w:p>
+      <w:r>
+        <w:t>}</w:t>
+      </w:r>
+    </w:p>
+    <w:p/>
+    <w:p>
+      <w:r>
+        <w:t xml:space="preserve"># Extract the timestamp from </w:t>
+      </w:r>
+      <w:proofErr w:type="spellStart"/>
+      <w:r>
+        <w:t>run_dir</w:t>
+      </w:r>
+      <w:proofErr w:type="spellEnd"/>
+      <w:r>
+        <w:t xml:space="preserve"> to always keep the LATEST row for each (model, </w:t>
+      </w:r>
+      <w:proofErr w:type="spellStart"/>
+      <w:r>
+        <w:t>chunk_id</w:t>
+      </w:r>
+      <w:proofErr w:type="spellEnd"/>
+      <w:r>
+        <w:t>)</w:t>
+      </w:r>
+    </w:p>
+    <w:p>
+      <w:proofErr w:type="spellStart"/>
+      <w:r>
+        <w:t>df</w:t>
+      </w:r>
+      <w:proofErr w:type="spellEnd"/>
+      <w:r>
+        <w:t>['_</w:t>
+      </w:r>
+      <w:proofErr w:type="spellStart"/>
+      <w:r>
+        <w:t>ts'</w:t>
+      </w:r>
+      <w:proofErr w:type="spellEnd"/>
+      <w:r>
+        <w:t xml:space="preserve">] = </w:t>
+      </w:r>
+      <w:proofErr w:type="spellStart"/>
+      <w:r>
+        <w:t>df</w:t>
+      </w:r>
+      <w:proofErr w:type="spellEnd"/>
+      <w:r>
+        <w:t>['</w:t>
+      </w:r>
+      <w:proofErr w:type="spellStart"/>
+      <w:r>
+        <w:t>run_dir</w:t>
+      </w:r>
+      <w:proofErr w:type="spellEnd"/>
+      <w:r>
+        <w:t>'].</w:t>
+      </w:r>
+      <w:proofErr w:type="spellStart"/>
+      <w:proofErr w:type="gramStart"/>
+      <w:r>
+        <w:t>str.extract</w:t>
+      </w:r>
+      <w:proofErr w:type="spellEnd"/>
+      <w:proofErr w:type="gramEnd"/>
+      <w:r>
+        <w:t>(</w:t>
+      </w:r>
+      <w:proofErr w:type="spellStart"/>
+      <w:proofErr w:type="gramStart"/>
+      <w:r>
+        <w:t>r'runs</w:t>
+      </w:r>
+      <w:proofErr w:type="spellEnd"/>
+      <w:r>
+        <w:t>.(</w:t>
+      </w:r>
+      <w:proofErr w:type="gramEnd"/>
+      <w:r>
+        <w:t>\d{8}T\</w:t>
+      </w:r>
+      <w:proofErr w:type="gramStart"/>
+      <w:r>
+        <w:t>d{</w:t>
+      </w:r>
+      <w:proofErr w:type="gramEnd"/>
+      <w:r>
+        <w:t>6}Z)')</w:t>
+      </w:r>
+    </w:p>
+    <w:p>
+      <w:r>
+        <w:t xml:space="preserve">mask = </w:t>
+      </w:r>
+      <w:proofErr w:type="spellStart"/>
+      <w:proofErr w:type="gramStart"/>
+      <w:r>
+        <w:t>pd.Series</w:t>
+      </w:r>
+      <w:proofErr w:type="spellEnd"/>
+      <w:proofErr w:type="gramEnd"/>
+      <w:r>
+        <w:t>(False, index=</w:t>
+      </w:r>
+      <w:proofErr w:type="spellStart"/>
+      <w:proofErr w:type="gramStart"/>
+      <w:r>
+        <w:t>df.index</w:t>
+      </w:r>
+      <w:proofErr w:type="spellEnd"/>
+      <w:proofErr w:type="gramEnd"/>
+      <w:r>
+        <w:t>)</w:t>
+      </w:r>
+    </w:p>
+    <w:p>
+      <w:r>
+        <w:t xml:space="preserve">for model, chunks in </w:t>
+      </w:r>
+      <w:proofErr w:type="spellStart"/>
+      <w:r>
+        <w:t>to_</w:t>
+      </w:r>
+      <w:proofErr w:type="gramStart"/>
+      <w:r>
+        <w:t>remove.items</w:t>
+      </w:r>
+      <w:proofErr w:type="spellEnd"/>
+      <w:proofErr w:type="gramEnd"/>
+      <w:r>
+        <w:t>():</w:t>
+      </w:r>
+    </w:p>
+    <w:p>
+      <w:r>
+        <w:t xml:space="preserve">    m = (</w:t>
+      </w:r>
+      <w:proofErr w:type="spellStart"/>
+      <w:r>
+        <w:t>df</w:t>
+      </w:r>
+      <w:proofErr w:type="spellEnd"/>
+      <w:r>
+        <w:t>['model'] == model) &amp; (</w:t>
+      </w:r>
+      <w:proofErr w:type="spellStart"/>
+      <w:r>
+        <w:t>df</w:t>
+      </w:r>
+      <w:proofErr w:type="spellEnd"/>
+      <w:r>
+        <w:t>['</w:t>
+      </w:r>
+      <w:proofErr w:type="spellStart"/>
+      <w:r>
+        <w:t>chunk_id</w:t>
+      </w:r>
+      <w:proofErr w:type="spellEnd"/>
+      <w:r>
+        <w:t>'</w:t>
+      </w:r>
+      <w:proofErr w:type="gramStart"/>
+      <w:r>
+        <w:t>].</w:t>
+      </w:r>
+      <w:proofErr w:type="spellStart"/>
+      <w:r>
+        <w:t>isin</w:t>
+      </w:r>
+      <w:proofErr w:type="spellEnd"/>
+      <w:proofErr w:type="gramEnd"/>
+      <w:r>
+        <w:t>(chunks))</w:t>
+      </w:r>
+    </w:p>
+    <w:p>
+      <w:r>
+        <w:t xml:space="preserve">    mask |= m</w:t>
+      </w:r>
+    </w:p>
+    <w:p/>
+    <w:p/>
     <w:sectPr>
       <w:pgSz w:w="11906" w:h="16838"/>
       <w:pgMar w:top="1440" w:right="1440" w:bottom="1440" w:left="1440" w:header="708" w:footer="708" w:gutter="0"/>
@@ -6748,7 +7492,6 @@
   <w:style w:type="character" w:default="1" w:styleId="DefaultParagraphFont">
     <w:name w:val="Default Paragraph Font"/>
     <w:uiPriority w:val="1"/>
-    <w:semiHidden/>
     <w:unhideWhenUsed/>
   </w:style>
   <w:style w:type="table" w:default="1" w:styleId="TableNormal">

</xml_diff>

<commit_message>
5 Tasks completed for single agent single turn, single agent multi turn and multi agent
</commit_message>
<xml_diff>
--- a/Follow up/multi agent selection justification.docx
+++ b/Follow up/multi agent selection justification.docx
@@ -17,18 +17,8 @@
           <w:bCs/>
           <w:u w:val="single"/>
         </w:rPr>
-        <w:t xml:space="preserve">Why not generating multiple </w:t>
-      </w:r>
-      <w:proofErr w:type="gramStart"/>
-      <w:r>
-        <w:rPr>
-          <w:b/>
-          <w:bCs/>
-          <w:u w:val="single"/>
-        </w:rPr>
-        <w:t>plan</w:t>
-      </w:r>
-      <w:proofErr w:type="gramEnd"/>
+        <w:t>Why not generating multiple plan</w:t>
+      </w:r>
       <w:r>
         <w:rPr>
           <w:b/>
@@ -84,15 +74,7 @@
         <w:t>same LLM that wrote the plan</w:t>
       </w:r>
       <w:r>
-        <w:t xml:space="preserve"> to self-assess how confident it is, before any code has run. That's exactly the kind of unverified self-judgment Huang et al. (2024) found </w:t>
-      </w:r>
-      <w:proofErr w:type="gramStart"/>
-      <w:r>
-        <w:t>unreliable  and</w:t>
-      </w:r>
-      <w:proofErr w:type="gramEnd"/>
-      <w:r>
-        <w:t xml:space="preserve"> we've seen it directly in our own data: </w:t>
+        <w:t xml:space="preserve"> to self-assess how confident it is, before any code has run. That's exactly the kind of unverified self-judgment Huang et al. (2024) found unreliable  and we've seen it directly in our own data: </w:t>
       </w:r>
       <w:proofErr w:type="spellStart"/>
       <w:r>
@@ -217,25 +199,7 @@
           <w:bCs/>
           <w:u w:val="single"/>
         </w:rPr>
-        <w:t xml:space="preserve"> Coding + </w:t>
-      </w:r>
-      <w:proofErr w:type="gramStart"/>
-      <w:r>
-        <w:rPr>
-          <w:b/>
-          <w:bCs/>
-          <w:u w:val="single"/>
-        </w:rPr>
-        <w:t>Debugging  a</w:t>
-      </w:r>
-      <w:proofErr w:type="gramEnd"/>
-      <w:r>
-        <w:rPr>
-          <w:b/>
-          <w:bCs/>
-          <w:u w:val="single"/>
-        </w:rPr>
-        <w:t xml:space="preserve"> real, fundamental distinction, not just a naming choice</w:t>
+        <w:t xml:space="preserve"> Coding + Debugging  a real, fundamental distinction, not just a naming choice</w:t>
       </w:r>
     </w:p>
     <w:p>
@@ -321,15 +285,7 @@
         <w:t>is</w:t>
       </w:r>
       <w:r>
-        <w:t xml:space="preserve"> the thing we're testing whether the model can </w:t>
-      </w:r>
-      <w:proofErr w:type="gramStart"/>
-      <w:r>
-        <w:t>compute  handing</w:t>
-      </w:r>
-      <w:proofErr w:type="gramEnd"/>
-      <w:r>
-        <w:t xml:space="preserve"> it over as a "sample answer" to check against would make the whole experiment circular. There is no equivalent of a sample I/O for "is this borough's spatial clustering significant."</w:t>
+        <w:t xml:space="preserve"> the thing we're testing whether the model can compute  handing it over as a "sample answer" to check against would make the whole experiment circular. There is no equivalent of a sample I/O for "is this borough's spatial clustering significant."</w:t>
       </w:r>
     </w:p>
     <w:p>
@@ -376,15 +332,7 @@
         <w:t>.</w:t>
       </w:r>
       <w:r>
-        <w:t xml:space="preserve"> It can catch nan, an impossible p-value, or a hardcoded </w:t>
-      </w:r>
-      <w:proofErr w:type="gramStart"/>
-      <w:r>
-        <w:t>literal  but</w:t>
-      </w:r>
-      <w:proofErr w:type="gramEnd"/>
-      <w:r>
-        <w:t xml:space="preserve"> it </w:t>
+        <w:t xml:space="preserve"> It can catch nan, an impossible p-value, or a hardcoded literal  but it </w:t>
       </w:r>
       <w:r>
         <w:rPr>
@@ -474,10 +422,48 @@
         <w:t xml:space="preserve"> (Generic)</w:t>
       </w:r>
     </w:p>
+    <w:p>
+      <w:pPr>
+        <w:rPr>
+          <w:b/>
+          <w:bCs/>
+        </w:rPr>
+      </w:pPr>
+      <w:r>
+        <w:rPr>
+          <w:b/>
+          <w:bCs/>
+        </w:rPr>
+        <w:t xml:space="preserve">2. The 5 validation checks </w:t>
+      </w:r>
+      <w:r>
+        <w:rPr>
+          <w:b/>
+          <w:bCs/>
+        </w:rPr>
+        <w:t xml:space="preserve">- </w:t>
+      </w:r>
+      <w:r>
+        <w:rPr>
+          <w:b/>
+          <w:bCs/>
+        </w:rPr>
+        <w:t>table for your supervisor</w:t>
+      </w:r>
+    </w:p>
     <w:tbl>
       <w:tblPr>
         <w:tblW w:w="0" w:type="auto"/>
         <w:tblCellSpacing w:w="15" w:type="dxa"/>
+        <w:tblInd w:w="-431" w:type="dxa"/>
+        <w:tblBorders>
+          <w:top w:val="single" w:sz="4" w:space="0" w:color="auto"/>
+          <w:left w:val="single" w:sz="4" w:space="0" w:color="auto"/>
+          <w:bottom w:val="single" w:sz="4" w:space="0" w:color="auto"/>
+          <w:right w:val="single" w:sz="4" w:space="0" w:color="auto"/>
+          <w:insideH w:val="single" w:sz="4" w:space="0" w:color="auto"/>
+          <w:insideV w:val="single" w:sz="4" w:space="0" w:color="auto"/>
+        </w:tblBorders>
         <w:tblCellMar>
           <w:top w:w="15" w:type="dxa"/>
           <w:left w:w="15" w:type="dxa"/>
@@ -487,13 +473,37 @@
         <w:tblLook w:val="04A0" w:firstRow="1" w:lastRow="0" w:firstColumn="1" w:lastColumn="0" w:noHBand="0" w:noVBand="1"/>
       </w:tblPr>
       <w:tblGrid>
-        <w:gridCol w:w="1830"/>
+        <w:gridCol w:w="2269"/>
+        <w:gridCol w:w="3775"/>
+        <w:gridCol w:w="3403"/>
       </w:tblGrid>
       <w:tr>
         <w:trPr>
           <w:tblHeader/>
           <w:tblCellSpacing w:w="15" w:type="dxa"/>
         </w:trPr>
+        <w:tc>
+          <w:tcPr>
+            <w:tcW w:w="2224" w:type="dxa"/>
+            <w:vAlign w:val="center"/>
+            <w:hideMark/>
+          </w:tcPr>
+          <w:p>
+            <w:pPr>
+              <w:rPr>
+                <w:b/>
+                <w:bCs/>
+              </w:rPr>
+            </w:pPr>
+            <w:r>
+              <w:rPr>
+                <w:b/>
+                <w:bCs/>
+              </w:rPr>
+              <w:t>Check</w:t>
+            </w:r>
+          </w:p>
+        </w:tc>
         <w:tc>
           <w:tcPr>
             <w:tcW w:w="0" w:type="auto"/>
@@ -512,1170 +522,879 @@
                 <w:b/>
                 <w:bCs/>
               </w:rPr>
-              <w:t>Validation tasks</w:t>
-            </w:r>
-          </w:p>
-        </w:tc>
-      </w:tr>
-    </w:tbl>
-    <w:p>
-      <w:pPr>
-        <w:spacing w:after="0" w:line="240" w:lineRule="auto"/>
-        <w:rPr>
-          <w:rFonts w:ascii="Times New Roman" w:eastAsia="Times New Roman" w:hAnsi="Times New Roman" w:cs="Times New Roman"/>
-          <w:b/>
-          <w:bCs/>
-          <w:kern w:val="0"/>
-          <w:lang w:eastAsia="en-AU"/>
-          <w14:ligatures w14:val="none"/>
-        </w:rPr>
-      </w:pPr>
-      <w:r>
-        <w:rPr>
-          <w:rFonts w:ascii="Times New Roman" w:eastAsia="Times New Roman" w:hAnsi="Times New Roman" w:cs="Times New Roman"/>
-          <w:b/>
-          <w:bCs/>
-          <w:kern w:val="0"/>
-          <w:lang w:eastAsia="en-AU"/>
-          <w14:ligatures w14:val="none"/>
-        </w:rPr>
-        <w:t>Check</w:t>
-      </w:r>
-      <w:r>
-        <w:rPr>
-          <w:rFonts w:ascii="Times New Roman" w:eastAsia="Times New Roman" w:hAnsi="Times New Roman" w:cs="Times New Roman"/>
-          <w:b/>
-          <w:bCs/>
-          <w:kern w:val="0"/>
-          <w:lang w:eastAsia="en-AU"/>
-          <w14:ligatures w14:val="none"/>
-        </w:rPr>
-        <w:tab/>
-      </w:r>
-      <w:r>
-        <w:rPr>
-          <w:rFonts w:ascii="Times New Roman" w:eastAsia="Times New Roman" w:hAnsi="Times New Roman" w:cs="Times New Roman"/>
-          <w:b/>
-          <w:bCs/>
-          <w:kern w:val="0"/>
-          <w:lang w:eastAsia="en-AU"/>
-          <w14:ligatures w14:val="none"/>
-        </w:rPr>
-        <w:tab/>
-      </w:r>
-      <w:r>
-        <w:rPr>
-          <w:rFonts w:ascii="Times New Roman" w:eastAsia="Times New Roman" w:hAnsi="Times New Roman" w:cs="Times New Roman"/>
-          <w:b/>
-          <w:bCs/>
-          <w:kern w:val="0"/>
-          <w:lang w:eastAsia="en-AU"/>
-          <w14:ligatures w14:val="none"/>
-        </w:rPr>
-        <w:t xml:space="preserve">            </w:t>
-      </w:r>
-      <w:r>
-        <w:rPr>
-          <w:rFonts w:ascii="Times New Roman" w:eastAsia="Times New Roman" w:hAnsi="Times New Roman" w:cs="Times New Roman"/>
-          <w:b/>
-          <w:bCs/>
-          <w:kern w:val="0"/>
-          <w:lang w:eastAsia="en-AU"/>
-          <w14:ligatures w14:val="none"/>
-        </w:rPr>
-        <w:t xml:space="preserve">       </w:t>
-      </w:r>
-      <w:r>
-        <w:rPr>
-          <w:rFonts w:ascii="Times New Roman" w:eastAsia="Times New Roman" w:hAnsi="Times New Roman" w:cs="Times New Roman"/>
-          <w:b/>
-          <w:bCs/>
-          <w:kern w:val="0"/>
-          <w:lang w:eastAsia="en-AU"/>
-          <w14:ligatures w14:val="none"/>
-        </w:rPr>
-        <w:t>General principle it's really an instance of</w:t>
-      </w:r>
-      <w:r>
-        <w:rPr>
-          <w:rFonts w:ascii="Times New Roman" w:eastAsia="Times New Roman" w:hAnsi="Times New Roman" w:cs="Times New Roman"/>
-          <w:b/>
-          <w:bCs/>
-          <w:kern w:val="0"/>
-          <w:lang w:eastAsia="en-AU"/>
-          <w14:ligatures w14:val="none"/>
-        </w:rPr>
-        <w:t xml:space="preserve">        </w:t>
-      </w:r>
-      <w:r>
-        <w:rPr>
-          <w:rFonts w:ascii="Times New Roman" w:eastAsia="Times New Roman" w:hAnsi="Times New Roman" w:cs="Times New Roman"/>
-          <w:b/>
-          <w:bCs/>
-          <w:kern w:val="0"/>
-          <w:lang w:eastAsia="en-AU"/>
-          <w14:ligatures w14:val="none"/>
-        </w:rPr>
-        <w:t>Generic because</w:t>
-      </w:r>
-    </w:p>
-    <w:tbl>
-      <w:tblPr>
-        <w:tblStyle w:val="TableGrid"/>
-        <w:tblW w:w="9253" w:type="dxa"/>
-        <w:tblLayout w:type="fixed"/>
-        <w:tblLook w:val="04A0" w:firstRow="1" w:lastRow="0" w:firstColumn="1" w:lastColumn="0" w:noHBand="0" w:noVBand="1"/>
-      </w:tblPr>
-      <w:tblGrid>
-        <w:gridCol w:w="2689"/>
-        <w:gridCol w:w="4579"/>
-        <w:gridCol w:w="1985"/>
-      </w:tblGrid>
-      <w:tr>
-        <w:trPr>
-          <w:trHeight w:val="1061"/>
-        </w:trPr>
-        <w:tc>
-          <w:tcPr>
-            <w:tcW w:w="2689" w:type="dxa"/>
-          </w:tcPr>
-          <w:p>
-            <w:pPr>
-              <w:rPr>
-                <w:rFonts w:ascii="Cambria" w:eastAsia="Times New Roman" w:hAnsi="Cambria" w:cs="Calibri"/>
-                <w:kern w:val="0"/>
-                <w:lang w:eastAsia="en-AU"/>
-                <w14:ligatures w14:val="none"/>
-              </w:rPr>
-            </w:pPr>
-            <w:r>
-              <w:rPr>
-                <w:rFonts w:ascii="Cambria" w:eastAsia="Times New Roman" w:hAnsi="Cambria" w:cs="Calibri"/>
-                <w:b/>
-                <w:bCs/>
-                <w:kern w:val="0"/>
-                <w:lang w:eastAsia="en-AU"/>
-                <w14:ligatures w14:val="none"/>
-              </w:rPr>
-              <w:t>Finite statistic</w:t>
-            </w:r>
-            <w:r>
-              <w:rPr>
-                <w:rFonts w:ascii="Cambria" w:eastAsia="Times New Roman" w:hAnsi="Cambria" w:cs="Calibri"/>
-                <w:kern w:val="0"/>
-                <w:lang w:eastAsia="en-AU"/>
-                <w14:ligatures w14:val="none"/>
-              </w:rPr>
-              <w:t xml:space="preserve"> (none, infinity checking)</w:t>
+              <w:t>What it actually does</w:t>
             </w:r>
           </w:p>
         </w:tc>
         <w:tc>
           <w:tcPr>
-            <w:tcW w:w="4579" w:type="dxa"/>
+            <w:tcW w:w="0" w:type="auto"/>
+            <w:vAlign w:val="center"/>
+            <w:hideMark/>
           </w:tcPr>
           <w:p>
             <w:pPr>
               <w:rPr>
-                <w:rFonts w:ascii="Cambria" w:eastAsia="Times New Roman" w:hAnsi="Cambria" w:cs="Calibri"/>
-                <w:kern w:val="0"/>
-                <w:lang w:eastAsia="en-AU"/>
-                <w14:ligatures w14:val="none"/>
+                <w:b/>
+                <w:bCs/>
               </w:rPr>
             </w:pPr>
             <w:r>
               <w:rPr>
-                <w:rFonts w:ascii="Cambria" w:eastAsia="Times New Roman" w:hAnsi="Cambria" w:cs="Calibri"/>
-                <w:kern w:val="0"/>
-                <w:lang w:eastAsia="en-AU"/>
-                <w14:ligatures w14:val="none"/>
+                <w:b/>
+                <w:bCs/>
               </w:rPr>
-              <w:t xml:space="preserve">Output </w:t>
-            </w:r>
-            <w:r>
-              <w:rPr>
-                <w:rFonts w:ascii="Cambria" w:eastAsia="Times New Roman" w:hAnsi="Cambria" w:cs="Calibri"/>
-                <w:kern w:val="0"/>
-                <w:lang w:eastAsia="en-AU"/>
-                <w14:ligatures w14:val="none"/>
-              </w:rPr>
-              <w:t>validity a</w:t>
-            </w:r>
-            <w:r>
-              <w:rPr>
-                <w:rFonts w:ascii="Cambria" w:eastAsia="Times New Roman" w:hAnsi="Cambria" w:cs="Calibri"/>
-                <w:kern w:val="0"/>
-                <w:lang w:eastAsia="en-AU"/>
-                <w14:ligatures w14:val="none"/>
-              </w:rPr>
-              <w:t xml:space="preserve"> basic postcondition of any numerical computation</w:t>
-            </w:r>
-          </w:p>
-        </w:tc>
-        <w:tc>
-          <w:tcPr>
-            <w:tcW w:w="1985" w:type="dxa"/>
-          </w:tcPr>
-          <w:p>
-            <w:pPr>
-              <w:rPr>
-                <w:rFonts w:ascii="Cambria" w:eastAsia="Times New Roman" w:hAnsi="Cambria" w:cs="Calibri"/>
-                <w:kern w:val="0"/>
-                <w:lang w:eastAsia="en-AU"/>
-                <w14:ligatures w14:val="none"/>
-              </w:rPr>
-            </w:pPr>
-            <w:r>
-              <w:rPr>
-                <w:rFonts w:ascii="Cambria" w:eastAsia="Times New Roman" w:hAnsi="Cambria" w:cs="Calibri"/>
-                <w:kern w:val="0"/>
-                <w:lang w:eastAsia="en-AU"/>
-                <w14:ligatures w14:val="none"/>
-              </w:rPr>
-              <w:t>This is a universal sanity check for any pipeline outputting numbers, statistical or not</w:t>
+              <w:t>Why it's generic</w:t>
             </w:r>
           </w:p>
         </w:tc>
       </w:tr>
       <w:tr>
         <w:trPr>
-          <w:trHeight w:val="1061"/>
+          <w:tblCellSpacing w:w="15" w:type="dxa"/>
         </w:trPr>
         <w:tc>
           <w:tcPr>
-            <w:tcW w:w="2689" w:type="dxa"/>
+            <w:tcW w:w="2224" w:type="dxa"/>
+            <w:vAlign w:val="center"/>
+            <w:hideMark/>
           </w:tcPr>
           <w:p>
             <w:pPr>
               <w:rPr>
-                <w:rFonts w:ascii="Cambria" w:eastAsia="Times New Roman" w:hAnsi="Cambria" w:cs="Calibri"/>
-                <w:kern w:val="0"/>
-                <w:lang w:eastAsia="en-AU"/>
-                <w14:ligatures w14:val="none"/>
+                <w:b/>
+                <w:bCs/>
               </w:rPr>
             </w:pPr>
             <w:r>
               <w:rPr>
-                <w:rFonts w:ascii="Cambria" w:eastAsia="Times New Roman" w:hAnsi="Cambria" w:cs="Calibri"/>
                 <w:b/>
                 <w:bCs/>
-                <w:kern w:val="0"/>
-                <w:lang w:eastAsia="en-AU"/>
-                <w14:ligatures w14:val="none"/>
               </w:rPr>
-              <w:t>p</w:t>
-            </w:r>
-            <w:r>
-              <w:rPr>
-                <w:rFonts w:ascii="Cambria" w:eastAsia="Times New Roman" w:hAnsi="Cambria" w:cs="Calibri"/>
-                <w:kern w:val="0"/>
-                <w:lang w:eastAsia="en-AU"/>
-                <w14:ligatures w14:val="none"/>
-              </w:rPr>
-              <w:t xml:space="preserve"> </w:t>
-            </w:r>
-            <w:r>
-              <w:rPr>
-                <w:rFonts w:ascii="Cambria" w:eastAsia="Times New Roman" w:hAnsi="Cambria" w:cs="Cambria Math"/>
-                <w:kern w:val="0"/>
-                <w:lang w:eastAsia="en-AU"/>
-                <w14:ligatures w14:val="none"/>
-              </w:rPr>
-              <w:t>∈</w:t>
-            </w:r>
-            <w:r>
-              <w:rPr>
-                <w:rFonts w:ascii="Cambria" w:eastAsia="Times New Roman" w:hAnsi="Cambria" w:cs="Calibri"/>
-                <w:kern w:val="0"/>
-                <w:lang w:eastAsia="en-AU"/>
-                <w14:ligatures w14:val="none"/>
-              </w:rPr>
-              <w:t xml:space="preserve"> [0,1]</w:t>
+              <w:t>1. Finite statistic</w:t>
             </w:r>
           </w:p>
         </w:tc>
         <w:tc>
           <w:tcPr>
-            <w:tcW w:w="4579" w:type="dxa"/>
+            <w:tcW w:w="0" w:type="auto"/>
+            <w:vAlign w:val="center"/>
+            <w:hideMark/>
           </w:tcPr>
           <w:p>
             <w:pPr>
               <w:rPr>
-                <w:rFonts w:ascii="Cambria" w:eastAsia="Times New Roman" w:hAnsi="Cambria" w:cs="Calibri"/>
-                <w:kern w:val="0"/>
-                <w:lang w:eastAsia="en-AU"/>
-                <w14:ligatures w14:val="none"/>
+                <w:b/>
+                <w:bCs/>
               </w:rPr>
             </w:pPr>
             <w:r>
               <w:rPr>
-                <w:rFonts w:ascii="Cambria" w:eastAsia="Times New Roman" w:hAnsi="Cambria" w:cs="Calibri"/>
-                <w:kern w:val="0"/>
-                <w:lang w:eastAsia="en-AU"/>
-                <w14:ligatures w14:val="none"/>
+                <w:b/>
+                <w:bCs/>
               </w:rPr>
-              <w:t xml:space="preserve">Definitional correctness this is what a p-value </w:t>
+              <w:t>Confirms the model's main reported number is a real, finite value</w:t>
             </w:r>
             <w:r>
               <w:rPr>
-                <w:rFonts w:ascii="Cambria" w:eastAsia="Times New Roman" w:hAnsi="Cambria" w:cs="Calibri"/>
-                <w:i/>
-                <w:iCs/>
-                <w:kern w:val="0"/>
-                <w:lang w:eastAsia="en-AU"/>
-                <w14:ligatures w14:val="none"/>
+                <w:b/>
+                <w:bCs/>
               </w:rPr>
-              <w:t>is</w:t>
+              <w:t xml:space="preserve"> -</w:t>
             </w:r>
             <w:r>
               <w:rPr>
-                <w:rFonts w:ascii="Cambria" w:eastAsia="Times New Roman" w:hAnsi="Cambria" w:cs="Calibri"/>
-                <w:kern w:val="0"/>
-                <w:lang w:eastAsia="en-AU"/>
-                <w14:ligatures w14:val="none"/>
+                <w:b/>
+                <w:bCs/>
               </w:rPr>
-              <w:t>, by mathematical definition</w:t>
+              <w:t xml:space="preserve"> not text, </w:t>
+            </w:r>
+            <w:r>
+              <w:rPr>
+                <w:b/>
+                <w:bCs/>
+              </w:rPr>
+              <w:t xml:space="preserve">not </w:t>
+            </w:r>
+            <w:r>
+              <w:rPr>
+                <w:b/>
+                <w:bCs/>
+              </w:rPr>
+              <w:t>missing</w:t>
             </w:r>
           </w:p>
         </w:tc>
         <w:tc>
           <w:tcPr>
-            <w:tcW w:w="1985" w:type="dxa"/>
+            <w:tcW w:w="0" w:type="auto"/>
+            <w:vAlign w:val="center"/>
+            <w:hideMark/>
           </w:tcPr>
           <w:p>
             <w:pPr>
               <w:rPr>
-                <w:rFonts w:ascii="Cambria" w:eastAsia="Times New Roman" w:hAnsi="Cambria" w:cs="Calibri"/>
-                <w:kern w:val="0"/>
-                <w:lang w:eastAsia="en-AU"/>
-                <w14:ligatures w14:val="none"/>
+                <w:b/>
+                <w:bCs/>
               </w:rPr>
             </w:pPr>
             <w:r>
               <w:rPr>
-                <w:rFonts w:ascii="Cambria" w:eastAsia="Times New Roman" w:hAnsi="Cambria" w:cs="Calibri"/>
-                <w:kern w:val="0"/>
-                <w:lang w:eastAsia="en-AU"/>
-                <w14:ligatures w14:val="none"/>
+                <w:b/>
+                <w:bCs/>
               </w:rPr>
-              <w:t>True for any valid significance test, regardless of method</w:t>
+              <w:t xml:space="preserve">Never references what the number </w:t>
+            </w:r>
+            <w:r>
+              <w:rPr>
+                <w:b/>
+                <w:bCs/>
+                <w:i/>
+                <w:iCs/>
+              </w:rPr>
+              <w:t>means</w:t>
+            </w:r>
+            <w:r>
+              <w:rPr>
+                <w:b/>
+                <w:bCs/>
+              </w:rPr>
+              <w:t xml:space="preserve"> or which method produced it </w:t>
+            </w:r>
+            <w:r>
+              <w:rPr>
+                <w:b/>
+                <w:bCs/>
+              </w:rPr>
+              <w:t xml:space="preserve">- </w:t>
+            </w:r>
+            <w:r>
+              <w:rPr>
+                <w:b/>
+                <w:bCs/>
+              </w:rPr>
+              <w:t>works for any statistic, any task</w:t>
             </w:r>
           </w:p>
         </w:tc>
       </w:tr>
       <w:tr>
         <w:trPr>
-          <w:trHeight w:val="1014"/>
+          <w:tblCellSpacing w:w="15" w:type="dxa"/>
         </w:trPr>
         <w:tc>
           <w:tcPr>
-            <w:tcW w:w="2689" w:type="dxa"/>
+            <w:tcW w:w="2224" w:type="dxa"/>
+            <w:vAlign w:val="center"/>
+            <w:hideMark/>
           </w:tcPr>
           <w:p>
             <w:pPr>
               <w:rPr>
-                <w:rFonts w:ascii="Cambria" w:eastAsia="Times New Roman" w:hAnsi="Cambria" w:cs="Calibri"/>
-                <w:kern w:val="0"/>
-                <w:lang w:eastAsia="en-AU"/>
-                <w14:ligatures w14:val="none"/>
+                <w:b/>
+                <w:bCs/>
               </w:rPr>
             </w:pPr>
             <w:r>
               <w:rPr>
-                <w:rFonts w:ascii="Cambria" w:eastAsia="Times New Roman" w:hAnsi="Cambria" w:cs="Calibri"/>
                 <w:b/>
                 <w:bCs/>
-                <w:kern w:val="0"/>
-                <w:lang w:eastAsia="en-AU"/>
-                <w14:ligatures w14:val="none"/>
               </w:rPr>
-              <w:t>Variable-reference, not hardcoded</w:t>
-            </w:r>
-            <w:r>
-              <w:rPr>
-                <w:rFonts w:ascii="Cambria" w:eastAsia="Times New Roman" w:hAnsi="Cambria" w:cs="Calibri"/>
-                <w:kern w:val="0"/>
-                <w:lang w:eastAsia="en-AU"/>
-                <w14:ligatures w14:val="none"/>
-              </w:rPr>
-              <w:t xml:space="preserve"> ("statistical method = Global Moran's I) – Instead </w:t>
-            </w:r>
-            <w:r>
-              <w:rPr>
-                <w:rFonts w:ascii="Cambria" w:eastAsia="Times New Roman" w:hAnsi="Cambria" w:cs="Calibri"/>
-                <w:kern w:val="0"/>
-                <w:lang w:eastAsia="en-AU"/>
-                <w14:ligatures w14:val="none"/>
-              </w:rPr>
-              <w:t>of giving</w:t>
-            </w:r>
-            <w:r>
-              <w:rPr>
-                <w:rFonts w:ascii="Cambria" w:eastAsia="Times New Roman" w:hAnsi="Cambria" w:cs="Calibri"/>
-                <w:kern w:val="0"/>
-                <w:lang w:eastAsia="en-AU"/>
-                <w14:ligatures w14:val="none"/>
-              </w:rPr>
-              <w:t xml:space="preserve"> a number giving </w:t>
-            </w:r>
-            <w:proofErr w:type="gramStart"/>
-            <w:r>
-              <w:rPr>
-                <w:rFonts w:ascii="Cambria" w:eastAsia="Times New Roman" w:hAnsi="Cambria" w:cs="Calibri"/>
-                <w:kern w:val="0"/>
-                <w:lang w:eastAsia="en-AU"/>
-                <w14:ligatures w14:val="none"/>
-              </w:rPr>
-              <w:t>hardcoded  values</w:t>
-            </w:r>
-            <w:proofErr w:type="gramEnd"/>
-            <w:r>
-              <w:rPr>
-                <w:rFonts w:ascii="Cambria" w:eastAsia="Times New Roman" w:hAnsi="Cambria" w:cs="Calibri"/>
-                <w:kern w:val="0"/>
-                <w:lang w:eastAsia="en-AU"/>
-                <w14:ligatures w14:val="none"/>
-              </w:rPr>
-              <w:t xml:space="preserve">, or </w:t>
-            </w:r>
-            <w:r>
-              <w:rPr>
-                <w:rFonts w:ascii="Cambria" w:eastAsia="Times New Roman" w:hAnsi="Cambria" w:cs="Calibri"/>
-                <w:kern w:val="0"/>
-                <w:lang w:eastAsia="en-AU"/>
-                <w14:ligatures w14:val="none"/>
-              </w:rPr>
-              <w:t>in place</w:t>
-            </w:r>
-            <w:r>
-              <w:rPr>
-                <w:rFonts w:ascii="Cambria" w:eastAsia="Times New Roman" w:hAnsi="Cambria" w:cs="Calibri"/>
-                <w:kern w:val="0"/>
-                <w:lang w:eastAsia="en-AU"/>
-                <w14:ligatures w14:val="none"/>
-              </w:rPr>
-              <w:t xml:space="preserve"> of value giving string like Global Moran's I</w:t>
+              <w:t>2. Finite secondary measures</w:t>
             </w:r>
           </w:p>
         </w:tc>
         <w:tc>
           <w:tcPr>
-            <w:tcW w:w="4579" w:type="dxa"/>
+            <w:tcW w:w="0" w:type="auto"/>
+            <w:vAlign w:val="center"/>
+            <w:hideMark/>
           </w:tcPr>
           <w:p>
             <w:pPr>
               <w:rPr>
-                <w:rFonts w:ascii="Cambria" w:eastAsia="Times New Roman" w:hAnsi="Cambria" w:cs="Calibri"/>
-                <w:kern w:val="0"/>
-                <w:lang w:eastAsia="en-AU"/>
-                <w14:ligatures w14:val="none"/>
+                <w:b/>
+                <w:bCs/>
               </w:rPr>
             </w:pPr>
             <w:r>
               <w:rPr>
-                <w:rFonts w:ascii="Cambria" w:eastAsia="Times New Roman" w:hAnsi="Cambria" w:cs="Calibri"/>
-                <w:kern w:val="0"/>
-                <w:lang w:eastAsia="en-AU"/>
-                <w14:ligatures w14:val="none"/>
+                <w:b/>
+                <w:bCs/>
               </w:rPr>
-              <w:t>Provenance / no fabrication</w:t>
+              <w:t>If a second number was reported (e.g. a p-value), confirms it's also finite</w:t>
             </w:r>
           </w:p>
         </w:tc>
         <w:tc>
           <w:tcPr>
-            <w:tcW w:w="1985" w:type="dxa"/>
+            <w:tcW w:w="0" w:type="auto"/>
+            <w:vAlign w:val="center"/>
+            <w:hideMark/>
           </w:tcPr>
           <w:p>
             <w:pPr>
               <w:rPr>
-                <w:rFonts w:ascii="Cambria" w:eastAsia="Times New Roman" w:hAnsi="Cambria" w:cs="Calibri"/>
-                <w:kern w:val="0"/>
-                <w:lang w:eastAsia="en-AU"/>
-                <w14:ligatures w14:val="none"/>
+                <w:b/>
+                <w:bCs/>
               </w:rPr>
             </w:pPr>
             <w:r>
               <w:rPr>
-                <w:rFonts w:ascii="Cambria" w:eastAsia="Times New Roman" w:hAnsi="Cambria" w:cs="Calibri"/>
-                <w:kern w:val="0"/>
-                <w:lang w:eastAsia="en-AU"/>
-                <w14:ligatures w14:val="none"/>
+                <w:b/>
+                <w:bCs/>
               </w:rPr>
-              <w:t xml:space="preserve">A standard reproducible-research </w:t>
+              <w:t xml:space="preserve">Doesn't assume every task needs a second number </w:t>
             </w:r>
             <w:r>
               <w:rPr>
-                <w:rFonts w:ascii="Cambria" w:eastAsia="Times New Roman" w:hAnsi="Cambria" w:cs="Calibri"/>
-                <w:kern w:val="0"/>
-                <w:lang w:eastAsia="en-AU"/>
-                <w14:ligatures w14:val="none"/>
+                <w:b/>
+                <w:bCs/>
               </w:rPr>
-              <w:t>requirement</w:t>
+              <w:t>-</w:t>
             </w:r>
             <w:r>
               <w:rPr>
-                <w:rFonts w:ascii="Cambria" w:eastAsia="Times New Roman" w:hAnsi="Cambria" w:cs="Calibri"/>
-                <w:kern w:val="0"/>
-                <w:lang w:eastAsia="en-AU"/>
-                <w14:ligatures w14:val="none"/>
+                <w:b/>
+                <w:bCs/>
               </w:rPr>
-              <w:t>,</w:t>
+              <w:t xml:space="preserve"> only checks it </w:t>
             </w:r>
             <w:r>
               <w:rPr>
-                <w:rFonts w:ascii="Cambria" w:eastAsia="Times New Roman" w:hAnsi="Cambria" w:cs="Calibri"/>
-                <w:kern w:val="0"/>
-                <w:lang w:eastAsia="en-AU"/>
-                <w14:ligatures w14:val="none"/>
+                <w:b/>
+                <w:bCs/>
+                <w:i/>
+                <w:iCs/>
               </w:rPr>
-              <w:t xml:space="preserve"> a</w:t>
+              <w:t>if</w:t>
             </w:r>
             <w:r>
               <w:rPr>
-                <w:rFonts w:ascii="Cambria" w:eastAsia="Times New Roman" w:hAnsi="Cambria" w:cs="Calibri"/>
-                <w:kern w:val="0"/>
-                <w:lang w:eastAsia="en-AU"/>
-                <w14:ligatures w14:val="none"/>
+                <w:b/>
+                <w:bCs/>
               </w:rPr>
-              <w:t xml:space="preserve"> reported number must trace to real computation</w:t>
+              <w:t xml:space="preserve"> one was given</w:t>
             </w:r>
           </w:p>
         </w:tc>
       </w:tr>
       <w:tr>
         <w:trPr>
-          <w:trHeight w:val="1061"/>
+          <w:tblCellSpacing w:w="15" w:type="dxa"/>
         </w:trPr>
         <w:tc>
           <w:tcPr>
-            <w:tcW w:w="2689" w:type="dxa"/>
+            <w:tcW w:w="2224" w:type="dxa"/>
+            <w:vAlign w:val="center"/>
+            <w:hideMark/>
           </w:tcPr>
           <w:p>
             <w:pPr>
               <w:rPr>
-                <w:rFonts w:ascii="Cambria" w:eastAsia="Times New Roman" w:hAnsi="Cambria" w:cs="Calibri"/>
-                <w:kern w:val="0"/>
-                <w:lang w:eastAsia="en-AU"/>
-                <w14:ligatures w14:val="none"/>
+                <w:b/>
+                <w:bCs/>
               </w:rPr>
             </w:pPr>
             <w:r>
               <w:rPr>
-                <w:rFonts w:ascii="Cambria" w:eastAsia="Times New Roman" w:hAnsi="Cambria" w:cs="Calibri"/>
                 <w:b/>
                 <w:bCs/>
-                <w:kern w:val="0"/>
-                <w:lang w:eastAsia="en-AU"/>
-                <w14:ligatures w14:val="none"/>
               </w:rPr>
-              <w:t>Permutation count</w:t>
-            </w:r>
-            <w:r>
-              <w:rPr>
-                <w:rFonts w:ascii="Cambria" w:eastAsia="Times New Roman" w:hAnsi="Cambria" w:cs="Calibri"/>
-                <w:kern w:val="0"/>
-                <w:lang w:eastAsia="en-AU"/>
-                <w14:ligatures w14:val="none"/>
-              </w:rPr>
-              <w:t xml:space="preserve"> ≥ 500</w:t>
+              <w:t>3. Real variable reference</w:t>
             </w:r>
           </w:p>
         </w:tc>
         <w:tc>
           <w:tcPr>
-            <w:tcW w:w="4579" w:type="dxa"/>
+            <w:tcW w:w="0" w:type="auto"/>
+            <w:vAlign w:val="center"/>
+            <w:hideMark/>
           </w:tcPr>
           <w:p>
             <w:pPr>
               <w:rPr>
-                <w:rFonts w:ascii="Cambria" w:eastAsia="Times New Roman" w:hAnsi="Cambria" w:cs="Calibri"/>
-                <w:kern w:val="0"/>
-                <w:lang w:eastAsia="en-AU"/>
-                <w14:ligatures w14:val="none"/>
+                <w:b/>
+                <w:bCs/>
               </w:rPr>
             </w:pPr>
             <w:r>
               <w:rPr>
-                <w:rFonts w:ascii="Cambria" w:eastAsia="Times New Roman" w:hAnsi="Cambria" w:cs="Calibri"/>
-                <w:kern w:val="0"/>
-                <w:lang w:eastAsia="en-AU"/>
-                <w14:ligatures w14:val="none"/>
+                <w:b/>
+                <w:bCs/>
               </w:rPr>
-              <w:t>Enforcing own stated methodology</w:t>
+              <w:t>Confirms the final answer's number was pulled from an actual computed variable in the code (an f-string with a placeholder), not typed by hand as a guess</w:t>
             </w:r>
           </w:p>
         </w:tc>
         <w:tc>
           <w:tcPr>
-            <w:tcW w:w="1985" w:type="dxa"/>
+            <w:tcW w:w="0" w:type="auto"/>
+            <w:vAlign w:val="center"/>
+            <w:hideMark/>
           </w:tcPr>
           <w:p>
             <w:pPr>
               <w:rPr>
-                <w:rFonts w:ascii="Cambria" w:eastAsia="Times New Roman" w:hAnsi="Cambria" w:cs="Calibri"/>
-                <w:kern w:val="0"/>
-                <w:lang w:eastAsia="en-AU"/>
-                <w14:ligatures w14:val="none"/>
+                <w:b/>
+                <w:bCs/>
               </w:rPr>
             </w:pPr>
             <w:r>
               <w:rPr>
-                <w:rFonts w:ascii="Cambria" w:eastAsia="Times New Roman" w:hAnsi="Cambria" w:cs="Calibri"/>
-                <w:kern w:val="0"/>
-                <w:lang w:eastAsia="en-AU"/>
-                <w14:ligatures w14:val="none"/>
+                <w:b/>
+                <w:bCs/>
               </w:rPr>
-              <w:t xml:space="preserve">This was already in </w:t>
+              <w:t xml:space="preserve">Checks code structure only </w:t>
             </w:r>
             <w:r>
               <w:rPr>
-                <w:rFonts w:ascii="Cambria" w:eastAsia="Times New Roman" w:hAnsi="Cambria" w:cs="Calibri"/>
-                <w:kern w:val="0"/>
-                <w:lang w:eastAsia="en-AU"/>
-                <w14:ligatures w14:val="none"/>
+                <w:b/>
+                <w:bCs/>
               </w:rPr>
-              <w:t>the</w:t>
+              <w:t>-</w:t>
             </w:r>
             <w:r>
               <w:rPr>
-                <w:rFonts w:ascii="Cambria" w:eastAsia="Times New Roman" w:hAnsi="Cambria" w:cs="Calibri"/>
-                <w:kern w:val="0"/>
-                <w:lang w:eastAsia="en-AU"/>
-                <w14:ligatures w14:val="none"/>
+                <w:b/>
+                <w:bCs/>
               </w:rPr>
-              <w:t xml:space="preserve"> original prompt for every model on every task the check just verifies compliance, it isn't new</w:t>
+              <w:t>applies to any statistic, any print statement</w:t>
             </w:r>
           </w:p>
         </w:tc>
       </w:tr>
       <w:tr>
         <w:trPr>
-          <w:trHeight w:val="1061"/>
+          <w:tblCellSpacing w:w="15" w:type="dxa"/>
         </w:trPr>
         <w:tc>
           <w:tcPr>
-            <w:tcW w:w="2689" w:type="dxa"/>
+            <w:tcW w:w="2224" w:type="dxa"/>
+            <w:vAlign w:val="center"/>
+            <w:hideMark/>
           </w:tcPr>
           <w:p>
             <w:pPr>
               <w:rPr>
-                <w:rFonts w:ascii="Cambria" w:eastAsia="Times New Roman" w:hAnsi="Cambria" w:cs="Calibri"/>
                 <w:b/>
                 <w:bCs/>
-                <w:kern w:val="0"/>
-                <w:lang w:eastAsia="en-AU"/>
-                <w14:ligatures w14:val="none"/>
               </w:rPr>
             </w:pPr>
-            <w:proofErr w:type="spellStart"/>
             <w:r>
               <w:rPr>
-                <w:rFonts w:ascii="Cambria" w:eastAsia="Times New Roman" w:hAnsi="Cambria" w:cs="Calibri"/>
                 <w:b/>
                 <w:bCs/>
-                <w:kern w:val="0"/>
-                <w:lang w:eastAsia="en-AU"/>
-                <w14:ligatures w14:val="none"/>
               </w:rPr>
-              <w:t>n_used</w:t>
+              <w:t>4. Data-points reconciliation</w:t>
             </w:r>
-            <w:proofErr w:type="spellEnd"/>
+          </w:p>
+        </w:tc>
+        <w:tc>
+          <w:tcPr>
+            <w:tcW w:w="0" w:type="auto"/>
+            <w:vAlign w:val="center"/>
+            <w:hideMark/>
+          </w:tcPr>
+          <w:p>
+            <w:pPr>
+              <w:rPr>
+                <w:b/>
+                <w:bCs/>
+              </w:rPr>
+            </w:pPr>
             <w:r>
               <w:rPr>
-                <w:rFonts w:ascii="Cambria" w:eastAsia="Times New Roman" w:hAnsi="Cambria" w:cs="Calibri"/>
                 <w:b/>
                 <w:bCs/>
-                <w:kern w:val="0"/>
-                <w:lang w:eastAsia="en-AU"/>
-                <w14:ligatures w14:val="none"/>
               </w:rPr>
-              <w:t xml:space="preserve"> reconciliation</w:t>
+              <w:t>Confirms the number of data points the model claims to have used matches what the dataset actually contains</w:t>
             </w:r>
           </w:p>
           <w:p>
             <w:pPr>
               <w:rPr>
-                <w:rFonts w:ascii="Cambria" w:eastAsia="Times New Roman" w:hAnsi="Cambria" w:cs="Calibri"/>
-                <w:kern w:val="0"/>
-                <w:lang w:eastAsia="en-AU"/>
-                <w14:ligatures w14:val="none"/>
+                <w:b/>
+                <w:bCs/>
               </w:rPr>
             </w:pPr>
           </w:p>
           <w:p>
             <w:pPr>
               <w:rPr>
-                <w:rFonts w:ascii="Cambria" w:eastAsia="Times New Roman" w:hAnsi="Cambria" w:cs="Calibri"/>
-                <w:kern w:val="0"/>
-                <w:lang w:eastAsia="en-AU"/>
-                <w14:ligatures w14:val="none"/>
-              </w:rPr>
-            </w:pPr>
-            <w:proofErr w:type="spellStart"/>
-            <w:r>
-              <w:rPr>
-                <w:rFonts w:ascii="Cambria" w:eastAsia="Times New Roman" w:hAnsi="Cambria" w:cs="Calibri"/>
-                <w:kern w:val="0"/>
-                <w:lang w:eastAsia="en-AU"/>
-                <w14:ligatures w14:val="none"/>
-              </w:rPr>
-              <w:t>expected_n_used</w:t>
-            </w:r>
-            <w:proofErr w:type="spellEnd"/>
-            <w:r>
-              <w:rPr>
-                <w:rFonts w:ascii="Cambria" w:eastAsia="Times New Roman" w:hAnsi="Cambria" w:cs="Calibri"/>
-                <w:kern w:val="0"/>
-                <w:lang w:eastAsia="en-AU"/>
-                <w14:ligatures w14:val="none"/>
-              </w:rPr>
-              <w:t xml:space="preserve"> = 33 </w:t>
-            </w:r>
-            <w:r>
-              <w:rPr>
-                <w:rFonts w:ascii="Cambria" w:eastAsia="Times New Roman" w:hAnsi="Cambria" w:cs="Calibri"/>
-                <w:kern w:val="0"/>
-                <w:lang w:eastAsia="en-AU"/>
-                <w14:ligatures w14:val="none"/>
-              </w:rPr>
-              <w:t>-</w:t>
-            </w:r>
-            <w:proofErr w:type="spellStart"/>
-            <w:r>
-              <w:rPr>
-                <w:rFonts w:ascii="Cambria" w:eastAsia="Times New Roman" w:hAnsi="Cambria" w:cs="Calibri"/>
-                <w:kern w:val="0"/>
-                <w:lang w:eastAsia="en-AU"/>
-                <w14:ligatures w14:val="none"/>
-              </w:rPr>
-              <w:t>profile_output</w:t>
-            </w:r>
-            <w:proofErr w:type="spellEnd"/>
-            <w:r>
-              <w:rPr>
-                <w:rFonts w:ascii="Cambria" w:eastAsia="Times New Roman" w:hAnsi="Cambria" w:cs="Calibri"/>
-                <w:kern w:val="0"/>
-                <w:lang w:eastAsia="en-AU"/>
-                <w14:ligatures w14:val="none"/>
-              </w:rPr>
-              <w:t>["</w:t>
-            </w:r>
-            <w:proofErr w:type="spellStart"/>
-            <w:r>
-              <w:rPr>
-                <w:rFonts w:ascii="Cambria" w:eastAsia="Times New Roman" w:hAnsi="Cambria" w:cs="Calibri"/>
-                <w:kern w:val="0"/>
-                <w:lang w:eastAsia="en-AU"/>
-                <w14:ligatures w14:val="none"/>
-              </w:rPr>
-              <w:t>missing_count_for_this_column</w:t>
-            </w:r>
-            <w:proofErr w:type="spellEnd"/>
-            <w:r>
-              <w:rPr>
-                <w:rFonts w:ascii="Cambria" w:eastAsia="Times New Roman" w:hAnsi="Cambria" w:cs="Calibri"/>
-                <w:kern w:val="0"/>
-                <w:lang w:eastAsia="en-AU"/>
-                <w14:ligatures w14:val="none"/>
-              </w:rPr>
-              <w:t>"]</w:t>
-            </w:r>
-          </w:p>
-          <w:p>
-            <w:pPr>
-              <w:rPr>
-                <w:rFonts w:ascii="Cambria" w:eastAsia="Times New Roman" w:hAnsi="Cambria" w:cs="Calibri"/>
-                <w:kern w:val="0"/>
-                <w:lang w:eastAsia="en-AU"/>
-                <w14:ligatures w14:val="none"/>
+                <w:b/>
+                <w:bCs/>
               </w:rPr>
             </w:pPr>
             <w:r>
               <w:rPr>
-                <w:rFonts w:ascii="Cambria" w:eastAsia="Times New Roman" w:hAnsi="Cambria" w:cs="Calibri"/>
-                <w:kern w:val="0"/>
-                <w:lang w:eastAsia="en-AU"/>
-                <w14:ligatures w14:val="none"/>
+                <w:b/>
+                <w:bCs/>
               </w:rPr>
-              <w:t xml:space="preserve"> </w:t>
-            </w:r>
-          </w:p>
-          <w:p>
-            <w:pPr>
-              <w:rPr>
-                <w:rFonts w:ascii="Cambria" w:eastAsia="Times New Roman" w:hAnsi="Cambria" w:cs="Calibri"/>
-                <w:kern w:val="0"/>
-                <w:lang w:eastAsia="en-AU"/>
-                <w14:ligatures w14:val="none"/>
-              </w:rPr>
-            </w:pPr>
-            <w:proofErr w:type="spellStart"/>
-            <w:r>
-              <w:rPr>
-                <w:rFonts w:ascii="Cambria" w:eastAsia="Times New Roman" w:hAnsi="Cambria" w:cs="Calibri"/>
-                <w:kern w:val="0"/>
-                <w:lang w:eastAsia="en-AU"/>
-                <w14:ligatures w14:val="none"/>
-              </w:rPr>
-              <w:t>actual_n_used</w:t>
-            </w:r>
-            <w:proofErr w:type="spellEnd"/>
-            <w:r>
-              <w:rPr>
-                <w:rFonts w:ascii="Cambria" w:eastAsia="Times New Roman" w:hAnsi="Cambria" w:cs="Calibri"/>
-                <w:kern w:val="0"/>
-                <w:lang w:eastAsia="en-AU"/>
-                <w14:ligatures w14:val="none"/>
-              </w:rPr>
-              <w:t xml:space="preserve"> = parsed from Coder's printed </w:t>
-            </w:r>
-          </w:p>
-          <w:p>
-            <w:pPr>
-              <w:rPr>
-                <w:rFonts w:ascii="Cambria" w:eastAsia="Times New Roman" w:hAnsi="Cambria" w:cs="Calibri"/>
-                <w:kern w:val="0"/>
-                <w:lang w:eastAsia="en-AU"/>
-                <w14:ligatures w14:val="none"/>
-              </w:rPr>
-            </w:pPr>
-          </w:p>
-          <w:p>
-            <w:pPr>
-              <w:rPr>
-                <w:rFonts w:ascii="Cambria" w:eastAsia="Times New Roman" w:hAnsi="Cambria" w:cs="Calibri"/>
-                <w:kern w:val="0"/>
-                <w:lang w:eastAsia="en-AU"/>
-                <w14:ligatures w14:val="none"/>
-              </w:rPr>
-            </w:pPr>
-            <w:r>
-              <w:rPr>
-                <w:rFonts w:ascii="Cambria" w:eastAsia="Times New Roman" w:hAnsi="Cambria" w:cs="Calibri"/>
-                <w:kern w:val="0"/>
-                <w:lang w:eastAsia="en-AU"/>
-                <w14:ligatures w14:val="none"/>
-              </w:rPr>
-              <w:t>"</w:t>
-            </w:r>
-            <w:proofErr w:type="spellStart"/>
-            <w:r>
-              <w:rPr>
-                <w:rFonts w:ascii="Cambria" w:eastAsia="Times New Roman" w:hAnsi="Cambria" w:cs="Calibri"/>
-                <w:kern w:val="0"/>
-                <w:lang w:eastAsia="en-AU"/>
-                <w14:ligatures w14:val="none"/>
-              </w:rPr>
-              <w:t>n_used</w:t>
-            </w:r>
-            <w:proofErr w:type="spellEnd"/>
-            <w:r>
-              <w:rPr>
-                <w:rFonts w:ascii="Cambria" w:eastAsia="Times New Roman" w:hAnsi="Cambria" w:cs="Calibri"/>
-                <w:kern w:val="0"/>
-                <w:lang w:eastAsia="en-AU"/>
-                <w14:ligatures w14:val="none"/>
-              </w:rPr>
-              <w:t xml:space="preserve"> = X" IF </w:t>
-            </w:r>
-            <w:proofErr w:type="spellStart"/>
-            <w:r>
-              <w:rPr>
-                <w:rFonts w:ascii="Cambria" w:eastAsia="Times New Roman" w:hAnsi="Cambria" w:cs="Calibri"/>
-                <w:kern w:val="0"/>
-                <w:lang w:eastAsia="en-AU"/>
-                <w14:ligatures w14:val="none"/>
-              </w:rPr>
-              <w:t>actual_n_</w:t>
-            </w:r>
-            <w:proofErr w:type="gramStart"/>
-            <w:r>
-              <w:rPr>
-                <w:rFonts w:ascii="Cambria" w:eastAsia="Times New Roman" w:hAnsi="Cambria" w:cs="Calibri"/>
-                <w:kern w:val="0"/>
-                <w:lang w:eastAsia="en-AU"/>
-                <w14:ligatures w14:val="none"/>
-              </w:rPr>
-              <w:t>used</w:t>
-            </w:r>
-            <w:proofErr w:type="spellEnd"/>
-            <w:r>
-              <w:rPr>
-                <w:rFonts w:ascii="Cambria" w:eastAsia="Times New Roman" w:hAnsi="Cambria" w:cs="Calibri"/>
-                <w:kern w:val="0"/>
-                <w:lang w:eastAsia="en-AU"/>
-                <w14:ligatures w14:val="none"/>
-              </w:rPr>
-              <w:t xml:space="preserve"> !</w:t>
-            </w:r>
-            <w:proofErr w:type="gramEnd"/>
-            <w:r>
-              <w:rPr>
-                <w:rFonts w:ascii="Cambria" w:eastAsia="Times New Roman" w:hAnsi="Cambria" w:cs="Calibri"/>
-                <w:kern w:val="0"/>
-                <w:lang w:eastAsia="en-AU"/>
-                <w14:ligatures w14:val="none"/>
-              </w:rPr>
-              <w:t xml:space="preserve">= </w:t>
-            </w:r>
-            <w:proofErr w:type="spellStart"/>
-            <w:r>
-              <w:rPr>
-                <w:rFonts w:ascii="Cambria" w:eastAsia="Times New Roman" w:hAnsi="Cambria" w:cs="Calibri"/>
-                <w:kern w:val="0"/>
-                <w:lang w:eastAsia="en-AU"/>
-                <w14:ligatures w14:val="none"/>
-              </w:rPr>
-              <w:t>expected_n_used</w:t>
-            </w:r>
-            <w:proofErr w:type="spellEnd"/>
-            <w:r>
-              <w:rPr>
-                <w:rFonts w:ascii="Cambria" w:eastAsia="Times New Roman" w:hAnsi="Cambria" w:cs="Calibri"/>
-                <w:kern w:val="0"/>
-                <w:lang w:eastAsia="en-AU"/>
-                <w14:ligatures w14:val="none"/>
-              </w:rPr>
-              <w:t>:</w:t>
+              <w:t>Data counts – missing from planner agent == data points found by coder</w:t>
             </w:r>
           </w:p>
         </w:tc>
         <w:tc>
           <w:tcPr>
-            <w:tcW w:w="4579" w:type="dxa"/>
+            <w:tcW w:w="0" w:type="auto"/>
+            <w:vAlign w:val="center"/>
+            <w:hideMark/>
           </w:tcPr>
           <w:p>
             <w:pPr>
               <w:rPr>
-                <w:rFonts w:ascii="Cambria" w:eastAsia="Times New Roman" w:hAnsi="Cambria" w:cs="Calibri"/>
-                <w:kern w:val="0"/>
-                <w:lang w:eastAsia="en-AU"/>
-                <w14:ligatures w14:val="none"/>
+                <w:b/>
+                <w:bCs/>
               </w:rPr>
             </w:pPr>
             <w:r>
               <w:rPr>
-                <w:rFonts w:ascii="Cambria" w:eastAsia="Times New Roman" w:hAnsi="Cambria" w:cs="Calibri"/>
-                <w:kern w:val="0"/>
-                <w:lang w:eastAsia="en-AU"/>
-                <w14:ligatures w14:val="none"/>
+                <w:b/>
+                <w:bCs/>
               </w:rPr>
-              <w:t xml:space="preserve">Data completeness </w:t>
+              <w:t xml:space="preserve">Uses only </w:t>
+            </w:r>
+            <w:proofErr w:type="spellStart"/>
+            <w:r>
+              <w:rPr>
+                <w:b/>
+                <w:bCs/>
+              </w:rPr>
+              <w:t>row_count</w:t>
+            </w:r>
+            <w:proofErr w:type="spellEnd"/>
+            <w:r>
+              <w:rPr>
+                <w:b/>
+                <w:bCs/>
+              </w:rPr>
+              <w:t xml:space="preserve"> and </w:t>
+            </w:r>
+            <w:proofErr w:type="spellStart"/>
+            <w:r>
+              <w:rPr>
+                <w:b/>
+                <w:bCs/>
+              </w:rPr>
+              <w:t>data_points_used</w:t>
+            </w:r>
+            <w:proofErr w:type="spellEnd"/>
+            <w:r>
+              <w:rPr>
+                <w:b/>
+                <w:bCs/>
+              </w:rPr>
+              <w:t xml:space="preserve"> </w:t>
             </w:r>
             <w:r>
               <w:rPr>
-                <w:rFonts w:ascii="Cambria" w:eastAsia="Times New Roman" w:hAnsi="Cambria" w:cs="Calibri"/>
-                <w:kern w:val="0"/>
-                <w:lang w:eastAsia="en-AU"/>
-                <w14:ligatures w14:val="none"/>
+                <w:b/>
+                <w:bCs/>
               </w:rPr>
-              <w:t>accounting standard</w:t>
+              <w:t>-</w:t>
             </w:r>
             <w:r>
               <w:rPr>
-                <w:rFonts w:ascii="Cambria" w:eastAsia="Times New Roman" w:hAnsi="Cambria" w:cs="Calibri"/>
-                <w:kern w:val="0"/>
-                <w:lang w:eastAsia="en-AU"/>
-                <w14:ligatures w14:val="none"/>
+                <w:b/>
+                <w:bCs/>
               </w:rPr>
-              <w:t xml:space="preserve"> practice in any analysis involving exclusions</w:t>
-            </w:r>
-          </w:p>
-        </w:tc>
-        <w:tc>
-          <w:tcPr>
-            <w:tcW w:w="1985" w:type="dxa"/>
-          </w:tcPr>
-          <w:p>
-            <w:pPr>
-              <w:rPr>
-                <w:rFonts w:ascii="Cambria" w:eastAsia="Times New Roman" w:hAnsi="Cambria" w:cs="Calibri"/>
-                <w:kern w:val="0"/>
-                <w:lang w:eastAsia="en-AU"/>
-                <w14:ligatures w14:val="none"/>
-              </w:rPr>
-            </w:pPr>
-            <w:r>
-              <w:rPr>
-                <w:rFonts w:ascii="Cambria" w:eastAsia="Times New Roman" w:hAnsi="Cambria" w:cs="Calibri"/>
-                <w:kern w:val="0"/>
-                <w:lang w:eastAsia="en-AU"/>
-                <w14:ligatures w14:val="none"/>
-              </w:rPr>
-              <w:t>A domain-general requirement wherever data can be legitimately excluded</w:t>
+              <w:t xml:space="preserve"> concepts every task already reports, regardless of subject matter</w:t>
             </w:r>
           </w:p>
         </w:tc>
       </w:tr>
       <w:tr>
         <w:trPr>
-          <w:trHeight w:val="1061"/>
+          <w:trHeight w:val="1770"/>
+          <w:tblCellSpacing w:w="15" w:type="dxa"/>
         </w:trPr>
         <w:tc>
           <w:tcPr>
-            <w:tcW w:w="2689" w:type="dxa"/>
+            <w:tcW w:w="2224" w:type="dxa"/>
+            <w:vAlign w:val="center"/>
+            <w:hideMark/>
           </w:tcPr>
           <w:p>
             <w:pPr>
               <w:rPr>
-                <w:rFonts w:ascii="Times New Roman" w:eastAsia="Times New Roman" w:hAnsi="Times New Roman" w:cs="Times New Roman"/>
                 <w:b/>
                 <w:bCs/>
-                <w:kern w:val="0"/>
-                <w:lang w:eastAsia="en-AU"/>
-                <w14:ligatures w14:val="none"/>
               </w:rPr>
             </w:pPr>
             <w:r>
               <w:rPr>
-                <w:rFonts w:ascii="Times New Roman" w:eastAsia="Times New Roman" w:hAnsi="Times New Roman" w:cs="Times New Roman"/>
                 <w:b/>
                 <w:bCs/>
-                <w:kern w:val="0"/>
-                <w:lang w:eastAsia="en-AU"/>
-                <w14:ligatures w14:val="none"/>
               </w:rPr>
-              <w:lastRenderedPageBreak/>
-              <w:t>Re-execution determinism-</w:t>
-            </w:r>
-          </w:p>
-          <w:p>
-            <w:pPr>
-              <w:rPr>
-                <w:rFonts w:ascii="Times New Roman" w:eastAsia="Times New Roman" w:hAnsi="Times New Roman" w:cs="Times New Roman"/>
-                <w:kern w:val="0"/>
-                <w:lang w:eastAsia="en-AU"/>
-                <w14:ligatures w14:val="none"/>
-              </w:rPr>
-            </w:pPr>
-            <w:r>
-              <w:rPr>
-                <w:rFonts w:ascii="Times New Roman" w:eastAsia="Times New Roman" w:hAnsi="Times New Roman" w:cs="Times New Roman"/>
-                <w:kern w:val="0"/>
-                <w:lang w:eastAsia="en-AU"/>
-                <w14:ligatures w14:val="none"/>
-              </w:rPr>
-              <w:t xml:space="preserve">the sandbox re-runs the </w:t>
-            </w:r>
-            <w:r>
-              <w:rPr>
-                <w:rFonts w:ascii="Times New Roman" w:eastAsia="Times New Roman" w:hAnsi="Times New Roman" w:cs="Times New Roman"/>
-                <w:i/>
-                <w:iCs/>
-                <w:kern w:val="0"/>
-                <w:lang w:eastAsia="en-AU"/>
-                <w14:ligatures w14:val="none"/>
-              </w:rPr>
-              <w:t>exact same code</w:t>
-            </w:r>
-            <w:r>
-              <w:rPr>
-                <w:rFonts w:ascii="Times New Roman" w:eastAsia="Times New Roman" w:hAnsi="Times New Roman" w:cs="Times New Roman"/>
-                <w:kern w:val="0"/>
-                <w:lang w:eastAsia="en-AU"/>
-                <w14:ligatures w14:val="none"/>
-              </w:rPr>
-              <w:t xml:space="preserve"> a second time (free, no new LLM call); the observed test statistic must match across both runs (the permutation-based p-value is allowed to vary, the statistic itself should not)</w:t>
+              <w:t>5. Determinism</w:t>
             </w:r>
           </w:p>
         </w:tc>
         <w:tc>
           <w:tcPr>
-            <w:tcW w:w="4579" w:type="dxa"/>
+            <w:tcW w:w="0" w:type="auto"/>
+            <w:vAlign w:val="center"/>
+            <w:hideMark/>
           </w:tcPr>
           <w:p>
             <w:pPr>
               <w:rPr>
-                <w:rFonts w:ascii="Times New Roman" w:eastAsia="Times New Roman" w:hAnsi="Times New Roman" w:cs="Times New Roman"/>
-                <w:kern w:val="0"/>
-                <w:lang w:eastAsia="en-AU"/>
-                <w14:ligatures w14:val="none"/>
+                <w:b/>
+                <w:bCs/>
               </w:rPr>
             </w:pPr>
             <w:r>
               <w:rPr>
-                <w:rFonts w:ascii="Times New Roman" w:eastAsia="Times New Roman" w:hAnsi="Times New Roman" w:cs="Times New Roman"/>
-                <w:kern w:val="0"/>
-                <w:lang w:eastAsia="en-AU"/>
-                <w14:ligatures w14:val="none"/>
+                <w:b/>
+                <w:bCs/>
               </w:rPr>
-              <w:t>Reproducibility a</w:t>
+              <w:t xml:space="preserve">Re-runs the model's exact code once, independently, and checks the result matches </w:t>
             </w:r>
             <w:r>
               <w:rPr>
-                <w:rFonts w:ascii="Times New Roman" w:eastAsia="Times New Roman" w:hAnsi="Times New Roman" w:cs="Times New Roman"/>
-                <w:kern w:val="0"/>
-                <w:lang w:eastAsia="en-AU"/>
-                <w14:ligatures w14:val="none"/>
+                <w:b/>
+                <w:bCs/>
               </w:rPr>
-              <w:t xml:space="preserve"> cornerstone of scientific computing: same input, same </w:t>
+              <w:t xml:space="preserve"> </w:t>
             </w:r>
             <w:r>
               <w:rPr>
-                <w:rFonts w:ascii="Times New Roman" w:eastAsia="Times New Roman" w:hAnsi="Times New Roman" w:cs="Times New Roman"/>
-                <w:kern w:val="0"/>
-                <w:lang w:eastAsia="en-AU"/>
-                <w14:ligatures w14:val="none"/>
+                <w:b/>
+                <w:bCs/>
               </w:rPr>
-              <w:t>code same</w:t>
-            </w:r>
-            <w:r>
-              <w:rPr>
-                <w:rFonts w:ascii="Times New Roman" w:eastAsia="Times New Roman" w:hAnsi="Times New Roman" w:cs="Times New Roman"/>
-                <w:kern w:val="0"/>
-                <w:lang w:eastAsia="en-AU"/>
-                <w14:ligatures w14:val="none"/>
-              </w:rPr>
-              <w:t xml:space="preserve"> output</w:t>
+              <w:t xml:space="preserve"> catches hidden randomness or bugs</w:t>
             </w:r>
           </w:p>
         </w:tc>
         <w:tc>
           <w:tcPr>
-            <w:tcW w:w="1985" w:type="dxa"/>
+            <w:tcW w:w="0" w:type="auto"/>
+            <w:vAlign w:val="center"/>
+            <w:hideMark/>
           </w:tcPr>
           <w:p>
             <w:pPr>
               <w:rPr>
-                <w:rFonts w:ascii="Times New Roman" w:eastAsia="Times New Roman" w:hAnsi="Times New Roman" w:cs="Times New Roman"/>
-                <w:kern w:val="0"/>
-                <w:lang w:eastAsia="en-AU"/>
-                <w14:ligatures w14:val="none"/>
+                <w:b/>
+                <w:bCs/>
               </w:rPr>
             </w:pPr>
             <w:r>
               <w:rPr>
-                <w:rFonts w:ascii="Times New Roman" w:eastAsia="Times New Roman" w:hAnsi="Times New Roman" w:cs="Times New Roman"/>
-                <w:kern w:val="0"/>
-                <w:lang w:eastAsia="en-AU"/>
-                <w14:ligatures w14:val="none"/>
+                <w:b/>
+                <w:bCs/>
               </w:rPr>
-              <w:t>Universal property expected of any deterministic statistical computation, unrelated to spatial statistics specifically</w:t>
+              <w:t xml:space="preserve">Just compares two numbers from the same code </w:t>
+            </w:r>
+            <w:r>
+              <w:rPr>
+                <w:b/>
+                <w:bCs/>
+              </w:rPr>
+              <w:t>-</w:t>
+            </w:r>
+            <w:r>
+              <w:rPr>
+                <w:b/>
+                <w:bCs/>
+              </w:rPr>
+              <w:t xml:space="preserve"> no task-specific logic involved</w:t>
             </w:r>
           </w:p>
         </w:tc>
       </w:tr>
     </w:tbl>
-    <w:p>
-      <w:pPr>
-        <w:spacing w:after="0" w:line="240" w:lineRule="auto"/>
+    <w:p/>
+    <w:p>
+      <w:pPr>
+        <w:jc w:val="center"/>
+      </w:pPr>
+    </w:p>
+    <w:p>
+      <w:pPr>
+        <w:jc w:val="center"/>
+      </w:pPr>
+    </w:p>
+    <w:p>
+      <w:pPr>
+        <w:jc w:val="center"/>
         <w:rPr>
-          <w:rFonts w:ascii="Times New Roman" w:eastAsia="Times New Roman" w:hAnsi="Times New Roman" w:cs="Times New Roman"/>
           <w:b/>
           <w:bCs/>
-          <w:kern w:val="0"/>
-          <w:lang w:eastAsia="en-AU"/>
-          <w14:ligatures w14:val="none"/>
         </w:rPr>
       </w:pPr>
-    </w:p>
-    <w:p>
-      <w:r>
-        <w:tab/>
+      <w:r>
+        <w:rPr>
+          <w:b/>
+          <w:bCs/>
+        </w:rPr>
+        <w:lastRenderedPageBreak/>
+        <w:t xml:space="preserve">Common model mistakes found: </w:t>
+      </w:r>
+    </w:p>
+    <w:p>
+      <w:pPr>
+        <w:pStyle w:val="ListParagraph"/>
+        <w:numPr>
+          <w:ilvl w:val="0"/>
+          <w:numId w:val="28"/>
+        </w:numPr>
+        <w:jc w:val="both"/>
+      </w:pPr>
+      <w:r>
+        <w:rPr>
+          <w:b/>
+          <w:bCs/>
+        </w:rPr>
+        <w:t xml:space="preserve">Standardization calculation: </w:t>
+      </w:r>
+      <w:r>
+        <w:rPr>
+          <w:b/>
+          <w:bCs/>
+        </w:rPr>
+        <w:t xml:space="preserve">value </w:t>
+      </w:r>
+      <w:r>
+        <w:rPr>
+          <w:b/>
+          <w:bCs/>
+        </w:rPr>
+        <w:t>-</w:t>
+      </w:r>
+      <w:r>
+        <w:rPr>
+          <w:b/>
+          <w:bCs/>
+        </w:rPr>
+        <w:t xml:space="preserve"> average (a direct deviation from the mean)</w:t>
+      </w:r>
+      <w:r>
+        <w:t xml:space="preserve"> this is the </w:t>
+      </w:r>
+      <w:r>
+        <w:rPr>
+          <w:b/>
+          <w:bCs/>
+        </w:rPr>
+        <w:t>Outlier Detection (Iterative-R)</w:t>
+      </w:r>
+      <w:r>
+        <w:t xml:space="preserve"> task's core formula: z = (</w:t>
+      </w:r>
+      <w:proofErr w:type="spellStart"/>
+      <w:r>
+        <w:t>target_value</w:t>
+      </w:r>
+      <w:proofErr w:type="spellEnd"/>
+      <w:r>
+        <w:t xml:space="preserve"> -  </w:t>
+      </w:r>
+      <w:proofErr w:type="spellStart"/>
+      <w:r>
+        <w:t>mean_of_neighbors</w:t>
+      </w:r>
+      <w:proofErr w:type="spellEnd"/>
+      <w:r>
+        <w:t xml:space="preserve">) / </w:t>
+      </w:r>
+      <w:proofErr w:type="spellStart"/>
+      <w:r>
+        <w:t>std_of_neighbors</w:t>
+      </w:r>
+      <w:proofErr w:type="spellEnd"/>
+      <w:r>
+        <w:t>. A model that drops the subtraction and just uses the raw value computes a meaningless number</w:t>
+      </w:r>
+    </w:p>
+    <w:p>
+      <w:pPr>
+        <w:pStyle w:val="ListParagraph"/>
+        <w:jc w:val="both"/>
+      </w:pPr>
+    </w:p>
+    <w:p>
+      <w:pPr>
+        <w:pStyle w:val="ListParagraph"/>
+        <w:numPr>
+          <w:ilvl w:val="0"/>
+          <w:numId w:val="28"/>
+        </w:numPr>
+        <w:jc w:val="both"/>
+      </w:pPr>
+      <w:r>
+        <w:rPr>
+          <w:b/>
+          <w:bCs/>
+        </w:rPr>
+        <w:t xml:space="preserve">Variance calculation: </w:t>
+      </w:r>
+      <w:r>
+        <w:rPr>
+          <w:b/>
+          <w:bCs/>
+        </w:rPr>
+        <w:t>n×(n-1) (a sample-size-dependent normalization term)</w:t>
+      </w:r>
+      <w:r>
+        <w:t xml:space="preserve"> this belongs to </w:t>
+      </w:r>
+      <w:r>
+        <w:rPr>
+          <w:b/>
+          <w:bCs/>
+        </w:rPr>
+        <w:t xml:space="preserve">Moran's I and </w:t>
+      </w:r>
+      <w:proofErr w:type="spellStart"/>
+      <w:r>
+        <w:rPr>
+          <w:b/>
+          <w:bCs/>
+        </w:rPr>
+        <w:t>Getis</w:t>
+      </w:r>
+      <w:proofErr w:type="spellEnd"/>
+      <w:r>
+        <w:rPr>
+          <w:b/>
+          <w:bCs/>
+        </w:rPr>
+        <w:t>-Ord Gi*</w:t>
+      </w:r>
+      <w:r>
+        <w:t xml:space="preserve"> (used in Spatial Correlation, Spatial Hotspot, Cross-variable/Bivariate Clustering, and Spatiotemporal Change Clustering). Their variance formulas, under the standard randomization assumption, require this term to correctly scale expected variance for the number of boroughs involved. Dropping it and using plain n produces a systematically wrong variance</w:t>
+      </w:r>
+    </w:p>
+    <w:p>
+      <w:pPr>
+        <w:pStyle w:val="ListParagraph"/>
+      </w:pPr>
+    </w:p>
+    <w:p>
+      <w:pPr>
+        <w:jc w:val="both"/>
+      </w:pPr>
+    </w:p>
+    <w:p>
+      <w:pPr>
+        <w:jc w:val="center"/>
+        <w:rPr>
+          <w:b/>
+          <w:bCs/>
+        </w:rPr>
+      </w:pPr>
+      <w:r>
+        <w:rPr>
+          <w:b/>
+          <w:bCs/>
+        </w:rPr>
+        <w:t>Scoring logic</w:t>
+      </w:r>
+    </w:p>
+    <w:p>
+      <w:pPr>
+        <w:jc w:val="center"/>
+        <w:rPr>
+          <w:b/>
+          <w:bCs/>
+        </w:rPr>
+      </w:pPr>
+    </w:p>
+    <w:p>
+      <w:r>
+        <w:t>A chunk only counts as "</w:t>
+      </w:r>
+      <w:r>
+        <w:rPr>
+          <w:b/>
+          <w:bCs/>
+        </w:rPr>
+        <w:t>evidenced</w:t>
+      </w:r>
+      <w:r>
+        <w:t xml:space="preserve">" if a real, finite number was cited (rejects nan, self-admitted non-computation phrases like "could not compute") </w:t>
+      </w:r>
+    </w:p>
+    <w:p>
+      <w:proofErr w:type="spellStart"/>
+      <w:r>
+        <w:rPr>
+          <w:b/>
+          <w:bCs/>
+        </w:rPr>
+        <w:t>outlier_magnitude_plausible</w:t>
+      </w:r>
+      <w:proofErr w:type="spellEnd"/>
+      <w:r>
+        <w:rPr>
+          <w:b/>
+          <w:bCs/>
+        </w:rPr>
+        <w:t>():</w:t>
+      </w:r>
+      <w:r>
+        <w:t xml:space="preserve"> rejects cited values &gt;</w:t>
+      </w:r>
+      <w:r>
+        <w:t xml:space="preserve"> (2* ground truth value)</w:t>
+      </w:r>
+      <w:r>
+        <w:t xml:space="preserve">, grounded in the real observed ground-truth max a task-specific, </w:t>
+      </w:r>
+      <w:r>
+        <w:t>If used other statistical method count them true if a finite number is cited.</w:t>
+      </w:r>
+      <w:r>
+        <w:t xml:space="preserve"> </w:t>
+      </w:r>
+      <w:r>
+        <w:t xml:space="preserve"> Some cited values are showing too big numbers. </w:t>
+      </w:r>
+    </w:p>
+    <w:p>
+      <w:proofErr w:type="spellStart"/>
+      <w:r>
+        <w:rPr>
+          <w:b/>
+          <w:bCs/>
+        </w:rPr>
+        <w:t>verdict_z_consistent</w:t>
+      </w:r>
+      <w:proofErr w:type="spellEnd"/>
+      <w:r>
+        <w:rPr>
+          <w:b/>
+          <w:bCs/>
+        </w:rPr>
+        <w:t>():</w:t>
+      </w:r>
+      <w:r>
+        <w:t xml:space="preserve"> rejects cases where the verdict contradicts the model's own cited value (e.g. a z=2.4 result </w:t>
+      </w:r>
+      <w:proofErr w:type="spellStart"/>
+      <w:r>
+        <w:t>labeled</w:t>
+      </w:r>
+      <w:proofErr w:type="spellEnd"/>
+      <w:r>
+        <w:t xml:space="preserve"> "not an outlier") but only when the label is confidently a standard z-score (not t, R, M, or other ambiguous method names the task explicitly permits)</w:t>
       </w:r>
     </w:p>
     <w:p/>
+    <w:p/>
+    <w:p/>
+    <w:p/>
+    <w:p/>
+    <w:p/>
+    <w:p/>
+    <w:p/>
+    <w:p>
+      <w:pPr>
+        <w:jc w:val="center"/>
+      </w:pPr>
+    </w:p>
     <w:p>
       <w:pPr>
         <w:jc w:val="center"/>
@@ -1740,147 +1459,37 @@
     <w:p>
       <w:pPr>
         <w:jc w:val="center"/>
-        <w:rPr>
-          <w:b/>
-          <w:bCs/>
-        </w:rPr>
-      </w:pPr>
-      <w:r>
-        <w:rPr>
-          <w:b/>
-          <w:bCs/>
-        </w:rPr>
-        <w:lastRenderedPageBreak/>
-        <w:t>User prompt</w:t>
-      </w:r>
-    </w:p>
-    <w:p>
-      <w:r>
-        <w:t xml:space="preserve">I've attached NO2 values for 33 London boroughs for the years 2021, 2022, and 2023, and a list showing which boroughs are geographic </w:t>
-      </w:r>
-      <w:proofErr w:type="spellStart"/>
-      <w:r>
-        <w:t>neighbors</w:t>
-      </w:r>
-      <w:proofErr w:type="spellEnd"/>
-      <w:r>
-        <w:t xml:space="preserve"> of each other.</w:t>
-      </w:r>
-    </w:p>
-    <w:p/>
-    <w:p>
-      <w:r>
-        <w:t xml:space="preserve">Question: Do boroughs that saw a large CHANGE in NO2 between 2021 and 2022 tend to be located near other boroughs that ALSO saw a </w:t>
-      </w:r>
-      <w:proofErr w:type="gramStart"/>
-      <w:r>
-        <w:t>similarly-sized</w:t>
-      </w:r>
-      <w:proofErr w:type="gramEnd"/>
-      <w:r>
-        <w:t xml:space="preserve"> change in the SAME direction (both increasing, or both decreasing), or does a borough's change show no relationship to its </w:t>
-      </w:r>
-      <w:proofErr w:type="spellStart"/>
-      <w:r>
-        <w:t>neighbors'</w:t>
-      </w:r>
-      <w:proofErr w:type="spellEnd"/>
-      <w:r>
-        <w:t xml:space="preserve"> changes? This tests whether the CHANGE itself clusters spatially, not just the raw level in any single year.</w:t>
-      </w:r>
-    </w:p>
-    <w:p/>
-    <w:p>
-      <w:r>
-        <w:t>(Note: the data includes a third year not needed for this question.)</w:t>
-      </w:r>
-    </w:p>
-    <w:p/>
-    <w:p>
-      <w:r>
-        <w:t>Explain your reasoning based on the data, including the actual computed statistic and its significance. You can use a statistical method such as Global Moran's I, or another appropriate method of your choosing, to support your conclusion.</w:t>
-      </w:r>
-    </w:p>
-    <w:p>
-      <w:pPr>
-        <w:tabs>
-          <w:tab w:val="left" w:pos="3804"/>
-        </w:tabs>
-      </w:pPr>
-      <w:r>
-        <w:tab/>
-      </w:r>
-    </w:p>
-    <w:p>
-      <w:r>
-        <w:t>Note: dedicated spatial-statistics packages (</w:t>
-      </w:r>
-      <w:proofErr w:type="spellStart"/>
-      <w:r>
-        <w:t>pysal</w:t>
-      </w:r>
-      <w:proofErr w:type="spellEnd"/>
-      <w:r>
-        <w:t xml:space="preserve">, </w:t>
-      </w:r>
-      <w:proofErr w:type="spellStart"/>
-      <w:r>
-        <w:t>esda</w:t>
-      </w:r>
-      <w:proofErr w:type="spellEnd"/>
-      <w:r>
-        <w:t xml:space="preserve">, </w:t>
-      </w:r>
-      <w:proofErr w:type="spellStart"/>
-      <w:r>
-        <w:t>libpysal</w:t>
-      </w:r>
-      <w:proofErr w:type="spellEnd"/>
-      <w:r>
-        <w:t xml:space="preserve">, </w:t>
-      </w:r>
-      <w:proofErr w:type="spellStart"/>
-      <w:r>
-        <w:t>geopandas</w:t>
-      </w:r>
-      <w:proofErr w:type="spellEnd"/>
-      <w:r>
-        <w:t xml:space="preserve">, or similar) are NOT installed in this environment -- don't spend turns trying different import paths for them. Implement your chosen method directly using only pandas and </w:t>
-      </w:r>
-      <w:proofErr w:type="spellStart"/>
-      <w:r>
-        <w:t>numpy</w:t>
-      </w:r>
-      <w:proofErr w:type="spellEnd"/>
-      <w:r>
-        <w:t>. If you test statistical significance via a permutation/randomization test, use at least 500 random shuffles -- fewer permutations can produce an unstable p-value that lands on the wrong side of the 0.05 threshold just by chance, especially when the true effect is only moderate.</w:t>
-      </w:r>
-    </w:p>
-    <w:p/>
-    <w:p>
-      <w:r>
-        <w:t>End your response with exactly one line, including the computed number(s) you used:</w:t>
-      </w:r>
-    </w:p>
-    <w:p>
-      <w:r>
-        <w:t>FINAL ANSWER: CLUSTERED (test statistic = &lt;value&gt;, p = &lt;value&gt;)</w:t>
-      </w:r>
-    </w:p>
-    <w:p>
-      <w:r>
-        <w:t>or</w:t>
-      </w:r>
-    </w:p>
-    <w:p>
-      <w:r>
-        <w:t>FINAL ANSWER: NOT CLUSTERED (test statistic = &lt;value&gt;, p = &lt;value&gt;)</w:t>
-      </w:r>
-    </w:p>
-    <w:p>
-      <w:r>
-        <w:t>(test statistic is just an example label -- if your method produces a different statistic, use its name instead, but the value after '=' must be a real number)</w:t>
-      </w:r>
+      </w:pPr>
+    </w:p>
+    <w:p>
+      <w:pPr>
+        <w:jc w:val="center"/>
+      </w:pPr>
+    </w:p>
+    <w:p>
+      <w:pPr>
+        <w:jc w:val="center"/>
+      </w:pPr>
+    </w:p>
+    <w:p>
+      <w:pPr>
+        <w:jc w:val="center"/>
+      </w:pPr>
+    </w:p>
+    <w:p>
+      <w:pPr>
+        <w:jc w:val="center"/>
+      </w:pPr>
+    </w:p>
+    <w:p>
+      <w:pPr>
+        <w:jc w:val="center"/>
+      </w:pPr>
+    </w:p>
+    <w:p>
+      <w:pPr>
+        <w:jc w:val="center"/>
+      </w:pPr>
     </w:p>
     <w:p>
       <w:pPr>
@@ -1915,6 +1524,163 @@
           <w:b/>
           <w:bCs/>
         </w:rPr>
+        <w:t>User prompt</w:t>
+      </w:r>
+    </w:p>
+    <w:p>
+      <w:r>
+        <w:t xml:space="preserve">I've attached NO2 values for 33 London boroughs for the years 2021, 2022, and 2023, and a list showing which boroughs are geographic </w:t>
+      </w:r>
+      <w:proofErr w:type="spellStart"/>
+      <w:r>
+        <w:t>neighbors</w:t>
+      </w:r>
+      <w:proofErr w:type="spellEnd"/>
+      <w:r>
+        <w:t xml:space="preserve"> of each other.</w:t>
+      </w:r>
+    </w:p>
+    <w:p/>
+    <w:p>
+      <w:r>
+        <w:t xml:space="preserve">Question: Do boroughs that saw a large CHANGE in NO2 between 2021 and 2022 tend to be located near other boroughs that ALSO saw a similarly-sized change in the SAME direction (both increasing, or both decreasing), or does a borough's change show no relationship to its </w:t>
+      </w:r>
+      <w:proofErr w:type="spellStart"/>
+      <w:r>
+        <w:t>neighbors'</w:t>
+      </w:r>
+      <w:proofErr w:type="spellEnd"/>
+      <w:r>
+        <w:t xml:space="preserve"> changes? This tests whether the CHANGE itself clusters spatially, not just the raw level in any single year.</w:t>
+      </w:r>
+    </w:p>
+    <w:p/>
+    <w:p>
+      <w:r>
+        <w:t>(Note: the data includes a third year not needed for this question.)</w:t>
+      </w:r>
+    </w:p>
+    <w:p/>
+    <w:p>
+      <w:r>
+        <w:t>Explain your reasoning based on the data, including the actual computed statistic and its significance. You can use a statistical method such as Global Moran's I, or another appropriate method of your choosing, to support your conclusion.</w:t>
+      </w:r>
+    </w:p>
+    <w:p>
+      <w:pPr>
+        <w:tabs>
+          <w:tab w:val="left" w:pos="3804"/>
+        </w:tabs>
+      </w:pPr>
+      <w:r>
+        <w:tab/>
+      </w:r>
+    </w:p>
+    <w:p>
+      <w:r>
+        <w:t>Note: dedicated spatial-statistics packages (</w:t>
+      </w:r>
+      <w:proofErr w:type="spellStart"/>
+      <w:r>
+        <w:t>pysal</w:t>
+      </w:r>
+      <w:proofErr w:type="spellEnd"/>
+      <w:r>
+        <w:t xml:space="preserve">, </w:t>
+      </w:r>
+      <w:proofErr w:type="spellStart"/>
+      <w:r>
+        <w:t>esda</w:t>
+      </w:r>
+      <w:proofErr w:type="spellEnd"/>
+      <w:r>
+        <w:t xml:space="preserve">, </w:t>
+      </w:r>
+      <w:proofErr w:type="spellStart"/>
+      <w:r>
+        <w:t>libpysal</w:t>
+      </w:r>
+      <w:proofErr w:type="spellEnd"/>
+      <w:r>
+        <w:t xml:space="preserve">, </w:t>
+      </w:r>
+      <w:proofErr w:type="spellStart"/>
+      <w:r>
+        <w:t>geopandas</w:t>
+      </w:r>
+      <w:proofErr w:type="spellEnd"/>
+      <w:r>
+        <w:t xml:space="preserve">, or similar) are NOT installed in this environment -- don't spend turns trying different import paths for them. Implement your chosen method directly using only pandas and </w:t>
+      </w:r>
+      <w:proofErr w:type="spellStart"/>
+      <w:r>
+        <w:t>numpy</w:t>
+      </w:r>
+      <w:proofErr w:type="spellEnd"/>
+      <w:r>
+        <w:t>. If you test statistical significance via a permutation/randomization test, use at least 500 random shuffles -- fewer permutations can produce an unstable p-value that lands on the wrong side of the 0.05 threshold just by chance, especially when the true effect is only moderate.</w:t>
+      </w:r>
+    </w:p>
+    <w:p/>
+    <w:p>
+      <w:r>
+        <w:t>End your response with exactly one line, including the computed number(s) you used:</w:t>
+      </w:r>
+    </w:p>
+    <w:p>
+      <w:r>
+        <w:t>FINAL ANSWER: CLUSTERED (test statistic = &lt;value&gt;, p = &lt;value&gt;)</w:t>
+      </w:r>
+    </w:p>
+    <w:p>
+      <w:r>
+        <w:t>or</w:t>
+      </w:r>
+    </w:p>
+    <w:p>
+      <w:r>
+        <w:t>FINAL ANSWER: NOT CLUSTERED (test statistic = &lt;value&gt;, p = &lt;value&gt;)</w:t>
+      </w:r>
+    </w:p>
+    <w:p>
+      <w:r>
+        <w:lastRenderedPageBreak/>
+        <w:t>(test statistic is just an example label -- if your method produces a different statistic, use its name instead, but the value after '=' must be a real number)</w:t>
+      </w:r>
+    </w:p>
+    <w:p>
+      <w:pPr>
+        <w:jc w:val="center"/>
+      </w:pPr>
+    </w:p>
+    <w:p>
+      <w:pPr>
+        <w:jc w:val="center"/>
+      </w:pPr>
+    </w:p>
+    <w:p>
+      <w:pPr>
+        <w:jc w:val="center"/>
+      </w:pPr>
+    </w:p>
+    <w:p>
+      <w:pPr>
+        <w:jc w:val="center"/>
+      </w:pPr>
+    </w:p>
+    <w:p>
+      <w:pPr>
+        <w:jc w:val="center"/>
+        <w:rPr>
+          <w:b/>
+          <w:bCs/>
+        </w:rPr>
+      </w:pPr>
+      <w:r>
+        <w:rPr>
+          <w:b/>
+          <w:bCs/>
+        </w:rPr>
         <w:t>System prompt</w:t>
       </w:r>
     </w:p>
@@ -1946,15 +1712,7 @@
     </w:p>
     <w:p>
       <w:r>
-        <w:t xml:space="preserve">You must ground every claim in code output -- never guess numbers. Always </w:t>
-      </w:r>
-      <w:proofErr w:type="gramStart"/>
-      <w:r>
-        <w:t>print(</w:t>
-      </w:r>
-      <w:proofErr w:type="gramEnd"/>
-      <w:r>
-        <w:t>) the numbers</w:t>
+        <w:t>You must ground every claim in code output -- never guess numbers. Always print() the numbers</w:t>
       </w:r>
     </w:p>
     <w:p>
@@ -1962,7 +1720,6 @@
         <w:t>you compute so they appear in the tool output."""</w:t>
       </w:r>
     </w:p>
-    <w:p/>
     <w:p/>
     <w:p>
       <w:pPr>
@@ -2006,58 +1763,79 @@
     </w:p>
     <w:p>
       <w:r>
+        <w:t>        "pandas code -- do not guess or describe from the preview alone. "</w:t>
+      </w:r>
+    </w:p>
+    <w:p>
+      <w:r>
+        <w:t>        "For every numeric column, print its missing-value count using "</w:t>
+      </w:r>
+    </w:p>
+    <w:p>
+      <w:r>
+        <w:t>        "EXACTLY this format, one line per column:\n"</w:t>
+      </w:r>
+    </w:p>
+    <w:p>
+      <w:r>
         <w:t>        "</w:t>
       </w:r>
-      <w:proofErr w:type="gramStart"/>
-      <w:r>
-        <w:t>pandas</w:t>
-      </w:r>
-      <w:proofErr w:type="gramEnd"/>
-      <w:r>
-        <w:t xml:space="preserve"> code -- do not guess or describe from the preview alone. "</w:t>
-      </w:r>
-    </w:p>
-    <w:p>
-      <w:r>
-        <w:t>        "For every numeric column, print the exact count of missing "</w:t>
-      </w:r>
-    </w:p>
-    <w:p>
-      <w:r>
-        <w:t>        "(</w:t>
-      </w:r>
       <w:proofErr w:type="spellStart"/>
       <w:r>
-        <w:t>NaN</w:t>
+        <w:t>missing_count</w:t>
       </w:r>
       <w:proofErr w:type="spellEnd"/>
       <w:r>
-        <w:t xml:space="preserve">) values. Print the total row count. Do not </w:t>
+        <w:t>_&lt;</w:t>
       </w:r>
       <w:proofErr w:type="spellStart"/>
       <w:r>
+        <w:t>column_name</w:t>
+      </w:r>
+      <w:proofErr w:type="spellEnd"/>
+      <w:r>
+        <w:t>&gt; = &lt;integer&gt;\n"</w:t>
+      </w:r>
+    </w:p>
+    <w:p>
+      <w:r>
+        <w:t>        "Then print the total row count using EXACTLY this format:\n"</w:t>
+      </w:r>
+    </w:p>
+    <w:p>
+      <w:r>
+        <w:t>        "</w:t>
+      </w:r>
+      <w:proofErr w:type="spellStart"/>
+      <w:r>
+        <w:t>row_count</w:t>
+      </w:r>
+      <w:proofErr w:type="spellEnd"/>
+      <w:r>
+        <w:t xml:space="preserve"> = &lt;integer&gt;\n"</w:t>
+      </w:r>
+    </w:p>
+    <w:p>
+      <w:r>
+        <w:t xml:space="preserve">        "Do not </w:t>
+      </w:r>
+      <w:proofErr w:type="spellStart"/>
+      <w:r>
         <w:t>analyze</w:t>
       </w:r>
       <w:proofErr w:type="spellEnd"/>
       <w:r>
-        <w:t xml:space="preserve"> or "</w:t>
-      </w:r>
-    </w:p>
-    <w:p>
-      <w:r>
-        <w:t>        "</w:t>
-      </w:r>
-      <w:proofErr w:type="gramStart"/>
-      <w:r>
-        <w:t>answer</w:t>
-      </w:r>
-      <w:proofErr w:type="gramEnd"/>
-      <w:r>
-        <w:t xml:space="preserve"> any question -- only report facts about the data itself."</w:t>
-      </w:r>
-    </w:p>
-    <w:p>
-      <w:r>
+        <w:t xml:space="preserve"> or answer any question -- only report these facts "</w:t>
+      </w:r>
+    </w:p>
+    <w:p>
+      <w:r>
+        <w:t>        "about the data itself, using the exact print formats above."</w:t>
+      </w:r>
+    </w:p>
+    <w:p>
+      <w:r>
+        <w:lastRenderedPageBreak/>
         <w:t>        f"\n\</w:t>
       </w:r>
       <w:proofErr w:type="spellStart"/>
@@ -2070,19 +1848,11 @@
       </w:r>
       <w:proofErr w:type="spellStart"/>
       <w:r>
-        <w:t>dataset_</w:t>
-      </w:r>
-      <w:proofErr w:type="gramStart"/>
-      <w:r>
-        <w:t>path</w:t>
+        <w:t>dataset_path</w:t>
       </w:r>
       <w:proofErr w:type="spellEnd"/>
       <w:r>
-        <w:t>}\</w:t>
-      </w:r>
-      <w:proofErr w:type="gramEnd"/>
-      <w:r>
-        <w:t>n"</w:t>
+        <w:t>}\n"</w:t>
       </w:r>
     </w:p>
     <w:p>
@@ -2092,15 +1862,7 @@
     </w:p>
     <w:p>
       <w:r>
-        <w:t>        "</w:t>
-      </w:r>
-      <w:proofErr w:type="gramStart"/>
-      <w:r>
-        <w:t>these</w:t>
-      </w:r>
-      <w:proofErr w:type="gramEnd"/>
-      <w:r>
-        <w:t xml:space="preserve"> facts. Re-import pandas/</w:t>
+        <w:t>        "these facts. Re-import pandas/</w:t>
       </w:r>
       <w:proofErr w:type="spellStart"/>
       <w:r>
@@ -2113,24 +1875,12 @@
     </w:p>
     <w:p>
       <w:r>
-        <w:t>        "</w:t>
-      </w:r>
-      <w:proofErr w:type="gramStart"/>
-      <w:r>
-        <w:t>process</w:t>
-      </w:r>
-      <w:proofErr w:type="gramEnd"/>
-      <w:r>
-        <w:t>.\n" + preview</w:t>
-      </w:r>
-    </w:p>
-    <w:p>
-      <w:r>
-        <w:t>    )</w:t>
-      </w:r>
-    </w:p>
-    <w:p/>
-    <w:p/>
+        <w:t>        "process.\n" + preview</w:t>
+      </w:r>
+      <w:r>
+        <w:t>)</w:t>
+      </w:r>
+    </w:p>
     <w:p>
       <w:pPr>
         <w:rPr>
@@ -2143,7 +1893,6 @@
           <w:b/>
           <w:bCs/>
         </w:rPr>
-        <w:lastRenderedPageBreak/>
         <w:t>Planner:</w:t>
       </w:r>
     </w:p>
@@ -2159,49 +1908,27 @@
     </w:p>
     <w:p>
       <w:r>
-        <w:t>        "</w:t>
-      </w:r>
-      <w:proofErr w:type="gramStart"/>
-      <w:r>
-        <w:t>no</w:t>
-      </w:r>
-      <w:proofErr w:type="gramEnd"/>
-      <w:r>
-        <w:t xml:space="preserve"> code) for answering this question, using the real data facts "</w:t>
-      </w:r>
-    </w:p>
-    <w:p>
-      <w:r>
-        <w:t>        "</w:t>
-      </w:r>
-      <w:proofErr w:type="gramStart"/>
-      <w:r>
-        <w:t>below</w:t>
-      </w:r>
-      <w:proofErr w:type="gramEnd"/>
-      <w:r>
-        <w:t>. Your plan should explicitly state how missing values "</w:t>
-      </w:r>
-    </w:p>
-    <w:p>
-      <w:r>
-        <w:t>        "</w:t>
-      </w:r>
-      <w:proofErr w:type="gramStart"/>
-      <w:r>
-        <w:t>will</w:t>
-      </w:r>
-      <w:proofErr w:type="gramEnd"/>
-      <w:r>
-        <w:t xml:space="preserve"> be handled if any </w:t>
-      </w:r>
-      <w:proofErr w:type="gramStart"/>
-      <w:r>
-        <w:t>exist.\n\n</w:t>
-      </w:r>
-      <w:proofErr w:type="gramEnd"/>
-      <w:r>
-        <w:t>"</w:t>
+        <w:t>        "no code) for answering this question, using the real data facts "</w:t>
+      </w:r>
+    </w:p>
+    <w:p>
+      <w:r>
+        <w:t>        "below. Your plan should explicitly state how missing values "</w:t>
+      </w:r>
+    </w:p>
+    <w:p>
+      <w:r>
+        <w:t>        "will be handled if any exist. Do not write a FINAL ANSWER line "</w:t>
+      </w:r>
+    </w:p>
+    <w:p>
+      <w:r>
+        <w:t>        "or invent any specific numbers -- describe the approach only, "</w:t>
+      </w:r>
+    </w:p>
+    <w:p>
+      <w:r>
+        <w:t>        "the actual values will come from real computation later.\n\n"</w:t>
       </w:r>
     </w:p>
     <w:p>
@@ -2267,7 +1994,6 @@
         <w:t>Coder:</w:t>
       </w:r>
     </w:p>
-    <w:p/>
     <w:p>
       <w:r>
         <w:t>   prompt = (</w:t>
@@ -2297,63 +2023,34 @@
       </w:r>
       <w:proofErr w:type="spellStart"/>
       <w:r>
-        <w:t>n_used</w:t>
+        <w:t>data_points_used</w:t>
       </w:r>
       <w:proofErr w:type="spellEnd"/>
       <w:r>
-        <w:t xml:space="preserve"> = &lt;integer&gt;` -- the exact number of data points used "</w:t>
-      </w:r>
-    </w:p>
-    <w:p>
-      <w:r>
-        <w:t>        "</w:t>
-      </w:r>
-      <w:proofErr w:type="gramStart"/>
-      <w:r>
-        <w:t>in</w:t>
-      </w:r>
-      <w:proofErr w:type="gramEnd"/>
-      <w:r>
-        <w:t xml:space="preserve"> your FINAL calculation (after excluding any missing </w:t>
-      </w:r>
-      <w:proofErr w:type="gramStart"/>
-      <w:r>
-        <w:t>values)\</w:t>
-      </w:r>
-      <w:proofErr w:type="gramEnd"/>
-      <w:r>
-        <w:t>n"</w:t>
-      </w:r>
-    </w:p>
-    <w:p>
-      <w:r>
-        <w:t>        "2. `FINAL ANSWER: &lt;verdict&gt; (test statistic = &lt;value&gt;, p = &lt;value</w:t>
-      </w:r>
-      <w:proofErr w:type="gramStart"/>
-      <w:r>
-        <w:t>&gt;)`</w:t>
-      </w:r>
-      <w:proofErr w:type="gramEnd"/>
-      <w:r>
-        <w:t xml:space="preserve"> "</w:t>
-      </w:r>
-    </w:p>
-    <w:p>
-      <w:r>
-        <w:t>        "-- using an f-string that references your actual computed "</w:t>
-      </w:r>
-    </w:p>
-    <w:p>
-      <w:r>
-        <w:t>        "</w:t>
-      </w:r>
-      <w:proofErr w:type="gramStart"/>
-      <w:r>
-        <w:t>variables</w:t>
-      </w:r>
-      <w:proofErr w:type="gramEnd"/>
-      <w:r>
-        <w:t>, never a hand-typed number\n\n"</w:t>
+        <w:t xml:space="preserve"> = &lt;integer&gt;` -- the exact number of data "</w:t>
+      </w:r>
+    </w:p>
+    <w:p>
+      <w:r>
+        <w:t>        "points used in your FINAL calculation (after excluding any "</w:t>
+      </w:r>
+    </w:p>
+    <w:p>
+      <w:r>
+        <w:t>        "missing values)\n"</w:t>
+      </w:r>
+    </w:p>
+    <w:p>
+      <w:r>
+        <w:t>        f"2. {</w:t>
+      </w:r>
+      <w:proofErr w:type="spellStart"/>
+      <w:r>
+        <w:t>format_instructions</w:t>
+      </w:r>
+      <w:proofErr w:type="spellEnd"/>
+      <w:r>
+        <w:t>}\n\n"</w:t>
       </w:r>
     </w:p>
     <w:p>
@@ -2378,11 +2075,7 @@
       </w:r>
       <w:proofErr w:type="spellStart"/>
       <w:r>
-        <w:t>profile_</w:t>
-      </w:r>
-      <w:proofErr w:type="gramStart"/>
-      <w:r>
-        <w:t>text</w:t>
+        <w:t>profile_text</w:t>
       </w:r>
       <w:proofErr w:type="spellEnd"/>
       <w:r>
@@ -2393,7 +2086,6 @@
         <w:t>nPlan</w:t>
       </w:r>
       <w:proofErr w:type="spellEnd"/>
-      <w:proofErr w:type="gramEnd"/>
       <w:r>
         <w:t>:\n{plan}"</w:t>
       </w:r>
@@ -2404,19 +2096,11 @@
       </w:r>
       <w:proofErr w:type="spellStart"/>
       <w:r>
-        <w:t>retry_</w:t>
-      </w:r>
-      <w:proofErr w:type="gramStart"/>
-      <w:r>
-        <w:t>block</w:t>
+        <w:t>retry_block</w:t>
       </w:r>
       <w:proofErr w:type="spellEnd"/>
       <w:r>
-        <w:t>}\</w:t>
-      </w:r>
-      <w:proofErr w:type="gramEnd"/>
-      <w:r>
-        <w:t>n"</w:t>
+        <w:t>}\n"</w:t>
       </w:r>
     </w:p>
     <w:p>
@@ -2436,526 +2120,532 @@
       <w:r>
         <w:t xml:space="preserve"> and reload the data.\n" + preview</w:t>
       </w:r>
-    </w:p>
-    <w:p>
       <w:r>
         <w:t>    )</w:t>
-      </w:r>
-    </w:p>
-    <w:p/>
-    <w:p/>
-    <w:p>
-      <w:r>
-        <w:lastRenderedPageBreak/>
-        <w:t xml:space="preserve">Get-Content </w:t>
-      </w:r>
-      <w:r>
-        <w:t>"</w:t>
-      </w:r>
-      <w:r>
-        <w:t>\runs\20260828T073219Z_bivariate_multiagent_openai-o3_bivariate_2021_energy_transport</w:t>
-      </w:r>
-      <w:r>
-        <w:t>\attempts_log.json"</w:t>
-      </w:r>
-    </w:p>
-    <w:p/>
-    <w:p>
-      <w:r>
-        <w:t>\runs\20260827T135045Z_bivariate_multiagent_qwen-qwen3-32b_bivariate_2021_gas_waste</w:t>
       </w:r>
     </w:p>
     <w:p/>
     <w:p/>
     <w:p/>
-    <w:p>
-      <w:r>
-        <w:t xml:space="preserve">$models = </w:t>
-      </w:r>
-      <w:proofErr w:type="gramStart"/>
-      <w:r>
-        <w:t>@(</w:t>
-      </w:r>
-      <w:proofErr w:type="gramEnd"/>
-    </w:p>
-    <w:p>
-      <w:r>
-        <w:t xml:space="preserve">    "</w:t>
-      </w:r>
-      <w:proofErr w:type="spellStart"/>
-      <w:r>
-        <w:t>openai</w:t>
-      </w:r>
-      <w:proofErr w:type="spellEnd"/>
-      <w:r>
-        <w:t>/o3",</w:t>
-      </w:r>
-    </w:p>
-    <w:p>
-      <w:r>
-        <w:t xml:space="preserve">    "</w:t>
-      </w:r>
-      <w:proofErr w:type="spellStart"/>
-      <w:r>
-        <w:t>openai</w:t>
-      </w:r>
-      <w:proofErr w:type="spellEnd"/>
-      <w:r>
-        <w:t>/o4-mini",</w:t>
-      </w:r>
-    </w:p>
-    <w:p>
-      <w:r>
-        <w:t xml:space="preserve">    "</w:t>
-      </w:r>
-      <w:proofErr w:type="spellStart"/>
-      <w:r>
-        <w:t>openai</w:t>
-      </w:r>
-      <w:proofErr w:type="spellEnd"/>
-      <w:r>
-        <w:t>/gpt-4o-mini"</w:t>
-      </w:r>
-    </w:p>
-    <w:p>
-      <w:r>
-        <w:t>)</w:t>
-      </w:r>
-    </w:p>
-    <w:p>
-      <w:r>
-        <w:t>foreach ($m in $models) {</w:t>
-      </w:r>
-    </w:p>
-    <w:p>
-      <w:r>
-        <w:t xml:space="preserve">    Write-Host "=== multi_agent_changespillover.py with $m ==="</w:t>
-      </w:r>
-    </w:p>
-    <w:p>
-      <w:r>
-        <w:t xml:space="preserve">    python multi_agent_changespillover.py --model $m 2&gt;&amp;1 | Tee-Object -Append -</w:t>
-      </w:r>
-      <w:proofErr w:type="spellStart"/>
-      <w:r>
-        <w:t>FilePath</w:t>
-      </w:r>
-      <w:proofErr w:type="spellEnd"/>
-      <w:r>
-        <w:t xml:space="preserve"> "changespillover_multiagent_run_log.txt"</w:t>
-      </w:r>
-    </w:p>
-    <w:p>
-      <w:r>
-        <w:t>}</w:t>
-      </w:r>
-    </w:p>
-    <w:p/>
-    <w:p>
-      <w:r>
-        <w:t xml:space="preserve">$models = </w:t>
-      </w:r>
-      <w:proofErr w:type="gramStart"/>
-      <w:r>
-        <w:t>@(</w:t>
-      </w:r>
-      <w:proofErr w:type="gramEnd"/>
-    </w:p>
-    <w:p>
-      <w:r>
-        <w:t xml:space="preserve">    "</w:t>
-      </w:r>
-      <w:proofErr w:type="spellStart"/>
-      <w:r>
-        <w:t>deepseek</w:t>
-      </w:r>
-      <w:proofErr w:type="spellEnd"/>
-      <w:r>
-        <w:t>/deepseek-chat-v3-0324",</w:t>
-      </w:r>
-    </w:p>
-    <w:p>
-      <w:r>
-        <w:t xml:space="preserve">    "</w:t>
-      </w:r>
-      <w:proofErr w:type="spellStart"/>
-      <w:r>
-        <w:t>deepseek</w:t>
-      </w:r>
-      <w:proofErr w:type="spellEnd"/>
-      <w:r>
-        <w:t>/deepseek-r1-0528",</w:t>
-      </w:r>
-    </w:p>
-    <w:p>
-      <w:r>
-        <w:t xml:space="preserve">    "</w:t>
-      </w:r>
-      <w:proofErr w:type="spellStart"/>
-      <w:r>
-        <w:t>qwen</w:t>
-      </w:r>
-      <w:proofErr w:type="spellEnd"/>
-      <w:r>
-        <w:t>/qwen3-32b",</w:t>
-      </w:r>
-    </w:p>
-    <w:p>
-      <w:r>
-        <w:t xml:space="preserve">    "</w:t>
-      </w:r>
-      <w:proofErr w:type="spellStart"/>
-      <w:r>
-        <w:t>moonshotai</w:t>
-      </w:r>
-      <w:proofErr w:type="spellEnd"/>
-      <w:r>
-        <w:t>/kimi-k2.6",</w:t>
-      </w:r>
-    </w:p>
-    <w:p>
-      <w:r>
-        <w:t xml:space="preserve">    "meta-llama/llama-3.1-8b-instruct"</w:t>
-      </w:r>
-    </w:p>
-    <w:p>
-      <w:r>
-        <w:t>)</w:t>
-      </w:r>
-    </w:p>
-    <w:p>
-      <w:r>
-        <w:t>foreach ($m in $models) {</w:t>
-      </w:r>
-    </w:p>
-    <w:p>
-      <w:r>
-        <w:t xml:space="preserve">    Write-Host "=== multi_agent_changespillover.py with $m ==="</w:t>
-      </w:r>
-    </w:p>
-    <w:p>
-      <w:r>
-        <w:lastRenderedPageBreak/>
-        <w:t xml:space="preserve">    python multi_agent_changespillover.py --model $m 2&gt;&amp;1 | Tee-Object -Append -</w:t>
-      </w:r>
-      <w:proofErr w:type="spellStart"/>
-      <w:r>
-        <w:t>FilePath</w:t>
-      </w:r>
-      <w:proofErr w:type="spellEnd"/>
-      <w:r>
-        <w:t xml:space="preserve"> "changespillover_multiagent_run_log.txt"</w:t>
-      </w:r>
-    </w:p>
-    <w:p>
-      <w:r>
-        <w:t>}</w:t>
-      </w:r>
-    </w:p>
-    <w:p/>
-    <w:p/>
-    <w:p>
-      <w:r>
-        <w:t># For single turn</w:t>
-      </w:r>
-    </w:p>
-    <w:p>
-      <w:r>
-        <w:t>RESULTS_CSV = "bivariate_results.csv"</w:t>
-      </w:r>
-    </w:p>
-    <w:p>
-      <w:r>
-        <w:t>SUMMARY_OUT = "Scores/single turn/bivariate_scoring_summary.csv"</w:t>
-      </w:r>
-    </w:p>
-    <w:p>
-      <w:r>
-        <w:t>CONFUSION_OUT = "Scores/single turn/bivariate_confusion_matrix.csv"</w:t>
-      </w:r>
-    </w:p>
-    <w:p/>
-    <w:p>
-      <w:r>
-        <w:t># For multi turn</w:t>
-      </w:r>
-    </w:p>
-    <w:p>
-      <w:r>
-        <w:t>#RESULTS_CSV = "results/single agent/bivariate_results_multi.csv"</w:t>
-      </w:r>
-    </w:p>
-    <w:p>
-      <w:r>
-        <w:t>#SUMMARY_OUT = "Scores/multi turn/bivariate_scoring_summary_multi.csv"</w:t>
-      </w:r>
-    </w:p>
-    <w:p>
-      <w:r>
-        <w:t>#CONFUSION_OUT = "Scores/multi turn/bivariate_confusion_matrix_multi.csv"</w:t>
-      </w:r>
-    </w:p>
-    <w:p/>
-    <w:p>
-      <w:r>
-        <w:t># For multi agent</w:t>
-      </w:r>
-    </w:p>
-    <w:p>
-      <w:r>
-        <w:t>#RESULTS_CSV = "results/multi agent/bivariate_results_multi.csv"</w:t>
-      </w:r>
-    </w:p>
-    <w:p>
-      <w:r>
-        <w:t>#SUMMARY_OUT = "Scores/multi agent/bivariate_scoring_summary_multi.csv"</w:t>
-      </w:r>
-    </w:p>
-    <w:p>
-      <w:r>
-        <w:t>#CONFUSION_OUT = "Scores/multi agent/bivariate_confusion_matrix_multi.csv"</w:t>
-      </w:r>
-    </w:p>
     <w:p/>
     <w:p/>
     <w:p/>
-    <w:p>
-      <w:r>
-        <w:t xml:space="preserve">$models = </w:t>
-      </w:r>
-      <w:proofErr w:type="gramStart"/>
-      <w:r>
-        <w:t>@(</w:t>
-      </w:r>
-      <w:proofErr w:type="gramEnd"/>
-    </w:p>
-    <w:p>
-      <w:r>
-        <w:t xml:space="preserve">    "</w:t>
-      </w:r>
-      <w:proofErr w:type="spellStart"/>
-      <w:r>
-        <w:t>openai</w:t>
-      </w:r>
-      <w:proofErr w:type="spellEnd"/>
-      <w:r>
-        <w:t>/o3",</w:t>
-      </w:r>
-    </w:p>
-    <w:p>
-      <w:r>
-        <w:t xml:space="preserve">    "</w:t>
-      </w:r>
-      <w:proofErr w:type="spellStart"/>
-      <w:r>
-        <w:t>openai</w:t>
-      </w:r>
-      <w:proofErr w:type="spellEnd"/>
-      <w:r>
-        <w:t>/o4-mini",</w:t>
-      </w:r>
-    </w:p>
-    <w:p>
-      <w:r>
-        <w:t xml:space="preserve">    "</w:t>
-      </w:r>
-      <w:proofErr w:type="spellStart"/>
-      <w:r>
-        <w:t>openai</w:t>
-      </w:r>
-      <w:proofErr w:type="spellEnd"/>
-      <w:r>
-        <w:t>/gpt-4o-mini"</w:t>
-      </w:r>
-    </w:p>
-    <w:p>
-      <w:r>
-        <w:t>)</w:t>
-      </w:r>
-    </w:p>
-    <w:p>
-      <w:r>
-        <w:t>foreach ($m in $models) {</w:t>
-      </w:r>
-    </w:p>
-    <w:p>
-      <w:r>
-        <w:lastRenderedPageBreak/>
-        <w:t xml:space="preserve">    Write-Host "=== multi_agent_outlier_iterative_r.py with $m ==="</w:t>
-      </w:r>
-    </w:p>
-    <w:p>
-      <w:r>
-        <w:t xml:space="preserve">    python multi_agent_outlier_iterative_r.py --model $m 2&gt;&amp;1 | Tee-Object -Append -</w:t>
-      </w:r>
-      <w:proofErr w:type="spellStart"/>
-      <w:r>
-        <w:t>FilePath</w:t>
-      </w:r>
-      <w:proofErr w:type="spellEnd"/>
-      <w:r>
-        <w:t xml:space="preserve"> "outlier_multiagent_run_log.txt"</w:t>
-      </w:r>
-    </w:p>
-    <w:p>
-      <w:r>
-        <w:t>}</w:t>
-      </w:r>
-    </w:p>
-    <w:p/>
-    <w:p/>
-    <w:p>
-      <w:r>
-        <w:t xml:space="preserve">$models = </w:t>
-      </w:r>
-      <w:proofErr w:type="gramStart"/>
-      <w:r>
-        <w:t>@(</w:t>
-      </w:r>
-      <w:proofErr w:type="gramEnd"/>
-    </w:p>
-    <w:p>
-      <w:r>
-        <w:t xml:space="preserve">    "</w:t>
-      </w:r>
-      <w:proofErr w:type="spellStart"/>
-      <w:r>
-        <w:t>deepseek</w:t>
-      </w:r>
-      <w:proofErr w:type="spellEnd"/>
-      <w:r>
-        <w:t>/deepseek-chat-v3-0324",</w:t>
-      </w:r>
-    </w:p>
-    <w:p>
-      <w:r>
-        <w:t xml:space="preserve">    "</w:t>
-      </w:r>
-      <w:proofErr w:type="spellStart"/>
-      <w:r>
-        <w:t>deepseek</w:t>
-      </w:r>
-      <w:proofErr w:type="spellEnd"/>
-      <w:r>
-        <w:t>/deepseek-r1-0528",</w:t>
-      </w:r>
-    </w:p>
-    <w:p>
-      <w:r>
-        <w:t xml:space="preserve">    "</w:t>
-      </w:r>
-      <w:proofErr w:type="spellStart"/>
-      <w:r>
-        <w:t>qwen</w:t>
-      </w:r>
-      <w:proofErr w:type="spellEnd"/>
-      <w:r>
-        <w:t>/qwen3-32b",</w:t>
-      </w:r>
-    </w:p>
-    <w:p>
-      <w:r>
-        <w:t xml:space="preserve">    "</w:t>
-      </w:r>
-      <w:proofErr w:type="spellStart"/>
-      <w:r>
-        <w:t>moonshotai</w:t>
-      </w:r>
-      <w:proofErr w:type="spellEnd"/>
-      <w:r>
-        <w:t>/kimi-k2.6",</w:t>
-      </w:r>
-    </w:p>
-    <w:p>
-      <w:r>
-        <w:t xml:space="preserve">    "meta-llama/llama-3.1-8b-instruct"</w:t>
-      </w:r>
-    </w:p>
-    <w:p>
-      <w:r>
-        <w:t>)</w:t>
-      </w:r>
-    </w:p>
-    <w:p>
-      <w:r>
-        <w:t>foreach ($m in $models) {</w:t>
-      </w:r>
-    </w:p>
-    <w:p>
-      <w:r>
-        <w:t xml:space="preserve">    Write-Host "=== multi_agent_outlier_iterative_r.py with $m ==="</w:t>
-      </w:r>
-    </w:p>
-    <w:p>
-      <w:r>
-        <w:t xml:space="preserve">    python multi_agent_outlier_iterative_r.py --model $m 2&gt;&amp;1 | Tee-Object -Append -</w:t>
-      </w:r>
-      <w:proofErr w:type="spellStart"/>
-      <w:r>
-        <w:t>FilePath</w:t>
-      </w:r>
-      <w:proofErr w:type="spellEnd"/>
-      <w:r>
-        <w:t xml:space="preserve"> "outlier_multiagent_run_log.txt"</w:t>
-      </w:r>
-    </w:p>
-    <w:p>
-      <w:r>
-        <w:t>}</w:t>
-      </w:r>
-    </w:p>
-    <w:p/>
-    <w:p>
-      <w:r>
-        <w:t># for multi turn</w:t>
-      </w:r>
-    </w:p>
-    <w:p>
-      <w:r>
-        <w:t>#RESULTS_CSV = "getisord_results_multi.csv"</w:t>
-      </w:r>
-    </w:p>
-    <w:p>
-      <w:r>
-        <w:t>#OUT_CSV = "Scores/multi turn/getisord_scoring_summary.csv"</w:t>
-      </w:r>
-    </w:p>
-    <w:p/>
-    <w:p>
-      <w:r>
-        <w:t>#For single turn</w:t>
-      </w:r>
-    </w:p>
-    <w:p>
-      <w:r>
-        <w:t>#RESULTS_CSV = "getisord_results.csv"</w:t>
-      </w:r>
-    </w:p>
-    <w:p>
-      <w:r>
-        <w:t>#OUT_CSV = "Scores/single turn/getisord_scoring_summary.csv"</w:t>
-      </w:r>
-    </w:p>
-    <w:p/>
-    <w:p>
-      <w:r>
-        <w:t>#For multi agent</w:t>
-      </w:r>
-    </w:p>
-    <w:p>
-      <w:r>
-        <w:t>RESULTS_CSV = "results/multi agent/getisord_results_multiagent.csv"</w:t>
-      </w:r>
-    </w:p>
-    <w:p>
-      <w:r>
-        <w:lastRenderedPageBreak/>
-        <w:t>OUT_CSV = "Scores/multi agent/getisord_scoring_summary.csv"</w:t>
-      </w:r>
-    </w:p>
     <w:p/>
     <w:p/>
     <w:p/>
+    <w:p/>
+    <w:p/>
+    <w:p/>
+    <w:p/>
+    <w:p/>
+    <w:p/>
+    <w:p/>
+    <w:p/>
+    <w:p/>
+    <w:p/>
+    <w:p/>
+    <w:p/>
+    <w:p/>
+    <w:p/>
+    <w:p/>
+    <w:p/>
+    <w:p/>
+    <w:p/>
+    <w:p/>
+    <w:p/>
+    <w:p/>
+    <w:p/>
+    <w:p/>
+    <w:p>
+      <w:r>
+        <w:t xml:space="preserve">Get-Content </w:t>
+      </w:r>
+      <w:r>
+        <w:t>"</w:t>
+      </w:r>
+      <w:r>
+        <w:t>\runs\20260828T073219Z_bivariate_multiagent_openai-o3_bivariate_2021_energy_transport</w:t>
+      </w:r>
+      <w:r>
+        <w:t>\attempts_log.json"</w:t>
+      </w:r>
+    </w:p>
+    <w:p/>
+    <w:p>
+      <w:r>
+        <w:t>\runs\20260827T135045Z_bivariate_multiagent_qwen-qwen3-32b_bivariate_2021_gas_waste</w:t>
+      </w:r>
+    </w:p>
+    <w:p/>
+    <w:p/>
+    <w:p/>
+    <w:p>
+      <w:r>
+        <w:t>$models = @(</w:t>
+      </w:r>
+    </w:p>
+    <w:p>
+      <w:r>
+        <w:t xml:space="preserve">    "</w:t>
+      </w:r>
+      <w:proofErr w:type="spellStart"/>
+      <w:r>
+        <w:t>openai</w:t>
+      </w:r>
+      <w:proofErr w:type="spellEnd"/>
+      <w:r>
+        <w:t>/o3",</w:t>
+      </w:r>
+    </w:p>
+    <w:p>
+      <w:r>
+        <w:t xml:space="preserve">    "</w:t>
+      </w:r>
+      <w:proofErr w:type="spellStart"/>
+      <w:r>
+        <w:t>openai</w:t>
+      </w:r>
+      <w:proofErr w:type="spellEnd"/>
+      <w:r>
+        <w:t>/o4-mini",</w:t>
+      </w:r>
+    </w:p>
+    <w:p>
+      <w:r>
+        <w:t xml:space="preserve">    "</w:t>
+      </w:r>
+      <w:proofErr w:type="spellStart"/>
+      <w:r>
+        <w:t>openai</w:t>
+      </w:r>
+      <w:proofErr w:type="spellEnd"/>
+      <w:r>
+        <w:t>/gpt-4o-mini"</w:t>
+      </w:r>
+    </w:p>
+    <w:p>
+      <w:r>
+        <w:t>)</w:t>
+      </w:r>
+    </w:p>
+    <w:p>
+      <w:r>
+        <w:t>foreach ($m in $models) {</w:t>
+      </w:r>
+    </w:p>
+    <w:p>
+      <w:r>
+        <w:t xml:space="preserve">    Write-Host "=== multi_agent_changespillover.py with $m ==="</w:t>
+      </w:r>
+    </w:p>
+    <w:p>
+      <w:r>
+        <w:t xml:space="preserve">    python multi_agent_changespillover.py --model $m 2&gt;&amp;1 | Tee-Object -Append -</w:t>
+      </w:r>
+      <w:proofErr w:type="spellStart"/>
+      <w:r>
+        <w:t>FilePath</w:t>
+      </w:r>
+      <w:proofErr w:type="spellEnd"/>
+      <w:r>
+        <w:t xml:space="preserve"> "changespillover_multiagent_run_log.txt"</w:t>
+      </w:r>
+    </w:p>
+    <w:p>
+      <w:r>
+        <w:t>}</w:t>
+      </w:r>
+    </w:p>
+    <w:p/>
+    <w:p>
+      <w:r>
+        <w:t>$models = @(</w:t>
+      </w:r>
+    </w:p>
+    <w:p>
+      <w:r>
+        <w:t xml:space="preserve">    "</w:t>
+      </w:r>
+      <w:proofErr w:type="spellStart"/>
+      <w:r>
+        <w:t>deepseek</w:t>
+      </w:r>
+      <w:proofErr w:type="spellEnd"/>
+      <w:r>
+        <w:t>/deepseek-chat-v3-0324",</w:t>
+      </w:r>
+    </w:p>
+    <w:p>
+      <w:r>
+        <w:t xml:space="preserve">    "</w:t>
+      </w:r>
+      <w:proofErr w:type="spellStart"/>
+      <w:r>
+        <w:t>deepseek</w:t>
+      </w:r>
+      <w:proofErr w:type="spellEnd"/>
+      <w:r>
+        <w:t>/deepseek-r1-0528",</w:t>
+      </w:r>
+    </w:p>
+    <w:p>
+      <w:r>
+        <w:t xml:space="preserve">    "</w:t>
+      </w:r>
+      <w:proofErr w:type="spellStart"/>
+      <w:r>
+        <w:t>qwen</w:t>
+      </w:r>
+      <w:proofErr w:type="spellEnd"/>
+      <w:r>
+        <w:t>/qwen3-32b",</w:t>
+      </w:r>
+    </w:p>
+    <w:p>
+      <w:r>
+        <w:t xml:space="preserve">    "</w:t>
+      </w:r>
+      <w:proofErr w:type="spellStart"/>
+      <w:r>
+        <w:t>moonshotai</w:t>
+      </w:r>
+      <w:proofErr w:type="spellEnd"/>
+      <w:r>
+        <w:t>/kimi-k2.6",</w:t>
+      </w:r>
+    </w:p>
+    <w:p>
+      <w:r>
+        <w:t xml:space="preserve">    "meta-llama/llama-3.1-8b-instruct"</w:t>
+      </w:r>
+    </w:p>
+    <w:p>
+      <w:r>
+        <w:lastRenderedPageBreak/>
+        <w:t>)</w:t>
+      </w:r>
+    </w:p>
+    <w:p>
+      <w:r>
+        <w:t>foreach ($m in $models) {</w:t>
+      </w:r>
+    </w:p>
+    <w:p>
+      <w:r>
+        <w:t xml:space="preserve">    Write-Host "=== multi_agent_changespillover.py with $m ==="</w:t>
+      </w:r>
+    </w:p>
+    <w:p>
+      <w:r>
+        <w:t xml:space="preserve">    python multi_agent_changespillover.py --model $m 2&gt;&amp;1 | Tee-Object -Append -</w:t>
+      </w:r>
+      <w:proofErr w:type="spellStart"/>
+      <w:r>
+        <w:t>FilePath</w:t>
+      </w:r>
+      <w:proofErr w:type="spellEnd"/>
+      <w:r>
+        <w:t xml:space="preserve"> "changespillover_multiagent_run_log.txt"</w:t>
+      </w:r>
+    </w:p>
+    <w:p>
+      <w:r>
+        <w:t>}</w:t>
+      </w:r>
+    </w:p>
+    <w:p/>
+    <w:p/>
+    <w:p>
+      <w:r>
+        <w:t># For single turn</w:t>
+      </w:r>
+    </w:p>
+    <w:p>
+      <w:r>
+        <w:t>RESULTS_CSV = "bivariate_results.csv"</w:t>
+      </w:r>
+    </w:p>
+    <w:p>
+      <w:r>
+        <w:t>SUMMARY_OUT = "Scores/single turn/bivariate_scoring_summary.csv"</w:t>
+      </w:r>
+    </w:p>
+    <w:p>
+      <w:r>
+        <w:t>CONFUSION_OUT = "Scores/single turn/bivariate_confusion_matrix.csv"</w:t>
+      </w:r>
+    </w:p>
+    <w:p/>
+    <w:p>
+      <w:r>
+        <w:t># For multi turn</w:t>
+      </w:r>
+    </w:p>
+    <w:p>
+      <w:r>
+        <w:t>#RESULTS_CSV = "results/single agent/bivariate_results_multi.csv"</w:t>
+      </w:r>
+    </w:p>
+    <w:p>
+      <w:r>
+        <w:t>#SUMMARY_OUT = "Scores/multi turn/bivariate_scoring_summary_multi.csv"</w:t>
+      </w:r>
+    </w:p>
+    <w:p>
+      <w:r>
+        <w:t>#CONFUSION_OUT = "Scores/multi turn/bivariate_confusion_matrix_multi.csv"</w:t>
+      </w:r>
+    </w:p>
+    <w:p/>
+    <w:p>
+      <w:r>
+        <w:t># For multi agent</w:t>
+      </w:r>
+    </w:p>
+    <w:p>
+      <w:r>
+        <w:t>#RESULTS_CSV = "results/multi agent/bivariate_results_multi.csv"</w:t>
+      </w:r>
+    </w:p>
+    <w:p>
+      <w:r>
+        <w:t>#SUMMARY_OUT = "Scores/multi agent/bivariate_scoring_summary_multi.csv"</w:t>
+      </w:r>
+    </w:p>
+    <w:p>
+      <w:r>
+        <w:t>#CONFUSION_OUT = "Scores/multi agent/bivariate_confusion_matrix_multi.csv"</w:t>
+      </w:r>
+    </w:p>
+    <w:p/>
+    <w:p/>
+    <w:p/>
+    <w:p>
+      <w:r>
+        <w:t>$models = @(</w:t>
+      </w:r>
+    </w:p>
+    <w:p>
+      <w:r>
+        <w:t xml:space="preserve">    "</w:t>
+      </w:r>
+      <w:proofErr w:type="spellStart"/>
+      <w:r>
+        <w:t>openai</w:t>
+      </w:r>
+      <w:proofErr w:type="spellEnd"/>
+      <w:r>
+        <w:t>/o3",</w:t>
+      </w:r>
+    </w:p>
+    <w:p>
+      <w:r>
+        <w:t xml:space="preserve">    "</w:t>
+      </w:r>
+      <w:proofErr w:type="spellStart"/>
+      <w:r>
+        <w:t>openai</w:t>
+      </w:r>
+      <w:proofErr w:type="spellEnd"/>
+      <w:r>
+        <w:t>/o4-mini",</w:t>
+      </w:r>
+    </w:p>
+    <w:p>
+      <w:r>
+        <w:lastRenderedPageBreak/>
+        <w:t xml:space="preserve">    "</w:t>
+      </w:r>
+      <w:proofErr w:type="spellStart"/>
+      <w:r>
+        <w:t>openai</w:t>
+      </w:r>
+      <w:proofErr w:type="spellEnd"/>
+      <w:r>
+        <w:t>/gpt-4o-mini"</w:t>
+      </w:r>
+    </w:p>
+    <w:p>
+      <w:r>
+        <w:t>)</w:t>
+      </w:r>
+    </w:p>
+    <w:p>
+      <w:r>
+        <w:t>foreach ($m in $models) {</w:t>
+      </w:r>
+    </w:p>
+    <w:p>
+      <w:r>
+        <w:t xml:space="preserve">    Write-Host "=== multi_agent_outlier_iterative_r.py with $m ==="</w:t>
+      </w:r>
+    </w:p>
+    <w:p>
+      <w:r>
+        <w:t xml:space="preserve">    python multi_agent_outlier_iterative_r.py --model $m 2&gt;&amp;1 | Tee-Object -Append -</w:t>
+      </w:r>
+      <w:proofErr w:type="spellStart"/>
+      <w:r>
+        <w:t>FilePath</w:t>
+      </w:r>
+      <w:proofErr w:type="spellEnd"/>
+      <w:r>
+        <w:t xml:space="preserve"> "outlier_multiagent_run_log.txt"</w:t>
+      </w:r>
+    </w:p>
+    <w:p>
+      <w:r>
+        <w:t>}</w:t>
+      </w:r>
+    </w:p>
+    <w:p/>
+    <w:p/>
+    <w:p>
+      <w:r>
+        <w:t>$models = @(</w:t>
+      </w:r>
+    </w:p>
+    <w:p>
+      <w:r>
+        <w:t xml:space="preserve">    "</w:t>
+      </w:r>
+      <w:proofErr w:type="spellStart"/>
+      <w:r>
+        <w:t>deepseek</w:t>
+      </w:r>
+      <w:proofErr w:type="spellEnd"/>
+      <w:r>
+        <w:t>/deepseek-chat-v3-0324",</w:t>
+      </w:r>
+    </w:p>
+    <w:p>
+      <w:r>
+        <w:t xml:space="preserve">    "</w:t>
+      </w:r>
+      <w:proofErr w:type="spellStart"/>
+      <w:r>
+        <w:t>deepseek</w:t>
+      </w:r>
+      <w:proofErr w:type="spellEnd"/>
+      <w:r>
+        <w:t>/deepseek-r1-0528",</w:t>
+      </w:r>
+    </w:p>
+    <w:p>
+      <w:r>
+        <w:t xml:space="preserve">    "</w:t>
+      </w:r>
+      <w:proofErr w:type="spellStart"/>
+      <w:r>
+        <w:t>qwen</w:t>
+      </w:r>
+      <w:proofErr w:type="spellEnd"/>
+      <w:r>
+        <w:t>/qwen3-32b",</w:t>
+      </w:r>
+    </w:p>
+    <w:p>
+      <w:r>
+        <w:t xml:space="preserve">    "</w:t>
+      </w:r>
+      <w:proofErr w:type="spellStart"/>
+      <w:r>
+        <w:t>moonshotai</w:t>
+      </w:r>
+      <w:proofErr w:type="spellEnd"/>
+      <w:r>
+        <w:t>/kimi-k2.6",</w:t>
+      </w:r>
+    </w:p>
+    <w:p>
+      <w:r>
+        <w:t xml:space="preserve">    "meta-llama/llama-3.1-8b-instruct"</w:t>
+      </w:r>
+    </w:p>
+    <w:p>
+      <w:r>
+        <w:t>)</w:t>
+      </w:r>
+    </w:p>
+    <w:p>
+      <w:r>
+        <w:t>foreach ($m in $models) {</w:t>
+      </w:r>
+    </w:p>
+    <w:p>
+      <w:r>
+        <w:t xml:space="preserve">    Write-Host "=== multi_agent_outlier_iterative_r.py with $m ==="</w:t>
+      </w:r>
+    </w:p>
+    <w:p>
+      <w:r>
+        <w:t xml:space="preserve">    python multi_agent_outlier_iterative_r.py --model $m 2&gt;&amp;1 | Tee-Object -Append -</w:t>
+      </w:r>
+      <w:proofErr w:type="spellStart"/>
+      <w:r>
+        <w:t>FilePath</w:t>
+      </w:r>
+      <w:proofErr w:type="spellEnd"/>
+      <w:r>
+        <w:t xml:space="preserve"> "outlier_multiagent_run_log.txt"</w:t>
+      </w:r>
+    </w:p>
+    <w:p>
+      <w:r>
+        <w:t>}</w:t>
+      </w:r>
+    </w:p>
+    <w:p/>
+    <w:p>
+      <w:r>
+        <w:t># for multi turn</w:t>
+      </w:r>
+    </w:p>
+    <w:p>
+      <w:r>
+        <w:t>#RESULTS_CSV = "getisord_results_multi.csv"</w:t>
+      </w:r>
+    </w:p>
+    <w:p>
+      <w:r>
+        <w:t>#OUT_CSV = "Scores/multi turn/getisord_scoring_summary.csv"</w:t>
+      </w:r>
+    </w:p>
+    <w:p/>
+    <w:p>
+      <w:r>
+        <w:t>#For single turn</w:t>
+      </w:r>
+    </w:p>
+    <w:p>
+      <w:r>
+        <w:t>#RESULTS_CSV = "getisord_results.csv"</w:t>
+      </w:r>
+    </w:p>
+    <w:p>
+      <w:r>
+        <w:t>#OUT_CSV = "Scores/single turn/getisord_scoring_summary.csv"</w:t>
+      </w:r>
+    </w:p>
+    <w:p/>
+    <w:p>
+      <w:r>
+        <w:t>#For multi agent</w:t>
+      </w:r>
+    </w:p>
+    <w:p>
+      <w:r>
+        <w:t>RESULTS_CSV = "results/multi agent/getisord_results_multiagent.csv"</w:t>
+      </w:r>
+    </w:p>
+    <w:p>
+      <w:r>
+        <w:t>OUT_CSV = "Scores/multi agent/getisord_scoring_summary.csv"</w:t>
+      </w:r>
+    </w:p>
+    <w:p/>
+    <w:p/>
+    <w:p/>
     <w:p>
       <w:r>
         <w:t>python -c "</w:t>
@@ -2968,13 +2658,7 @@
     </w:p>
     <w:p>
       <w:r>
-        <w:t>path = '</w:t>
-      </w:r>
-      <w:r>
-        <w:t>results/multi agent/</w:t>
-      </w:r>
-      <w:r>
-        <w:t>getisord_results_multiagent.csv'</w:t>
+        <w:t>path = 'results/multi agent/getisord_results_multiagent.csv'</w:t>
       </w:r>
     </w:p>
     <w:p>
@@ -2987,13 +2671,8 @@
         <w:t xml:space="preserve"> = </w:t>
       </w:r>
       <w:proofErr w:type="spellStart"/>
-      <w:proofErr w:type="gramStart"/>
-      <w:r>
-        <w:t>pd.read</w:t>
-      </w:r>
-      <w:proofErr w:type="gramEnd"/>
-      <w:r>
-        <w:t>_csv</w:t>
+      <w:r>
+        <w:t>pd.read_csv</w:t>
       </w:r>
       <w:proofErr w:type="spellEnd"/>
       <w:r>
@@ -3037,181 +2716,87 @@
     <w:p/>
     <w:p>
       <w:r>
-        <w:t xml:space="preserve"># Extract the timestamp from </w:t>
+        <w:t>$models = @(</w:t>
+      </w:r>
+    </w:p>
+    <w:p>
+      <w:r>
+        <w:t xml:space="preserve">    "</w:t>
       </w:r>
       <w:proofErr w:type="spellStart"/>
       <w:r>
-        <w:t>run_dir</w:t>
+        <w:t>deepseek</w:t>
       </w:r>
       <w:proofErr w:type="spellEnd"/>
       <w:r>
-        <w:t xml:space="preserve"> to always keep the LATEST row for each (model, </w:t>
+        <w:t>/deepseek-r1-0528",</w:t>
+      </w:r>
+    </w:p>
+    <w:p>
+      <w:r>
+        <w:t xml:space="preserve">    "</w:t>
       </w:r>
       <w:proofErr w:type="spellStart"/>
       <w:r>
-        <w:t>chunk_id</w:t>
+        <w:t>qwen</w:t>
       </w:r>
       <w:proofErr w:type="spellEnd"/>
       <w:r>
+        <w:t>/qwen3-32b",</w:t>
+      </w:r>
+    </w:p>
+    <w:p>
+      <w:r>
+        <w:t xml:space="preserve">    "</w:t>
+      </w:r>
+      <w:proofErr w:type="spellStart"/>
+      <w:r>
+        <w:t>moonshotai</w:t>
+      </w:r>
+      <w:proofErr w:type="spellEnd"/>
+      <w:r>
+        <w:t>/kimi-k2.6",</w:t>
+      </w:r>
+    </w:p>
+    <w:p>
+      <w:r>
+        <w:t xml:space="preserve">    "meta-llama/llama-3.1-8b-instruct"</w:t>
+      </w:r>
+    </w:p>
+    <w:p>
+      <w:r>
         <w:t>)</w:t>
       </w:r>
     </w:p>
     <w:p>
+      <w:r>
+        <w:t>foreach ($m in $models) {</w:t>
+      </w:r>
+    </w:p>
+    <w:p>
+      <w:r>
+        <w:t xml:space="preserve">    Write-Host "=== multi_agent_outlier_iterative_r.py with $m ==="</w:t>
+      </w:r>
+    </w:p>
+    <w:p>
+      <w:r>
+        <w:t xml:space="preserve">    python multi_agent_outlier_iterative_r.py --model $m 2&gt;&amp;1 | Tee-Object -Append -</w:t>
+      </w:r>
       <w:proofErr w:type="spellStart"/>
       <w:r>
-        <w:t>df</w:t>
+        <w:t>FilePath</w:t>
       </w:r>
       <w:proofErr w:type="spellEnd"/>
       <w:r>
-        <w:t>['_</w:t>
-      </w:r>
-      <w:proofErr w:type="spellStart"/>
-      <w:r>
-        <w:t>ts'</w:t>
-      </w:r>
-      <w:proofErr w:type="spellEnd"/>
-      <w:r>
-        <w:t xml:space="preserve">] = </w:t>
-      </w:r>
-      <w:proofErr w:type="spellStart"/>
-      <w:r>
-        <w:t>df</w:t>
-      </w:r>
-      <w:proofErr w:type="spellEnd"/>
-      <w:r>
-        <w:t>['</w:t>
-      </w:r>
-      <w:proofErr w:type="spellStart"/>
-      <w:r>
-        <w:t>run_dir</w:t>
-      </w:r>
-      <w:proofErr w:type="spellEnd"/>
-      <w:r>
-        <w:t>'].</w:t>
-      </w:r>
-      <w:proofErr w:type="spellStart"/>
-      <w:proofErr w:type="gramStart"/>
-      <w:r>
-        <w:t>str.extract</w:t>
-      </w:r>
-      <w:proofErr w:type="spellEnd"/>
-      <w:proofErr w:type="gramEnd"/>
-      <w:r>
-        <w:t>(</w:t>
-      </w:r>
-      <w:proofErr w:type="spellStart"/>
-      <w:proofErr w:type="gramStart"/>
-      <w:r>
-        <w:t>r'runs</w:t>
-      </w:r>
-      <w:proofErr w:type="spellEnd"/>
-      <w:r>
-        <w:t>.(</w:t>
-      </w:r>
-      <w:proofErr w:type="gramEnd"/>
-      <w:r>
-        <w:t>\d{8}T\</w:t>
-      </w:r>
-      <w:proofErr w:type="gramStart"/>
-      <w:r>
-        <w:t>d{</w:t>
-      </w:r>
-      <w:proofErr w:type="gramEnd"/>
-      <w:r>
-        <w:t>6}Z)')</w:t>
-      </w:r>
-    </w:p>
-    <w:p>
-      <w:r>
-        <w:t xml:space="preserve">mask = </w:t>
-      </w:r>
-      <w:proofErr w:type="spellStart"/>
-      <w:proofErr w:type="gramStart"/>
-      <w:r>
-        <w:t>pd.Series</w:t>
-      </w:r>
-      <w:proofErr w:type="spellEnd"/>
-      <w:proofErr w:type="gramEnd"/>
-      <w:r>
-        <w:t>(False, index=</w:t>
-      </w:r>
-      <w:proofErr w:type="spellStart"/>
-      <w:proofErr w:type="gramStart"/>
-      <w:r>
-        <w:t>df.index</w:t>
-      </w:r>
-      <w:proofErr w:type="spellEnd"/>
-      <w:proofErr w:type="gramEnd"/>
-      <w:r>
-        <w:t>)</w:t>
-      </w:r>
-    </w:p>
-    <w:p>
-      <w:r>
-        <w:t xml:space="preserve">for model, chunks in </w:t>
-      </w:r>
-      <w:proofErr w:type="spellStart"/>
-      <w:r>
-        <w:t>to_</w:t>
-      </w:r>
-      <w:proofErr w:type="gramStart"/>
-      <w:r>
-        <w:t>remove.items</w:t>
-      </w:r>
-      <w:proofErr w:type="spellEnd"/>
-      <w:proofErr w:type="gramEnd"/>
-      <w:r>
-        <w:t>():</w:t>
-      </w:r>
-    </w:p>
-    <w:p>
-      <w:r>
-        <w:t xml:space="preserve">    m = (</w:t>
-      </w:r>
-      <w:proofErr w:type="spellStart"/>
-      <w:r>
-        <w:t>df</w:t>
-      </w:r>
-      <w:proofErr w:type="spellEnd"/>
-      <w:r>
-        <w:t>['model'] == model) &amp; (</w:t>
-      </w:r>
-      <w:proofErr w:type="spellStart"/>
-      <w:r>
-        <w:t>df</w:t>
-      </w:r>
-      <w:proofErr w:type="spellEnd"/>
-      <w:r>
-        <w:t>['</w:t>
-      </w:r>
-      <w:proofErr w:type="spellStart"/>
-      <w:r>
-        <w:t>chunk_id</w:t>
-      </w:r>
-      <w:proofErr w:type="spellEnd"/>
-      <w:r>
-        <w:t>'</w:t>
-      </w:r>
-      <w:proofErr w:type="gramStart"/>
-      <w:r>
-        <w:t>].</w:t>
-      </w:r>
-      <w:proofErr w:type="spellStart"/>
-      <w:r>
-        <w:t>isin</w:t>
-      </w:r>
-      <w:proofErr w:type="spellEnd"/>
-      <w:proofErr w:type="gramEnd"/>
-      <w:r>
-        <w:t>(chunks))</w:t>
-      </w:r>
-    </w:p>
-    <w:p>
-      <w:r>
-        <w:t xml:space="preserve">    mask |= m</w:t>
-      </w:r>
-    </w:p>
-    <w:p/>
+        <w:t xml:space="preserve"> "outlier_multiagent_run_log.txt"</w:t>
+      </w:r>
+    </w:p>
+    <w:p>
+      <w:r>
+        <w:lastRenderedPageBreak/>
+        <w:t>}</w:t>
+      </w:r>
+    </w:p>
     <w:p/>
     <w:sectPr>
       <w:pgSz w:w="11906" w:h="16838"/>
@@ -3389,6 +2974,95 @@
     </w:lvl>
   </w:abstractNum>
   <w:abstractNum w:abstractNumId="1" w15:restartNumberingAfterBreak="0">
+    <w:nsid w:val="06826401"/>
+    <w:multiLevelType w:val="hybridMultilevel"/>
+    <w:tmpl w:val="838E86CC"/>
+    <w:lvl w:ilvl="0" w:tplc="0C09000F">
+      <w:start w:val="1"/>
+      <w:numFmt w:val="decimal"/>
+      <w:lvlText w:val="%1."/>
+      <w:lvlJc w:val="left"/>
+      <w:pPr>
+        <w:ind w:left="720" w:hanging="360"/>
+      </w:pPr>
+      <w:rPr>
+        <w:rFonts w:hint="default"/>
+      </w:rPr>
+    </w:lvl>
+    <w:lvl w:ilvl="1" w:tplc="0C090019" w:tentative="1">
+      <w:start w:val="1"/>
+      <w:numFmt w:val="lowerLetter"/>
+      <w:lvlText w:val="%2."/>
+      <w:lvlJc w:val="left"/>
+      <w:pPr>
+        <w:ind w:left="1440" w:hanging="360"/>
+      </w:pPr>
+    </w:lvl>
+    <w:lvl w:ilvl="2" w:tplc="0C09001B" w:tentative="1">
+      <w:start w:val="1"/>
+      <w:numFmt w:val="lowerRoman"/>
+      <w:lvlText w:val="%3."/>
+      <w:lvlJc w:val="right"/>
+      <w:pPr>
+        <w:ind w:left="2160" w:hanging="180"/>
+      </w:pPr>
+    </w:lvl>
+    <w:lvl w:ilvl="3" w:tplc="0C09000F" w:tentative="1">
+      <w:start w:val="1"/>
+      <w:numFmt w:val="decimal"/>
+      <w:lvlText w:val="%4."/>
+      <w:lvlJc w:val="left"/>
+      <w:pPr>
+        <w:ind w:left="2880" w:hanging="360"/>
+      </w:pPr>
+    </w:lvl>
+    <w:lvl w:ilvl="4" w:tplc="0C090019" w:tentative="1">
+      <w:start w:val="1"/>
+      <w:numFmt w:val="lowerLetter"/>
+      <w:lvlText w:val="%5."/>
+      <w:lvlJc w:val="left"/>
+      <w:pPr>
+        <w:ind w:left="3600" w:hanging="360"/>
+      </w:pPr>
+    </w:lvl>
+    <w:lvl w:ilvl="5" w:tplc="0C09001B" w:tentative="1">
+      <w:start w:val="1"/>
+      <w:numFmt w:val="lowerRoman"/>
+      <w:lvlText w:val="%6."/>
+      <w:lvlJc w:val="right"/>
+      <w:pPr>
+        <w:ind w:left="4320" w:hanging="180"/>
+      </w:pPr>
+    </w:lvl>
+    <w:lvl w:ilvl="6" w:tplc="0C09000F" w:tentative="1">
+      <w:start w:val="1"/>
+      <w:numFmt w:val="decimal"/>
+      <w:lvlText w:val="%7."/>
+      <w:lvlJc w:val="left"/>
+      <w:pPr>
+        <w:ind w:left="5040" w:hanging="360"/>
+      </w:pPr>
+    </w:lvl>
+    <w:lvl w:ilvl="7" w:tplc="0C090019" w:tentative="1">
+      <w:start w:val="1"/>
+      <w:numFmt w:val="lowerLetter"/>
+      <w:lvlText w:val="%8."/>
+      <w:lvlJc w:val="left"/>
+      <w:pPr>
+        <w:ind w:left="5760" w:hanging="360"/>
+      </w:pPr>
+    </w:lvl>
+    <w:lvl w:ilvl="8" w:tplc="0C09001B" w:tentative="1">
+      <w:start w:val="1"/>
+      <w:numFmt w:val="lowerRoman"/>
+      <w:lvlText w:val="%9."/>
+      <w:lvlJc w:val="right"/>
+      <w:pPr>
+        <w:ind w:left="6480" w:hanging="180"/>
+      </w:pPr>
+    </w:lvl>
+  </w:abstractNum>
+  <w:abstractNum w:abstractNumId="2" w15:restartNumberingAfterBreak="0">
     <w:nsid w:val="082937AA"/>
     <w:multiLevelType w:val="hybridMultilevel"/>
     <w:tmpl w:val="87B2303A"/>
@@ -3501,7 +3175,7 @@
       </w:rPr>
     </w:lvl>
   </w:abstractNum>
-  <w:abstractNum w:abstractNumId="2" w15:restartNumberingAfterBreak="0">
+  <w:abstractNum w:abstractNumId="3" w15:restartNumberingAfterBreak="0">
     <w:nsid w:val="0BB97773"/>
     <w:multiLevelType w:val="multilevel"/>
     <w:tmpl w:val="7F88F9C0"/>
@@ -3650,7 +3324,7 @@
       </w:rPr>
     </w:lvl>
   </w:abstractNum>
-  <w:abstractNum w:abstractNumId="3" w15:restartNumberingAfterBreak="0">
+  <w:abstractNum w:abstractNumId="4" w15:restartNumberingAfterBreak="0">
     <w:nsid w:val="1ED57FF1"/>
     <w:multiLevelType w:val="multilevel"/>
     <w:tmpl w:val="1AA23DEE"/>
@@ -3799,7 +3473,7 @@
       </w:rPr>
     </w:lvl>
   </w:abstractNum>
-  <w:abstractNum w:abstractNumId="4" w15:restartNumberingAfterBreak="0">
+  <w:abstractNum w:abstractNumId="5" w15:restartNumberingAfterBreak="0">
     <w:nsid w:val="1F581C15"/>
     <w:multiLevelType w:val="multilevel"/>
     <w:tmpl w:val="FAEE2784"/>
@@ -3948,7 +3622,7 @@
       </w:rPr>
     </w:lvl>
   </w:abstractNum>
-  <w:abstractNum w:abstractNumId="5" w15:restartNumberingAfterBreak="0">
+  <w:abstractNum w:abstractNumId="6" w15:restartNumberingAfterBreak="0">
     <w:nsid w:val="25AB59F7"/>
     <w:multiLevelType w:val="multilevel"/>
     <w:tmpl w:val="EF38EB24"/>
@@ -4097,7 +3771,7 @@
       </w:rPr>
     </w:lvl>
   </w:abstractNum>
-  <w:abstractNum w:abstractNumId="6" w15:restartNumberingAfterBreak="0">
+  <w:abstractNum w:abstractNumId="7" w15:restartNumberingAfterBreak="0">
     <w:nsid w:val="29612503"/>
     <w:multiLevelType w:val="hybridMultilevel"/>
     <w:tmpl w:val="1FEA999A"/>
@@ -4186,7 +3860,7 @@
       </w:pPr>
     </w:lvl>
   </w:abstractNum>
-  <w:abstractNum w:abstractNumId="7" w15:restartNumberingAfterBreak="0">
+  <w:abstractNum w:abstractNumId="8" w15:restartNumberingAfterBreak="0">
     <w:nsid w:val="2A52345E"/>
     <w:multiLevelType w:val="hybridMultilevel"/>
     <w:tmpl w:val="F766BA28"/>
@@ -4275,7 +3949,7 @@
       </w:pPr>
     </w:lvl>
   </w:abstractNum>
-  <w:abstractNum w:abstractNumId="8" w15:restartNumberingAfterBreak="0">
+  <w:abstractNum w:abstractNumId="9" w15:restartNumberingAfterBreak="0">
     <w:nsid w:val="2B191E51"/>
     <w:multiLevelType w:val="multilevel"/>
     <w:tmpl w:val="80E8CF20"/>
@@ -4424,7 +4098,7 @@
       </w:rPr>
     </w:lvl>
   </w:abstractNum>
-  <w:abstractNum w:abstractNumId="9" w15:restartNumberingAfterBreak="0">
+  <w:abstractNum w:abstractNumId="10" w15:restartNumberingAfterBreak="0">
     <w:nsid w:val="2E9E10AA"/>
     <w:multiLevelType w:val="multilevel"/>
     <w:tmpl w:val="14AEC0C0"/>
@@ -4573,7 +4247,7 @@
       </w:rPr>
     </w:lvl>
   </w:abstractNum>
-  <w:abstractNum w:abstractNumId="10" w15:restartNumberingAfterBreak="0">
+  <w:abstractNum w:abstractNumId="11" w15:restartNumberingAfterBreak="0">
     <w:nsid w:val="32180EFE"/>
     <w:multiLevelType w:val="hybridMultilevel"/>
     <w:tmpl w:val="077446E2"/>
@@ -4662,7 +4336,7 @@
       </w:pPr>
     </w:lvl>
   </w:abstractNum>
-  <w:abstractNum w:abstractNumId="11" w15:restartNumberingAfterBreak="0">
+  <w:abstractNum w:abstractNumId="12" w15:restartNumberingAfterBreak="0">
     <w:nsid w:val="409D05EC"/>
     <w:multiLevelType w:val="multilevel"/>
     <w:tmpl w:val="CAE07CEA"/>
@@ -4811,7 +4485,7 @@
       </w:rPr>
     </w:lvl>
   </w:abstractNum>
-  <w:abstractNum w:abstractNumId="12" w15:restartNumberingAfterBreak="0">
+  <w:abstractNum w:abstractNumId="13" w15:restartNumberingAfterBreak="0">
     <w:nsid w:val="41B929FE"/>
     <w:multiLevelType w:val="hybridMultilevel"/>
     <w:tmpl w:val="6ED8BA58"/>
@@ -4924,7 +4598,7 @@
       </w:rPr>
     </w:lvl>
   </w:abstractNum>
-  <w:abstractNum w:abstractNumId="13" w15:restartNumberingAfterBreak="0">
+  <w:abstractNum w:abstractNumId="14" w15:restartNumberingAfterBreak="0">
     <w:nsid w:val="47EE46DD"/>
     <w:multiLevelType w:val="multilevel"/>
     <w:tmpl w:val="C10692C6"/>
@@ -5073,7 +4747,7 @@
       </w:rPr>
     </w:lvl>
   </w:abstractNum>
-  <w:abstractNum w:abstractNumId="14" w15:restartNumberingAfterBreak="0">
+  <w:abstractNum w:abstractNumId="15" w15:restartNumberingAfterBreak="0">
     <w:nsid w:val="48984071"/>
     <w:multiLevelType w:val="hybridMultilevel"/>
     <w:tmpl w:val="C22A5966"/>
@@ -5186,7 +4860,7 @@
       </w:rPr>
     </w:lvl>
   </w:abstractNum>
-  <w:abstractNum w:abstractNumId="15" w15:restartNumberingAfterBreak="0">
+  <w:abstractNum w:abstractNumId="16" w15:restartNumberingAfterBreak="0">
     <w:nsid w:val="51E57F3F"/>
     <w:multiLevelType w:val="multilevel"/>
     <w:tmpl w:val="BFE4032E"/>
@@ -5335,7 +5009,7 @@
       </w:rPr>
     </w:lvl>
   </w:abstractNum>
-  <w:abstractNum w:abstractNumId="16" w15:restartNumberingAfterBreak="0">
+  <w:abstractNum w:abstractNumId="17" w15:restartNumberingAfterBreak="0">
     <w:nsid w:val="52664C58"/>
     <w:multiLevelType w:val="multilevel"/>
     <w:tmpl w:val="FD7C4348"/>
@@ -5484,7 +5158,7 @@
       </w:rPr>
     </w:lvl>
   </w:abstractNum>
-  <w:abstractNum w:abstractNumId="17" w15:restartNumberingAfterBreak="0">
+  <w:abstractNum w:abstractNumId="18" w15:restartNumberingAfterBreak="0">
     <w:nsid w:val="52A66F86"/>
     <w:multiLevelType w:val="multilevel"/>
     <w:tmpl w:val="5F825836"/>
@@ -5633,7 +5307,7 @@
       </w:rPr>
     </w:lvl>
   </w:abstractNum>
-  <w:abstractNum w:abstractNumId="18" w15:restartNumberingAfterBreak="0">
+  <w:abstractNum w:abstractNumId="19" w15:restartNumberingAfterBreak="0">
     <w:nsid w:val="56763302"/>
     <w:multiLevelType w:val="multilevel"/>
     <w:tmpl w:val="417CC12C"/>
@@ -5746,7 +5420,7 @@
       </w:pPr>
     </w:lvl>
   </w:abstractNum>
-  <w:abstractNum w:abstractNumId="19" w15:restartNumberingAfterBreak="0">
+  <w:abstractNum w:abstractNumId="20" w15:restartNumberingAfterBreak="0">
     <w:nsid w:val="56E85177"/>
     <w:multiLevelType w:val="hybridMultilevel"/>
     <w:tmpl w:val="F6C215CC"/>
@@ -5835,7 +5509,7 @@
       </w:pPr>
     </w:lvl>
   </w:abstractNum>
-  <w:abstractNum w:abstractNumId="20" w15:restartNumberingAfterBreak="0">
+  <w:abstractNum w:abstractNumId="21" w15:restartNumberingAfterBreak="0">
     <w:nsid w:val="57B7580C"/>
     <w:multiLevelType w:val="multilevel"/>
     <w:tmpl w:val="331897E6"/>
@@ -5984,7 +5658,7 @@
       </w:rPr>
     </w:lvl>
   </w:abstractNum>
-  <w:abstractNum w:abstractNumId="21" w15:restartNumberingAfterBreak="0">
+  <w:abstractNum w:abstractNumId="22" w15:restartNumberingAfterBreak="0">
     <w:nsid w:val="6E2B2539"/>
     <w:multiLevelType w:val="multilevel"/>
     <w:tmpl w:val="5E18522E"/>
@@ -6133,7 +5807,7 @@
       </w:rPr>
     </w:lvl>
   </w:abstractNum>
-  <w:abstractNum w:abstractNumId="22" w15:restartNumberingAfterBreak="0">
+  <w:abstractNum w:abstractNumId="23" w15:restartNumberingAfterBreak="0">
     <w:nsid w:val="6FCF39EB"/>
     <w:multiLevelType w:val="multilevel"/>
     <w:tmpl w:val="5622D1B6"/>
@@ -6246,7 +5920,7 @@
       </w:pPr>
     </w:lvl>
   </w:abstractNum>
-  <w:abstractNum w:abstractNumId="23" w15:restartNumberingAfterBreak="0">
+  <w:abstractNum w:abstractNumId="24" w15:restartNumberingAfterBreak="0">
     <w:nsid w:val="73FC6699"/>
     <w:multiLevelType w:val="multilevel"/>
     <w:tmpl w:val="B0FC59DA"/>
@@ -6395,7 +6069,7 @@
       </w:rPr>
     </w:lvl>
   </w:abstractNum>
-  <w:abstractNum w:abstractNumId="24" w15:restartNumberingAfterBreak="0">
+  <w:abstractNum w:abstractNumId="25" w15:restartNumberingAfterBreak="0">
     <w:nsid w:val="79406C92"/>
     <w:multiLevelType w:val="multilevel"/>
     <w:tmpl w:val="BD2CB4EE"/>
@@ -6544,7 +6218,7 @@
       </w:rPr>
     </w:lvl>
   </w:abstractNum>
-  <w:abstractNum w:abstractNumId="25" w15:restartNumberingAfterBreak="0">
+  <w:abstractNum w:abstractNumId="26" w15:restartNumberingAfterBreak="0">
     <w:nsid w:val="79FE63D3"/>
     <w:multiLevelType w:val="hybridMultilevel"/>
     <w:tmpl w:val="E8104E28"/>
@@ -6657,7 +6331,7 @@
       </w:rPr>
     </w:lvl>
   </w:abstractNum>
-  <w:abstractNum w:abstractNumId="26" w15:restartNumberingAfterBreak="0">
+  <w:abstractNum w:abstractNumId="27" w15:restartNumberingAfterBreak="0">
     <w:nsid w:val="7E747D97"/>
     <w:multiLevelType w:val="multilevel"/>
     <w:tmpl w:val="B9663854"/>
@@ -6807,85 +6481,88 @@
     </w:lvl>
   </w:abstractNum>
   <w:num w:numId="1" w16cid:durableId="218325662">
+    <w:abstractNumId w:val="11"/>
+  </w:num>
+  <w:num w:numId="2" w16cid:durableId="949894460">
+    <w:abstractNumId w:val="27"/>
+  </w:num>
+  <w:num w:numId="3" w16cid:durableId="2046249276">
+    <w:abstractNumId w:val="13"/>
+  </w:num>
+  <w:num w:numId="4" w16cid:durableId="666372398">
+    <w:abstractNumId w:val="15"/>
+  </w:num>
+  <w:num w:numId="5" w16cid:durableId="1366442354">
+    <w:abstractNumId w:val="12"/>
+  </w:num>
+  <w:num w:numId="6" w16cid:durableId="446856109">
+    <w:abstractNumId w:val="26"/>
+  </w:num>
+  <w:num w:numId="7" w16cid:durableId="1248686708">
+    <w:abstractNumId w:val="9"/>
+  </w:num>
+  <w:num w:numId="8" w16cid:durableId="309411250">
+    <w:abstractNumId w:val="2"/>
+  </w:num>
+  <w:num w:numId="9" w16cid:durableId="805900537">
+    <w:abstractNumId w:val="16"/>
+  </w:num>
+  <w:num w:numId="10" w16cid:durableId="1637374921">
+    <w:abstractNumId w:val="21"/>
+  </w:num>
+  <w:num w:numId="11" w16cid:durableId="591663597">
+    <w:abstractNumId w:val="22"/>
+  </w:num>
+  <w:num w:numId="12" w16cid:durableId="413086598">
     <w:abstractNumId w:val="10"/>
   </w:num>
-  <w:num w:numId="2" w16cid:durableId="949894460">
-    <w:abstractNumId w:val="26"/>
+  <w:num w:numId="13" w16cid:durableId="543177734">
+    <w:abstractNumId w:val="4"/>
   </w:num>
-  <w:num w:numId="3" w16cid:durableId="2046249276">
-    <w:abstractNumId w:val="12"/>
+  <w:num w:numId="14" w16cid:durableId="1741715099">
+    <w:abstractNumId w:val="3"/>
   </w:num>
-  <w:num w:numId="4" w16cid:durableId="666372398">
+  <w:num w:numId="15" w16cid:durableId="571080886">
+    <w:abstractNumId w:val="6"/>
+  </w:num>
+  <w:num w:numId="16" w16cid:durableId="923998874">
+    <w:abstractNumId w:val="17"/>
+  </w:num>
+  <w:num w:numId="17" w16cid:durableId="508526334">
+    <w:abstractNumId w:val="5"/>
+  </w:num>
+  <w:num w:numId="18" w16cid:durableId="1243176050">
+    <w:abstractNumId w:val="25"/>
+  </w:num>
+  <w:num w:numId="19" w16cid:durableId="976909258">
+    <w:abstractNumId w:val="18"/>
+  </w:num>
+  <w:num w:numId="20" w16cid:durableId="1794206950">
+    <w:abstractNumId w:val="8"/>
+  </w:num>
+  <w:num w:numId="21" w16cid:durableId="647708104">
+    <w:abstractNumId w:val="19"/>
+  </w:num>
+  <w:num w:numId="22" w16cid:durableId="1383990435">
+    <w:abstractNumId w:val="7"/>
+  </w:num>
+  <w:num w:numId="23" w16cid:durableId="447822864">
     <w:abstractNumId w:val="14"/>
   </w:num>
-  <w:num w:numId="5" w16cid:durableId="1366442354">
-    <w:abstractNumId w:val="11"/>
-  </w:num>
-  <w:num w:numId="6" w16cid:durableId="446856109">
-    <w:abstractNumId w:val="25"/>
-  </w:num>
-  <w:num w:numId="7" w16cid:durableId="1248686708">
-    <w:abstractNumId w:val="8"/>
-  </w:num>
-  <w:num w:numId="8" w16cid:durableId="309411250">
-    <w:abstractNumId w:val="1"/>
-  </w:num>
-  <w:num w:numId="9" w16cid:durableId="805900537">
-    <w:abstractNumId w:val="15"/>
-  </w:num>
-  <w:num w:numId="10" w16cid:durableId="1637374921">
-    <w:abstractNumId w:val="20"/>
-  </w:num>
-  <w:num w:numId="11" w16cid:durableId="591663597">
-    <w:abstractNumId w:val="21"/>
-  </w:num>
-  <w:num w:numId="12" w16cid:durableId="413086598">
-    <w:abstractNumId w:val="9"/>
-  </w:num>
-  <w:num w:numId="13" w16cid:durableId="543177734">
-    <w:abstractNumId w:val="3"/>
-  </w:num>
-  <w:num w:numId="14" w16cid:durableId="1741715099">
-    <w:abstractNumId w:val="2"/>
-  </w:num>
-  <w:num w:numId="15" w16cid:durableId="571080886">
-    <w:abstractNumId w:val="5"/>
-  </w:num>
-  <w:num w:numId="16" w16cid:durableId="923998874">
-    <w:abstractNumId w:val="16"/>
-  </w:num>
-  <w:num w:numId="17" w16cid:durableId="508526334">
-    <w:abstractNumId w:val="4"/>
-  </w:num>
-  <w:num w:numId="18" w16cid:durableId="1243176050">
-    <w:abstractNumId w:val="24"/>
-  </w:num>
-  <w:num w:numId="19" w16cid:durableId="976909258">
-    <w:abstractNumId w:val="17"/>
-  </w:num>
-  <w:num w:numId="20" w16cid:durableId="1794206950">
-    <w:abstractNumId w:val="7"/>
-  </w:num>
-  <w:num w:numId="21" w16cid:durableId="647708104">
-    <w:abstractNumId w:val="18"/>
-  </w:num>
-  <w:num w:numId="22" w16cid:durableId="1383990435">
-    <w:abstractNumId w:val="6"/>
-  </w:num>
-  <w:num w:numId="23" w16cid:durableId="447822864">
-    <w:abstractNumId w:val="13"/>
-  </w:num>
   <w:num w:numId="24" w16cid:durableId="1749838753">
-    <w:abstractNumId w:val="22"/>
+    <w:abstractNumId w:val="23"/>
   </w:num>
   <w:num w:numId="25" w16cid:durableId="1297024767">
-    <w:abstractNumId w:val="23"/>
+    <w:abstractNumId w:val="24"/>
   </w:num>
   <w:num w:numId="26" w16cid:durableId="1129130640">
     <w:abstractNumId w:val="0"/>
   </w:num>
   <w:num w:numId="27" w16cid:durableId="1227767284">
-    <w:abstractNumId w:val="19"/>
+    <w:abstractNumId w:val="20"/>
+  </w:num>
+  <w:num w:numId="28" w16cid:durableId="986321622">
+    <w:abstractNumId w:val="1"/>
   </w:num>
 </w:numbering>
 </file>
@@ -7340,7 +7017,6 @@
     <w:next w:val="Normal"/>
     <w:link w:val="Heading3Char"/>
     <w:uiPriority w:val="9"/>
-    <w:semiHidden/>
     <w:unhideWhenUsed/>
     <w:qFormat/>
     <w:rsid w:val="00DA5D36"/>
@@ -7546,7 +7222,6 @@
     <w:basedOn w:val="DefaultParagraphFont"/>
     <w:link w:val="Heading3"/>
     <w:uiPriority w:val="9"/>
-    <w:semiHidden/>
     <w:rsid w:val="00DA5D36"/>
     <w:rPr>
       <w:rFonts w:eastAsiaTheme="majorEastAsia" w:cstheme="majorBidi"/>

</xml_diff>

<commit_message>
Process based scoring metrics used for all 5 tasks
</commit_message>
<xml_diff>
--- a/Follow up/multi agent selection justification.docx
+++ b/Follow up/multi agent selection justification.docx
@@ -17,8 +17,18 @@
           <w:bCs/>
           <w:u w:val="single"/>
         </w:rPr>
-        <w:t>Why not generating multiple plan</w:t>
-      </w:r>
+        <w:t xml:space="preserve">Why not generating multiple </w:t>
+      </w:r>
+      <w:proofErr w:type="gramStart"/>
+      <w:r>
+        <w:rPr>
+          <w:b/>
+          <w:bCs/>
+          <w:u w:val="single"/>
+        </w:rPr>
+        <w:t>plan</w:t>
+      </w:r>
+      <w:proofErr w:type="gramEnd"/>
       <w:r>
         <w:rPr>
           <w:b/>
@@ -74,7 +84,15 @@
         <w:t>same LLM that wrote the plan</w:t>
       </w:r>
       <w:r>
-        <w:t xml:space="preserve"> to self-assess how confident it is, before any code has run. That's exactly the kind of unverified self-judgment Huang et al. (2024) found unreliable  and we've seen it directly in our own data: </w:t>
+        <w:t xml:space="preserve"> to self-assess how confident it is, before any code has run. That's exactly the kind of unverified self-judgment Huang et al. (2024) found </w:t>
+      </w:r>
+      <w:proofErr w:type="gramStart"/>
+      <w:r>
+        <w:t>unreliable  and</w:t>
+      </w:r>
+      <w:proofErr w:type="gramEnd"/>
+      <w:r>
+        <w:t xml:space="preserve"> we've seen it directly in our own data: </w:t>
       </w:r>
       <w:proofErr w:type="spellStart"/>
       <w:r>
@@ -199,7 +217,25 @@
           <w:bCs/>
           <w:u w:val="single"/>
         </w:rPr>
-        <w:t xml:space="preserve"> Coding + Debugging  a real, fundamental distinction, not just a naming choice</w:t>
+        <w:t xml:space="preserve"> Coding + </w:t>
+      </w:r>
+      <w:proofErr w:type="gramStart"/>
+      <w:r>
+        <w:rPr>
+          <w:b/>
+          <w:bCs/>
+          <w:u w:val="single"/>
+        </w:rPr>
+        <w:t>Debugging  a</w:t>
+      </w:r>
+      <w:proofErr w:type="gramEnd"/>
+      <w:r>
+        <w:rPr>
+          <w:b/>
+          <w:bCs/>
+          <w:u w:val="single"/>
+        </w:rPr>
+        <w:t xml:space="preserve"> real, fundamental distinction, not just a naming choice</w:t>
       </w:r>
     </w:p>
     <w:p>
@@ -285,7 +321,15 @@
         <w:t>is</w:t>
       </w:r>
       <w:r>
-        <w:t xml:space="preserve"> the thing we're testing whether the model can compute  handing it over as a "sample answer" to check against would make the whole experiment circular. There is no equivalent of a sample I/O for "is this borough's spatial clustering significant."</w:t>
+        <w:t xml:space="preserve"> the thing we're testing whether the model can </w:t>
+      </w:r>
+      <w:proofErr w:type="gramStart"/>
+      <w:r>
+        <w:t>compute  handing</w:t>
+      </w:r>
+      <w:proofErr w:type="gramEnd"/>
+      <w:r>
+        <w:t xml:space="preserve"> it over as a "sample answer" to check against would make the whole experiment circular. There is no equivalent of a sample I/O for "is this borough's spatial clustering significant."</w:t>
       </w:r>
     </w:p>
     <w:p>
@@ -332,7 +376,15 @@
         <w:t>.</w:t>
       </w:r>
       <w:r>
-        <w:t xml:space="preserve"> It can catch nan, an impossible p-value, or a hardcoded literal  but it </w:t>
+        <w:t xml:space="preserve"> It can catch nan, an impossible p-value, or a hardcoded </w:t>
+      </w:r>
+      <w:proofErr w:type="gramStart"/>
+      <w:r>
+        <w:t>literal  but</w:t>
+      </w:r>
+      <w:proofErr w:type="gramEnd"/>
+      <w:r>
+        <w:t xml:space="preserve"> it </w:t>
       </w:r>
       <w:r>
         <w:rPr>
@@ -522,8 +574,17 @@
                 <w:b/>
                 <w:bCs/>
               </w:rPr>
-              <w:t>What it actually does</w:t>
-            </w:r>
+              <w:t xml:space="preserve">What it </w:t>
+            </w:r>
+            <w:proofErr w:type="gramStart"/>
+            <w:r>
+              <w:rPr>
+                <w:b/>
+                <w:bCs/>
+              </w:rPr>
+              <w:t>actually does</w:t>
+            </w:r>
+            <w:proofErr w:type="gramEnd"/>
           </w:p>
         </w:tc>
         <w:tc>
@@ -908,8 +969,17 @@
                 <w:b/>
                 <w:bCs/>
               </w:rPr>
-              <w:t>Confirms the number of data points the model claims to have used matches what the dataset actually contains</w:t>
-            </w:r>
+              <w:t xml:space="preserve">Confirms the number of data points the model claims to have used matches what the dataset </w:t>
+            </w:r>
+            <w:proofErr w:type="gramStart"/>
+            <w:r>
+              <w:rPr>
+                <w:b/>
+                <w:bCs/>
+              </w:rPr>
+              <w:t>actually contains</w:t>
+            </w:r>
+            <w:proofErr w:type="gramEnd"/>
           </w:p>
           <w:p>
             <w:pPr>
@@ -931,7 +1001,21 @@
                 <w:b/>
                 <w:bCs/>
               </w:rPr>
-              <w:t>Data counts – missing from planner agent == data points found by coder</w:t>
+              <w:t xml:space="preserve">Data counts </w:t>
+            </w:r>
+            <w:r>
+              <w:rPr>
+                <w:b/>
+                <w:bCs/>
+              </w:rPr>
+              <w:t>(from file read)</w:t>
+            </w:r>
+            <w:r>
+              <w:rPr>
+                <w:b/>
+                <w:bCs/>
+              </w:rPr>
+              <w:t>– missing from planner agent == data points found by coder</w:t>
             </w:r>
           </w:p>
         </w:tc>
@@ -1189,11 +1273,19 @@
       </w:r>
       <w:proofErr w:type="spellEnd"/>
       <w:r>
-        <w:t xml:space="preserve"> -  </w:t>
+        <w:t xml:space="preserve"> </w:t>
+      </w:r>
+      <w:proofErr w:type="gramStart"/>
+      <w:r>
+        <w:t xml:space="preserve">-  </w:t>
       </w:r>
       <w:proofErr w:type="spellStart"/>
       <w:r>
-        <w:t>mean_of_neighbors</w:t>
+        <w:t>mean</w:t>
+      </w:r>
+      <w:proofErr w:type="gramEnd"/>
+      <w:r>
+        <w:t>_of_neighbors</w:t>
       </w:r>
       <w:proofErr w:type="spellEnd"/>
       <w:r>
@@ -1324,7 +1416,15 @@
           <w:b/>
           <w:bCs/>
         </w:rPr>
-        <w:t>outlier_magnitude_plausible</w:t>
+        <w:t>outlier_magnitude_</w:t>
+      </w:r>
+      <w:proofErr w:type="gramStart"/>
+      <w:r>
+        <w:rPr>
+          <w:b/>
+          <w:bCs/>
+        </w:rPr>
+        <w:t>plausible</w:t>
       </w:r>
       <w:proofErr w:type="spellEnd"/>
       <w:r>
@@ -1332,7 +1432,15 @@
           <w:b/>
           <w:bCs/>
         </w:rPr>
-        <w:t>():</w:t>
+        <w:t>(</w:t>
+      </w:r>
+      <w:proofErr w:type="gramEnd"/>
+      <w:r>
+        <w:rPr>
+          <w:b/>
+          <w:bCs/>
+        </w:rPr>
+        <w:t>):</w:t>
       </w:r>
       <w:r>
         <w:t xml:space="preserve"> rejects cited values &gt;</w:t>
@@ -1343,8 +1451,13 @@
       <w:r>
         <w:t xml:space="preserve">, grounded in the real observed ground-truth max a task-specific, </w:t>
       </w:r>
-      <w:r>
-        <w:t>If used other statistical method count them true if a finite number is cited.</w:t>
+      <w:proofErr w:type="gramStart"/>
+      <w:r>
+        <w:t>If</w:t>
+      </w:r>
+      <w:proofErr w:type="gramEnd"/>
+      <w:r>
+        <w:t xml:space="preserve"> used other statistical method count them true if a finite number is cited.</w:t>
       </w:r>
       <w:r>
         <w:t xml:space="preserve"> </w:t>
@@ -1352,6 +1465,9 @@
       <w:r>
         <w:t xml:space="preserve"> Some cited values are showing too big numbers. </w:t>
       </w:r>
+      <w:r>
+        <w:tab/>
+      </w:r>
     </w:p>
     <w:p>
       <w:proofErr w:type="spellStart"/>
@@ -1360,7 +1476,15 @@
           <w:b/>
           <w:bCs/>
         </w:rPr>
-        <w:t>verdict_z_consistent</w:t>
+        <w:t>verdict_z_</w:t>
+      </w:r>
+      <w:proofErr w:type="gramStart"/>
+      <w:r>
+        <w:rPr>
+          <w:b/>
+          <w:bCs/>
+        </w:rPr>
+        <w:t>consistent</w:t>
       </w:r>
       <w:proofErr w:type="spellEnd"/>
       <w:r>
@@ -1368,7 +1492,15 @@
           <w:b/>
           <w:bCs/>
         </w:rPr>
-        <w:t>():</w:t>
+        <w:t>(</w:t>
+      </w:r>
+      <w:proofErr w:type="gramEnd"/>
+      <w:r>
+        <w:rPr>
+          <w:b/>
+          <w:bCs/>
+        </w:rPr>
+        <w:t>):</w:t>
       </w:r>
       <w:r>
         <w:t xml:space="preserve"> rejects cases where the verdict contradicts the model's own cited value (e.g. a z=2.4 result </w:t>
@@ -1543,7 +1675,15 @@
     <w:p/>
     <w:p>
       <w:r>
-        <w:t xml:space="preserve">Question: Do boroughs that saw a large CHANGE in NO2 between 2021 and 2022 tend to be located near other boroughs that ALSO saw a similarly-sized change in the SAME direction (both increasing, or both decreasing), or does a borough's change show no relationship to its </w:t>
+        <w:t xml:space="preserve">Question: Do boroughs that saw a large CHANGE in NO2 between 2021 and 2022 tend to be located near other boroughs that ALSO saw a </w:t>
+      </w:r>
+      <w:proofErr w:type="gramStart"/>
+      <w:r>
+        <w:t>similarly-sized</w:t>
+      </w:r>
+      <w:proofErr w:type="gramEnd"/>
+      <w:r>
+        <w:t xml:space="preserve"> change in the SAME direction (both increasing, or both decreasing), or does a borough's change show no relationship to its </w:t>
       </w:r>
       <w:proofErr w:type="spellStart"/>
       <w:r>
@@ -1712,7 +1852,15 @@
     </w:p>
     <w:p>
       <w:r>
-        <w:t>You must ground every claim in code output -- never guess numbers. Always print() the numbers</w:t>
+        <w:t xml:space="preserve">You must ground every claim in code output -- never guess numbers. Always </w:t>
+      </w:r>
+      <w:proofErr w:type="gramStart"/>
+      <w:r>
+        <w:t>print(</w:t>
+      </w:r>
+      <w:proofErr w:type="gramEnd"/>
+      <w:r>
+        <w:t>) the numbers</w:t>
       </w:r>
     </w:p>
     <w:p>
@@ -1763,7 +1911,15 @@
     </w:p>
     <w:p>
       <w:r>
-        <w:t>        "pandas code -- do not guess or describe from the preview alone. "</w:t>
+        <w:t>        "</w:t>
+      </w:r>
+      <w:proofErr w:type="gramStart"/>
+      <w:r>
+        <w:t>pandas</w:t>
+      </w:r>
+      <w:proofErr w:type="gramEnd"/>
+      <w:r>
+        <w:t xml:space="preserve"> code -- do not guess or describe from the preview alone. "</w:t>
       </w:r>
     </w:p>
     <w:p>
@@ -1781,8 +1937,13 @@
         <w:t>        "</w:t>
       </w:r>
       <w:proofErr w:type="spellStart"/>
-      <w:r>
-        <w:t>missing_count</w:t>
+      <w:proofErr w:type="gramStart"/>
+      <w:r>
+        <w:t>missing</w:t>
+      </w:r>
+      <w:proofErr w:type="gramEnd"/>
+      <w:r>
+        <w:t>_count</w:t>
       </w:r>
       <w:proofErr w:type="spellEnd"/>
       <w:r>
@@ -1807,8 +1968,13 @@
         <w:t>        "</w:t>
       </w:r>
       <w:proofErr w:type="spellStart"/>
-      <w:r>
-        <w:t>row_count</w:t>
+      <w:proofErr w:type="gramStart"/>
+      <w:r>
+        <w:t>row</w:t>
+      </w:r>
+      <w:proofErr w:type="gramEnd"/>
+      <w:r>
+        <w:t>_count</w:t>
       </w:r>
       <w:proofErr w:type="spellEnd"/>
       <w:r>
@@ -1830,7 +1996,15 @@
     </w:p>
     <w:p>
       <w:r>
-        <w:t>        "about the data itself, using the exact print formats above."</w:t>
+        <w:t>        "</w:t>
+      </w:r>
+      <w:proofErr w:type="gramStart"/>
+      <w:r>
+        <w:t>about</w:t>
+      </w:r>
+      <w:proofErr w:type="gramEnd"/>
+      <w:r>
+        <w:t xml:space="preserve"> the data itself, using the exact print formats above."</w:t>
       </w:r>
     </w:p>
     <w:p>
@@ -1848,11 +2022,19 @@
       </w:r>
       <w:proofErr w:type="spellStart"/>
       <w:r>
-        <w:t>dataset_path</w:t>
+        <w:t>dataset_</w:t>
+      </w:r>
+      <w:proofErr w:type="gramStart"/>
+      <w:r>
+        <w:t>path</w:t>
       </w:r>
       <w:proofErr w:type="spellEnd"/>
       <w:r>
-        <w:t>}\n"</w:t>
+        <w:t>}\</w:t>
+      </w:r>
+      <w:proofErr w:type="gramEnd"/>
+      <w:r>
+        <w:t>n"</w:t>
       </w:r>
     </w:p>
     <w:p>
@@ -1862,7 +2044,15 @@
     </w:p>
     <w:p>
       <w:r>
-        <w:t>        "these facts. Re-import pandas/</w:t>
+        <w:t>        "</w:t>
+      </w:r>
+      <w:proofErr w:type="gramStart"/>
+      <w:r>
+        <w:t>these</w:t>
+      </w:r>
+      <w:proofErr w:type="gramEnd"/>
+      <w:r>
+        <w:t xml:space="preserve"> facts. Re-import pandas/</w:t>
       </w:r>
       <w:proofErr w:type="spellStart"/>
       <w:r>
@@ -1875,7 +2065,15 @@
     </w:p>
     <w:p>
       <w:r>
-        <w:t>        "process.\n" + preview</w:t>
+        <w:t>        "</w:t>
+      </w:r>
+      <w:proofErr w:type="gramStart"/>
+      <w:r>
+        <w:t>process</w:t>
+      </w:r>
+      <w:proofErr w:type="gramEnd"/>
+      <w:r>
+        <w:t>.\n" + preview</w:t>
       </w:r>
       <w:r>
         <w:t>)</w:t>
@@ -1908,27 +2106,75 @@
     </w:p>
     <w:p>
       <w:r>
-        <w:t>        "no code) for answering this question, using the real data facts "</w:t>
-      </w:r>
-    </w:p>
-    <w:p>
-      <w:r>
-        <w:t>        "below. Your plan should explicitly state how missing values "</w:t>
-      </w:r>
-    </w:p>
-    <w:p>
-      <w:r>
-        <w:t>        "will be handled if any exist. Do not write a FINAL ANSWER line "</w:t>
-      </w:r>
-    </w:p>
-    <w:p>
-      <w:r>
-        <w:t>        "or invent any specific numbers -- describe the approach only, "</w:t>
-      </w:r>
-    </w:p>
-    <w:p>
-      <w:r>
-        <w:t>        "the actual values will come from real computation later.\n\n"</w:t>
+        <w:t>        "</w:t>
+      </w:r>
+      <w:proofErr w:type="gramStart"/>
+      <w:r>
+        <w:t>no</w:t>
+      </w:r>
+      <w:proofErr w:type="gramEnd"/>
+      <w:r>
+        <w:t xml:space="preserve"> code) for answering this question, using the real data facts "</w:t>
+      </w:r>
+    </w:p>
+    <w:p>
+      <w:r>
+        <w:t>        "</w:t>
+      </w:r>
+      <w:proofErr w:type="gramStart"/>
+      <w:r>
+        <w:t>below</w:t>
+      </w:r>
+      <w:proofErr w:type="gramEnd"/>
+      <w:r>
+        <w:t>. Your plan should explicitly state how missing values "</w:t>
+      </w:r>
+    </w:p>
+    <w:p>
+      <w:r>
+        <w:t>        "</w:t>
+      </w:r>
+      <w:proofErr w:type="gramStart"/>
+      <w:r>
+        <w:t>will</w:t>
+      </w:r>
+      <w:proofErr w:type="gramEnd"/>
+      <w:r>
+        <w:t xml:space="preserve"> be handled if any exist. Do not write a FINAL ANSWER line "</w:t>
+      </w:r>
+    </w:p>
+    <w:p>
+      <w:r>
+        <w:t>        "</w:t>
+      </w:r>
+      <w:proofErr w:type="gramStart"/>
+      <w:r>
+        <w:t>or</w:t>
+      </w:r>
+      <w:proofErr w:type="gramEnd"/>
+      <w:r>
+        <w:t xml:space="preserve"> invent any specific numbers -- describe the approach only, "</w:t>
+      </w:r>
+    </w:p>
+    <w:p>
+      <w:r>
+        <w:t>        "</w:t>
+      </w:r>
+      <w:proofErr w:type="gramStart"/>
+      <w:r>
+        <w:t>the</w:t>
+      </w:r>
+      <w:proofErr w:type="gramEnd"/>
+      <w:r>
+        <w:t xml:space="preserve"> actual values will come from real computation </w:t>
+      </w:r>
+      <w:proofErr w:type="gramStart"/>
+      <w:r>
+        <w:t>later.\n\n</w:t>
+      </w:r>
+      <w:proofErr w:type="gramEnd"/>
+      <w:r>
+        <w:t>"</w:t>
       </w:r>
     </w:p>
     <w:p>
@@ -2032,12 +2278,36 @@
     </w:p>
     <w:p>
       <w:r>
-        <w:t>        "points used in your FINAL calculation (after excluding any "</w:t>
-      </w:r>
-    </w:p>
-    <w:p>
-      <w:r>
-        <w:t>        "missing values)\n"</w:t>
+        <w:t>        "</w:t>
+      </w:r>
+      <w:proofErr w:type="gramStart"/>
+      <w:r>
+        <w:t>points</w:t>
+      </w:r>
+      <w:proofErr w:type="gramEnd"/>
+      <w:r>
+        <w:t xml:space="preserve"> used in your FINAL calculation (after excluding any "</w:t>
+      </w:r>
+    </w:p>
+    <w:p>
+      <w:r>
+        <w:t>        "</w:t>
+      </w:r>
+      <w:proofErr w:type="gramStart"/>
+      <w:r>
+        <w:t>missing</w:t>
+      </w:r>
+      <w:proofErr w:type="gramEnd"/>
+      <w:r>
+        <w:t xml:space="preserve"> </w:t>
+      </w:r>
+      <w:proofErr w:type="gramStart"/>
+      <w:r>
+        <w:t>values)\</w:t>
+      </w:r>
+      <w:proofErr w:type="gramEnd"/>
+      <w:r>
+        <w:t>n"</w:t>
       </w:r>
     </w:p>
     <w:p>
@@ -2046,11 +2316,19 @@
       </w:r>
       <w:proofErr w:type="spellStart"/>
       <w:r>
-        <w:t>format_instructions</w:t>
+        <w:t>format_</w:t>
+      </w:r>
+      <w:proofErr w:type="gramStart"/>
+      <w:r>
+        <w:t>instructions</w:t>
       </w:r>
       <w:proofErr w:type="spellEnd"/>
       <w:r>
-        <w:t>}\n\n"</w:t>
+        <w:t>}\n\n</w:t>
+      </w:r>
+      <w:proofErr w:type="gramEnd"/>
+      <w:r>
+        <w:t>"</w:t>
       </w:r>
     </w:p>
     <w:p>
@@ -2075,7 +2353,11 @@
       </w:r>
       <w:proofErr w:type="spellStart"/>
       <w:r>
-        <w:t>profile_text</w:t>
+        <w:t>profile_</w:t>
+      </w:r>
+      <w:proofErr w:type="gramStart"/>
+      <w:r>
+        <w:t>text</w:t>
       </w:r>
       <w:proofErr w:type="spellEnd"/>
       <w:r>
@@ -2086,6 +2368,7 @@
         <w:t>nPlan</w:t>
       </w:r>
       <w:proofErr w:type="spellEnd"/>
+      <w:proofErr w:type="gramEnd"/>
       <w:r>
         <w:t>:\n{plan}"</w:t>
       </w:r>
@@ -2096,11 +2379,19 @@
       </w:r>
       <w:proofErr w:type="spellStart"/>
       <w:r>
-        <w:t>retry_block</w:t>
+        <w:t>retry_</w:t>
+      </w:r>
+      <w:proofErr w:type="gramStart"/>
+      <w:r>
+        <w:t>block</w:t>
       </w:r>
       <w:proofErr w:type="spellEnd"/>
       <w:r>
-        <w:t>}\n"</w:t>
+        <w:t>}\</w:t>
+      </w:r>
+      <w:proofErr w:type="gramEnd"/>
+      <w:r>
+        <w:t>n"</w:t>
       </w:r>
     </w:p>
     <w:p>
@@ -2121,683 +2412,3005 @@
         <w:t xml:space="preserve"> and reload the data.\n" + preview</w:t>
       </w:r>
       <w:r>
-        <w:t>    )</w:t>
-      </w:r>
-    </w:p>
+        <w:t xml:space="preserve">  </w:t>
+      </w:r>
+      <w:proofErr w:type="gramStart"/>
+      <w:r>
+        <w:t>  )</w:t>
+      </w:r>
+      <w:proofErr w:type="gramEnd"/>
+    </w:p>
+    <w:p>
+      <w:pPr>
+        <w:jc w:val="center"/>
+        <w:rPr>
+          <w:b/>
+          <w:bCs/>
+          <w:u w:val="single"/>
+        </w:rPr>
+      </w:pPr>
+      <w:r>
+        <w:rPr>
+          <w:b/>
+          <w:bCs/>
+          <w:u w:val="single"/>
+        </w:rPr>
+        <w:lastRenderedPageBreak/>
+        <w:t>Scoring logic:</w:t>
+      </w:r>
+    </w:p>
+    <w:p>
+      <w:pPr>
+        <w:jc w:val="center"/>
+        <w:rPr>
+          <w:b/>
+          <w:bCs/>
+          <w:u w:val="single"/>
+        </w:rPr>
+      </w:pPr>
+    </w:p>
+    <w:p>
+      <w:pPr>
+        <w:jc w:val="center"/>
+        <w:rPr>
+          <w:b/>
+          <w:bCs/>
+          <w:u w:val="single"/>
+        </w:rPr>
+      </w:pPr>
+      <w:r>
+        <w:rPr>
+          <w:b/>
+          <w:bCs/>
+          <w:u w:val="single"/>
+        </w:rPr>
+        <w:t>For Bivariate:</w:t>
+      </w:r>
+    </w:p>
+    <w:tbl>
+      <w:tblPr>
+        <w:tblW w:w="0" w:type="auto"/>
+        <w:tblCellSpacing w:w="15" w:type="dxa"/>
+        <w:tblCellMar>
+          <w:top w:w="15" w:type="dxa"/>
+          <w:left w:w="15" w:type="dxa"/>
+          <w:bottom w:w="15" w:type="dxa"/>
+          <w:right w:w="15" w:type="dxa"/>
+        </w:tblCellMar>
+        <w:tblLook w:val="04A0" w:firstRow="1" w:lastRow="0" w:firstColumn="1" w:lastColumn="0" w:noHBand="0" w:noVBand="1"/>
+      </w:tblPr>
+      <w:tblGrid>
+        <w:gridCol w:w="2815"/>
+        <w:gridCol w:w="6211"/>
+      </w:tblGrid>
+      <w:tr>
+        <w:trPr>
+          <w:tblHeader/>
+          <w:tblCellSpacing w:w="15" w:type="dxa"/>
+        </w:trPr>
+        <w:tc>
+          <w:tcPr>
+            <w:tcW w:w="0" w:type="auto"/>
+            <w:vAlign w:val="center"/>
+            <w:hideMark/>
+          </w:tcPr>
+          <w:p>
+            <w:pPr>
+              <w:rPr>
+                <w:b/>
+                <w:bCs/>
+              </w:rPr>
+            </w:pPr>
+            <w:r>
+              <w:rPr>
+                <w:b/>
+                <w:bCs/>
+              </w:rPr>
+              <w:t>Change</w:t>
+            </w:r>
+          </w:p>
+        </w:tc>
+        <w:tc>
+          <w:tcPr>
+            <w:tcW w:w="0" w:type="auto"/>
+            <w:vAlign w:val="center"/>
+            <w:hideMark/>
+          </w:tcPr>
+          <w:p>
+            <w:pPr>
+              <w:rPr>
+                <w:b/>
+                <w:bCs/>
+              </w:rPr>
+            </w:pPr>
+            <w:r>
+              <w:rPr>
+                <w:b/>
+                <w:bCs/>
+              </w:rPr>
+              <w:t>What it does</w:t>
+            </w:r>
+          </w:p>
+        </w:tc>
+      </w:tr>
+      <w:tr>
+        <w:trPr>
+          <w:tblCellSpacing w:w="15" w:type="dxa"/>
+        </w:trPr>
+        <w:tc>
+          <w:tcPr>
+            <w:tcW w:w="0" w:type="auto"/>
+            <w:vAlign w:val="center"/>
+            <w:hideMark/>
+          </w:tcPr>
+          <w:p>
+            <w:r>
+              <w:t>_</w:t>
+            </w:r>
+            <w:proofErr w:type="spellStart"/>
+            <w:r>
+              <w:t>resolve_ground_</w:t>
+            </w:r>
+            <w:proofErr w:type="gramStart"/>
+            <w:r>
+              <w:t>truth</w:t>
+            </w:r>
+            <w:proofErr w:type="spellEnd"/>
+            <w:r>
+              <w:t>(</w:t>
+            </w:r>
+            <w:proofErr w:type="gramEnd"/>
+            <w:r>
+              <w:t>)</w:t>
+            </w:r>
+          </w:p>
+        </w:tc>
+        <w:tc>
+          <w:tcPr>
+            <w:tcW w:w="0" w:type="auto"/>
+            <w:vAlign w:val="center"/>
+            <w:hideMark/>
+          </w:tcPr>
+          <w:p>
+            <w:r>
+              <w:t xml:space="preserve">Per row, tries the row's own </w:t>
+            </w:r>
+            <w:proofErr w:type="spellStart"/>
+            <w:r>
+              <w:t>statistical_method</w:t>
+            </w:r>
+            <w:proofErr w:type="spellEnd"/>
+            <w:r>
+              <w:t xml:space="preserve"> against ground_truth_all_methods.csv first; falls back to the manifest's Lee's L only if that method has no computed ground truth</w:t>
+            </w:r>
+          </w:p>
+        </w:tc>
+      </w:tr>
+      <w:tr>
+        <w:trPr>
+          <w:tblCellSpacing w:w="15" w:type="dxa"/>
+        </w:trPr>
+        <w:tc>
+          <w:tcPr>
+            <w:tcW w:w="0" w:type="auto"/>
+            <w:vAlign w:val="center"/>
+            <w:hideMark/>
+          </w:tcPr>
+          <w:p>
+            <w:r>
+              <w:t>correct (primary)</w:t>
+            </w:r>
+          </w:p>
+        </w:tc>
+        <w:tc>
+          <w:tcPr>
+            <w:tcW w:w="0" w:type="auto"/>
+            <w:vAlign w:val="center"/>
+            <w:hideMark/>
+          </w:tcPr>
+          <w:p>
+            <w:r>
+              <w:t xml:space="preserve">Now checked against </w:t>
+            </w:r>
+            <w:proofErr w:type="spellStart"/>
+            <w:r>
+              <w:t>gt_direction_used</w:t>
+            </w:r>
+            <w:proofErr w:type="spellEnd"/>
+            <w:r>
+              <w:t xml:space="preserve"> — the resolved, method-matched truth — not always Lee's L</w:t>
+            </w:r>
+          </w:p>
+        </w:tc>
+      </w:tr>
+      <w:tr>
+        <w:trPr>
+          <w:tblCellSpacing w:w="15" w:type="dxa"/>
+        </w:trPr>
+        <w:tc>
+          <w:tcPr>
+            <w:tcW w:w="0" w:type="auto"/>
+            <w:vAlign w:val="center"/>
+            <w:hideMark/>
+          </w:tcPr>
+          <w:p>
+            <w:proofErr w:type="spellStart"/>
+            <w:r>
+              <w:t>correct_vs_manifest</w:t>
+            </w:r>
+            <w:proofErr w:type="spellEnd"/>
+            <w:r>
+              <w:t xml:space="preserve"> (new, secondary)</w:t>
+            </w:r>
+          </w:p>
+        </w:tc>
+        <w:tc>
+          <w:tcPr>
+            <w:tcW w:w="0" w:type="auto"/>
+            <w:vAlign w:val="center"/>
+            <w:hideMark/>
+          </w:tcPr>
+          <w:p>
+            <w:r>
+              <w:t>Kept as an always-Lee's-L comparison so you still have "did it answer the official question" as a separate reportable number</w:t>
+            </w:r>
+          </w:p>
+        </w:tc>
+      </w:tr>
+      <w:tr>
+        <w:trPr>
+          <w:tblCellSpacing w:w="15" w:type="dxa"/>
+        </w:trPr>
+        <w:tc>
+          <w:tcPr>
+            <w:tcW w:w="0" w:type="auto"/>
+            <w:vAlign w:val="center"/>
+            <w:hideMark/>
+          </w:tcPr>
+          <w:p>
+            <w:proofErr w:type="spellStart"/>
+            <w:r>
+              <w:t>ground_truth_source</w:t>
+            </w:r>
+            <w:proofErr w:type="spellEnd"/>
+          </w:p>
+        </w:tc>
+        <w:tc>
+          <w:tcPr>
+            <w:tcW w:w="0" w:type="auto"/>
+            <w:vAlign w:val="center"/>
+            <w:hideMark/>
+          </w:tcPr>
+          <w:p>
+            <w:r>
+              <w:t>"</w:t>
+            </w:r>
+            <w:proofErr w:type="spellStart"/>
+            <w:proofErr w:type="gramStart"/>
+            <w:r>
+              <w:t>method</w:t>
+            </w:r>
+            <w:proofErr w:type="gramEnd"/>
+            <w:r>
+              <w:t>_specific</w:t>
+            </w:r>
+            <w:proofErr w:type="spellEnd"/>
+            <w:r>
+              <w:t>" or "</w:t>
+            </w:r>
+            <w:proofErr w:type="spellStart"/>
+            <w:r>
+              <w:t>manifest_fallback</w:t>
+            </w:r>
+            <w:proofErr w:type="spellEnd"/>
+            <w:r>
+              <w:t xml:space="preserve">" per row — fully auditable, surfaced in the summary as </w:t>
+            </w:r>
+            <w:proofErr w:type="spellStart"/>
+            <w:r>
+              <w:t>n_method_specific_gt</w:t>
+            </w:r>
+            <w:proofErr w:type="spellEnd"/>
+            <w:r>
+              <w:t xml:space="preserve"> / </w:t>
+            </w:r>
+            <w:proofErr w:type="spellStart"/>
+            <w:r>
+              <w:t>n_manifest_fallback_gt</w:t>
+            </w:r>
+            <w:proofErr w:type="spellEnd"/>
+          </w:p>
+        </w:tc>
+      </w:tr>
+      <w:tr>
+        <w:trPr>
+          <w:tblCellSpacing w:w="15" w:type="dxa"/>
+        </w:trPr>
+        <w:tc>
+          <w:tcPr>
+            <w:tcW w:w="0" w:type="auto"/>
+            <w:vAlign w:val="center"/>
+            <w:hideMark/>
+          </w:tcPr>
+          <w:p>
+            <w:r>
+              <w:t>Confusion matrix / F1</w:t>
+            </w:r>
+          </w:p>
+        </w:tc>
+        <w:tc>
+          <w:tcPr>
+            <w:tcW w:w="0" w:type="auto"/>
+            <w:vAlign w:val="center"/>
+            <w:hideMark/>
+          </w:tcPr>
+          <w:p>
+            <w:r>
+              <w:t xml:space="preserve">Now use </w:t>
+            </w:r>
+            <w:proofErr w:type="spellStart"/>
+            <w:r>
+              <w:t>gt_direction_used</w:t>
+            </w:r>
+            <w:proofErr w:type="spellEnd"/>
+            <w:r>
+              <w:t xml:space="preserve"> too, so they're consistent with the primary correct column instead of silently disagreeing with it</w:t>
+            </w:r>
+          </w:p>
+        </w:tc>
+      </w:tr>
+      <w:tr>
+        <w:trPr>
+          <w:tblCellSpacing w:w="15" w:type="dxa"/>
+        </w:trPr>
+        <w:tc>
+          <w:tcPr>
+            <w:tcW w:w="0" w:type="auto"/>
+            <w:vAlign w:val="center"/>
+            <w:hideMark/>
+          </w:tcPr>
+          <w:p>
+            <w:r>
+              <w:t>Tolerance</w:t>
+            </w:r>
+          </w:p>
+        </w:tc>
+        <w:tc>
+          <w:tcPr>
+            <w:tcW w:w="0" w:type="auto"/>
+            <w:vAlign w:val="center"/>
+            <w:hideMark/>
+          </w:tcPr>
+          <w:p>
+            <w:r>
+              <w:t>10% relative / 0.02 absolute, with the per-method justification/caveat written directly into the docstring</w:t>
+            </w:r>
+          </w:p>
+        </w:tc>
+      </w:tr>
+    </w:tbl>
     <w:p/>
+    <w:p>
+      <w:r>
+        <w:t>For variance:</w:t>
+      </w:r>
+    </w:p>
+    <w:p>
+      <w:r>
+        <w:t xml:space="preserve">Good — let me </w:t>
+      </w:r>
+      <w:proofErr w:type="gramStart"/>
+      <w:r>
+        <w:t>actually derive</w:t>
+      </w:r>
+      <w:proofErr w:type="gramEnd"/>
+      <w:r>
+        <w:t xml:space="preserve"> a number instead of guessing at one. I can run a simulation right now: generate spatial data with a network structurally similar to your London borough adjacency (33 nodes, realistic connectivity via Delaunay triangulation), then measure how much Lee's L and Cross-Moran's I </w:t>
+      </w:r>
+      <w:r>
+        <w:rPr>
+          <w:i/>
+          <w:iCs/>
+        </w:rPr>
+        <w:t>actually</w:t>
+      </w:r>
+      <w:r>
+        <w:t xml:space="preserve"> differ between two legitimate weight-matrix conventions (row-standardized vs. binary) across many random draws. That gives an </w:t>
+      </w:r>
+      <w:proofErr w:type="gramStart"/>
+      <w:r>
+        <w:t>empirically-grounded</w:t>
+      </w:r>
+      <w:proofErr w:type="gramEnd"/>
+      <w:r>
+        <w:t xml:space="preserve"> tolerance instead of a round number I picked.</w:t>
+      </w:r>
+    </w:p>
+    <w:p>
+      <w:r>
+        <w:t xml:space="preserve">This is a much better basis than a guessed number — and it revealed something important: </w:t>
+      </w:r>
+      <w:r>
+        <w:rPr>
+          <w:b/>
+          <w:bCs/>
+        </w:rPr>
+        <w:t>relative tolerance is the wrong metric entirely</w:t>
+      </w:r>
+      <w:r>
+        <w:t xml:space="preserve"> for these statistics. Because Lee's L and Cross-Moran's I are often close to zero, relative error blows up (a stat of 0.01 </w:t>
+      </w:r>
+      <w:r>
+        <w:lastRenderedPageBreak/>
+        <w:t xml:space="preserve">vs 0.02 is "100% relative difference" but a trivial absolute difference). The </w:t>
+      </w:r>
+      <w:r>
+        <w:rPr>
+          <w:b/>
+          <w:bCs/>
+        </w:rPr>
+        <w:t>absolute</w:t>
+      </w:r>
+      <w:r>
+        <w:t xml:space="preserve"> differences are stable and interpretable instead:</w:t>
+      </w:r>
+    </w:p>
+    <w:tbl>
+      <w:tblPr>
+        <w:tblW w:w="0" w:type="auto"/>
+        <w:tblCellSpacing w:w="15" w:type="dxa"/>
+        <w:tblCellMar>
+          <w:top w:w="15" w:type="dxa"/>
+          <w:left w:w="15" w:type="dxa"/>
+          <w:bottom w:w="15" w:type="dxa"/>
+          <w:right w:w="15" w:type="dxa"/>
+        </w:tblCellMar>
+        <w:tblLook w:val="04A0" w:firstRow="1" w:lastRow="0" w:firstColumn="1" w:lastColumn="0" w:noHBand="0" w:noVBand="1"/>
+      </w:tblPr>
+      <w:tblGrid>
+        <w:gridCol w:w="1689"/>
+        <w:gridCol w:w="1724"/>
+        <w:gridCol w:w="642"/>
+        <w:gridCol w:w="657"/>
+      </w:tblGrid>
+      <w:tr>
+        <w:trPr>
+          <w:tblHeader/>
+          <w:tblCellSpacing w:w="15" w:type="dxa"/>
+        </w:trPr>
+        <w:tc>
+          <w:tcPr>
+            <w:tcW w:w="0" w:type="auto"/>
+            <w:vAlign w:val="center"/>
+            <w:hideMark/>
+          </w:tcPr>
+          <w:p>
+            <w:pPr>
+              <w:rPr>
+                <w:b/>
+                <w:bCs/>
+              </w:rPr>
+            </w:pPr>
+            <w:r>
+              <w:rPr>
+                <w:b/>
+                <w:bCs/>
+              </w:rPr>
+              <w:t>Method</w:t>
+            </w:r>
+          </w:p>
+        </w:tc>
+        <w:tc>
+          <w:tcPr>
+            <w:tcW w:w="0" w:type="auto"/>
+            <w:vAlign w:val="center"/>
+            <w:hideMark/>
+          </w:tcPr>
+          <w:p>
+            <w:pPr>
+              <w:rPr>
+                <w:b/>
+                <w:bCs/>
+              </w:rPr>
+            </w:pPr>
+            <w:r>
+              <w:rPr>
+                <w:b/>
+                <w:bCs/>
+              </w:rPr>
+              <w:t>Median abs diff</w:t>
+            </w:r>
+          </w:p>
+        </w:tc>
+        <w:tc>
+          <w:tcPr>
+            <w:tcW w:w="0" w:type="auto"/>
+            <w:vAlign w:val="center"/>
+            <w:hideMark/>
+          </w:tcPr>
+          <w:p>
+            <w:pPr>
+              <w:rPr>
+                <w:b/>
+                <w:bCs/>
+              </w:rPr>
+            </w:pPr>
+            <w:r>
+              <w:rPr>
+                <w:b/>
+                <w:bCs/>
+              </w:rPr>
+              <w:t>p90</w:t>
+            </w:r>
+          </w:p>
+        </w:tc>
+        <w:tc>
+          <w:tcPr>
+            <w:tcW w:w="0" w:type="auto"/>
+            <w:vAlign w:val="center"/>
+            <w:hideMark/>
+          </w:tcPr>
+          <w:p>
+            <w:pPr>
+              <w:rPr>
+                <w:b/>
+                <w:bCs/>
+              </w:rPr>
+            </w:pPr>
+            <w:r>
+              <w:rPr>
+                <w:b/>
+                <w:bCs/>
+              </w:rPr>
+              <w:t>p95</w:t>
+            </w:r>
+          </w:p>
+        </w:tc>
+      </w:tr>
+      <w:tr>
+        <w:trPr>
+          <w:tblCellSpacing w:w="15" w:type="dxa"/>
+        </w:trPr>
+        <w:tc>
+          <w:tcPr>
+            <w:tcW w:w="0" w:type="auto"/>
+            <w:vAlign w:val="center"/>
+            <w:hideMark/>
+          </w:tcPr>
+          <w:p>
+            <w:r>
+              <w:t>Lee's L</w:t>
+            </w:r>
+          </w:p>
+        </w:tc>
+        <w:tc>
+          <w:tcPr>
+            <w:tcW w:w="0" w:type="auto"/>
+            <w:vAlign w:val="center"/>
+            <w:hideMark/>
+          </w:tcPr>
+          <w:p>
+            <w:r>
+              <w:t>0.012</w:t>
+            </w:r>
+          </w:p>
+        </w:tc>
+        <w:tc>
+          <w:tcPr>
+            <w:tcW w:w="0" w:type="auto"/>
+            <w:vAlign w:val="center"/>
+            <w:hideMark/>
+          </w:tcPr>
+          <w:p>
+            <w:r>
+              <w:t>0.033</w:t>
+            </w:r>
+          </w:p>
+        </w:tc>
+        <w:tc>
+          <w:tcPr>
+            <w:tcW w:w="0" w:type="auto"/>
+            <w:vAlign w:val="center"/>
+            <w:hideMark/>
+          </w:tcPr>
+          <w:p>
+            <w:r>
+              <w:t>0.044</w:t>
+            </w:r>
+          </w:p>
+        </w:tc>
+      </w:tr>
+      <w:tr>
+        <w:trPr>
+          <w:tblCellSpacing w:w="15" w:type="dxa"/>
+        </w:trPr>
+        <w:tc>
+          <w:tcPr>
+            <w:tcW w:w="0" w:type="auto"/>
+            <w:vAlign w:val="center"/>
+            <w:hideMark/>
+          </w:tcPr>
+          <w:p>
+            <w:r>
+              <w:t>Cross-Moran's I</w:t>
+            </w:r>
+          </w:p>
+        </w:tc>
+        <w:tc>
+          <w:tcPr>
+            <w:tcW w:w="0" w:type="auto"/>
+            <w:vAlign w:val="center"/>
+            <w:hideMark/>
+          </w:tcPr>
+          <w:p>
+            <w:r>
+              <w:t>0.012</w:t>
+            </w:r>
+          </w:p>
+        </w:tc>
+        <w:tc>
+          <w:tcPr>
+            <w:tcW w:w="0" w:type="auto"/>
+            <w:vAlign w:val="center"/>
+            <w:hideMark/>
+          </w:tcPr>
+          <w:p>
+            <w:r>
+              <w:t>0.031</w:t>
+            </w:r>
+          </w:p>
+        </w:tc>
+        <w:tc>
+          <w:tcPr>
+            <w:tcW w:w="0" w:type="auto"/>
+            <w:vAlign w:val="center"/>
+            <w:hideMark/>
+          </w:tcPr>
+          <w:p>
+            <w:r>
+              <w:t>0.037</w:t>
+            </w:r>
+          </w:p>
+        </w:tc>
+      </w:tr>
+    </w:tbl>
+    <w:p>
+      <w:r>
+        <w:t xml:space="preserve">So: </w:t>
+      </w:r>
+      <w:r>
+        <w:rPr>
+          <w:b/>
+          <w:bCs/>
+        </w:rPr>
+        <w:t>switch from relative to absolute tolerance</w:t>
+      </w:r>
+      <w:r>
+        <w:t xml:space="preserve">, set at </w:t>
+      </w:r>
+      <w:r>
+        <w:rPr>
+          <w:b/>
+          <w:bCs/>
+        </w:rPr>
+        <w:t>0.05</w:t>
+      </w:r>
+      <w:r>
+        <w:t xml:space="preserve"> for the spatially-weighted methods — that covers roughly the 95th percentile of legitimate row-standardized-vs-binary variation in this simulation, while still being far tighter than the multi-hundred/billion-magnitude gaps we saw from broken runs. For Pearson, I'll set it much tighter (0.01) since it has no such ambiguity — that case is rare in your data anyway, per your note.</w:t>
+      </w:r>
+    </w:p>
+    <w:p>
+      <w:r>
+        <w:t>Updating the script accordingly:</w:t>
+      </w:r>
+    </w:p>
+    <w:p>
+      <w:r>
+        <w:t xml:space="preserve">Clean — no leftover references. Also including the sensitivity simulation script itself so you have it for your methodology appendix (and can re-run it against the </w:t>
+      </w:r>
+      <w:r>
+        <w:rPr>
+          <w:i/>
+          <w:iCs/>
+        </w:rPr>
+        <w:t>real</w:t>
+      </w:r>
+      <w:r>
+        <w:t xml:space="preserve"> borough adjacency instead of the synthetic Delaunay stand-in, which would tighten the number further):</w:t>
+      </w:r>
+    </w:p>
+    <w:p>
+      <w:r>
+        <w:rPr>
+          <w:b/>
+          <w:bCs/>
+        </w:rPr>
+        <w:t>Summary of the change:</w:t>
+      </w:r>
+    </w:p>
+    <w:tbl>
+      <w:tblPr>
+        <w:tblW w:w="0" w:type="auto"/>
+        <w:tblCellSpacing w:w="15" w:type="dxa"/>
+        <w:tblCellMar>
+          <w:top w:w="15" w:type="dxa"/>
+          <w:left w:w="15" w:type="dxa"/>
+          <w:bottom w:w="15" w:type="dxa"/>
+          <w:right w:w="15" w:type="dxa"/>
+        </w:tblCellMar>
+        <w:tblLook w:val="04A0" w:firstRow="1" w:lastRow="0" w:firstColumn="1" w:lastColumn="0" w:noHBand="0" w:noVBand="1"/>
+      </w:tblPr>
+      <w:tblGrid>
+        <w:gridCol w:w="1506"/>
+        <w:gridCol w:w="1259"/>
+        <w:gridCol w:w="1849"/>
+        <w:gridCol w:w="4412"/>
+      </w:tblGrid>
+      <w:tr>
+        <w:trPr>
+          <w:tblHeader/>
+          <w:tblCellSpacing w:w="15" w:type="dxa"/>
+        </w:trPr>
+        <w:tc>
+          <w:tcPr>
+            <w:tcW w:w="0" w:type="auto"/>
+            <w:vAlign w:val="center"/>
+            <w:hideMark/>
+          </w:tcPr>
+          <w:p>
+            <w:pPr>
+              <w:rPr>
+                <w:b/>
+                <w:bCs/>
+              </w:rPr>
+            </w:pPr>
+            <w:r>
+              <w:rPr>
+                <w:b/>
+                <w:bCs/>
+              </w:rPr>
+              <w:t>Method</w:t>
+            </w:r>
+          </w:p>
+        </w:tc>
+        <w:tc>
+          <w:tcPr>
+            <w:tcW w:w="0" w:type="auto"/>
+            <w:vAlign w:val="center"/>
+            <w:hideMark/>
+          </w:tcPr>
+          <w:p>
+            <w:pPr>
+              <w:rPr>
+                <w:b/>
+                <w:bCs/>
+              </w:rPr>
+            </w:pPr>
+            <w:r>
+              <w:rPr>
+                <w:b/>
+                <w:bCs/>
+              </w:rPr>
+              <w:t>Old (guessed)</w:t>
+            </w:r>
+          </w:p>
+        </w:tc>
+        <w:tc>
+          <w:tcPr>
+            <w:tcW w:w="0" w:type="auto"/>
+            <w:vAlign w:val="center"/>
+            <w:hideMark/>
+          </w:tcPr>
+          <w:p>
+            <w:pPr>
+              <w:rPr>
+                <w:b/>
+                <w:bCs/>
+              </w:rPr>
+            </w:pPr>
+            <w:r>
+              <w:rPr>
+                <w:b/>
+                <w:bCs/>
+              </w:rPr>
+              <w:t>New (empirically derived)</w:t>
+            </w:r>
+          </w:p>
+        </w:tc>
+        <w:tc>
+          <w:tcPr>
+            <w:tcW w:w="0" w:type="auto"/>
+            <w:vAlign w:val="center"/>
+            <w:hideMark/>
+          </w:tcPr>
+          <w:p>
+            <w:pPr>
+              <w:rPr>
+                <w:b/>
+                <w:bCs/>
+              </w:rPr>
+            </w:pPr>
+            <w:r>
+              <w:rPr>
+                <w:b/>
+                <w:bCs/>
+              </w:rPr>
+              <w:t>Basis</w:t>
+            </w:r>
+          </w:p>
+        </w:tc>
+      </w:tr>
+      <w:tr>
+        <w:trPr>
+          <w:tblCellSpacing w:w="15" w:type="dxa"/>
+        </w:trPr>
+        <w:tc>
+          <w:tcPr>
+            <w:tcW w:w="0" w:type="auto"/>
+            <w:vAlign w:val="center"/>
+            <w:hideMark/>
+          </w:tcPr>
+          <w:p>
+            <w:r>
+              <w:t>Lee's L</w:t>
+            </w:r>
+          </w:p>
+        </w:tc>
+        <w:tc>
+          <w:tcPr>
+            <w:tcW w:w="0" w:type="auto"/>
+            <w:vAlign w:val="center"/>
+            <w:hideMark/>
+          </w:tcPr>
+          <w:p>
+            <w:r>
+              <w:t>10% relative</w:t>
+            </w:r>
+          </w:p>
+        </w:tc>
+        <w:tc>
+          <w:tcPr>
+            <w:tcW w:w="0" w:type="auto"/>
+            <w:vAlign w:val="center"/>
+            <w:hideMark/>
+          </w:tcPr>
+          <w:p>
+            <w:r>
+              <w:rPr>
+                <w:b/>
+                <w:bCs/>
+              </w:rPr>
+              <w:t>0.05 absolute</w:t>
+            </w:r>
+          </w:p>
+        </w:tc>
+        <w:tc>
+          <w:tcPr>
+            <w:tcW w:w="0" w:type="auto"/>
+            <w:vAlign w:val="center"/>
+            <w:hideMark/>
+          </w:tcPr>
+          <w:p>
+            <w:r>
+              <w:t>p95 of simulated row-standardized vs. binary weight variation ≈ 0.044</w:t>
+            </w:r>
+          </w:p>
+        </w:tc>
+      </w:tr>
+      <w:tr>
+        <w:trPr>
+          <w:tblCellSpacing w:w="15" w:type="dxa"/>
+        </w:trPr>
+        <w:tc>
+          <w:tcPr>
+            <w:tcW w:w="0" w:type="auto"/>
+            <w:vAlign w:val="center"/>
+            <w:hideMark/>
+          </w:tcPr>
+          <w:p>
+            <w:r>
+              <w:t>Cross-Moran's I</w:t>
+            </w:r>
+          </w:p>
+        </w:tc>
+        <w:tc>
+          <w:tcPr>
+            <w:tcW w:w="0" w:type="auto"/>
+            <w:vAlign w:val="center"/>
+            <w:hideMark/>
+          </w:tcPr>
+          <w:p>
+            <w:r>
+              <w:t>10% relative</w:t>
+            </w:r>
+          </w:p>
+        </w:tc>
+        <w:tc>
+          <w:tcPr>
+            <w:tcW w:w="0" w:type="auto"/>
+            <w:vAlign w:val="center"/>
+            <w:hideMark/>
+          </w:tcPr>
+          <w:p>
+            <w:r>
+              <w:rPr>
+                <w:b/>
+                <w:bCs/>
+              </w:rPr>
+              <w:t>0.05 absolute</w:t>
+            </w:r>
+          </w:p>
+        </w:tc>
+        <w:tc>
+          <w:tcPr>
+            <w:tcW w:w="0" w:type="auto"/>
+            <w:vAlign w:val="center"/>
+            <w:hideMark/>
+          </w:tcPr>
+          <w:p>
+            <w:r>
+              <w:t>p95 ≈ 0.037</w:t>
+            </w:r>
+          </w:p>
+        </w:tc>
+      </w:tr>
+      <w:tr>
+        <w:trPr>
+          <w:tblCellSpacing w:w="15" w:type="dxa"/>
+        </w:trPr>
+        <w:tc>
+          <w:tcPr>
+            <w:tcW w:w="0" w:type="auto"/>
+            <w:vAlign w:val="center"/>
+            <w:hideMark/>
+          </w:tcPr>
+          <w:p>
+            <w:r>
+              <w:t>Univariate Moran's I</w:t>
+            </w:r>
+          </w:p>
+        </w:tc>
+        <w:tc>
+          <w:tcPr>
+            <w:tcW w:w="0" w:type="auto"/>
+            <w:vAlign w:val="center"/>
+            <w:hideMark/>
+          </w:tcPr>
+          <w:p>
+            <w:r>
+              <w:t>10% relative</w:t>
+            </w:r>
+          </w:p>
+        </w:tc>
+        <w:tc>
+          <w:tcPr>
+            <w:tcW w:w="0" w:type="auto"/>
+            <w:vAlign w:val="center"/>
+            <w:hideMark/>
+          </w:tcPr>
+          <w:p>
+            <w:r>
+              <w:rPr>
+                <w:b/>
+                <w:bCs/>
+              </w:rPr>
+              <w:t>0.05 absolute</w:t>
+            </w:r>
+          </w:p>
+        </w:tc>
+        <w:tc>
+          <w:tcPr>
+            <w:tcW w:w="0" w:type="auto"/>
+            <w:vAlign w:val="center"/>
+            <w:hideMark/>
+          </w:tcPr>
+          <w:p>
+            <w:r>
+              <w:t>applied same figure — hasn't been separately validated, but same weight-matrix mechanism applies</w:t>
+            </w:r>
+          </w:p>
+        </w:tc>
+      </w:tr>
+      <w:tr>
+        <w:trPr>
+          <w:tblCellSpacing w:w="15" w:type="dxa"/>
+        </w:trPr>
+        <w:tc>
+          <w:tcPr>
+            <w:tcW w:w="0" w:type="auto"/>
+            <w:vAlign w:val="center"/>
+            <w:hideMark/>
+          </w:tcPr>
+          <w:p>
+            <w:r>
+              <w:t>Pearson correlation</w:t>
+            </w:r>
+          </w:p>
+        </w:tc>
+        <w:tc>
+          <w:tcPr>
+            <w:tcW w:w="0" w:type="auto"/>
+            <w:vAlign w:val="center"/>
+            <w:hideMark/>
+          </w:tcPr>
+          <w:p>
+            <w:r>
+              <w:t>10% relative</w:t>
+            </w:r>
+          </w:p>
+        </w:tc>
+        <w:tc>
+          <w:tcPr>
+            <w:tcW w:w="0" w:type="auto"/>
+            <w:vAlign w:val="center"/>
+            <w:hideMark/>
+          </w:tcPr>
+          <w:p>
+            <w:r>
+              <w:rPr>
+                <w:b/>
+                <w:bCs/>
+              </w:rPr>
+              <w:t>0.01 absolute</w:t>
+            </w:r>
+          </w:p>
+        </w:tc>
+        <w:tc>
+          <w:tcPr>
+            <w:tcW w:w="0" w:type="auto"/>
+            <w:vAlign w:val="center"/>
+            <w:hideMark/>
+          </w:tcPr>
+          <w:p>
+            <w:r>
+              <w:t>no legitimate convention ambiguity — floating-point margin only</w:t>
+            </w:r>
+          </w:p>
+        </w:tc>
+      </w:tr>
+    </w:tbl>
+    <w:p>
+      <w:r>
+        <w:t xml:space="preserve">One honest limitation to state alongside this in your thesis: the simulation uses a </w:t>
+      </w:r>
+      <w:r>
+        <w:rPr>
+          <w:i/>
+          <w:iCs/>
+        </w:rPr>
+        <w:t>synthetic</w:t>
+      </w:r>
+      <w:r>
+        <w:t xml:space="preserve"> Delaunay-triangulated network (33 nodes, comparable density) as a stand-in for the real London borough adjacency graph, since I don't have your actual borough_adjacency.csv here. If you run sensitivity_sim.py locally with the real </w:t>
+      </w:r>
+      <w:r>
+        <w:lastRenderedPageBreak/>
+        <w:t>adjacency structure substituted in, you'd get a number tied specifically to your data rather than a structurally-similar proxy — worth doing before finalizing this in the thesis, even though I'd expect the real figure to land close to this one given comparable network density.</w:t>
+      </w:r>
+    </w:p>
     <w:p/>
+    <w:p>
+      <w:pPr>
+        <w:jc w:val="center"/>
+        <w:rPr>
+          <w:b/>
+          <w:bCs/>
+          <w:u w:val="single"/>
+        </w:rPr>
+      </w:pPr>
+      <w:r>
+        <w:rPr>
+          <w:b/>
+          <w:bCs/>
+          <w:u w:val="single"/>
+        </w:rPr>
+        <w:t>For Hotspot (</w:t>
+      </w:r>
+      <w:proofErr w:type="spellStart"/>
+      <w:r>
+        <w:rPr>
+          <w:b/>
+          <w:bCs/>
+          <w:u w:val="single"/>
+        </w:rPr>
+        <w:t>Geoisord</w:t>
+      </w:r>
+      <w:proofErr w:type="spellEnd"/>
+      <w:r>
+        <w:rPr>
+          <w:b/>
+          <w:bCs/>
+          <w:u w:val="single"/>
+        </w:rPr>
+        <w:t>)</w:t>
+      </w:r>
+    </w:p>
     <w:p/>
+    <w:p>
+      <w:pPr>
+        <w:rPr>
+          <w:b/>
+          <w:bCs/>
+        </w:rPr>
+      </w:pPr>
+      <w:r>
+        <w:rPr>
+          <w:b/>
+          <w:bCs/>
+        </w:rPr>
+        <w:t>Final scoring logic — one table, plain English</w:t>
+      </w:r>
+    </w:p>
+    <w:tbl>
+      <w:tblPr>
+        <w:tblW w:w="0" w:type="auto"/>
+        <w:tblCellSpacing w:w="15" w:type="dxa"/>
+        <w:tblCellMar>
+          <w:top w:w="15" w:type="dxa"/>
+          <w:left w:w="15" w:type="dxa"/>
+          <w:bottom w:w="15" w:type="dxa"/>
+          <w:right w:w="15" w:type="dxa"/>
+        </w:tblCellMar>
+        <w:tblLook w:val="04A0" w:firstRow="1" w:lastRow="0" w:firstColumn="1" w:lastColumn="0" w:noHBand="0" w:noVBand="1"/>
+      </w:tblPr>
+      <w:tblGrid>
+        <w:gridCol w:w="2496"/>
+        <w:gridCol w:w="2298"/>
+        <w:gridCol w:w="4232"/>
+      </w:tblGrid>
+      <w:tr>
+        <w:trPr>
+          <w:tblHeader/>
+          <w:tblCellSpacing w:w="15" w:type="dxa"/>
+        </w:trPr>
+        <w:tc>
+          <w:tcPr>
+            <w:tcW w:w="0" w:type="auto"/>
+            <w:vAlign w:val="center"/>
+            <w:hideMark/>
+          </w:tcPr>
+          <w:p>
+            <w:pPr>
+              <w:rPr>
+                <w:b/>
+                <w:bCs/>
+              </w:rPr>
+            </w:pPr>
+            <w:r>
+              <w:rPr>
+                <w:b/>
+                <w:bCs/>
+              </w:rPr>
+              <w:t>Column</w:t>
+            </w:r>
+          </w:p>
+        </w:tc>
+        <w:tc>
+          <w:tcPr>
+            <w:tcW w:w="0" w:type="auto"/>
+            <w:vAlign w:val="center"/>
+            <w:hideMark/>
+          </w:tcPr>
+          <w:p>
+            <w:pPr>
+              <w:rPr>
+                <w:b/>
+                <w:bCs/>
+              </w:rPr>
+            </w:pPr>
+            <w:r>
+              <w:rPr>
+                <w:b/>
+                <w:bCs/>
+              </w:rPr>
+              <w:t>What it measures</w:t>
+            </w:r>
+          </w:p>
+        </w:tc>
+        <w:tc>
+          <w:tcPr>
+            <w:tcW w:w="0" w:type="auto"/>
+            <w:vAlign w:val="center"/>
+            <w:hideMark/>
+          </w:tcPr>
+          <w:p>
+            <w:pPr>
+              <w:rPr>
+                <w:b/>
+                <w:bCs/>
+              </w:rPr>
+            </w:pPr>
+            <w:r>
+              <w:rPr>
+                <w:b/>
+                <w:bCs/>
+              </w:rPr>
+              <w:t>Justification</w:t>
+            </w:r>
+          </w:p>
+        </w:tc>
+      </w:tr>
+      <w:tr>
+        <w:trPr>
+          <w:tblCellSpacing w:w="15" w:type="dxa"/>
+        </w:trPr>
+        <w:tc>
+          <w:tcPr>
+            <w:tcW w:w="0" w:type="auto"/>
+            <w:vAlign w:val="center"/>
+            <w:hideMark/>
+          </w:tcPr>
+          <w:p>
+            <w:r>
+              <w:rPr>
+                <w:b/>
+                <w:bCs/>
+              </w:rPr>
+              <w:t>accuracy</w:t>
+            </w:r>
+          </w:p>
+        </w:tc>
+        <w:tc>
+          <w:tcPr>
+            <w:tcW w:w="0" w:type="auto"/>
+            <w:vAlign w:val="center"/>
+            <w:hideMark/>
+          </w:tcPr>
+          <w:p>
+            <w:r>
+              <w:t>Per-chunk F1, averaged across all chunks — full credit for an exact match, partial credit for a partial one</w:t>
+            </w:r>
+          </w:p>
+        </w:tc>
+        <w:tc>
+          <w:tcPr>
+            <w:tcW w:w="0" w:type="auto"/>
+            <w:vAlign w:val="center"/>
+            <w:hideMark/>
+          </w:tcPr>
+          <w:p>
+            <w:r>
+              <w:t xml:space="preserve">Chosen over strict exact-match (checked directly against your </w:t>
+            </w:r>
+            <w:proofErr w:type="gramStart"/>
+            <w:r>
+              <w:t>data:</w:t>
+            </w:r>
+            <w:proofErr w:type="gramEnd"/>
+            <w:r>
+              <w:t xml:space="preserve"> stays at 0 for any model that isn't hitting the true set exactly) and over Youden's J (its penalty is diluted by the large pool of non-significant boroughs, so it barely punishes over-guessing here). F1 penalizes misses and false alarms symmetrically — the closest citable match to "credit per hit, penalty per miss."</w:t>
+            </w:r>
+          </w:p>
+        </w:tc>
+      </w:tr>
+      <w:tr>
+        <w:trPr>
+          <w:tblCellSpacing w:w="15" w:type="dxa"/>
+        </w:trPr>
+        <w:tc>
+          <w:tcPr>
+            <w:tcW w:w="0" w:type="auto"/>
+            <w:vAlign w:val="center"/>
+            <w:hideMark/>
+          </w:tcPr>
+          <w:p>
+            <w:proofErr w:type="spellStart"/>
+            <w:r>
+              <w:t>correct_number</w:t>
+            </w:r>
+            <w:proofErr w:type="spellEnd"/>
+          </w:p>
+        </w:tc>
+        <w:tc>
+          <w:tcPr>
+            <w:tcW w:w="0" w:type="auto"/>
+            <w:vAlign w:val="center"/>
+            <w:hideMark/>
+          </w:tcPr>
+          <w:p>
+            <w:r>
+              <w:t>Raw count of chunks with a perfect exact-set match</w:t>
+            </w:r>
+          </w:p>
+        </w:tc>
+        <w:tc>
+          <w:tcPr>
+            <w:tcW w:w="0" w:type="auto"/>
+            <w:vAlign w:val="center"/>
+            <w:hideMark/>
+          </w:tcPr>
+          <w:p>
+            <w:r>
+              <w:t>Kept from the original script, unchanged — gives you the strict view without needing a separate ratio column for it.</w:t>
+            </w:r>
+          </w:p>
+        </w:tc>
+      </w:tr>
+      <w:tr>
+        <w:trPr>
+          <w:tblCellSpacing w:w="15" w:type="dxa"/>
+        </w:trPr>
+        <w:tc>
+          <w:tcPr>
+            <w:tcW w:w="0" w:type="auto"/>
+            <w:vAlign w:val="center"/>
+            <w:hideMark/>
+          </w:tcPr>
+          <w:p>
+            <w:r>
+              <w:t>precision / recall / f1</w:t>
+            </w:r>
+          </w:p>
+        </w:tc>
+        <w:tc>
+          <w:tcPr>
+            <w:tcW w:w="0" w:type="auto"/>
+            <w:vAlign w:val="center"/>
+            <w:hideMark/>
+          </w:tcPr>
+          <w:p>
+            <w:r>
+              <w:t>Same idea as accuracy, but pooled across the whole model's output rather than averaged per chunk</w:t>
+            </w:r>
+          </w:p>
+        </w:tc>
+        <w:tc>
+          <w:tcPr>
+            <w:tcW w:w="0" w:type="auto"/>
+            <w:vAlign w:val="center"/>
+            <w:hideMark/>
+          </w:tcPr>
+          <w:p>
+            <w:r>
+              <w:t>Unchanged from the original script — shows overall calibration (does the model systematically over- or under-guess).</w:t>
+            </w:r>
+          </w:p>
+        </w:tc>
+      </w:tr>
+      <w:tr>
+        <w:trPr>
+          <w:tblCellSpacing w:w="15" w:type="dxa"/>
+        </w:trPr>
+        <w:tc>
+          <w:tcPr>
+            <w:tcW w:w="0" w:type="auto"/>
+            <w:vAlign w:val="center"/>
+            <w:hideMark/>
+          </w:tcPr>
+          <w:p>
+            <w:pPr>
+              <w:rPr>
+                <w:highlight w:val="green"/>
+              </w:rPr>
+            </w:pPr>
+            <w:proofErr w:type="spellStart"/>
+            <w:r>
+              <w:rPr>
+                <w:highlight w:val="green"/>
+              </w:rPr>
+              <w:t>partial_accuracy</w:t>
+            </w:r>
+            <w:proofErr w:type="spellEnd"/>
+          </w:p>
+        </w:tc>
+        <w:tc>
+          <w:tcPr>
+            <w:tcW w:w="0" w:type="auto"/>
+            <w:vAlign w:val="center"/>
+            <w:hideMark/>
+          </w:tcPr>
+          <w:p>
+            <w:pPr>
+              <w:rPr>
+                <w:highlight w:val="green"/>
+              </w:rPr>
+            </w:pPr>
+            <w:r>
+              <w:rPr>
+                <w:highlight w:val="green"/>
+              </w:rPr>
+              <w:t>Overlap ÷ union of predicted and true boroughs (Jaccard)</w:t>
+            </w:r>
+          </w:p>
+        </w:tc>
+        <w:tc>
+          <w:tcPr>
+            <w:tcW w:w="0" w:type="auto"/>
+            <w:vAlign w:val="center"/>
+            <w:hideMark/>
+          </w:tcPr>
+          <w:p>
+            <w:r>
+              <w:t>Unchanged from the original script — a stricter partial-credit alternative sitting alongside accuracy.</w:t>
+            </w:r>
+          </w:p>
+        </w:tc>
+      </w:tr>
+      <w:tr>
+        <w:trPr>
+          <w:tblCellSpacing w:w="15" w:type="dxa"/>
+        </w:trPr>
+        <w:tc>
+          <w:tcPr>
+            <w:tcW w:w="0" w:type="auto"/>
+            <w:vAlign w:val="center"/>
+            <w:hideMark/>
+          </w:tcPr>
+          <w:p>
+            <w:proofErr w:type="spellStart"/>
+            <w:r>
+              <w:t>n_method_specific_gt</w:t>
+            </w:r>
+            <w:proofErr w:type="spellEnd"/>
+            <w:r>
+              <w:t xml:space="preserve"> </w:t>
+            </w:r>
+            <w:r>
+              <w:rPr>
+                <w:i/>
+                <w:iCs/>
+              </w:rPr>
+              <w:t>(new)</w:t>
+            </w:r>
+          </w:p>
+        </w:tc>
+        <w:tc>
+          <w:tcPr>
+            <w:tcW w:w="0" w:type="auto"/>
+            <w:vAlign w:val="center"/>
+            <w:hideMark/>
+          </w:tcPr>
+          <w:p>
+            <w:r>
+              <w:t xml:space="preserve">How many chunks were scored against ground truth for the </w:t>
+            </w:r>
+            <w:r>
+              <w:lastRenderedPageBreak/>
+              <w:t>exact method that row used, vs. falling back to the manifest's Gi* answer</w:t>
+            </w:r>
+          </w:p>
+        </w:tc>
+        <w:tc>
+          <w:tcPr>
+            <w:tcW w:w="0" w:type="auto"/>
+            <w:vAlign w:val="center"/>
+            <w:hideMark/>
+          </w:tcPr>
+          <w:p>
+            <w:r>
+              <w:lastRenderedPageBreak/>
+              <w:t xml:space="preserve">Without this, there's no way to tell whether a model's score is method-matched or a fallback comparison — </w:t>
+            </w:r>
+            <w:r>
+              <w:lastRenderedPageBreak/>
+              <w:t>directly load-bearing for the method-resolution logic you asked for earlier.</w:t>
+            </w:r>
+          </w:p>
+        </w:tc>
+      </w:tr>
+      <w:tr>
+        <w:trPr>
+          <w:tblCellSpacing w:w="15" w:type="dxa"/>
+        </w:trPr>
+        <w:tc>
+          <w:tcPr>
+            <w:tcW w:w="0" w:type="auto"/>
+            <w:vAlign w:val="center"/>
+            <w:hideMark/>
+          </w:tcPr>
+          <w:p>
+            <w:proofErr w:type="spellStart"/>
+            <w:r>
+              <w:lastRenderedPageBreak/>
+              <w:t>accuracy_fully_verified</w:t>
+            </w:r>
+            <w:proofErr w:type="spellEnd"/>
+            <w:r>
+              <w:t xml:space="preserve"> </w:t>
+            </w:r>
+            <w:r>
+              <w:rPr>
+                <w:i/>
+                <w:iCs/>
+              </w:rPr>
+              <w:t>(new)</w:t>
+            </w:r>
+          </w:p>
+        </w:tc>
+        <w:tc>
+          <w:tcPr>
+            <w:tcW w:w="0" w:type="auto"/>
+            <w:vAlign w:val="center"/>
+            <w:hideMark/>
+          </w:tcPr>
+          <w:p>
+            <w:r>
+              <w:t>Fraction of chunks that are correct, evidenced, AND have every reported number within tolerance of the ground truth</w:t>
+            </w:r>
+          </w:p>
+        </w:tc>
+        <w:tc>
+          <w:tcPr>
+            <w:tcW w:w="0" w:type="auto"/>
+            <w:vAlign w:val="center"/>
+            <w:hideMark/>
+          </w:tcPr>
+          <w:p>
+            <w:r>
+              <w:t>The one column that can't be gamed by a lucky guess or a fabricated number — the strictest, most trustworthy metric in the table.</w:t>
+            </w:r>
+          </w:p>
+        </w:tc>
+      </w:tr>
+    </w:tbl>
+    <w:p>
+      <w:r>
+        <w:t xml:space="preserve">Matching (unchanged from last message, since it wasn't the actual cause of the zero): a borough counts as identified by </w:t>
+      </w:r>
+      <w:r>
+        <w:rPr>
+          <w:b/>
+          <w:bCs/>
+        </w:rPr>
+        <w:t>name only</w:t>
+      </w:r>
+      <w:r>
+        <w:t xml:space="preserve"> — hot/cold direction is not checked, per your instruction.</w:t>
+      </w:r>
+    </w:p>
     <w:p/>
-    <w:p/>
-    <w:p/>
-    <w:p/>
-    <w:p/>
-    <w:p/>
-    <w:p/>
-    <w:p/>
-    <w:p/>
-    <w:p/>
-    <w:p/>
-    <w:p/>
-    <w:p/>
-    <w:p/>
-    <w:p/>
-    <w:p/>
-    <w:p/>
-    <w:p/>
-    <w:p/>
-    <w:p/>
-    <w:p/>
-    <w:p/>
-    <w:p/>
-    <w:p/>
-    <w:p/>
-    <w:p/>
-    <w:p/>
-    <w:p/>
-    <w:p/>
-    <w:p>
-      <w:r>
-        <w:t xml:space="preserve">Get-Content </w:t>
-      </w:r>
-      <w:r>
-        <w:t>"</w:t>
-      </w:r>
-      <w:r>
-        <w:t>\runs\20260828T073219Z_bivariate_multiagent_openai-o3_bivariate_2021_energy_transport</w:t>
-      </w:r>
-      <w:r>
-        <w:t>\attempts_log.json"</w:t>
-      </w:r>
-    </w:p>
-    <w:p/>
-    <w:p>
-      <w:r>
-        <w:t>\runs\20260827T135045Z_bivariate_multiagent_qwen-qwen3-32b_bivariate_2021_gas_waste</w:t>
-      </w:r>
-    </w:p>
-    <w:p/>
-    <w:p/>
-    <w:p/>
-    <w:p>
-      <w:r>
-        <w:t>$models = @(</w:t>
-      </w:r>
-    </w:p>
-    <w:p>
-      <w:r>
-        <w:t xml:space="preserve">    "</w:t>
+    <w:p>
+      <w:pPr>
+        <w:jc w:val="center"/>
+        <w:rPr>
+          <w:b/>
+          <w:bCs/>
+          <w:u w:val="single"/>
+        </w:rPr>
+      </w:pPr>
+      <w:r>
+        <w:rPr>
+          <w:b/>
+          <w:bCs/>
+          <w:u w:val="single"/>
+        </w:rPr>
+        <w:t>For outlier detection</w:t>
+      </w:r>
+    </w:p>
+    <w:p>
+      <w:pPr>
+        <w:jc w:val="center"/>
+        <w:rPr>
+          <w:b/>
+          <w:bCs/>
+          <w:u w:val="single"/>
+        </w:rPr>
+      </w:pPr>
+    </w:p>
+    <w:p>
+      <w:pPr>
+        <w:jc w:val="both"/>
+      </w:pPr>
+      <w:r>
+        <w:t>Scoring logic — what changed and why</w:t>
+      </w:r>
+    </w:p>
+    <w:p>
+      <w:pPr>
+        <w:jc w:val="both"/>
+      </w:pPr>
+      <w:r>
+        <w:t>Kept exactly as you had it (these were real fixes, not something to touch):</w:t>
+      </w:r>
+    </w:p>
+    <w:tbl>
+      <w:tblPr>
+        <w:tblW w:w="0" w:type="auto"/>
+        <w:tblCellSpacing w:w="15" w:type="dxa"/>
+        <w:tblCellMar>
+          <w:top w:w="15" w:type="dxa"/>
+          <w:left w:w="15" w:type="dxa"/>
+          <w:bottom w:w="15" w:type="dxa"/>
+          <w:right w:w="15" w:type="dxa"/>
+        </w:tblCellMar>
+        <w:tblLook w:val="04A0" w:firstRow="1" w:lastRow="0" w:firstColumn="1" w:lastColumn="0" w:noHBand="0" w:noVBand="1"/>
+      </w:tblPr>
+      <w:tblGrid>
+        <w:gridCol w:w="3032"/>
+        <w:gridCol w:w="5994"/>
+      </w:tblGrid>
+      <w:tr>
+        <w:trPr>
+          <w:tblHeader/>
+          <w:tblCellSpacing w:w="15" w:type="dxa"/>
+        </w:trPr>
+        <w:tc>
+          <w:tcPr>
+            <w:tcW w:w="0" w:type="auto"/>
+            <w:vAlign w:val="center"/>
+            <w:hideMark/>
+          </w:tcPr>
+          <w:p>
+            <w:pPr>
+              <w:jc w:val="both"/>
+            </w:pPr>
+            <w:r>
+              <w:t>Check</w:t>
+            </w:r>
+          </w:p>
+        </w:tc>
+        <w:tc>
+          <w:tcPr>
+            <w:tcW w:w="0" w:type="auto"/>
+            <w:vAlign w:val="center"/>
+            <w:hideMark/>
+          </w:tcPr>
+          <w:p>
+            <w:pPr>
+              <w:jc w:val="both"/>
+            </w:pPr>
+            <w:r>
+              <w:t>What it catches</w:t>
+            </w:r>
+          </w:p>
+        </w:tc>
+      </w:tr>
+      <w:tr>
+        <w:trPr>
+          <w:tblCellSpacing w:w="15" w:type="dxa"/>
+        </w:trPr>
+        <w:tc>
+          <w:tcPr>
+            <w:tcW w:w="0" w:type="auto"/>
+            <w:vAlign w:val="center"/>
+            <w:hideMark/>
+          </w:tcPr>
+          <w:p>
+            <w:pPr>
+              <w:jc w:val="both"/>
+            </w:pPr>
+            <w:proofErr w:type="spellStart"/>
+            <w:r>
+              <w:t>verdict_z_consistent</w:t>
+            </w:r>
+            <w:proofErr w:type="spellEnd"/>
+          </w:p>
+        </w:tc>
+        <w:tc>
+          <w:tcPr>
+            <w:tcW w:w="0" w:type="auto"/>
+            <w:vAlign w:val="center"/>
+            <w:hideMark/>
+          </w:tcPr>
+          <w:p>
+            <w:pPr>
+              <w:jc w:val="both"/>
+            </w:pPr>
+            <w:r>
+              <w:t xml:space="preserve">A verdict only gets penalized against its own reported number when the number's </w:t>
+            </w:r>
+            <w:r>
+              <w:rPr>
+                <w:i/>
+                <w:iCs/>
+              </w:rPr>
+              <w:t>label</w:t>
+            </w:r>
+            <w:r>
+              <w:t xml:space="preserve"> confidently identifies it as a z-score or p-value — not guessed from magnitude alone. Fixes the real false positive where "z = 0.031" was misread as a significant p-value.</w:t>
+            </w:r>
+          </w:p>
+        </w:tc>
+      </w:tr>
+      <w:tr>
+        <w:trPr>
+          <w:tblCellSpacing w:w="15" w:type="dxa"/>
+        </w:trPr>
+        <w:tc>
+          <w:tcPr>
+            <w:tcW w:w="0" w:type="auto"/>
+            <w:vAlign w:val="center"/>
+            <w:hideMark/>
+          </w:tcPr>
+          <w:p>
+            <w:pPr>
+              <w:jc w:val="both"/>
+            </w:pPr>
+            <w:proofErr w:type="spellStart"/>
+            <w:r>
+              <w:t>outlier_magnitude_plausible</w:t>
+            </w:r>
+            <w:proofErr w:type="spellEnd"/>
+          </w:p>
+        </w:tc>
+        <w:tc>
+          <w:tcPr>
+            <w:tcW w:w="0" w:type="auto"/>
+            <w:vAlign w:val="center"/>
+            <w:hideMark/>
+          </w:tcPr>
+          <w:p>
+            <w:pPr>
+              <w:jc w:val="both"/>
+            </w:pPr>
+            <w:r>
+              <w:t>Flat 12.0 ceiling (≈2× the real observed max of 5.54 across the manifest). Catches genuinely-computed-but-broken answers, like the z=30.41 masking-bias-omission case, without penalizing correct direction.</w:t>
+            </w:r>
+          </w:p>
+        </w:tc>
+      </w:tr>
+    </w:tbl>
+    <w:p>
+      <w:pPr>
+        <w:jc w:val="both"/>
+      </w:pPr>
+      <w:r>
+        <w:t>New, layered on top:</w:t>
+      </w:r>
+    </w:p>
+    <w:tbl>
+      <w:tblPr>
+        <w:tblW w:w="0" w:type="auto"/>
+        <w:tblCellSpacing w:w="15" w:type="dxa"/>
+        <w:tblCellMar>
+          <w:top w:w="15" w:type="dxa"/>
+          <w:left w:w="15" w:type="dxa"/>
+          <w:bottom w:w="15" w:type="dxa"/>
+          <w:right w:w="15" w:type="dxa"/>
+        </w:tblCellMar>
+        <w:tblLook w:val="04A0" w:firstRow="1" w:lastRow="0" w:firstColumn="1" w:lastColumn="0" w:noHBand="0" w:noVBand="1"/>
+      </w:tblPr>
+      <w:tblGrid>
+        <w:gridCol w:w="2441"/>
+        <w:gridCol w:w="4615"/>
+        <w:gridCol w:w="1970"/>
+      </w:tblGrid>
+      <w:tr>
+        <w:trPr>
+          <w:tblHeader/>
+          <w:tblCellSpacing w:w="15" w:type="dxa"/>
+        </w:trPr>
+        <w:tc>
+          <w:tcPr>
+            <w:tcW w:w="0" w:type="auto"/>
+            <w:vAlign w:val="center"/>
+            <w:hideMark/>
+          </w:tcPr>
+          <w:p>
+            <w:pPr>
+              <w:jc w:val="both"/>
+            </w:pPr>
+            <w:r>
+              <w:lastRenderedPageBreak/>
+              <w:t>Column</w:t>
+            </w:r>
+          </w:p>
+        </w:tc>
+        <w:tc>
+          <w:tcPr>
+            <w:tcW w:w="0" w:type="auto"/>
+            <w:vAlign w:val="center"/>
+            <w:hideMark/>
+          </w:tcPr>
+          <w:p>
+            <w:pPr>
+              <w:jc w:val="both"/>
+            </w:pPr>
+            <w:r>
+              <w:t>Logic</w:t>
+            </w:r>
+          </w:p>
+        </w:tc>
+        <w:tc>
+          <w:tcPr>
+            <w:tcW w:w="0" w:type="auto"/>
+            <w:vAlign w:val="center"/>
+            <w:hideMark/>
+          </w:tcPr>
+          <w:p>
+            <w:pPr>
+              <w:jc w:val="both"/>
+            </w:pPr>
+            <w:r>
+              <w:t>Why</w:t>
+            </w:r>
+          </w:p>
+        </w:tc>
+      </w:tr>
+      <w:tr>
+        <w:trPr>
+          <w:tblCellSpacing w:w="15" w:type="dxa"/>
+        </w:trPr>
+        <w:tc>
+          <w:tcPr>
+            <w:tcW w:w="0" w:type="auto"/>
+            <w:vAlign w:val="center"/>
+            <w:hideMark/>
+          </w:tcPr>
+          <w:p>
+            <w:pPr>
+              <w:jc w:val="both"/>
+            </w:pPr>
+            <w:r>
+              <w:t>correct / accuracy</w:t>
+            </w:r>
+          </w:p>
+        </w:tc>
+        <w:tc>
+          <w:tcPr>
+            <w:tcW w:w="0" w:type="auto"/>
+            <w:vAlign w:val="center"/>
+            <w:hideMark/>
+          </w:tcPr>
+          <w:p>
+            <w:pPr>
+              <w:jc w:val="both"/>
+            </w:pPr>
+            <w:r>
+              <w:t>Predicted class == ground truth for the specific method that row used (from ground_truth_all_methods_outlierr.csv), not always Iterative-R</w:t>
+            </w:r>
+          </w:p>
+        </w:tc>
+        <w:tc>
+          <w:tcPr>
+            <w:tcW w:w="0" w:type="auto"/>
+            <w:vAlign w:val="center"/>
+            <w:hideMark/>
+          </w:tcPr>
+          <w:p>
+            <w:pPr>
+              <w:jc w:val="both"/>
+            </w:pPr>
+            <w:r>
+              <w:t xml:space="preserve">A row using Local Moran's I should be judged against what Local Moran's I </w:t>
+            </w:r>
+            <w:proofErr w:type="gramStart"/>
+            <w:r>
+              <w:t>actually says</w:t>
+            </w:r>
+            <w:proofErr w:type="gramEnd"/>
+            <w:r>
+              <w:t>, not against a different statistic's answer</w:t>
+            </w:r>
+          </w:p>
+        </w:tc>
+      </w:tr>
+      <w:tr>
+        <w:trPr>
+          <w:tblCellSpacing w:w="15" w:type="dxa"/>
+        </w:trPr>
+        <w:tc>
+          <w:tcPr>
+            <w:tcW w:w="0" w:type="auto"/>
+            <w:vAlign w:val="center"/>
+            <w:hideMark/>
+          </w:tcPr>
+          <w:p>
+            <w:pPr>
+              <w:jc w:val="both"/>
+            </w:pPr>
+            <w:proofErr w:type="spellStart"/>
+            <w:r>
+              <w:t>n_method_specific_gt</w:t>
+            </w:r>
+            <w:proofErr w:type="spellEnd"/>
+          </w:p>
+        </w:tc>
+        <w:tc>
+          <w:tcPr>
+            <w:tcW w:w="0" w:type="auto"/>
+            <w:vAlign w:val="center"/>
+            <w:hideMark/>
+          </w:tcPr>
+          <w:p>
+            <w:pPr>
+              <w:jc w:val="both"/>
+            </w:pPr>
+            <w:r>
+              <w:t>Count of chunks scored against a method-matched ground truth vs. the Iterative-R fallback</w:t>
+            </w:r>
+          </w:p>
+        </w:tc>
+        <w:tc>
+          <w:tcPr>
+            <w:tcW w:w="0" w:type="auto"/>
+            <w:vAlign w:val="center"/>
+            <w:hideMark/>
+          </w:tcPr>
+          <w:p>
+            <w:pPr>
+              <w:jc w:val="both"/>
+            </w:pPr>
+            <w:r>
+              <w:t>Transparency — shows how much of a model's score rests on which comparison</w:t>
+            </w:r>
+          </w:p>
+        </w:tc>
+      </w:tr>
+      <w:tr>
+        <w:trPr>
+          <w:tblCellSpacing w:w="15" w:type="dxa"/>
+        </w:trPr>
+        <w:tc>
+          <w:tcPr>
+            <w:tcW w:w="0" w:type="auto"/>
+            <w:vAlign w:val="center"/>
+            <w:hideMark/>
+          </w:tcPr>
+          <w:p>
+            <w:pPr>
+              <w:jc w:val="both"/>
+            </w:pPr>
+            <w:proofErr w:type="spellStart"/>
+            <w:r>
+              <w:t>accuracy_fully_verified</w:t>
+            </w:r>
+            <w:proofErr w:type="spellEnd"/>
+          </w:p>
+        </w:tc>
+        <w:tc>
+          <w:tcPr>
+            <w:tcW w:w="0" w:type="auto"/>
+            <w:vAlign w:val="center"/>
+            <w:hideMark/>
+          </w:tcPr>
+          <w:p>
+            <w:pPr>
+              <w:jc w:val="both"/>
+            </w:pPr>
+            <w:r>
+              <w:t>correct AND evidenced AND reported z-value within absolute tolerance of the resolved ground truth</w:t>
+            </w:r>
+          </w:p>
+        </w:tc>
+        <w:tc>
+          <w:tcPr>
+            <w:tcW w:w="0" w:type="auto"/>
+            <w:vAlign w:val="center"/>
+            <w:hideMark/>
+          </w:tcPr>
+          <w:p>
+            <w:pPr>
+              <w:jc w:val="both"/>
+            </w:pPr>
+            <w:r>
+              <w:t>The strictest metric — can't be gamed by a lucky directional guess</w:t>
+            </w:r>
+          </w:p>
+        </w:tc>
+      </w:tr>
+    </w:tbl>
+    <w:p>
+      <w:pPr>
+        <w:jc w:val="both"/>
+        <w:rPr>
+          <w:b/>
+          <w:bCs/>
+          <w:u w:val="single"/>
+        </w:rPr>
+      </w:pPr>
+      <w:r>
+        <w:t xml:space="preserve">Tolerance is absolute, not relative — same reasoning as </w:t>
       </w:r>
       <w:proofErr w:type="spellStart"/>
       <w:r>
-        <w:t>openai</w:t>
+        <w:t>getisord</w:t>
       </w:r>
       <w:proofErr w:type="spellEnd"/>
       <w:r>
-        <w:t>/o3",</w:t>
-      </w:r>
-    </w:p>
-    <w:p>
-      <w:r>
-        <w:t xml:space="preserve">    "</w:t>
+        <w:t xml:space="preserve">: relative error blows up meaninglessly near zero (a z of 0.05 vs 0.1 is "100% relative error" but a trivial real difference). Values are method-specific because the </w:t>
+      </w:r>
+      <w:r>
+        <w:rPr>
+          <w:i/>
+          <w:iCs/>
+        </w:rPr>
+        <w:t>source</w:t>
+      </w:r>
+      <w:r>
+        <w:t xml:space="preserve"> of legitimate implementation variance differs: regression-based methods (Iterative-R, single-pass, robust) can differ by which residual convention is used (standardized vs. studentized — empirically measured at p95 = 0.073, so 0.1 tolerance), the </w:t>
       </w:r>
       <w:proofErr w:type="spellStart"/>
       <w:r>
-        <w:t>openai</w:t>
+        <w:t>neighbor</w:t>
       </w:r>
       <w:proofErr w:type="spellEnd"/>
       <w:r>
-        <w:t>/o4-mini",</w:t>
-      </w:r>
-    </w:p>
-    <w:p>
-      <w:r>
-        <w:t xml:space="preserve">    "</w:t>
+        <w:t xml:space="preserve"> mean/std z-score has no such fitting ambiguity so gets a tighter 0.05, and Local Moran's I reuses </w:t>
       </w:r>
       <w:proofErr w:type="spellStart"/>
       <w:r>
-        <w:t>openai</w:t>
+        <w:t>getisord's</w:t>
       </w:r>
       <w:proofErr w:type="spellEnd"/>
       <w:r>
-        <w:t>/gpt-4o-mini"</w:t>
-      </w:r>
-    </w:p>
-    <w:p>
-      <w:r>
-        <w:t>)</w:t>
-      </w:r>
-    </w:p>
-    <w:p>
-      <w:r>
-        <w:t>foreach ($m in $models) {</w:t>
-      </w:r>
-    </w:p>
-    <w:p>
-      <w:r>
-        <w:t xml:space="preserve">    Write-Host "=== multi_agent_changespillover.py with $m ==="</w:t>
-      </w:r>
-    </w:p>
-    <w:p>
-      <w:r>
-        <w:t xml:space="preserve">    python multi_agent_changespillover.py --model $m 2&gt;&amp;1 | Tee-Object -Append -</w:t>
+        <w:t xml:space="preserve"> 1.5 since it's the identical statistic with the identical analytic-vs-permutation variance-estimation spread.</w:t>
+      </w:r>
+    </w:p>
+    <w:p>
+      <w:pPr>
+        <w:jc w:val="center"/>
+        <w:rPr>
+          <w:b/>
+          <w:bCs/>
+          <w:u w:val="single"/>
+        </w:rPr>
+      </w:pPr>
+    </w:p>
+    <w:p>
+      <w:pPr>
+        <w:jc w:val="center"/>
+        <w:rPr>
+          <w:b/>
+          <w:bCs/>
+          <w:u w:val="single"/>
+        </w:rPr>
+      </w:pPr>
+    </w:p>
+    <w:p>
+      <w:pPr>
+        <w:jc w:val="center"/>
+        <w:rPr>
+          <w:b/>
+          <w:bCs/>
+          <w:u w:val="single"/>
+        </w:rPr>
+      </w:pPr>
+    </w:p>
+    <w:p>
+      <w:pPr>
+        <w:jc w:val="center"/>
+        <w:rPr>
+          <w:b/>
+          <w:bCs/>
+          <w:u w:val="single"/>
+        </w:rPr>
+      </w:pPr>
+      <w:r>
+        <w:rPr>
+          <w:b/>
+          <w:bCs/>
+          <w:u w:val="single"/>
+        </w:rPr>
+        <w:t xml:space="preserve">For </w:t>
       </w:r>
       <w:proofErr w:type="spellStart"/>
       <w:r>
-        <w:t>FilePath</w:t>
+        <w:rPr>
+          <w:b/>
+          <w:bCs/>
+          <w:u w:val="single"/>
+        </w:rPr>
+        <w:t>changespliover</w:t>
       </w:r>
       <w:proofErr w:type="spellEnd"/>
-      <w:r>
-        <w:t xml:space="preserve"> "changespillover_multiagent_run_log.txt"</w:t>
-      </w:r>
-    </w:p>
-    <w:p>
-      <w:r>
-        <w:t>}</w:t>
-      </w:r>
-    </w:p>
-    <w:p/>
-    <w:p>
-      <w:r>
-        <w:t>$models = @(</w:t>
-      </w:r>
-    </w:p>
-    <w:p>
-      <w:r>
-        <w:t xml:space="preserve">    "</w:t>
-      </w:r>
-      <w:proofErr w:type="spellStart"/>
-      <w:r>
-        <w:t>deepseek</w:t>
-      </w:r>
-      <w:proofErr w:type="spellEnd"/>
-      <w:r>
-        <w:t>/deepseek-chat-v3-0324",</w:t>
-      </w:r>
-    </w:p>
-    <w:p>
-      <w:r>
-        <w:t xml:space="preserve">    "</w:t>
-      </w:r>
-      <w:proofErr w:type="spellStart"/>
-      <w:r>
-        <w:t>deepseek</w:t>
-      </w:r>
-      <w:proofErr w:type="spellEnd"/>
-      <w:r>
-        <w:t>/deepseek-r1-0528",</w:t>
-      </w:r>
-    </w:p>
-    <w:p>
-      <w:r>
-        <w:t xml:space="preserve">    "</w:t>
-      </w:r>
-      <w:proofErr w:type="spellStart"/>
-      <w:r>
-        <w:t>qwen</w:t>
-      </w:r>
-      <w:proofErr w:type="spellEnd"/>
-      <w:r>
-        <w:t>/qwen3-32b",</w:t>
-      </w:r>
-    </w:p>
-    <w:p>
-      <w:r>
-        <w:t xml:space="preserve">    "</w:t>
-      </w:r>
-      <w:proofErr w:type="spellStart"/>
-      <w:r>
-        <w:t>moonshotai</w:t>
-      </w:r>
-      <w:proofErr w:type="spellEnd"/>
-      <w:r>
-        <w:t>/kimi-k2.6",</w:t>
-      </w:r>
-    </w:p>
-    <w:p>
-      <w:r>
-        <w:t xml:space="preserve">    "meta-llama/llama-3.1-8b-instruct"</w:t>
-      </w:r>
-    </w:p>
-    <w:p>
-      <w:r>
+    </w:p>
+    <w:p>
+      <w:pPr>
+        <w:jc w:val="center"/>
+        <w:rPr>
+          <w:b/>
+          <w:bCs/>
+          <w:u w:val="single"/>
+        </w:rPr>
+      </w:pPr>
+    </w:p>
+    <w:p>
+      <w:pPr>
+        <w:jc w:val="both"/>
+      </w:pPr>
+      <w:r>
+        <w:t>score_changespillover.py (binary: CLUSTERED / NOT CLUSTERED, single global test per chunk)</w:t>
+      </w:r>
+    </w:p>
+    <w:tbl>
+      <w:tblPr>
+        <w:tblW w:w="0" w:type="auto"/>
+        <w:tblCellSpacing w:w="15" w:type="dxa"/>
+        <w:tblCellMar>
+          <w:top w:w="15" w:type="dxa"/>
+          <w:left w:w="15" w:type="dxa"/>
+          <w:bottom w:w="15" w:type="dxa"/>
+          <w:right w:w="15" w:type="dxa"/>
+        </w:tblCellMar>
+        <w:tblLook w:val="04A0" w:firstRow="1" w:lastRow="0" w:firstColumn="1" w:lastColumn="0" w:noHBand="0" w:noVBand="1"/>
+      </w:tblPr>
+      <w:tblGrid>
+        <w:gridCol w:w="2478"/>
+        <w:gridCol w:w="3424"/>
+        <w:gridCol w:w="3124"/>
+      </w:tblGrid>
+      <w:tr>
+        <w:trPr>
+          <w:tblHeader/>
+          <w:tblCellSpacing w:w="15" w:type="dxa"/>
+        </w:trPr>
+        <w:tc>
+          <w:tcPr>
+            <w:tcW w:w="0" w:type="auto"/>
+            <w:vAlign w:val="center"/>
+            <w:hideMark/>
+          </w:tcPr>
+          <w:p>
+            <w:pPr>
+              <w:jc w:val="both"/>
+            </w:pPr>
+            <w:r>
+              <w:lastRenderedPageBreak/>
+              <w:t>Column</w:t>
+            </w:r>
+          </w:p>
+        </w:tc>
+        <w:tc>
+          <w:tcPr>
+            <w:tcW w:w="0" w:type="auto"/>
+            <w:vAlign w:val="center"/>
+            <w:hideMark/>
+          </w:tcPr>
+          <w:p>
+            <w:pPr>
+              <w:jc w:val="both"/>
+            </w:pPr>
+            <w:r>
+              <w:t>What it measures</w:t>
+            </w:r>
+          </w:p>
+        </w:tc>
+        <w:tc>
+          <w:tcPr>
+            <w:tcW w:w="0" w:type="auto"/>
+            <w:vAlign w:val="center"/>
+            <w:hideMark/>
+          </w:tcPr>
+          <w:p>
+            <w:pPr>
+              <w:jc w:val="both"/>
+            </w:pPr>
+            <w:r>
+              <w:t>Justification</w:t>
+            </w:r>
+          </w:p>
+        </w:tc>
+      </w:tr>
+      <w:tr>
+        <w:trPr>
+          <w:tblCellSpacing w:w="15" w:type="dxa"/>
+        </w:trPr>
+        <w:tc>
+          <w:tcPr>
+            <w:tcW w:w="0" w:type="auto"/>
+            <w:vAlign w:val="center"/>
+            <w:hideMark/>
+          </w:tcPr>
+          <w:p>
+            <w:pPr>
+              <w:jc w:val="both"/>
+            </w:pPr>
+            <w:r>
+              <w:t>accuracy</w:t>
+            </w:r>
+          </w:p>
+        </w:tc>
+        <w:tc>
+          <w:tcPr>
+            <w:tcW w:w="0" w:type="auto"/>
+            <w:vAlign w:val="center"/>
+            <w:hideMark/>
+          </w:tcPr>
+          <w:p>
+            <w:pPr>
+              <w:jc w:val="both"/>
+            </w:pPr>
+            <w:r>
+              <w:t xml:space="preserve">Predicted CLUSTERED/NOT CLUSTERED == ground truth for the specific method that chunk used (Global Moran's I, Geary's C, Join Count, or </w:t>
+            </w:r>
+            <w:proofErr w:type="spellStart"/>
+            <w:r>
+              <w:t>Neighbor</w:t>
+            </w:r>
+            <w:proofErr w:type="spellEnd"/>
+            <w:r>
+              <w:t>-average correlation), with fallback to the manifest's Global Moran's I answer if the method has no computed ground truth</w:t>
+            </w:r>
+          </w:p>
+        </w:tc>
+        <w:tc>
+          <w:tcPr>
+            <w:tcW w:w="0" w:type="auto"/>
+            <w:vAlign w:val="center"/>
+            <w:hideMark/>
+          </w:tcPr>
+          <w:p>
+            <w:pPr>
+              <w:jc w:val="both"/>
+            </w:pPr>
+            <w:r>
+              <w:t xml:space="preserve">Judges a model's conclusion against what its own chosen method </w:t>
+            </w:r>
+            <w:proofErr w:type="gramStart"/>
+            <w:r>
+              <w:t>actually says</w:t>
+            </w:r>
+            <w:proofErr w:type="gramEnd"/>
+            <w:r>
+              <w:t>, not always against Moran's I</w:t>
+            </w:r>
+          </w:p>
+        </w:tc>
+      </w:tr>
+      <w:tr>
+        <w:trPr>
+          <w:tblCellSpacing w:w="15" w:type="dxa"/>
+        </w:trPr>
+        <w:tc>
+          <w:tcPr>
+            <w:tcW w:w="0" w:type="auto"/>
+            <w:vAlign w:val="center"/>
+            <w:hideMark/>
+          </w:tcPr>
+          <w:p>
+            <w:pPr>
+              <w:jc w:val="both"/>
+            </w:pPr>
+            <w:r>
+              <w:t>precision / recall / f1</w:t>
+            </w:r>
+          </w:p>
+        </w:tc>
+        <w:tc>
+          <w:tcPr>
+            <w:tcW w:w="0" w:type="auto"/>
+            <w:vAlign w:val="center"/>
+            <w:hideMark/>
+          </w:tcPr>
+          <w:p>
+            <w:pPr>
+              <w:jc w:val="both"/>
+            </w:pPr>
+            <w:r>
+              <w:t>2-class macro-averaged (CLUSTERED and NOT CLUSTERED each scored as their own class, then averaged)</w:t>
+            </w:r>
+          </w:p>
+        </w:tc>
+        <w:tc>
+          <w:tcPr>
+            <w:tcW w:w="0" w:type="auto"/>
+            <w:vAlign w:val="center"/>
+            <w:hideMark/>
+          </w:tcPr>
+          <w:p>
+            <w:pPr>
+              <w:jc w:val="both"/>
+            </w:pPr>
+            <w:r>
+              <w:t>Prevents a model from hiding poor CLUSTERED-detection behind good majority-class guessing; also closes a real blind spot in the original single-class version, where an ambiguous row could only ever hurt F1 when the true answer was CLUSTERED</w:t>
+            </w:r>
+          </w:p>
+        </w:tc>
+      </w:tr>
+      <w:tr>
+        <w:trPr>
+          <w:tblCellSpacing w:w="15" w:type="dxa"/>
+        </w:trPr>
+        <w:tc>
+          <w:tcPr>
+            <w:tcW w:w="0" w:type="auto"/>
+            <w:vAlign w:val="center"/>
+            <w:hideMark/>
+          </w:tcPr>
+          <w:p>
+            <w:pPr>
+              <w:jc w:val="both"/>
+            </w:pPr>
+            <w:proofErr w:type="spellStart"/>
+            <w:r>
+              <w:t>tp</w:t>
+            </w:r>
+            <w:proofErr w:type="spellEnd"/>
+            <w:r>
+              <w:t xml:space="preserve"> / </w:t>
+            </w:r>
+            <w:proofErr w:type="spellStart"/>
+            <w:r>
+              <w:t>fp</w:t>
+            </w:r>
+            <w:proofErr w:type="spellEnd"/>
+          </w:p>
+        </w:tc>
+        <w:tc>
+          <w:tcPr>
+            <w:tcW w:w="0" w:type="auto"/>
+            <w:vAlign w:val="center"/>
+            <w:hideMark/>
+          </w:tcPr>
+          <w:p>
+            <w:pPr>
+              <w:jc w:val="both"/>
+            </w:pPr>
+            <w:r>
+              <w:t>Raw counts for the CLUSTERED class only</w:t>
+            </w:r>
+          </w:p>
+        </w:tc>
+        <w:tc>
+          <w:tcPr>
+            <w:tcW w:w="0" w:type="auto"/>
+            <w:vAlign w:val="center"/>
+            <w:hideMark/>
+          </w:tcPr>
+          <w:p>
+            <w:pPr>
+              <w:jc w:val="both"/>
+            </w:pPr>
+            <w:r>
+              <w:t>Descriptive only — kept for reference, not the basis of precision/recall anymore</w:t>
+            </w:r>
+          </w:p>
+        </w:tc>
+      </w:tr>
+      <w:tr>
+        <w:trPr>
+          <w:tblCellSpacing w:w="15" w:type="dxa"/>
+        </w:trPr>
+        <w:tc>
+          <w:tcPr>
+            <w:tcW w:w="0" w:type="auto"/>
+            <w:vAlign w:val="center"/>
+            <w:hideMark/>
+          </w:tcPr>
+          <w:p>
+            <w:pPr>
+              <w:jc w:val="both"/>
+            </w:pPr>
+            <w:proofErr w:type="spellStart"/>
+            <w:r>
+              <w:t>pct_with_evidence</w:t>
+            </w:r>
+            <w:proofErr w:type="spellEnd"/>
+          </w:p>
+        </w:tc>
+        <w:tc>
+          <w:tcPr>
+            <w:tcW w:w="0" w:type="auto"/>
+            <w:vAlign w:val="center"/>
+            <w:hideMark/>
+          </w:tcPr>
+          <w:p>
+            <w:pPr>
+              <w:jc w:val="both"/>
+            </w:pPr>
+            <w:r>
+              <w:t>Fraction of rows with a real, non-fabricated statistic, a valid probability, and a p-value consistent with the claimed verdict</w:t>
+            </w:r>
+          </w:p>
+        </w:tc>
+        <w:tc>
+          <w:tcPr>
+            <w:tcW w:w="0" w:type="auto"/>
+            <w:vAlign w:val="center"/>
+            <w:hideMark/>
+          </w:tcPr>
+          <w:p>
+            <w:pPr>
+              <w:jc w:val="both"/>
+            </w:pPr>
+            <w:r>
+              <w:t>Same evidence-fabrication check used across every task this session</w:t>
+            </w:r>
+          </w:p>
+        </w:tc>
+      </w:tr>
+      <w:tr>
+        <w:trPr>
+          <w:tblCellSpacing w:w="15" w:type="dxa"/>
+        </w:trPr>
+        <w:tc>
+          <w:tcPr>
+            <w:tcW w:w="0" w:type="auto"/>
+            <w:vAlign w:val="center"/>
+            <w:hideMark/>
+          </w:tcPr>
+          <w:p>
+            <w:pPr>
+              <w:jc w:val="both"/>
+            </w:pPr>
+            <w:proofErr w:type="spellStart"/>
+            <w:r>
+              <w:t>n_method_specific_gt</w:t>
+            </w:r>
+            <w:proofErr w:type="spellEnd"/>
+            <w:r>
+              <w:t xml:space="preserve"> </w:t>
+            </w:r>
+            <w:r>
+              <w:rPr>
+                <w:i/>
+                <w:iCs/>
+              </w:rPr>
+              <w:t>(new)</w:t>
+            </w:r>
+          </w:p>
+        </w:tc>
+        <w:tc>
+          <w:tcPr>
+            <w:tcW w:w="0" w:type="auto"/>
+            <w:vAlign w:val="center"/>
+            <w:hideMark/>
+          </w:tcPr>
+          <w:p>
+            <w:pPr>
+              <w:jc w:val="both"/>
+            </w:pPr>
+            <w:r>
+              <w:t>How many chunks were scored against ground truth for the exact method used, vs. the Global Moran's I fallback</w:t>
+            </w:r>
+          </w:p>
+        </w:tc>
+        <w:tc>
+          <w:tcPr>
+            <w:tcW w:w="0" w:type="auto"/>
+            <w:vAlign w:val="center"/>
+            <w:hideMark/>
+          </w:tcPr>
+          <w:p>
+            <w:pPr>
+              <w:jc w:val="both"/>
+            </w:pPr>
+            <w:r>
+              <w:t>Transparency — shows how much of a model's score rests on a method-matched vs. fallback comparison</w:t>
+            </w:r>
+          </w:p>
+        </w:tc>
+      </w:tr>
+      <w:tr>
+        <w:trPr>
+          <w:tblCellSpacing w:w="15" w:type="dxa"/>
+        </w:trPr>
+        <w:tc>
+          <w:tcPr>
+            <w:tcW w:w="0" w:type="auto"/>
+            <w:vAlign w:val="center"/>
+            <w:hideMark/>
+          </w:tcPr>
+          <w:p>
+            <w:pPr>
+              <w:jc w:val="both"/>
+            </w:pPr>
+            <w:proofErr w:type="spellStart"/>
+            <w:r>
+              <w:t>accuracy_fully_verified</w:t>
+            </w:r>
+            <w:proofErr w:type="spellEnd"/>
+            <w:r>
+              <w:t xml:space="preserve"> </w:t>
+            </w:r>
+            <w:r>
+              <w:rPr>
+                <w:i/>
+                <w:iCs/>
+              </w:rPr>
+              <w:t>(new)</w:t>
+            </w:r>
+          </w:p>
+        </w:tc>
+        <w:tc>
+          <w:tcPr>
+            <w:tcW w:w="0" w:type="auto"/>
+            <w:vAlign w:val="center"/>
+            <w:hideMark/>
+          </w:tcPr>
+          <w:p>
+            <w:pPr>
+              <w:jc w:val="both"/>
+            </w:pPr>
+            <w:r>
+              <w:t>Correct + evidenced + reported statistic within 0.05 absolute of the resolved ground truth's value</w:t>
+            </w:r>
+          </w:p>
+        </w:tc>
+        <w:tc>
+          <w:tcPr>
+            <w:tcW w:w="0" w:type="auto"/>
+            <w:vAlign w:val="center"/>
+            <w:hideMark/>
+          </w:tcPr>
+          <w:p>
+            <w:pPr>
+              <w:jc w:val="both"/>
+            </w:pPr>
+          </w:p>
+        </w:tc>
+      </w:tr>
+    </w:tbl>
+    <w:p>
+      <w:pPr>
+        <w:jc w:val="center"/>
+        <w:rPr>
+          <w:b/>
+          <w:bCs/>
+          <w:u w:val="single"/>
+        </w:rPr>
+      </w:pPr>
+    </w:p>
+    <w:p>
+      <w:pPr>
+        <w:jc w:val="center"/>
+        <w:rPr>
+          <w:b/>
+          <w:bCs/>
+          <w:u w:val="single"/>
+        </w:rPr>
+      </w:pPr>
+    </w:p>
+    <w:p>
+      <w:pPr>
+        <w:jc w:val="center"/>
+        <w:rPr>
+          <w:b/>
+          <w:bCs/>
+          <w:u w:val="single"/>
+        </w:rPr>
+      </w:pPr>
+      <w:r>
+        <w:rPr>
+          <w:b/>
+          <w:bCs/>
+          <w:u w:val="single"/>
+        </w:rPr>
         <w:lastRenderedPageBreak/>
-        <w:t>)</w:t>
-      </w:r>
-    </w:p>
-    <w:p>
-      <w:r>
-        <w:t>foreach ($m in $models) {</w:t>
-      </w:r>
-    </w:p>
-    <w:p>
-      <w:r>
-        <w:t xml:space="preserve">    Write-Host "=== multi_agent_changespillover.py with $m ==="</w:t>
-      </w:r>
-    </w:p>
-    <w:p>
-      <w:r>
-        <w:t xml:space="preserve">    python multi_agent_changespillover.py --model $m 2&gt;&amp;1 | Tee-Object -Append -</w:t>
-      </w:r>
-      <w:proofErr w:type="spellStart"/>
-      <w:r>
-        <w:t>FilePath</w:t>
-      </w:r>
-      <w:proofErr w:type="spellEnd"/>
-      <w:r>
-        <w:t xml:space="preserve"> "changespillover_multiagent_run_log.txt"</w:t>
-      </w:r>
-    </w:p>
-    <w:p>
-      <w:r>
-        <w:t>}</w:t>
-      </w:r>
-    </w:p>
-    <w:p/>
-    <w:p/>
-    <w:p>
-      <w:r>
-        <w:t># For single turn</w:t>
-      </w:r>
-    </w:p>
-    <w:p>
-      <w:r>
-        <w:t>RESULTS_CSV = "bivariate_results.csv"</w:t>
-      </w:r>
-    </w:p>
-    <w:p>
-      <w:r>
-        <w:t>SUMMARY_OUT = "Scores/single turn/bivariate_scoring_summary.csv"</w:t>
-      </w:r>
-    </w:p>
-    <w:p>
-      <w:r>
-        <w:t>CONFUSION_OUT = "Scores/single turn/bivariate_confusion_matrix.csv"</w:t>
-      </w:r>
-    </w:p>
-    <w:p/>
-    <w:p>
-      <w:r>
-        <w:t># For multi turn</w:t>
-      </w:r>
-    </w:p>
-    <w:p>
-      <w:r>
-        <w:t>#RESULTS_CSV = "results/single agent/bivariate_results_multi.csv"</w:t>
-      </w:r>
-    </w:p>
-    <w:p>
-      <w:r>
-        <w:t>#SUMMARY_OUT = "Scores/multi turn/bivariate_scoring_summary_multi.csv"</w:t>
-      </w:r>
-    </w:p>
-    <w:p>
-      <w:r>
-        <w:t>#CONFUSION_OUT = "Scores/multi turn/bivariate_confusion_matrix_multi.csv"</w:t>
-      </w:r>
-    </w:p>
-    <w:p/>
-    <w:p>
-      <w:r>
-        <w:t># For multi agent</w:t>
-      </w:r>
-    </w:p>
-    <w:p>
-      <w:r>
-        <w:t>#RESULTS_CSV = "results/multi agent/bivariate_results_multi.csv"</w:t>
-      </w:r>
-    </w:p>
-    <w:p>
-      <w:r>
-        <w:t>#SUMMARY_OUT = "Scores/multi agent/bivariate_scoring_summary_multi.csv"</w:t>
-      </w:r>
-    </w:p>
-    <w:p>
-      <w:r>
-        <w:t>#CONFUSION_OUT = "Scores/multi agent/bivariate_confusion_matrix_multi.csv"</w:t>
-      </w:r>
-    </w:p>
-    <w:p/>
-    <w:p/>
-    <w:p/>
-    <w:p>
-      <w:r>
-        <w:t>$models = @(</w:t>
-      </w:r>
-    </w:p>
-    <w:p>
-      <w:r>
-        <w:t xml:space="preserve">    "</w:t>
-      </w:r>
-      <w:proofErr w:type="spellStart"/>
-      <w:r>
-        <w:t>openai</w:t>
-      </w:r>
-      <w:proofErr w:type="spellEnd"/>
-      <w:r>
-        <w:t>/o3",</w:t>
-      </w:r>
-    </w:p>
-    <w:p>
-      <w:r>
-        <w:t xml:space="preserve">    "</w:t>
-      </w:r>
-      <w:proofErr w:type="spellStart"/>
-      <w:r>
-        <w:t>openai</w:t>
-      </w:r>
-      <w:proofErr w:type="spellEnd"/>
-      <w:r>
-        <w:t>/o4-mini",</w:t>
-      </w:r>
-    </w:p>
-    <w:p>
-      <w:r>
-        <w:lastRenderedPageBreak/>
-        <w:t xml:space="preserve">    "</w:t>
-      </w:r>
-      <w:proofErr w:type="spellStart"/>
-      <w:r>
-        <w:t>openai</w:t>
-      </w:r>
-      <w:proofErr w:type="spellEnd"/>
-      <w:r>
-        <w:t>/gpt-4o-mini"</w:t>
-      </w:r>
-    </w:p>
-    <w:p>
-      <w:r>
-        <w:t>)</w:t>
-      </w:r>
-    </w:p>
-    <w:p>
-      <w:r>
-        <w:t>foreach ($m in $models) {</w:t>
-      </w:r>
-    </w:p>
-    <w:p>
-      <w:r>
-        <w:t xml:space="preserve">    Write-Host "=== multi_agent_outlier_iterative_r.py with $m ==="</w:t>
-      </w:r>
-    </w:p>
-    <w:p>
-      <w:r>
-        <w:t xml:space="preserve">    python multi_agent_outlier_iterative_r.py --model $m 2&gt;&amp;1 | Tee-Object -Append -</w:t>
-      </w:r>
-      <w:proofErr w:type="spellStart"/>
-      <w:r>
-        <w:t>FilePath</w:t>
-      </w:r>
-      <w:proofErr w:type="spellEnd"/>
-      <w:r>
-        <w:t xml:space="preserve"> "outlier_multiagent_run_log.txt"</w:t>
-      </w:r>
-    </w:p>
-    <w:p>
-      <w:r>
-        <w:t>}</w:t>
-      </w:r>
-    </w:p>
-    <w:p/>
-    <w:p/>
-    <w:p>
-      <w:r>
-        <w:t>$models = @(</w:t>
-      </w:r>
-    </w:p>
-    <w:p>
-      <w:r>
-        <w:t xml:space="preserve">    "</w:t>
-      </w:r>
-      <w:proofErr w:type="spellStart"/>
-      <w:r>
-        <w:t>deepseek</w:t>
-      </w:r>
-      <w:proofErr w:type="spellEnd"/>
-      <w:r>
-        <w:t>/deepseek-chat-v3-0324",</w:t>
-      </w:r>
-    </w:p>
-    <w:p>
-      <w:r>
-        <w:t xml:space="preserve">    "</w:t>
-      </w:r>
-      <w:proofErr w:type="spellStart"/>
-      <w:r>
-        <w:t>deepseek</w:t>
-      </w:r>
-      <w:proofErr w:type="spellEnd"/>
-      <w:r>
-        <w:t>/deepseek-r1-0528",</w:t>
-      </w:r>
-    </w:p>
-    <w:p>
-      <w:r>
-        <w:t xml:space="preserve">    "</w:t>
-      </w:r>
-      <w:proofErr w:type="spellStart"/>
-      <w:r>
-        <w:t>qwen</w:t>
-      </w:r>
-      <w:proofErr w:type="spellEnd"/>
-      <w:r>
-        <w:t>/qwen3-32b",</w:t>
-      </w:r>
-    </w:p>
-    <w:p>
-      <w:r>
-        <w:t xml:space="preserve">    "</w:t>
-      </w:r>
-      <w:proofErr w:type="spellStart"/>
-      <w:r>
-        <w:t>moonshotai</w:t>
-      </w:r>
-      <w:proofErr w:type="spellEnd"/>
-      <w:r>
-        <w:t>/kimi-k2.6",</w:t>
-      </w:r>
-    </w:p>
-    <w:p>
-      <w:r>
-        <w:t xml:space="preserve">    "meta-llama/llama-3.1-8b-instruct"</w:t>
-      </w:r>
-    </w:p>
-    <w:p>
-      <w:r>
-        <w:t>)</w:t>
-      </w:r>
-    </w:p>
-    <w:p>
-      <w:r>
-        <w:t>foreach ($m in $models) {</w:t>
-      </w:r>
-    </w:p>
-    <w:p>
-      <w:r>
-        <w:t xml:space="preserve">    Write-Host "=== multi_agent_outlier_iterative_r.py with $m ==="</w:t>
-      </w:r>
-    </w:p>
-    <w:p>
-      <w:r>
-        <w:t xml:space="preserve">    python multi_agent_outlier_iterative_r.py --model $m 2&gt;&amp;1 | Tee-Object -Append -</w:t>
-      </w:r>
-      <w:proofErr w:type="spellStart"/>
-      <w:r>
-        <w:t>FilePath</w:t>
-      </w:r>
-      <w:proofErr w:type="spellEnd"/>
-      <w:r>
-        <w:t xml:space="preserve"> "outlier_multiagent_run_log.txt"</w:t>
-      </w:r>
-    </w:p>
-    <w:p>
-      <w:r>
-        <w:t>}</w:t>
-      </w:r>
-    </w:p>
-    <w:p/>
-    <w:p>
-      <w:r>
-        <w:t># for multi turn</w:t>
-      </w:r>
-    </w:p>
-    <w:p>
-      <w:r>
-        <w:t>#RESULTS_CSV = "getisord_results_multi.csv"</w:t>
-      </w:r>
-    </w:p>
-    <w:p>
-      <w:r>
-        <w:t>#OUT_CSV = "Scores/multi turn/getisord_scoring_summary.csv"</w:t>
-      </w:r>
-    </w:p>
-    <w:p/>
-    <w:p>
-      <w:r>
-        <w:t>#For single turn</w:t>
-      </w:r>
-    </w:p>
-    <w:p>
-      <w:r>
-        <w:t>#RESULTS_CSV = "getisord_results.csv"</w:t>
-      </w:r>
-    </w:p>
-    <w:p>
-      <w:r>
-        <w:t>#OUT_CSV = "Scores/single turn/getisord_scoring_summary.csv"</w:t>
-      </w:r>
-    </w:p>
-    <w:p/>
-    <w:p>
-      <w:r>
-        <w:t>#For multi agent</w:t>
-      </w:r>
-    </w:p>
-    <w:p>
-      <w:r>
-        <w:t>RESULTS_CSV = "results/multi agent/getisord_results_multiagent.csv"</w:t>
-      </w:r>
-    </w:p>
-    <w:p>
-      <w:r>
-        <w:t>OUT_CSV = "Scores/multi agent/getisord_scoring_summary.csv"</w:t>
-      </w:r>
-    </w:p>
-    <w:p/>
-    <w:p/>
-    <w:p/>
-    <w:p>
-      <w:r>
-        <w:t>python -c "</w:t>
-      </w:r>
-    </w:p>
-    <w:p>
-      <w:r>
-        <w:t>import pandas as pd</w:t>
-      </w:r>
-    </w:p>
-    <w:p>
-      <w:r>
-        <w:t>path = 'results/multi agent/getisord_results_multiagent.csv'</w:t>
-      </w:r>
-    </w:p>
-    <w:p>
-      <w:proofErr w:type="spellStart"/>
-      <w:r>
-        <w:t>df</w:t>
-      </w:r>
-      <w:proofErr w:type="spellEnd"/>
-      <w:r>
-        <w:t xml:space="preserve"> = </w:t>
-      </w:r>
-      <w:proofErr w:type="spellStart"/>
-      <w:r>
-        <w:t>pd.read_csv</w:t>
-      </w:r>
-      <w:proofErr w:type="spellEnd"/>
-      <w:r>
-        <w:t>(path)</w:t>
-      </w:r>
-    </w:p>
-    <w:p/>
-    <w:p>
-      <w:proofErr w:type="spellStart"/>
-      <w:r>
-        <w:t>to_remove</w:t>
-      </w:r>
-      <w:proofErr w:type="spellEnd"/>
-      <w:r>
-        <w:t xml:space="preserve"> = {</w:t>
-      </w:r>
-    </w:p>
-    <w:p>
-      <w:r>
-        <w:t xml:space="preserve">    'meta-llama/llama-3.1-8b-instruct': ['getisord_2021_no2', 'getisord_2021_transport', 'getisord_2023_crime', 'getisord_2023_gas'],</w:t>
-      </w:r>
-    </w:p>
-    <w:p>
-      <w:r>
-        <w:t xml:space="preserve">    '</w:t>
-      </w:r>
-      <w:proofErr w:type="spellStart"/>
-      <w:r>
-        <w:t>openai</w:t>
-      </w:r>
-      <w:proofErr w:type="spellEnd"/>
-      <w:r>
-        <w:t>/gpt-4o-mini': ['getisord_2021_transport', 'getisord_2022_transport', 'getisord_2023_transport'],</w:t>
-      </w:r>
-    </w:p>
-    <w:p>
-      <w:r>
-        <w:t>}</w:t>
-      </w:r>
-    </w:p>
-    <w:p/>
-    <w:p>
-      <w:r>
-        <w:t>$models = @(</w:t>
-      </w:r>
-    </w:p>
-    <w:p>
-      <w:r>
-        <w:t xml:space="preserve">    "</w:t>
-      </w:r>
-      <w:proofErr w:type="spellStart"/>
-      <w:r>
-        <w:t>deepseek</w:t>
-      </w:r>
-      <w:proofErr w:type="spellEnd"/>
-      <w:r>
-        <w:t>/deepseek-r1-0528",</w:t>
-      </w:r>
-    </w:p>
-    <w:p>
-      <w:r>
-        <w:t xml:space="preserve">    "</w:t>
-      </w:r>
-      <w:proofErr w:type="spellStart"/>
-      <w:r>
-        <w:t>qwen</w:t>
-      </w:r>
-      <w:proofErr w:type="spellEnd"/>
-      <w:r>
-        <w:t>/qwen3-32b",</w:t>
-      </w:r>
-    </w:p>
-    <w:p>
-      <w:r>
-        <w:t xml:space="preserve">    "</w:t>
-      </w:r>
-      <w:proofErr w:type="spellStart"/>
-      <w:r>
-        <w:t>moonshotai</w:t>
-      </w:r>
-      <w:proofErr w:type="spellEnd"/>
-      <w:r>
-        <w:t>/kimi-k2.6",</w:t>
-      </w:r>
-    </w:p>
-    <w:p>
-      <w:r>
-        <w:t xml:space="preserve">    "meta-llama/llama-3.1-8b-instruct"</w:t>
-      </w:r>
-    </w:p>
-    <w:p>
-      <w:r>
-        <w:t>)</w:t>
-      </w:r>
-    </w:p>
-    <w:p>
-      <w:r>
-        <w:t>foreach ($m in $models) {</w:t>
-      </w:r>
-    </w:p>
-    <w:p>
-      <w:r>
-        <w:t xml:space="preserve">    Write-Host "=== multi_agent_outlier_iterative_r.py with $m ==="</w:t>
-      </w:r>
-    </w:p>
-    <w:p>
-      <w:r>
-        <w:t xml:space="preserve">    python multi_agent_outlier_iterative_r.py --model $m 2&gt;&amp;1 | Tee-Object -Append -</w:t>
-      </w:r>
-      <w:proofErr w:type="spellStart"/>
-      <w:r>
-        <w:t>FilePath</w:t>
-      </w:r>
-      <w:proofErr w:type="spellEnd"/>
-      <w:r>
-        <w:t xml:space="preserve"> "outlier_multiagent_run_log.txt"</w:t>
-      </w:r>
-    </w:p>
-    <w:p>
-      <w:r>
-        <w:lastRenderedPageBreak/>
-        <w:t>}</w:t>
-      </w:r>
-    </w:p>
-    <w:p/>
+        <w:t>For spatial correlation analysis</w:t>
+      </w:r>
+    </w:p>
+    <w:p>
+      <w:pPr>
+        <w:jc w:val="center"/>
+        <w:rPr>
+          <w:b/>
+          <w:bCs/>
+          <w:u w:val="single"/>
+        </w:rPr>
+      </w:pPr>
+    </w:p>
+    <w:p>
+      <w:pPr>
+        <w:jc w:val="center"/>
+        <w:rPr>
+          <w:b/>
+          <w:bCs/>
+        </w:rPr>
+      </w:pPr>
+      <w:r>
+        <w:rPr>
+          <w:b/>
+          <w:bCs/>
+        </w:rPr>
+        <w:t>Scoring logic — plain-English table (columns unchanged from before)</w:t>
+      </w:r>
+    </w:p>
+    <w:tbl>
+      <w:tblPr>
+        <w:tblW w:w="0" w:type="auto"/>
+        <w:tblCellSpacing w:w="15" w:type="dxa"/>
+        <w:tblBorders>
+          <w:top w:val="single" w:sz="4" w:space="0" w:color="auto"/>
+          <w:left w:val="single" w:sz="4" w:space="0" w:color="auto"/>
+          <w:bottom w:val="single" w:sz="4" w:space="0" w:color="auto"/>
+          <w:right w:val="single" w:sz="4" w:space="0" w:color="auto"/>
+          <w:insideH w:val="single" w:sz="4" w:space="0" w:color="auto"/>
+          <w:insideV w:val="single" w:sz="4" w:space="0" w:color="auto"/>
+        </w:tblBorders>
+        <w:tblCellMar>
+          <w:top w:w="15" w:type="dxa"/>
+          <w:left w:w="15" w:type="dxa"/>
+          <w:bottom w:w="15" w:type="dxa"/>
+          <w:right w:w="15" w:type="dxa"/>
+        </w:tblCellMar>
+        <w:tblLook w:val="04A0" w:firstRow="1" w:lastRow="0" w:firstColumn="1" w:lastColumn="0" w:noHBand="0" w:noVBand="1"/>
+      </w:tblPr>
+      <w:tblGrid>
+        <w:gridCol w:w="2106"/>
+        <w:gridCol w:w="2509"/>
+        <w:gridCol w:w="4401"/>
+      </w:tblGrid>
+      <w:tr>
+        <w:trPr>
+          <w:tblHeader/>
+          <w:tblCellSpacing w:w="15" w:type="dxa"/>
+        </w:trPr>
+        <w:tc>
+          <w:tcPr>
+            <w:tcW w:w="0" w:type="auto"/>
+            <w:vAlign w:val="center"/>
+            <w:hideMark/>
+          </w:tcPr>
+          <w:p>
+            <w:pPr>
+              <w:jc w:val="center"/>
+              <w:rPr>
+                <w:b/>
+                <w:bCs/>
+              </w:rPr>
+            </w:pPr>
+            <w:r>
+              <w:rPr>
+                <w:b/>
+                <w:bCs/>
+              </w:rPr>
+              <w:t>Column</w:t>
+            </w:r>
+          </w:p>
+        </w:tc>
+        <w:tc>
+          <w:tcPr>
+            <w:tcW w:w="0" w:type="auto"/>
+            <w:vAlign w:val="center"/>
+            <w:hideMark/>
+          </w:tcPr>
+          <w:p>
+            <w:pPr>
+              <w:jc w:val="center"/>
+              <w:rPr>
+                <w:b/>
+                <w:bCs/>
+              </w:rPr>
+            </w:pPr>
+            <w:r>
+              <w:rPr>
+                <w:b/>
+                <w:bCs/>
+              </w:rPr>
+              <w:t>GLOBAL rows</w:t>
+            </w:r>
+          </w:p>
+        </w:tc>
+        <w:tc>
+          <w:tcPr>
+            <w:tcW w:w="0" w:type="auto"/>
+            <w:vAlign w:val="center"/>
+            <w:hideMark/>
+          </w:tcPr>
+          <w:p>
+            <w:pPr>
+              <w:jc w:val="center"/>
+              <w:rPr>
+                <w:b/>
+                <w:bCs/>
+              </w:rPr>
+            </w:pPr>
+            <w:r>
+              <w:rPr>
+                <w:b/>
+                <w:bCs/>
+              </w:rPr>
+              <w:t>LOCAL rows</w:t>
+            </w:r>
+          </w:p>
+        </w:tc>
+      </w:tr>
+      <w:tr>
+        <w:trPr>
+          <w:tblCellSpacing w:w="15" w:type="dxa"/>
+        </w:trPr>
+        <w:tc>
+          <w:tcPr>
+            <w:tcW w:w="0" w:type="auto"/>
+            <w:vAlign w:val="center"/>
+            <w:hideMark/>
+          </w:tcPr>
+          <w:p>
+            <w:pPr>
+              <w:jc w:val="center"/>
+            </w:pPr>
+            <w:r>
+              <w:rPr>
+                <w:b/>
+                <w:bCs/>
+              </w:rPr>
+              <w:t>correct</w:t>
+            </w:r>
+          </w:p>
+        </w:tc>
+        <w:tc>
+          <w:tcPr>
+            <w:tcW w:w="0" w:type="auto"/>
+            <w:vAlign w:val="center"/>
+            <w:hideMark/>
+          </w:tcPr>
+          <w:p>
+            <w:pPr>
+              <w:jc w:val="center"/>
+            </w:pPr>
+            <w:r>
+              <w:t>1.0 if predicted CLUSTERED/NOT matches resolved ground truth, else 0.0 (unchanged)</w:t>
+            </w:r>
+          </w:p>
+        </w:tc>
+        <w:tc>
+          <w:tcPr>
+            <w:tcW w:w="0" w:type="auto"/>
+            <w:vAlign w:val="center"/>
+            <w:hideMark/>
+          </w:tcPr>
+          <w:p>
+            <w:pPr>
+              <w:jc w:val="center"/>
+            </w:pPr>
+            <w:r>
+              <w:rPr>
+                <w:b/>
+                <w:bCs/>
+              </w:rPr>
+              <w:t>Per-chunk F1</w:t>
+            </w:r>
+            <w:r>
+              <w:t xml:space="preserve"> between the model's cited borough names and the manifest's </w:t>
+            </w:r>
+            <w:proofErr w:type="spellStart"/>
+            <w:r>
+              <w:t>significant_cluster_boroughs</w:t>
+            </w:r>
+            <w:proofErr w:type="spellEnd"/>
+            <w:r>
+              <w:t xml:space="preserve"> — credit per correct name, penalty per wrong one, naturally bounded [0,1]</w:t>
+            </w:r>
+          </w:p>
+        </w:tc>
+      </w:tr>
+      <w:tr>
+        <w:trPr>
+          <w:tblCellSpacing w:w="15" w:type="dxa"/>
+        </w:trPr>
+        <w:tc>
+          <w:tcPr>
+            <w:tcW w:w="0" w:type="auto"/>
+            <w:vAlign w:val="center"/>
+            <w:hideMark/>
+          </w:tcPr>
+          <w:p>
+            <w:pPr>
+              <w:jc w:val="center"/>
+            </w:pPr>
+            <w:proofErr w:type="spellStart"/>
+            <w:r>
+              <w:t>correct_number</w:t>
+            </w:r>
+            <w:proofErr w:type="spellEnd"/>
+            <w:r>
+              <w:t xml:space="preserve"> / accuracy</w:t>
+            </w:r>
+          </w:p>
+        </w:tc>
+        <w:tc>
+          <w:tcPr>
+            <w:tcW w:w="0" w:type="auto"/>
+            <w:vAlign w:val="center"/>
+            <w:hideMark/>
+          </w:tcPr>
+          <w:p>
+            <w:pPr>
+              <w:jc w:val="center"/>
+            </w:pPr>
+            <w:r>
+              <w:t>Same formula as before (sum(correct)/n)</w:t>
+            </w:r>
+          </w:p>
+        </w:tc>
+        <w:tc>
+          <w:tcPr>
+            <w:tcW w:w="0" w:type="auto"/>
+            <w:vAlign w:val="center"/>
+            <w:hideMark/>
+          </w:tcPr>
+          <w:p>
+            <w:pPr>
+              <w:jc w:val="center"/>
+            </w:pPr>
+            <w:r>
+              <w:t>Same formula — now blends exact 0/1 credit (global) with partial credit (local) automatically</w:t>
+            </w:r>
+          </w:p>
+        </w:tc>
+      </w:tr>
+      <w:tr>
+        <w:trPr>
+          <w:tblCellSpacing w:w="15" w:type="dxa"/>
+        </w:trPr>
+        <w:tc>
+          <w:tcPr>
+            <w:tcW w:w="0" w:type="auto"/>
+            <w:vAlign w:val="center"/>
+            <w:hideMark/>
+          </w:tcPr>
+          <w:p>
+            <w:pPr>
+              <w:jc w:val="center"/>
+            </w:pPr>
+            <w:proofErr w:type="spellStart"/>
+            <w:r>
+              <w:t>tp</w:t>
+            </w:r>
+            <w:proofErr w:type="spellEnd"/>
+            <w:r>
+              <w:t xml:space="preserve"> / </w:t>
+            </w:r>
+            <w:proofErr w:type="spellStart"/>
+            <w:r>
+              <w:t>fp</w:t>
+            </w:r>
+            <w:proofErr w:type="spellEnd"/>
+          </w:p>
+        </w:tc>
+        <w:tc>
+          <w:tcPr>
+            <w:tcW w:w="0" w:type="auto"/>
+            <w:vAlign w:val="center"/>
+            <w:hideMark/>
+          </w:tcPr>
+          <w:p>
+            <w:pPr>
+              <w:jc w:val="center"/>
+            </w:pPr>
+            <w:r>
+              <w:t>Chunk-level CLUSTERED-class counts (unchanged)</w:t>
+            </w:r>
+          </w:p>
+        </w:tc>
+        <w:tc>
+          <w:tcPr>
+            <w:tcW w:w="0" w:type="auto"/>
+            <w:vAlign w:val="center"/>
+            <w:hideMark/>
+          </w:tcPr>
+          <w:p>
+            <w:pPr>
+              <w:jc w:val="center"/>
+            </w:pPr>
+            <w:r>
+              <w:rPr>
+                <w:b/>
+                <w:bCs/>
+              </w:rPr>
+              <w:t>Borough-level</w:t>
+            </w:r>
+            <w:r>
+              <w:t xml:space="preserve"> counts, pooled across every local chunk, added into the same totals</w:t>
+            </w:r>
+          </w:p>
+        </w:tc>
+      </w:tr>
+      <w:tr>
+        <w:trPr>
+          <w:tblCellSpacing w:w="15" w:type="dxa"/>
+        </w:trPr>
+        <w:tc>
+          <w:tcPr>
+            <w:tcW w:w="0" w:type="auto"/>
+            <w:vAlign w:val="center"/>
+            <w:hideMark/>
+          </w:tcPr>
+          <w:p>
+            <w:pPr>
+              <w:jc w:val="center"/>
+            </w:pPr>
+            <w:r>
+              <w:t>precision / recall / f1</w:t>
+            </w:r>
+          </w:p>
+        </w:tc>
+        <w:tc>
+          <w:tcPr>
+            <w:tcW w:w="0" w:type="auto"/>
+            <w:vAlign w:val="center"/>
+            <w:hideMark/>
+          </w:tcPr>
+          <w:p>
+            <w:pPr>
+              <w:jc w:val="center"/>
+            </w:pPr>
+            <w:r>
+              <w:t>Macro-averaged over CLUSTERED / NOT_CLUSTERED (unchanged)</w:t>
+            </w:r>
+          </w:p>
+        </w:tc>
+        <w:tc>
+          <w:tcPr>
+            <w:tcW w:w="0" w:type="auto"/>
+            <w:vAlign w:val="center"/>
+            <w:hideMark/>
+          </w:tcPr>
+          <w:p>
+            <w:pPr>
+              <w:jc w:val="center"/>
+            </w:pPr>
+            <w:r>
+              <w:t xml:space="preserve">A </w:t>
+            </w:r>
+            <w:r>
+              <w:rPr>
+                <w:b/>
+                <w:bCs/>
+              </w:rPr>
+              <w:t>third pseudo-class</w:t>
+            </w:r>
+            <w:r>
+              <w:t>, LOCAL_BOROUGH_MATCH, averaged in on equal footing with the other two</w:t>
+            </w:r>
+          </w:p>
+        </w:tc>
+      </w:tr>
+      <w:tr>
+        <w:trPr>
+          <w:tblCellSpacing w:w="15" w:type="dxa"/>
+        </w:trPr>
+        <w:tc>
+          <w:tcPr>
+            <w:tcW w:w="0" w:type="auto"/>
+            <w:vAlign w:val="center"/>
+            <w:hideMark/>
+          </w:tcPr>
+          <w:p>
+            <w:pPr>
+              <w:jc w:val="center"/>
+            </w:pPr>
+            <w:proofErr w:type="spellStart"/>
+            <w:r>
+              <w:t>pct_with_evidence</w:t>
+            </w:r>
+            <w:proofErr w:type="spellEnd"/>
+          </w:p>
+        </w:tc>
+        <w:tc>
+          <w:tcPr>
+            <w:tcW w:w="0" w:type="auto"/>
+            <w:vAlign w:val="center"/>
+            <w:hideMark/>
+          </w:tcPr>
+          <w:p>
+            <w:pPr>
+              <w:jc w:val="center"/>
+            </w:pPr>
+            <w:r>
+              <w:t>Unchanged</w:t>
+            </w:r>
+          </w:p>
+        </w:tc>
+        <w:tc>
+          <w:tcPr>
+            <w:tcW w:w="0" w:type="auto"/>
+            <w:vAlign w:val="center"/>
+            <w:hideMark/>
+          </w:tcPr>
+          <w:p>
+            <w:pPr>
+              <w:jc w:val="center"/>
+            </w:pPr>
+            <w:r>
+              <w:t>Unchanged</w:t>
+            </w:r>
+          </w:p>
+        </w:tc>
+      </w:tr>
+    </w:tbl>
+    <w:p>
+      <w:pPr>
+        <w:jc w:val="center"/>
+        <w:rPr>
+          <w:b/>
+          <w:bCs/>
+          <w:u w:val="single"/>
+        </w:rPr>
+      </w:pPr>
+    </w:p>
+    <w:p>
+      <w:pPr>
+        <w:jc w:val="center"/>
+        <w:rPr>
+          <w:b/>
+          <w:bCs/>
+          <w:u w:val="single"/>
+        </w:rPr>
+      </w:pPr>
+    </w:p>
     <w:sectPr>
       <w:pgSz w:w="11906" w:h="16838"/>
       <w:pgMar w:top="1440" w:right="1440" w:bottom="1440" w:left="1440" w:header="708" w:footer="708" w:gutter="0"/>

</xml_diff>

<commit_message>
Over 300 test cases completed for all 5 spatiotemporal tasks
</commit_message>
<xml_diff>
--- a/Follow up/multi agent selection justification.docx
+++ b/Follow up/multi agent selection justification.docx
@@ -5400,6 +5400,182 @@
           <w:u w:val="single"/>
         </w:rPr>
       </w:pPr>
+    </w:p>
+    <w:p>
+      <w:pPr>
+        <w:jc w:val="center"/>
+        <w:rPr>
+          <w:b/>
+          <w:bCs/>
+          <w:u w:val="single"/>
+        </w:rPr>
+      </w:pPr>
+    </w:p>
+    <w:p>
+      <w:pPr>
+        <w:jc w:val="center"/>
+        <w:rPr>
+          <w:b/>
+          <w:bCs/>
+          <w:u w:val="single"/>
+        </w:rPr>
+      </w:pPr>
+    </w:p>
+    <w:p>
+      <w:pPr>
+        <w:jc w:val="center"/>
+        <w:rPr>
+          <w:b/>
+          <w:bCs/>
+          <w:u w:val="single"/>
+        </w:rPr>
+      </w:pPr>
+    </w:p>
+    <w:p>
+      <w:pPr>
+        <w:jc w:val="center"/>
+        <w:rPr>
+          <w:b/>
+          <w:bCs/>
+          <w:u w:val="single"/>
+        </w:rPr>
+      </w:pPr>
+    </w:p>
+    <w:p>
+      <w:pPr>
+        <w:jc w:val="center"/>
+        <w:rPr>
+          <w:b/>
+          <w:bCs/>
+          <w:u w:val="single"/>
+        </w:rPr>
+      </w:pPr>
+    </w:p>
+    <w:p>
+      <w:pPr>
+        <w:jc w:val="center"/>
+        <w:rPr>
+          <w:b/>
+          <w:bCs/>
+          <w:u w:val="single"/>
+        </w:rPr>
+      </w:pPr>
+    </w:p>
+    <w:p>
+      <w:pPr>
+        <w:jc w:val="center"/>
+        <w:rPr>
+          <w:b/>
+          <w:bCs/>
+          <w:u w:val="single"/>
+        </w:rPr>
+      </w:pPr>
+    </w:p>
+    <w:p>
+      <w:pPr>
+        <w:jc w:val="center"/>
+        <w:rPr>
+          <w:b/>
+          <w:bCs/>
+          <w:u w:val="single"/>
+        </w:rPr>
+      </w:pPr>
+    </w:p>
+    <w:p>
+      <w:pPr>
+        <w:jc w:val="center"/>
+        <w:rPr>
+          <w:b/>
+          <w:bCs/>
+          <w:u w:val="single"/>
+        </w:rPr>
+      </w:pPr>
+    </w:p>
+    <w:p>
+      <w:pPr>
+        <w:jc w:val="center"/>
+        <w:rPr>
+          <w:b/>
+          <w:bCs/>
+          <w:u w:val="single"/>
+        </w:rPr>
+      </w:pPr>
+    </w:p>
+    <w:p>
+      <w:pPr>
+        <w:jc w:val="center"/>
+        <w:rPr>
+          <w:b/>
+          <w:bCs/>
+          <w:u w:val="single"/>
+        </w:rPr>
+      </w:pPr>
+      <w:r>
+        <w:rPr>
+          <w:b/>
+          <w:bCs/>
+          <w:u w:val="single"/>
+        </w:rPr>
+        <w:t>adjustment between proposal and thesis </w:t>
+      </w:r>
+    </w:p>
+    <w:p>
+      <w:r>
+        <w:t>Dear teaching team,</w:t>
+      </w:r>
+    </w:p>
+    <w:p>
+      <w:r>
+        <w:t>I am writing to seek clarification regarding minor procedural adjustments for my final thesis.</w:t>
+      </w:r>
+    </w:p>
+    <w:p>
+      <w:r>
+        <w:t>Following recent discussions with my supervisor, we agreed that certain aspects of the project plan outlined in my submitted research proposal need refinement:</w:t>
+      </w:r>
+    </w:p>
+    <w:p>
+      <w:r>
+        <w:t>Feature Selection Adjustment: We identified the need to modify the feature selection strategy. Could you please clarify if I need to submit an amended proposal, or if it is acceptable to directly incorporate and justify these changes within the final thesis?</w:t>
+      </w:r>
+    </w:p>
+    <w:p>
+      <w:r>
+        <w:t>Data Analysis Workflow: We are planning to adjust the specific data analysis pipeline while keeping the core research questions and research objectives unchanged. Could you confirm whether formal approval/resubmission is required for updating the analysis workflow under this condition?</w:t>
+      </w:r>
+    </w:p>
+    <w:p>
+      <w:r>
+        <w:t>Best regards,</w:t>
+      </w:r>
+    </w:p>
+    <w:p/>
+    <w:p/>
+    <w:p>
+      <w:r>
+        <w:t>Dulan Perera</w:t>
+      </w:r>
+    </w:p>
+    <w:p>
+      <w:hyperlink r:id="rId9" w:history="1">
+        <w:r>
+          <w:rPr>
+            <w:rStyle w:val="Hyperlink"/>
+            <w:u w:val="none"/>
+          </w:rPr>
+          <w:t>Last week</w:t>
+        </w:r>
+      </w:hyperlink>
+    </w:p>
+    <w:p>
+      <w:r>
+        <w:t>If the changes are minor and are still reflected in your current thesis title, you do not need to change the title or resubmit the proposal.</w:t>
+      </w:r>
+    </w:p>
+    <w:p>
+      <w:r>
+        <w:t>However, if you would like to update the thesis title to better reflect the changes, you will need to submit a thesis title change request to the CE of the unit, briefly explaining the reason for the change. Please also CC me and your supervisor on the email.</w:t>
+      </w:r>
     </w:p>
     <w:p>
       <w:pPr>

</xml_diff>